<commit_message>
updates about adding of authority sign in between the For BlechTek Software Solutions LLP Sushama Inamdar
</commit_message>
<xml_diff>
--- a/QuotationApp.API/Templates/QuotationTemplate_Updated.docx
+++ b/QuotationApp.API/Templates/QuotationTemplate_Updated.docx
@@ -858,6 +858,20 @@
         </w:rPr>
         <w:t>Price for Implementation</w:t>
       </w:r>
+      <w:r>
+        <w:rPr>
+          <w:b/>
+          <w:bCs/>
+          <w:caps/>
+          <w:color w:val="65AADB"/>
+          <w:sz w:val="26"/>
+          <w:szCs w:val="26"/>
+        </w:rPr>
+        <w:t xml:space="preserve"> of cqual - </w:t>
+      </w:r>
+      <w:r>
+        <w:t>{{MODULE_LIST}}</w:t>
+      </w:r>
     </w:p>
     <w:tbl>
       <w:tblPr>
@@ -1060,7 +1074,13 @@
               <w:t>Customization</w:t>
             </w:r>
             <w:r>
-              <w:t xml:space="preserve"> - any additional development beyond scope, charged at INR 7,000 / man-day.</w:t>
+              <w:t xml:space="preserve"> - any additional development beyond scope, charged at INR </w:t>
+            </w:r>
+            <w:r>
+              <w:t>8</w:t>
+            </w:r>
+            <w:r>
+              <w:t>,000 / man-day.</w:t>
             </w:r>
           </w:p>
         </w:tc>

</xml_diff>

<commit_message>
updates about price of implementation table correction of color and showing the module names infront of the price of implementation table text
</commit_message>
<xml_diff>
--- a/QuotationApp.API/Templates/QuotationTemplate_Updated.docx
+++ b/QuotationApp.API/Templates/QuotationTemplate_Updated.docx
@@ -43,7 +43,25 @@
           <w:bCs/>
           <w:color w:val="65AADB"/>
         </w:rPr>
-        <w:t>{{OrganizationName}}</w:t>
+        <w:t>{{</w:t>
+      </w:r>
+      <w:proofErr w:type="spellStart"/>
+      <w:r>
+        <w:rPr>
+          <w:b/>
+          <w:bCs/>
+          <w:color w:val="65AADB"/>
+        </w:rPr>
+        <w:t>OrganizationName</w:t>
+      </w:r>
+      <w:proofErr w:type="spellEnd"/>
+      <w:r>
+        <w:rPr>
+          <w:b/>
+          <w:bCs/>
+          <w:color w:val="65AADB"/>
+        </w:rPr>
+        <w:t>}}</w:t>
       </w:r>
     </w:p>
     <w:p>
@@ -134,7 +152,21 @@
         <w:rPr>
           <w:b/>
         </w:rPr>
-        <w:t>{{QuotationNo}}</w:t>
+        <w:t>{{</w:t>
+      </w:r>
+      <w:proofErr w:type="spellStart"/>
+      <w:r>
+        <w:rPr>
+          <w:b/>
+        </w:rPr>
+        <w:t>QuotationNo</w:t>
+      </w:r>
+      <w:proofErr w:type="spellEnd"/>
+      <w:r>
+        <w:rPr>
+          <w:b/>
+        </w:rPr>
+        <w:t>}}</w:t>
       </w:r>
     </w:p>
     <w:p>
@@ -220,6 +252,7 @@
         </w:rPr>
         <w:tab/>
       </w:r>
+      <w:proofErr w:type="gramStart"/>
       <w:r>
         <w:rPr>
           <w:b/>
@@ -234,7 +267,11 @@
         <w:t xml:space="preserve"> </w:t>
       </w:r>
       <w:r>
-        <w:t>{{Date}}</w:t>
+        <w:t>{{</w:t>
+      </w:r>
+      <w:proofErr w:type="gramEnd"/>
+      <w:r>
+        <w:t>Date}}</w:t>
       </w:r>
     </w:p>
     <w:p>
@@ -260,10 +297,23 @@
           <w:bCs/>
           <w:color w:val="65AADB"/>
         </w:rPr>
-        <w:t>Contact No.: {{CONTACT_PHONE}}</w:t>
-      </w:r>
-      <w:r>
-        <w:t xml:space="preserve">   |   </w:t>
+        <w:t>Contact No.: {{CONTACT_PHONE</w:t>
+      </w:r>
+      <w:proofErr w:type="gramStart"/>
+      <w:r>
+        <w:rPr>
+          <w:b/>
+          <w:bCs/>
+          <w:color w:val="65AADB"/>
+        </w:rPr>
+        <w:t>}}</w:t>
+      </w:r>
+      <w:r>
+        <w:t xml:space="preserve">   </w:t>
+      </w:r>
+      <w:proofErr w:type="gramEnd"/>
+      <w:r>
+        <w:t xml:space="preserve">|   </w:t>
       </w:r>
       <w:r>
         <w:rPr>
@@ -352,19 +402,43 @@
         <w:rPr>
           <w:lang w:val="en-US"/>
         </w:rPr>
-        <w:t xml:space="preserve">We discussed the current challenges and solutions CQUAL can provide, based on our brief discussions, please find attached a Preliminary Business Proposal for the required changeover at </w:t>
-      </w:r>
-      <w:r>
-        <w:rPr>
-          <w:b/>
-          <w:bCs/>
-          <w:color w:val="65AADB"/>
-        </w:rPr>
-        <w:t>{{ORG_NAME}}</w:t>
+        <w:t>We discussed the current challenges and solutions CQUAL can provide</w:t>
+      </w:r>
+      <w:proofErr w:type="gramStart"/>
+      <w:r>
+        <w:rPr>
+          <w:lang w:val="en-US"/>
+        </w:rPr>
+        <w:t>, based</w:t>
+      </w:r>
+      <w:proofErr w:type="gramEnd"/>
+      <w:r>
+        <w:rPr>
+          <w:lang w:val="en-US"/>
+        </w:rPr>
+        <w:t xml:space="preserve"> on our brief discussions, please find attached a Preliminary Business Proposal for the required changeover at </w:t>
+      </w:r>
+      <w:r>
+        <w:rPr>
+          <w:b/>
+          <w:bCs/>
+          <w:color w:val="65AADB"/>
+        </w:rPr>
+        <w:t>{{ORG_</w:t>
+      </w:r>
+      <w:proofErr w:type="gramStart"/>
+      <w:r>
+        <w:rPr>
+          <w:b/>
+          <w:bCs/>
+          <w:color w:val="65AADB"/>
+        </w:rPr>
+        <w:t>NAME}}</w:t>
       </w:r>
       <w:r>
         <w:t>.</w:t>
       </w:r>
+      <w:proofErr w:type="gramEnd"/>
     </w:p>
     <w:p>
       <w:pPr>
@@ -507,7 +581,15 @@
         <w:spacing w:after="200"/>
       </w:pPr>
       <w:r>
-        <w:t>Deliverables do not include the source code. Use of the solution is under license from BlechTek Software Solutions LLP.</w:t>
+        <w:t xml:space="preserve">Deliverables do not include the source code. Use of the solution is under license from </w:t>
+      </w:r>
+      <w:proofErr w:type="spellStart"/>
+      <w:r>
+        <w:t>BlechTek</w:t>
+      </w:r>
+      <w:proofErr w:type="spellEnd"/>
+      <w:r>
+        <w:t xml:space="preserve"> Software Solutions LLP.</w:t>
       </w:r>
     </w:p>
     <w:p>
@@ -563,7 +645,25 @@
           <w:bCs/>
           <w:lang w:val="en-US"/>
         </w:rPr>
-        <w:t>For BlechTek Software Solutions LLP.</w:t>
+        <w:t xml:space="preserve">For </w:t>
+      </w:r>
+      <w:proofErr w:type="spellStart"/>
+      <w:r>
+        <w:rPr>
+          <w:b/>
+          <w:bCs/>
+          <w:lang w:val="en-US"/>
+        </w:rPr>
+        <w:t>BlechTek</w:t>
+      </w:r>
+      <w:proofErr w:type="spellEnd"/>
+      <w:r>
+        <w:rPr>
+          <w:b/>
+          <w:bCs/>
+          <w:lang w:val="en-US"/>
+        </w:rPr>
+        <w:t xml:space="preserve"> Software Solutions LLP.</w:t>
       </w:r>
     </w:p>
     <w:p>
@@ -575,26 +675,45 @@
           <w:lang w:val="en-US"/>
         </w:rPr>
       </w:pPr>
-    </w:p>
-    <w:p>
-      <w:pPr>
-        <w:spacing w:line="240" w:lineRule="auto"/>
-      </w:pPr>
-    </w:p>
-    <w:p>
-      <w:pPr>
-        <w:spacing w:line="240" w:lineRule="auto"/>
-      </w:pPr>
-    </w:p>
-    <w:p>
-      <w:pPr>
-        <w:spacing w:line="240" w:lineRule="auto"/>
-      </w:pPr>
-    </w:p>
-    <w:p>
-      <w:pPr>
-        <w:spacing w:line="240" w:lineRule="auto"/>
-      </w:pPr>
+      <w:r>
+        <w:rPr>
+          <w:noProof/>
+        </w:rPr>
+        <w:lastRenderedPageBreak/>
+        <w:drawing>
+          <wp:inline distT="0" distB="0" distL="0" distR="0" wp14:anchorId="3D41E2FB" wp14:editId="23AD92E6">
+            <wp:extent cx="1045464" cy="1033272"/>
+            <wp:effectExtent l="0" t="0" r="0" b="0"/>
+            <wp:docPr id="66384000" name="Picture 66384000"/>
+            <wp:cNvGraphicFramePr/>
+            <a:graphic xmlns:a="http://schemas.openxmlformats.org/drawingml/2006/main">
+              <a:graphicData uri="http://schemas.openxmlformats.org/drawingml/2006/picture">
+                <pic:pic xmlns:pic="http://schemas.openxmlformats.org/drawingml/2006/picture">
+                  <pic:nvPicPr>
+                    <pic:cNvPr id="97" name="Picture 97"/>
+                    <pic:cNvPicPr/>
+                  </pic:nvPicPr>
+                  <pic:blipFill>
+                    <a:blip r:embed="rId7"/>
+                    <a:stretch>
+                      <a:fillRect/>
+                    </a:stretch>
+                  </pic:blipFill>
+                  <pic:spPr>
+                    <a:xfrm>
+                      <a:off x="0" y="0"/>
+                      <a:ext cx="1045464" cy="1033272"/>
+                    </a:xfrm>
+                    <a:prstGeom prst="rect">
+                      <a:avLst/>
+                    </a:prstGeom>
+                  </pic:spPr>
+                </pic:pic>
+              </a:graphicData>
+            </a:graphic>
+          </wp:inline>
+        </w:drawing>
+      </w:r>
     </w:p>
     <w:p>
       <w:pPr>
@@ -636,7 +755,6 @@
           <w:sz w:val="26"/>
           <w:szCs w:val="26"/>
         </w:rPr>
-        <w:lastRenderedPageBreak/>
         <w:t>Scope</w:t>
       </w:r>
     </w:p>
@@ -884,6 +1002,7 @@
           <w:insideH w:val="single" w:sz="4" w:space="0" w:color="auto"/>
           <w:insideV w:val="single" w:sz="4" w:space="0" w:color="auto"/>
         </w:tblBorders>
+        <w:shd w:val="clear" w:color="auto" w:fill="FFFFFF" w:themeFill="background1"/>
         <w:tblCellMar>
           <w:left w:w="10" w:type="dxa"/>
           <w:right w:w="10" w:type="dxa"/>
@@ -973,6 +1092,7 @@
         <w:tc>
           <w:tcPr>
             <w:tcW w:w="700" w:type="dxa"/>
+            <w:shd w:val="clear" w:color="auto" w:fill="FFFFFF" w:themeFill="background1"/>
             <w:tcMar>
               <w:top w:w="80" w:type="dxa"/>
               <w:left w:w="120" w:type="dxa"/>
@@ -989,6 +1109,7 @@
         <w:tc>
           <w:tcPr>
             <w:tcW w:w="5300" w:type="dxa"/>
+            <w:shd w:val="clear" w:color="auto" w:fill="FFFFFF" w:themeFill="background1"/>
             <w:tcMar>
               <w:top w:w="80" w:type="dxa"/>
               <w:left w:w="120" w:type="dxa"/>
@@ -1017,6 +1138,7 @@
         <w:tc>
           <w:tcPr>
             <w:tcW w:w="3000" w:type="dxa"/>
+            <w:shd w:val="clear" w:color="auto" w:fill="FFFFFF" w:themeFill="background1"/>
             <w:tcMar>
               <w:top w:w="80" w:type="dxa"/>
               <w:left w:w="120" w:type="dxa"/>
@@ -1040,7 +1162,7 @@
         <w:tc>
           <w:tcPr>
             <w:tcW w:w="700" w:type="dxa"/>
-            <w:shd w:val="clear" w:color="auto" w:fill="F2F4F7"/>
+            <w:shd w:val="clear" w:color="auto" w:fill="FFFFFF" w:themeFill="background1"/>
             <w:tcMar>
               <w:top w:w="80" w:type="dxa"/>
               <w:left w:w="120" w:type="dxa"/>
@@ -1057,7 +1179,7 @@
         <w:tc>
           <w:tcPr>
             <w:tcW w:w="5300" w:type="dxa"/>
-            <w:shd w:val="clear" w:color="auto" w:fill="F2F4F7"/>
+            <w:shd w:val="clear" w:color="auto" w:fill="FFFFFF" w:themeFill="background1"/>
             <w:tcMar>
               <w:top w:w="80" w:type="dxa"/>
               <w:left w:w="120" w:type="dxa"/>
@@ -1087,7 +1209,7 @@
         <w:tc>
           <w:tcPr>
             <w:tcW w:w="3000" w:type="dxa"/>
-            <w:shd w:val="clear" w:color="auto" w:fill="F2F4F7"/>
+            <w:shd w:val="clear" w:color="auto" w:fill="FFFFFF" w:themeFill="background1"/>
             <w:tcMar>
               <w:top w:w="80" w:type="dxa"/>
               <w:left w:w="120" w:type="dxa"/>
@@ -1106,6 +1228,7 @@
         <w:tc>
           <w:tcPr>
             <w:tcW w:w="700" w:type="dxa"/>
+            <w:shd w:val="clear" w:color="auto" w:fill="FFFFFF" w:themeFill="background1"/>
             <w:tcMar>
               <w:top w:w="80" w:type="dxa"/>
               <w:left w:w="120" w:type="dxa"/>
@@ -1122,6 +1245,7 @@
         <w:tc>
           <w:tcPr>
             <w:tcW w:w="5300" w:type="dxa"/>
+            <w:shd w:val="clear" w:color="auto" w:fill="FFFFFF" w:themeFill="background1"/>
             <w:tcMar>
               <w:top w:w="80" w:type="dxa"/>
               <w:left w:w="120" w:type="dxa"/>
@@ -1145,6 +1269,7 @@
         <w:tc>
           <w:tcPr>
             <w:tcW w:w="3000" w:type="dxa"/>
+            <w:shd w:val="clear" w:color="auto" w:fill="FFFFFF" w:themeFill="background1"/>
             <w:tcMar>
               <w:top w:w="80" w:type="dxa"/>
               <w:left w:w="120" w:type="dxa"/>
@@ -1159,7 +1284,7 @@
         <w:tc>
           <w:tcPr>
             <w:tcW w:w="700" w:type="dxa"/>
-            <w:shd w:val="clear" w:color="auto" w:fill="F2F4F7"/>
+            <w:shd w:val="clear" w:color="auto" w:fill="FFFFFF" w:themeFill="background1"/>
             <w:tcMar>
               <w:top w:w="80" w:type="dxa"/>
               <w:left w:w="120" w:type="dxa"/>
@@ -1176,7 +1301,7 @@
         <w:tc>
           <w:tcPr>
             <w:tcW w:w="5300" w:type="dxa"/>
-            <w:shd w:val="clear" w:color="auto" w:fill="F2F4F7"/>
+            <w:shd w:val="clear" w:color="auto" w:fill="FFFFFF" w:themeFill="background1"/>
             <w:tcMar>
               <w:top w:w="80" w:type="dxa"/>
               <w:left w:w="120" w:type="dxa"/>
@@ -1200,7 +1325,7 @@
         <w:tc>
           <w:tcPr>
             <w:tcW w:w="3000" w:type="dxa"/>
-            <w:shd w:val="clear" w:color="auto" w:fill="F2F4F7"/>
+            <w:shd w:val="clear" w:color="auto" w:fill="FFFFFF" w:themeFill="background1"/>
             <w:tcMar>
               <w:top w:w="80" w:type="dxa"/>
               <w:left w:w="120" w:type="dxa"/>
@@ -1215,6 +1340,7 @@
         <w:tc>
           <w:tcPr>
             <w:tcW w:w="700" w:type="dxa"/>
+            <w:shd w:val="clear" w:color="auto" w:fill="FFFFFF" w:themeFill="background1"/>
             <w:tcMar>
               <w:top w:w="80" w:type="dxa"/>
               <w:left w:w="120" w:type="dxa"/>
@@ -1231,6 +1357,7 @@
         <w:tc>
           <w:tcPr>
             <w:tcW w:w="5300" w:type="dxa"/>
+            <w:shd w:val="clear" w:color="auto" w:fill="FFFFFF" w:themeFill="background1"/>
             <w:tcMar>
               <w:top w:w="80" w:type="dxa"/>
               <w:left w:w="120" w:type="dxa"/>
@@ -1275,6 +1402,7 @@
         <w:tc>
           <w:tcPr>
             <w:tcW w:w="3000" w:type="dxa"/>
+            <w:shd w:val="clear" w:color="auto" w:fill="FFFFFF" w:themeFill="background1"/>
             <w:tcMar>
               <w:top w:w="80" w:type="dxa"/>
               <w:left w:w="120" w:type="dxa"/>
@@ -1289,7 +1417,7 @@
         <w:tc>
           <w:tcPr>
             <w:tcW w:w="700" w:type="dxa"/>
-            <w:shd w:val="clear" w:color="auto" w:fill="F2F4F7"/>
+            <w:shd w:val="clear" w:color="auto" w:fill="FFFFFF" w:themeFill="background1"/>
             <w:tcMar>
               <w:top w:w="80" w:type="dxa"/>
               <w:left w:w="120" w:type="dxa"/>
@@ -1310,7 +1438,7 @@
         <w:tc>
           <w:tcPr>
             <w:tcW w:w="5300" w:type="dxa"/>
-            <w:shd w:val="clear" w:color="auto" w:fill="F2F4F7"/>
+            <w:shd w:val="clear" w:color="auto" w:fill="FFFFFF" w:themeFill="background1"/>
             <w:tcMar>
               <w:top w:w="80" w:type="dxa"/>
               <w:left w:w="120" w:type="dxa"/>
@@ -1331,7 +1459,7 @@
         <w:tc>
           <w:tcPr>
             <w:tcW w:w="3000" w:type="dxa"/>
-            <w:shd w:val="clear" w:color="auto" w:fill="F2F4F7"/>
+            <w:shd w:val="clear" w:color="auto" w:fill="FFFFFF" w:themeFill="background1"/>
             <w:tcMar>
               <w:top w:w="80" w:type="dxa"/>
               <w:left w:w="120" w:type="dxa"/>
@@ -1346,6 +1474,7 @@
         <w:tc>
           <w:tcPr>
             <w:tcW w:w="700" w:type="dxa"/>
+            <w:shd w:val="clear" w:color="auto" w:fill="FFFFFF" w:themeFill="background1"/>
             <w:tcMar>
               <w:top w:w="80" w:type="dxa"/>
               <w:left w:w="120" w:type="dxa"/>
@@ -1358,6 +1487,7 @@
         <w:tc>
           <w:tcPr>
             <w:tcW w:w="5300" w:type="dxa"/>
+            <w:shd w:val="clear" w:color="auto" w:fill="FFFFFF" w:themeFill="background1"/>
             <w:tcMar>
               <w:top w:w="80" w:type="dxa"/>
               <w:left w:w="120" w:type="dxa"/>
@@ -1403,6 +1533,7 @@
         <w:tc>
           <w:tcPr>
             <w:tcW w:w="3000" w:type="dxa"/>
+            <w:shd w:val="clear" w:color="auto" w:fill="FFFFFF" w:themeFill="background1"/>
             <w:tcMar>
               <w:top w:w="80" w:type="dxa"/>
               <w:left w:w="120" w:type="dxa"/>
@@ -1421,7 +1552,7 @@
         <w:tc>
           <w:tcPr>
             <w:tcW w:w="700" w:type="dxa"/>
-            <w:shd w:val="clear" w:color="auto" w:fill="F2F4F7"/>
+            <w:shd w:val="clear" w:color="auto" w:fill="FFFFFF" w:themeFill="background1"/>
             <w:tcMar>
               <w:top w:w="80" w:type="dxa"/>
               <w:left w:w="120" w:type="dxa"/>
@@ -1434,7 +1565,7 @@
         <w:tc>
           <w:tcPr>
             <w:tcW w:w="5300" w:type="dxa"/>
-            <w:shd w:val="clear" w:color="auto" w:fill="F2F4F7"/>
+            <w:shd w:val="clear" w:color="auto" w:fill="FFFFFF" w:themeFill="background1"/>
             <w:tcMar>
               <w:top w:w="80" w:type="dxa"/>
               <w:left w:w="120" w:type="dxa"/>
@@ -1470,14 +1601,22 @@
           </w:p>
           <w:p>
             <w:r>
-              <w:t>Identified by you or by BlechTek Software Solutions LLP.</w:t>
+              <w:t xml:space="preserve">Identified by you or by </w:t>
+            </w:r>
+            <w:proofErr w:type="spellStart"/>
+            <w:r>
+              <w:t>BlechTek</w:t>
+            </w:r>
+            <w:proofErr w:type="spellEnd"/>
+            <w:r>
+              <w:t xml:space="preserve"> Software Solutions LLP.</w:t>
             </w:r>
           </w:p>
         </w:tc>
         <w:tc>
           <w:tcPr>
             <w:tcW w:w="3000" w:type="dxa"/>
-            <w:shd w:val="clear" w:color="auto" w:fill="F2F4F7"/>
+            <w:shd w:val="clear" w:color="auto" w:fill="FFFFFF" w:themeFill="background1"/>
             <w:tcMar>
               <w:top w:w="80" w:type="dxa"/>
               <w:left w:w="120" w:type="dxa"/>
@@ -1496,6 +1635,7 @@
         <w:tc>
           <w:tcPr>
             <w:tcW w:w="700" w:type="dxa"/>
+            <w:shd w:val="clear" w:color="auto" w:fill="FFFFFF" w:themeFill="background1"/>
             <w:tcMar>
               <w:top w:w="80" w:type="dxa"/>
               <w:left w:w="120" w:type="dxa"/>
@@ -1508,6 +1648,7 @@
         <w:tc>
           <w:tcPr>
             <w:tcW w:w="5300" w:type="dxa"/>
+            <w:shd w:val="clear" w:color="auto" w:fill="FFFFFF" w:themeFill="background1"/>
             <w:tcMar>
               <w:top w:w="80" w:type="dxa"/>
               <w:left w:w="120" w:type="dxa"/>
@@ -1553,6 +1694,7 @@
         <w:tc>
           <w:tcPr>
             <w:tcW w:w="3000" w:type="dxa"/>
+            <w:shd w:val="clear" w:color="auto" w:fill="FFFFFF" w:themeFill="background1"/>
             <w:tcMar>
               <w:top w:w="80" w:type="dxa"/>
               <w:left w:w="120" w:type="dxa"/>
@@ -1571,7 +1713,7 @@
         <w:tc>
           <w:tcPr>
             <w:tcW w:w="700" w:type="dxa"/>
-            <w:shd w:val="clear" w:color="auto" w:fill="F2F4F7"/>
+            <w:shd w:val="clear" w:color="auto" w:fill="FFFFFF" w:themeFill="background1"/>
             <w:tcMar>
               <w:top w:w="80" w:type="dxa"/>
               <w:left w:w="120" w:type="dxa"/>
@@ -1584,7 +1726,7 @@
         <w:tc>
           <w:tcPr>
             <w:tcW w:w="5300" w:type="dxa"/>
-            <w:shd w:val="clear" w:color="auto" w:fill="F2F4F7"/>
+            <w:shd w:val="clear" w:color="auto" w:fill="FFFFFF" w:themeFill="background1"/>
             <w:tcMar>
               <w:top w:w="80" w:type="dxa"/>
               <w:left w:w="120" w:type="dxa"/>
@@ -1623,14 +1765,22 @@
           </w:p>
           <w:p>
             <w:r>
-              <w:t>As done by BlechTek Software Solutions LLP on its own.</w:t>
+              <w:t xml:space="preserve">As done by </w:t>
+            </w:r>
+            <w:proofErr w:type="spellStart"/>
+            <w:r>
+              <w:t>BlechTek</w:t>
+            </w:r>
+            <w:proofErr w:type="spellEnd"/>
+            <w:r>
+              <w:t xml:space="preserve"> Software Solutions LLP on its own.</w:t>
             </w:r>
           </w:p>
         </w:tc>
         <w:tc>
           <w:tcPr>
             <w:tcW w:w="3000" w:type="dxa"/>
-            <w:shd w:val="clear" w:color="auto" w:fill="F2F4F7"/>
+            <w:shd w:val="clear" w:color="auto" w:fill="FFFFFF" w:themeFill="background1"/>
             <w:tcMar>
               <w:top w:w="80" w:type="dxa"/>
               <w:left w:w="120" w:type="dxa"/>
@@ -1649,6 +1799,7 @@
         <w:tc>
           <w:tcPr>
             <w:tcW w:w="700" w:type="dxa"/>
+            <w:shd w:val="clear" w:color="auto" w:fill="FFFFFF" w:themeFill="background1"/>
             <w:tcMar>
               <w:top w:w="80" w:type="dxa"/>
               <w:left w:w="120" w:type="dxa"/>
@@ -1661,6 +1812,7 @@
         <w:tc>
           <w:tcPr>
             <w:tcW w:w="5300" w:type="dxa"/>
+            <w:shd w:val="clear" w:color="auto" w:fill="FFFFFF" w:themeFill="background1"/>
             <w:tcMar>
               <w:top w:w="80" w:type="dxa"/>
               <w:left w:w="120" w:type="dxa"/>
@@ -1696,13 +1848,22 @@
           </w:p>
           <w:p>
             <w:r>
-              <w:t>Master updation, new feature implementation.</w:t>
+              <w:t xml:space="preserve">Master </w:t>
+            </w:r>
+            <w:proofErr w:type="spellStart"/>
+            <w:r>
+              <w:t>updation</w:t>
+            </w:r>
+            <w:proofErr w:type="spellEnd"/>
+            <w:r>
+              <w:t>, new feature implementation.</w:t>
             </w:r>
           </w:p>
         </w:tc>
         <w:tc>
           <w:tcPr>
             <w:tcW w:w="3000" w:type="dxa"/>
+            <w:shd w:val="clear" w:color="auto" w:fill="FFFFFF" w:themeFill="background1"/>
             <w:tcMar>
               <w:top w:w="80" w:type="dxa"/>
               <w:left w:w="120" w:type="dxa"/>
@@ -1721,7 +1882,7 @@
         <w:tc>
           <w:tcPr>
             <w:tcW w:w="700" w:type="dxa"/>
-            <w:shd w:val="clear" w:color="auto" w:fill="F2F4F7"/>
+            <w:shd w:val="clear" w:color="auto" w:fill="FFFFFF" w:themeFill="background1"/>
             <w:tcMar>
               <w:top w:w="80" w:type="dxa"/>
               <w:left w:w="120" w:type="dxa"/>
@@ -1738,7 +1899,7 @@
         <w:tc>
           <w:tcPr>
             <w:tcW w:w="5300" w:type="dxa"/>
-            <w:shd w:val="clear" w:color="auto" w:fill="F2F4F7"/>
+            <w:shd w:val="clear" w:color="auto" w:fill="FFFFFF" w:themeFill="background1"/>
             <w:tcMar>
               <w:top w:w="80" w:type="dxa"/>
               <w:left w:w="120" w:type="dxa"/>
@@ -1755,7 +1916,7 @@
         <w:tc>
           <w:tcPr>
             <w:tcW w:w="3000" w:type="dxa"/>
-            <w:shd w:val="clear" w:color="auto" w:fill="F2F4F7"/>
+            <w:shd w:val="clear" w:color="auto" w:fill="FFFFFF" w:themeFill="background1"/>
             <w:tcMar>
               <w:top w:w="80" w:type="dxa"/>
               <w:left w:w="120" w:type="dxa"/>
@@ -1795,8 +1956,260 @@
           <w:sz w:val="26"/>
           <w:szCs w:val="26"/>
         </w:rPr>
+        <w:t>Terms and Conditions</w:t>
+      </w:r>
+    </w:p>
+    <w:p>
+      <w:pPr>
+        <w:spacing w:before="160" w:after="40"/>
+      </w:pPr>
+      <w:r>
+        <w:rPr>
+          <w:b/>
+          <w:bCs/>
+          <w:color w:val="65AADB"/>
+        </w:rPr>
+        <w:t>1. Confidentiality</w:t>
+      </w:r>
+    </w:p>
+    <w:p>
+      <w:pPr>
+        <w:spacing w:after="60"/>
+      </w:pPr>
+      <w:proofErr w:type="spellStart"/>
+      <w:r>
+        <w:t>BlechTek</w:t>
+      </w:r>
+      <w:proofErr w:type="spellEnd"/>
+      <w:r>
+        <w:t xml:space="preserve"> Software Solutions LLP agrees to maintain the confidentiality of all insights gained into your organization.</w:t>
+      </w:r>
+    </w:p>
+    <w:p>
+      <w:pPr>
+        <w:spacing w:before="160" w:after="40"/>
+      </w:pPr>
+      <w:r>
+        <w:rPr>
+          <w:b/>
+          <w:bCs/>
+          <w:color w:val="65AADB"/>
+        </w:rPr>
+        <w:t>2. License</w:t>
+      </w:r>
+    </w:p>
+    <w:p>
+      <w:pPr>
+        <w:spacing w:after="60"/>
+      </w:pPr>
+      <w:r>
+        <w:t>You are responsible for holding valid licenses for any Operating System software required.</w:t>
+      </w:r>
+    </w:p>
+    <w:p>
+      <w:pPr>
+        <w:spacing w:before="160" w:after="40"/>
+      </w:pPr>
+      <w:r>
+        <w:rPr>
+          <w:b/>
+          <w:bCs/>
+          <w:color w:val="65AADB"/>
+        </w:rPr>
+        <w:t>3. Ownership of Source Code</w:t>
+      </w:r>
+    </w:p>
+    <w:p>
+      <w:pPr>
+        <w:spacing w:after="60"/>
+      </w:pPr>
+      <w:r>
+        <w:t xml:space="preserve">Source Code remains the property of </w:t>
+      </w:r>
+      <w:proofErr w:type="spellStart"/>
+      <w:r>
+        <w:t>BlechTek</w:t>
+      </w:r>
+      <w:proofErr w:type="spellEnd"/>
+      <w:r>
+        <w:t xml:space="preserve"> Software Solutions LLP. The customer shall not claim any right in or to any patent, copyright, trademark or other proprietary right of the original manufacturer, developer or licensor. The software, hardware or other goods supplied are in accordance with the export laws of the respective countries, and diversion contrary to these laws or regulations is prohibited.</w:t>
+      </w:r>
+    </w:p>
+    <w:p>
+      <w:pPr>
+        <w:spacing w:before="160" w:after="40"/>
+      </w:pPr>
+      <w:r>
+        <w:rPr>
+          <w:b/>
+          <w:bCs/>
+          <w:color w:val="65AADB"/>
+        </w:rPr>
+        <w:t>4. Warranty</w:t>
+      </w:r>
+    </w:p>
+    <w:p>
+      <w:pPr>
+        <w:spacing w:after="60"/>
+      </w:pPr>
+      <w:proofErr w:type="spellStart"/>
+      <w:r>
+        <w:t>BlechTek</w:t>
+      </w:r>
+      <w:proofErr w:type="spellEnd"/>
+      <w:r>
+        <w:t xml:space="preserve"> offers a standard warranty against development defects for 3 months from the date of installation. </w:t>
+      </w:r>
+      <w:proofErr w:type="spellStart"/>
+      <w:r>
+        <w:t>BlechTek</w:t>
+      </w:r>
+      <w:proofErr w:type="spellEnd"/>
+      <w:r>
+        <w:t xml:space="preserve"> is not responsible for data loss due to platform, cyber-security or virus issues.</w:t>
+      </w:r>
+    </w:p>
+    <w:p>
+      <w:pPr>
+        <w:spacing w:before="160" w:after="40"/>
+      </w:pPr>
+      <w:r>
+        <w:rPr>
+          <w:b/>
+          <w:bCs/>
+          <w:color w:val="65AADB"/>
+        </w:rPr>
+        <w:t>5. Installation of Software</w:t>
+      </w:r>
+    </w:p>
+    <w:p>
+      <w:pPr>
+        <w:spacing w:after="60"/>
+      </w:pPr>
+      <w:r>
+        <w:t xml:space="preserve">The software is considered installed once loaded on the server. For </w:t>
+      </w:r>
+      <w:proofErr w:type="gramStart"/>
+      <w:r>
+        <w:t>on-premise</w:t>
+      </w:r>
+      <w:proofErr w:type="gramEnd"/>
+      <w:r>
+        <w:t xml:space="preserve"> servers, installation will be carried out only after receipt of a Site Readiness report from you, a copy of which will be forwarded to you along with our Order Acceptance / Request for Installation.</w:t>
+      </w:r>
+    </w:p>
+    <w:p>
+      <w:pPr>
+        <w:spacing w:before="160" w:after="40"/>
+      </w:pPr>
+      <w:r>
+        <w:rPr>
+          <w:b/>
+          <w:bCs/>
+          <w:color w:val="65AADB"/>
+        </w:rPr>
+        <w:t>6. Excused Performance</w:t>
+      </w:r>
+    </w:p>
+    <w:p>
+      <w:pPr>
+        <w:spacing w:after="60"/>
+      </w:pPr>
+      <w:proofErr w:type="spellStart"/>
+      <w:r>
+        <w:t>BlechTek</w:t>
+      </w:r>
+      <w:proofErr w:type="spellEnd"/>
+      <w:r>
+        <w:t xml:space="preserve"> is not liable for delay or failure in performance due to strikes, riots, war, fire, acts of God, governmental regulation, or failure of hardware/network outside its control.</w:t>
+      </w:r>
+    </w:p>
+    <w:p>
+      <w:pPr>
+        <w:spacing w:before="160" w:after="40"/>
+      </w:pPr>
+      <w:r>
+        <w:rPr>
+          <w:b/>
+          <w:bCs/>
+          <w:color w:val="65AADB"/>
+        </w:rPr>
+        <w:t>7. Discontinuation of Contract</w:t>
+      </w:r>
+    </w:p>
+    <w:p>
+      <w:pPr>
+        <w:spacing w:after="60"/>
+      </w:pPr>
+      <w:r>
+        <w:t xml:space="preserve">You will be required to pay the balance amount to </w:t>
+      </w:r>
+      <w:proofErr w:type="spellStart"/>
+      <w:r>
+        <w:t>BlechTek</w:t>
+      </w:r>
+      <w:proofErr w:type="spellEnd"/>
+      <w:r>
+        <w:t xml:space="preserve"> immediately in case of the following: (</w:t>
+      </w:r>
+      <w:proofErr w:type="spellStart"/>
+      <w:r>
+        <w:t>i</w:t>
+      </w:r>
+      <w:proofErr w:type="spellEnd"/>
+      <w:r>
+        <w:t xml:space="preserve">) discontinuation of the contract for reasons that are not related to </w:t>
+      </w:r>
+      <w:proofErr w:type="spellStart"/>
+      <w:r>
+        <w:t>BlechTek</w:t>
+      </w:r>
+      <w:proofErr w:type="spellEnd"/>
+      <w:r>
+        <w:t>; or (ii) the contract is stalled by you at any stage for a period of more than 60 days.</w:t>
+      </w:r>
+    </w:p>
+    <w:p>
+      <w:pPr>
+        <w:spacing w:before="160" w:after="40"/>
+      </w:pPr>
+      <w:r>
+        <w:rPr>
+          <w:b/>
+          <w:bCs/>
+          <w:color w:val="65AADB"/>
+        </w:rPr>
+        <w:t>8. TDS</w:t>
+      </w:r>
+    </w:p>
+    <w:p>
+      <w:pPr>
+        <w:spacing w:after="60"/>
+      </w:pPr>
+      <w:r>
+        <w:t>Any TDS deducted must be supported by a certificate within 6 months or by the end of the financial year, failing which the deducted amount becomes payable.</w:t>
+      </w:r>
+    </w:p>
+    <w:p>
+      <w:pPr>
+        <w:spacing w:before="160" w:after="40"/>
+      </w:pPr>
+      <w:r>
+        <w:rPr>
+          <w:b/>
+          <w:bCs/>
+          <w:color w:val="65AADB"/>
+        </w:rPr>
         <w:lastRenderedPageBreak/>
-        <w:t>Terms and Conditions</w:t>
+        <w:t>9. Validity of the Offer</w:t>
+      </w:r>
+    </w:p>
+    <w:p>
+      <w:pPr>
+        <w:spacing w:after="60"/>
+      </w:pPr>
+      <w:r>
+        <w:t>This offer is valid up to {{VALIDATION_DATE}}.</w:t>
       </w:r>
     </w:p>
     <w:p>
@@ -1809,7 +2222,7 @@
           <w:bCs/>
           <w:color w:val="65AADB"/>
         </w:rPr>
-        <w:t>1. Confidentiality</w:t>
+        <w:t>10. Suggestions by Auditors / Consultants</w:t>
       </w:r>
     </w:p>
     <w:p>
@@ -1817,7 +2230,7 @@
         <w:spacing w:after="60"/>
       </w:pPr>
       <w:r>
-        <w:t>BlechTek Software Solutions LLP agrees to maintain the confidentiality of all insights gained into your organization.</w:t>
+        <w:t>Any changes suggested by auditors or consultants must be raised before order finalization; later changes are chargeable separately.</w:t>
       </w:r>
     </w:p>
     <w:p>
@@ -1830,7 +2243,7 @@
           <w:bCs/>
           <w:color w:val="65AADB"/>
         </w:rPr>
-        <w:t>2. License</w:t>
+        <w:t>11. Legal</w:t>
       </w:r>
     </w:p>
     <w:p>
@@ -1838,195 +2251,6 @@
         <w:spacing w:after="60"/>
       </w:pPr>
       <w:r>
-        <w:t>You are responsible for holding valid licenses for any Operating System software required.</w:t>
-      </w:r>
-    </w:p>
-    <w:p>
-      <w:pPr>
-        <w:spacing w:before="160" w:after="40"/>
-      </w:pPr>
-      <w:r>
-        <w:rPr>
-          <w:b/>
-          <w:bCs/>
-          <w:color w:val="65AADB"/>
-        </w:rPr>
-        <w:t>3. Ownership of Source Code</w:t>
-      </w:r>
-    </w:p>
-    <w:p>
-      <w:pPr>
-        <w:spacing w:after="60"/>
-      </w:pPr>
-      <w:r>
-        <w:t>Source Code remains the property of BlechTek Software Solutions LLP. The customer shall not claim any right in or to any patent, copyright, trademark or other proprietary right of the original manufacturer, developer or licensor. The software, hardware or other goods supplied are in accordance with the export laws of the respective countries, and diversion contrary to these laws or regulations is prohibited.</w:t>
-      </w:r>
-    </w:p>
-    <w:p>
-      <w:pPr>
-        <w:spacing w:before="160" w:after="40"/>
-      </w:pPr>
-      <w:r>
-        <w:rPr>
-          <w:b/>
-          <w:bCs/>
-          <w:color w:val="65AADB"/>
-        </w:rPr>
-        <w:t>4. Warranty</w:t>
-      </w:r>
-    </w:p>
-    <w:p>
-      <w:pPr>
-        <w:spacing w:after="60"/>
-      </w:pPr>
-      <w:r>
-        <w:t>BlechTek offers a standard warranty against development defects for 3 months from the date of installation. BlechTek is not responsible for data loss due to platform, cyber-security or virus issues.</w:t>
-      </w:r>
-    </w:p>
-    <w:p>
-      <w:pPr>
-        <w:spacing w:before="160" w:after="40"/>
-      </w:pPr>
-      <w:r>
-        <w:rPr>
-          <w:b/>
-          <w:bCs/>
-          <w:color w:val="65AADB"/>
-        </w:rPr>
-        <w:t>5. Installation of Software</w:t>
-      </w:r>
-    </w:p>
-    <w:p>
-      <w:pPr>
-        <w:spacing w:after="60"/>
-      </w:pPr>
-      <w:r>
-        <w:t>The software is considered installed once loaded on the server. For on-premise servers, installation will be carried out only after receipt of a Site Readiness report from you, a copy of which will be forwarded to you along with our Order Acceptance / Request for Installation.</w:t>
-      </w:r>
-    </w:p>
-    <w:p>
-      <w:pPr>
-        <w:spacing w:before="160" w:after="40"/>
-      </w:pPr>
-      <w:r>
-        <w:rPr>
-          <w:b/>
-          <w:bCs/>
-          <w:color w:val="65AADB"/>
-        </w:rPr>
-        <w:t>6. Excused Performance</w:t>
-      </w:r>
-    </w:p>
-    <w:p>
-      <w:pPr>
-        <w:spacing w:after="60"/>
-      </w:pPr>
-      <w:r>
-        <w:t>BlechTek is not liable for delay or failure in performance due to strikes, riots, war, fire, acts of God, governmental regulation, or failure of hardware/network outside its control.</w:t>
-      </w:r>
-    </w:p>
-    <w:p>
-      <w:pPr>
-        <w:spacing w:before="160" w:after="40"/>
-      </w:pPr>
-      <w:r>
-        <w:rPr>
-          <w:b/>
-          <w:bCs/>
-          <w:color w:val="65AADB"/>
-        </w:rPr>
-        <w:t>7. Discontinuation of Contract</w:t>
-      </w:r>
-    </w:p>
-    <w:p>
-      <w:pPr>
-        <w:spacing w:after="60"/>
-      </w:pPr>
-      <w:r>
-        <w:t>You will be required to pay the balance amount to BlechTek immediately in case of the following: (i) discontinuation of the contract for reasons that are not related to BlechTek; or (ii) the contract is stalled by you at any stage for a period of more than 60 days.</w:t>
-      </w:r>
-    </w:p>
-    <w:p>
-      <w:pPr>
-        <w:spacing w:before="160" w:after="40"/>
-      </w:pPr>
-      <w:r>
-        <w:rPr>
-          <w:b/>
-          <w:bCs/>
-          <w:color w:val="65AADB"/>
-        </w:rPr>
-        <w:t>8. TDS</w:t>
-      </w:r>
-    </w:p>
-    <w:p>
-      <w:pPr>
-        <w:spacing w:after="60"/>
-      </w:pPr>
-      <w:r>
-        <w:t>Any TDS deducted must be supported by a certificate within 6 months or by the end of the financial year, failing which the deducted amount becomes payable.</w:t>
-      </w:r>
-    </w:p>
-    <w:p>
-      <w:pPr>
-        <w:spacing w:before="160" w:after="40"/>
-      </w:pPr>
-      <w:r>
-        <w:rPr>
-          <w:b/>
-          <w:bCs/>
-          <w:color w:val="65AADB"/>
-        </w:rPr>
-        <w:t>9. Validity of the Offer</w:t>
-      </w:r>
-    </w:p>
-    <w:p>
-      <w:pPr>
-        <w:spacing w:after="60"/>
-      </w:pPr>
-      <w:r>
-        <w:t>This offer is valid up to {{VALIDATION_DATE}}.</w:t>
-      </w:r>
-    </w:p>
-    <w:p>
-      <w:pPr>
-        <w:spacing w:before="160" w:after="40"/>
-      </w:pPr>
-      <w:r>
-        <w:rPr>
-          <w:b/>
-          <w:bCs/>
-          <w:color w:val="65AADB"/>
-        </w:rPr>
-        <w:t>10. Suggestions by Auditors / Consultants</w:t>
-      </w:r>
-    </w:p>
-    <w:p>
-      <w:pPr>
-        <w:spacing w:after="60"/>
-      </w:pPr>
-      <w:r>
-        <w:t>Any changes suggested by auditors or consultants must be raised before order finalization; later changes are chargeable separately.</w:t>
-      </w:r>
-    </w:p>
-    <w:p>
-      <w:pPr>
-        <w:spacing w:before="160" w:after="40"/>
-      </w:pPr>
-      <w:r>
-        <w:rPr>
-          <w:b/>
-          <w:bCs/>
-          <w:color w:val="65AADB"/>
-        </w:rPr>
-        <w:t>11. Legal</w:t>
-      </w:r>
-    </w:p>
-    <w:p>
-      <w:pPr>
-        <w:spacing w:after="60"/>
-      </w:pPr>
-      <w:r>
         <w:t>Disputes arising from this order are subject to the jurisdiction of courts at Pune, Maharashtra.</w:t>
       </w:r>
     </w:p>
@@ -2040,7 +2264,6 @@
         <w:spacing w:before="300" w:after="40"/>
       </w:pPr>
       <w:r>
-        <w:lastRenderedPageBreak/>
         <w:t>We hope this document aligns with our discussions. Please feel free to reach out for any clarification. Thanking you in anticipation.</w:t>
       </w:r>
     </w:p>
@@ -2067,72 +2290,73 @@
           <w:bCs/>
           <w:color w:val="65AADB"/>
         </w:rPr>
-        <w:t>For BlechTek Software Solutions LLP</w:t>
+        <w:t xml:space="preserve">For </w:t>
+      </w:r>
+      <w:proofErr w:type="spellStart"/>
+      <w:r>
+        <w:rPr>
+          <w:b/>
+          <w:bCs/>
+          <w:color w:val="65AADB"/>
+        </w:rPr>
+        <w:t>BlechTek</w:t>
+      </w:r>
+      <w:proofErr w:type="spellEnd"/>
+      <w:r>
+        <w:rPr>
+          <w:b/>
+          <w:bCs/>
+          <w:color w:val="65AADB"/>
+        </w:rPr>
+        <w:t xml:space="preserve"> Software Solutions LLP</w:t>
       </w:r>
     </w:p>
     <w:p>
       <w:pPr>
         <w:spacing w:after="20"/>
-        <w:rPr>
-          <w:b/>
-          <w:bCs/>
-          <w:color w:val="65AADB"/>
-        </w:rPr>
-      </w:pPr>
+      </w:pPr>
+      <w:r>
+        <w:rPr>
+          <w:noProof/>
+        </w:rPr>
+        <w:drawing>
+          <wp:inline distT="0" distB="0" distL="0" distR="0" wp14:anchorId="5F628F96" wp14:editId="632B5E55">
+            <wp:extent cx="1045464" cy="1033272"/>
+            <wp:effectExtent l="0" t="0" r="0" b="0"/>
+            <wp:docPr id="97" name="Picture 97"/>
+            <wp:cNvGraphicFramePr/>
+            <a:graphic xmlns:a="http://schemas.openxmlformats.org/drawingml/2006/main">
+              <a:graphicData uri="http://schemas.openxmlformats.org/drawingml/2006/picture">
+                <pic:pic xmlns:pic="http://schemas.openxmlformats.org/drawingml/2006/picture">
+                  <pic:nvPicPr>
+                    <pic:cNvPr id="97" name="Picture 97"/>
+                    <pic:cNvPicPr/>
+                  </pic:nvPicPr>
+                  <pic:blipFill>
+                    <a:blip r:embed="rId7"/>
+                    <a:stretch>
+                      <a:fillRect/>
+                    </a:stretch>
+                  </pic:blipFill>
+                  <pic:spPr>
+                    <a:xfrm>
+                      <a:off x="0" y="0"/>
+                      <a:ext cx="1045464" cy="1033272"/>
+                    </a:xfrm>
+                    <a:prstGeom prst="rect">
+                      <a:avLst/>
+                    </a:prstGeom>
+                  </pic:spPr>
+                </pic:pic>
+              </a:graphicData>
+            </a:graphic>
+          </wp:inline>
+        </w:drawing>
+      </w:r>
     </w:p>
     <w:p>
       <w:pPr>
         <w:spacing w:after="20"/>
-        <w:rPr>
-          <w:b/>
-          <w:bCs/>
-          <w:color w:val="65AADB"/>
-        </w:rPr>
-      </w:pPr>
-    </w:p>
-    <w:p>
-      <w:pPr>
-        <w:spacing w:after="20"/>
-        <w:rPr>
-          <w:b/>
-          <w:bCs/>
-          <w:color w:val="65AADB"/>
-        </w:rPr>
-      </w:pPr>
-    </w:p>
-    <w:p>
-      <w:pPr>
-        <w:spacing w:after="20"/>
-      </w:pPr>
-    </w:p>
-    <w:p>
-      <w:pPr>
-        <w:spacing w:after="20"/>
-      </w:pPr>
-    </w:p>
-    <w:p>
-      <w:pPr>
-        <w:spacing w:after="20"/>
-      </w:pPr>
-    </w:p>
-    <w:p>
-      <w:pPr>
-        <w:spacing w:after="20"/>
-      </w:pPr>
-    </w:p>
-    <w:p>
-      <w:pPr>
-        <w:spacing w:after="20"/>
-      </w:pPr>
-    </w:p>
-    <w:p>
-      <w:pPr>
-        <w:spacing w:after="20"/>
-      </w:pPr>
-    </w:p>
-    <w:p>
-      <w:pPr>
-        <w:spacing w:before="200"/>
       </w:pPr>
       <w:r>
         <w:rPr>
@@ -2144,12 +2368,8 @@
       </w:r>
     </w:p>
     <w:sectPr>
-      <w:headerReference w:type="even" r:id="rId7"/>
       <w:headerReference w:type="default" r:id="rId8"/>
-      <w:footerReference w:type="even" r:id="rId9"/>
-      <w:footerReference w:type="default" r:id="rId10"/>
-      <w:headerReference w:type="first" r:id="rId11"/>
-      <w:footerReference w:type="first" r:id="rId12"/>
+      <w:footerReference w:type="default" r:id="rId9"/>
       <w:pgSz w:w="12240" w:h="15840"/>
       <w:pgMar w:top="1000" w:right="1100" w:bottom="1000" w:left="1100" w:header="708" w:footer="737" w:gutter="0"/>
       <w:cols w:space="720"/>
@@ -2185,16 +2405,6 @@
 </file>
 
 <file path=word/footer1.xml><?xml version="1.0" encoding="utf-8"?>
-<w:ftr xmlns:wpc="http://schemas.microsoft.com/office/word/2010/wordprocessingCanvas" xmlns:cx="http://schemas.microsoft.com/office/drawing/2014/chartex" xmlns:cx1="http://schemas.microsoft.com/office/drawing/2015/9/8/chartex" xmlns:cx2="http://schemas.microsoft.com/office/drawing/2015/10/21/chartex" xmlns:cx3="http://schemas.microsoft.com/office/drawing/2016/5/9/chartex" xmlns:cx4="http://schemas.microsoft.com/office/drawing/2016/5/10/chartex" xmlns:cx5="http://schemas.microsoft.com/office/drawing/2016/5/11/chartex" xmlns:cx6="http://schemas.microsoft.com/office/drawing/2016/5/12/chartex" xmlns:cx7="http://schemas.microsoft.com/office/drawing/2016/5/13/chartex" xmlns:cx8="http://schemas.microsoft.com/office/drawing/2016/5/14/chartex" xmlns:mc="http://schemas.openxmlformats.org/markup-compatibility/2006" xmlns:aink="http://schemas.microsoft.com/office/drawing/2016/ink" xmlns:am3d="http://schemas.microsoft.com/office/drawing/2017/model3d" xmlns:o="urn:schemas-microsoft-com:office:office" xmlns:oel="http://schemas.microsoft.com/office/2019/extlst" xmlns:r="http://schemas.openxmlformats.org/officeDocument/2006/relationships" xmlns:m="http://schemas.openxmlformats.org/officeDocument/2006/math" xmlns:v="urn:schemas-microsoft-com:vml" xmlns:wp14="http://schemas.microsoft.com/office/word/2010/wordprocessingDrawing" xmlns:wp="http://schemas.openxmlformats.org/drawingml/2006/wordprocessingDrawing" xmlns:w10="urn:schemas-microsoft-com:office:word" xmlns:w="http://schemas.openxmlformats.org/wordprocessingml/2006/main" xmlns:w14="http://schemas.microsoft.com/office/word/2010/wordml" xmlns:w15="http://schemas.microsoft.com/office/word/2012/wordml" xmlns:w16cex="http://schemas.microsoft.com/office/word/2018/wordml/cex" xmlns:w16cid="http://schemas.microsoft.com/office/word/2016/wordml/cid" xmlns:w16="http://schemas.microsoft.com/office/word/2018/wordml" xmlns:w16du="http://schemas.microsoft.com/office/word/2023/wordml/word16du" xmlns:w16sdtdh="http://schemas.microsoft.com/office/word/2020/wordml/sdtdatahash" xmlns:w16sdtfl="http://schemas.microsoft.com/office/word/2024/wordml/sdtformatlock" xmlns:w16se="http://schemas.microsoft.com/office/word/2015/wordml/symex" xmlns:wpg="http://schemas.microsoft.com/office/word/2010/wordprocessingGroup" xmlns:wpi="http://schemas.microsoft.com/office/word/2010/wordprocessingInk" xmlns:wne="http://schemas.microsoft.com/office/word/2006/wordml" xmlns:wps="http://schemas.microsoft.com/office/word/2010/wordprocessingShape" mc:Ignorable="w14 w15 w16se w16cid w16 w16cex w16sdtdh w16sdtfl w16du wp14">
-  <w:p>
-    <w:pPr>
-      <w:pStyle w:val="Footer"/>
-    </w:pPr>
-  </w:p>
-</w:ftr>
-</file>
-
-<file path=word/footer2.xml><?xml version="1.0" encoding="utf-8"?>
 <w:ftr xmlns:wpc="http://schemas.microsoft.com/office/word/2010/wordprocessingCanvas" xmlns:cx="http://schemas.microsoft.com/office/drawing/2014/chartex" xmlns:cx1="http://schemas.microsoft.com/office/drawing/2015/9/8/chartex" xmlns:cx2="http://schemas.microsoft.com/office/drawing/2015/10/21/chartex" xmlns:cx3="http://schemas.microsoft.com/office/drawing/2016/5/9/chartex" xmlns:cx4="http://schemas.microsoft.com/office/drawing/2016/5/10/chartex" xmlns:cx5="http://schemas.microsoft.com/office/drawing/2016/5/11/chartex" xmlns:cx6="http://schemas.microsoft.com/office/drawing/2016/5/12/chartex" xmlns:cx7="http://schemas.microsoft.com/office/drawing/2016/5/13/chartex" xmlns:cx8="http://schemas.microsoft.com/office/drawing/2016/5/14/chartex" xmlns:mc="http://schemas.openxmlformats.org/markup-compatibility/2006" xmlns:aink="http://schemas.microsoft.com/office/drawing/2016/ink" xmlns:am3d="http://schemas.microsoft.com/office/drawing/2017/model3d" xmlns:o="urn:schemas-microsoft-com:office:office" xmlns:oel="http://schemas.microsoft.com/office/2019/extlst" xmlns:r="http://schemas.openxmlformats.org/officeDocument/2006/relationships" xmlns:m="http://schemas.openxmlformats.org/officeDocument/2006/math" xmlns:v="urn:schemas-microsoft-com:vml" xmlns:wp14="http://schemas.microsoft.com/office/word/2010/wordprocessingDrawing" xmlns:wp="http://schemas.openxmlformats.org/drawingml/2006/wordprocessingDrawing" xmlns:w10="urn:schemas-microsoft-com:office:word" xmlns:w="http://schemas.openxmlformats.org/wordprocessingml/2006/main" xmlns:w14="http://schemas.microsoft.com/office/word/2010/wordml" xmlns:w15="http://schemas.microsoft.com/office/word/2012/wordml" xmlns:w16cex="http://schemas.microsoft.com/office/word/2018/wordml/cex" xmlns:w16cid="http://schemas.microsoft.com/office/word/2016/wordml/cid" xmlns:w16="http://schemas.microsoft.com/office/word/2018/wordml" xmlns:w16du="http://schemas.microsoft.com/office/word/2023/wordml/word16du" xmlns:w16sdtdh="http://schemas.microsoft.com/office/word/2020/wordml/sdtdatahash" xmlns:w16sdtfl="http://schemas.microsoft.com/office/word/2024/wordml/sdtformatlock" xmlns:w16se="http://schemas.microsoft.com/office/word/2015/wordml/symex" xmlns:wpg="http://schemas.microsoft.com/office/word/2010/wordprocessingGroup" xmlns:wpi="http://schemas.microsoft.com/office/word/2010/wordprocessingInk" xmlns:wne="http://schemas.microsoft.com/office/word/2006/wordml" xmlns:wps="http://schemas.microsoft.com/office/word/2010/wordprocessingShape" mc:Ignorable="w14 w15 w16se w16cid w16 w16cex w16sdtdh w16sdtfl w16du wp14">
   <w:p>
     <w:pPr>
@@ -2246,13 +2456,23 @@
     <w:pPr>
       <w:jc w:val="center"/>
     </w:pPr>
+    <w:proofErr w:type="spellStart"/>
     <w:r>
       <w:rPr>
         <w:color w:val="5B6478"/>
         <w:sz w:val="16"/>
         <w:szCs w:val="16"/>
       </w:rPr>
-      <w:t>BlechTek Software Solutions LLP</w:t>
+      <w:t>BlechTek</w:t>
+    </w:r>
+    <w:proofErr w:type="spellEnd"/>
+    <w:r>
+      <w:rPr>
+        <w:color w:val="5B6478"/>
+        <w:sz w:val="16"/>
+        <w:szCs w:val="16"/>
+      </w:rPr>
+      <w:t xml:space="preserve"> Software Solutions LLP</w:t>
     </w:r>
   </w:p>
   <w:p>
@@ -2265,7 +2485,79 @@
         <w:sz w:val="14"/>
         <w:szCs w:val="14"/>
       </w:rPr>
-      <w:t>Address: S.NO. 257/2/2A/4 ABC Business Center, S Floor, Opp. WindMill Village Road, WindMill Village, Bavdhan, Pune 411021, Maharashtra</w:t>
+      <w:t xml:space="preserve">Address: S.NO. 257/2/2A/4 ABC Business </w:t>
+    </w:r>
+    <w:proofErr w:type="spellStart"/>
+    <w:r>
+      <w:rPr>
+        <w:color w:val="5B6478"/>
+        <w:sz w:val="14"/>
+        <w:szCs w:val="14"/>
+      </w:rPr>
+      <w:t>Center</w:t>
+    </w:r>
+    <w:proofErr w:type="spellEnd"/>
+    <w:r>
+      <w:rPr>
+        <w:color w:val="5B6478"/>
+        <w:sz w:val="14"/>
+        <w:szCs w:val="14"/>
+      </w:rPr>
+      <w:t xml:space="preserve">, S Floor, Opp. </w:t>
+    </w:r>
+    <w:proofErr w:type="spellStart"/>
+    <w:r>
+      <w:rPr>
+        <w:color w:val="5B6478"/>
+        <w:sz w:val="14"/>
+        <w:szCs w:val="14"/>
+      </w:rPr>
+      <w:t>WindMill</w:t>
+    </w:r>
+    <w:proofErr w:type="spellEnd"/>
+    <w:r>
+      <w:rPr>
+        <w:color w:val="5B6478"/>
+        <w:sz w:val="14"/>
+        <w:szCs w:val="14"/>
+      </w:rPr>
+      <w:t xml:space="preserve"> Village Road, </w:t>
+    </w:r>
+    <w:proofErr w:type="spellStart"/>
+    <w:r>
+      <w:rPr>
+        <w:color w:val="5B6478"/>
+        <w:sz w:val="14"/>
+        <w:szCs w:val="14"/>
+      </w:rPr>
+      <w:t>WindMill</w:t>
+    </w:r>
+    <w:proofErr w:type="spellEnd"/>
+    <w:r>
+      <w:rPr>
+        <w:color w:val="5B6478"/>
+        <w:sz w:val="14"/>
+        <w:szCs w:val="14"/>
+      </w:rPr>
+      <w:t xml:space="preserve"> Village, </w:t>
+    </w:r>
+    <w:proofErr w:type="spellStart"/>
+    <w:r>
+      <w:rPr>
+        <w:color w:val="5B6478"/>
+        <w:sz w:val="14"/>
+        <w:szCs w:val="14"/>
+      </w:rPr>
+      <w:t>Bavdhan</w:t>
+    </w:r>
+    <w:proofErr w:type="spellEnd"/>
+    <w:r>
+      <w:rPr>
+        <w:color w:val="5B6478"/>
+        <w:sz w:val="14"/>
+        <w:szCs w:val="14"/>
+      </w:rPr>
+      <w:t>, Pune 411021, Maharashtra</w:t>
     </w:r>
   </w:p>
   <w:p>
@@ -2284,16 +2576,6 @@
 </w:ftr>
 </file>
 
-<file path=word/footer3.xml><?xml version="1.0" encoding="utf-8"?>
-<w:ftr xmlns:wpc="http://schemas.microsoft.com/office/word/2010/wordprocessingCanvas" xmlns:cx="http://schemas.microsoft.com/office/drawing/2014/chartex" xmlns:cx1="http://schemas.microsoft.com/office/drawing/2015/9/8/chartex" xmlns:cx2="http://schemas.microsoft.com/office/drawing/2015/10/21/chartex" xmlns:cx3="http://schemas.microsoft.com/office/drawing/2016/5/9/chartex" xmlns:cx4="http://schemas.microsoft.com/office/drawing/2016/5/10/chartex" xmlns:cx5="http://schemas.microsoft.com/office/drawing/2016/5/11/chartex" xmlns:cx6="http://schemas.microsoft.com/office/drawing/2016/5/12/chartex" xmlns:cx7="http://schemas.microsoft.com/office/drawing/2016/5/13/chartex" xmlns:cx8="http://schemas.microsoft.com/office/drawing/2016/5/14/chartex" xmlns:mc="http://schemas.openxmlformats.org/markup-compatibility/2006" xmlns:aink="http://schemas.microsoft.com/office/drawing/2016/ink" xmlns:am3d="http://schemas.microsoft.com/office/drawing/2017/model3d" xmlns:o="urn:schemas-microsoft-com:office:office" xmlns:oel="http://schemas.microsoft.com/office/2019/extlst" xmlns:r="http://schemas.openxmlformats.org/officeDocument/2006/relationships" xmlns:m="http://schemas.openxmlformats.org/officeDocument/2006/math" xmlns:v="urn:schemas-microsoft-com:vml" xmlns:wp14="http://schemas.microsoft.com/office/word/2010/wordprocessingDrawing" xmlns:wp="http://schemas.openxmlformats.org/drawingml/2006/wordprocessingDrawing" xmlns:w10="urn:schemas-microsoft-com:office:word" xmlns:w="http://schemas.openxmlformats.org/wordprocessingml/2006/main" xmlns:w14="http://schemas.microsoft.com/office/word/2010/wordml" xmlns:w15="http://schemas.microsoft.com/office/word/2012/wordml" xmlns:w16cex="http://schemas.microsoft.com/office/word/2018/wordml/cex" xmlns:w16cid="http://schemas.microsoft.com/office/word/2016/wordml/cid" xmlns:w16="http://schemas.microsoft.com/office/word/2018/wordml" xmlns:w16du="http://schemas.microsoft.com/office/word/2023/wordml/word16du" xmlns:w16sdtdh="http://schemas.microsoft.com/office/word/2020/wordml/sdtdatahash" xmlns:w16sdtfl="http://schemas.microsoft.com/office/word/2024/wordml/sdtformatlock" xmlns:w16se="http://schemas.microsoft.com/office/word/2015/wordml/symex" xmlns:wpg="http://schemas.microsoft.com/office/word/2010/wordprocessingGroup" xmlns:wpi="http://schemas.microsoft.com/office/word/2010/wordprocessingInk" xmlns:wne="http://schemas.microsoft.com/office/word/2006/wordml" xmlns:wps="http://schemas.microsoft.com/office/word/2010/wordprocessingShape" mc:Ignorable="w14 w15 w16se w16cid w16 w16cex w16sdtdh w16sdtfl w16du wp14">
-  <w:p>
-    <w:pPr>
-      <w:pStyle w:val="Footer"/>
-    </w:pPr>
-  </w:p>
-</w:ftr>
-</file>
-
 <file path=word/footnotes.xml><?xml version="1.0" encoding="utf-8"?>
 <w:footnotes xmlns:wpc="http://schemas.microsoft.com/office/word/2010/wordprocessingCanvas" xmlns:cx="http://schemas.microsoft.com/office/drawing/2014/chartex" xmlns:cx1="http://schemas.microsoft.com/office/drawing/2015/9/8/chartex" xmlns:cx2="http://schemas.microsoft.com/office/drawing/2015/10/21/chartex" xmlns:cx3="http://schemas.microsoft.com/office/drawing/2016/5/9/chartex" xmlns:cx4="http://schemas.microsoft.com/office/drawing/2016/5/10/chartex" xmlns:cx5="http://schemas.microsoft.com/office/drawing/2016/5/11/chartex" xmlns:cx6="http://schemas.microsoft.com/office/drawing/2016/5/12/chartex" xmlns:cx7="http://schemas.microsoft.com/office/drawing/2016/5/13/chartex" xmlns:cx8="http://schemas.microsoft.com/office/drawing/2016/5/14/chartex" xmlns:mc="http://schemas.openxmlformats.org/markup-compatibility/2006" xmlns:aink="http://schemas.microsoft.com/office/drawing/2016/ink" xmlns:am3d="http://schemas.microsoft.com/office/drawing/2017/model3d" xmlns:o="urn:schemas-microsoft-com:office:office" xmlns:oel="http://schemas.microsoft.com/office/2019/extlst" xmlns:r="http://schemas.openxmlformats.org/officeDocument/2006/relationships" xmlns:m="http://schemas.openxmlformats.org/officeDocument/2006/math" xmlns:v="urn:schemas-microsoft-com:vml" xmlns:wp14="http://schemas.microsoft.com/office/word/2010/wordprocessingDrawing" xmlns:wp="http://schemas.openxmlformats.org/drawingml/2006/wordprocessingDrawing" xmlns:w10="urn:schemas-microsoft-com:office:word" xmlns:w="http://schemas.openxmlformats.org/wordprocessingml/2006/main" xmlns:w14="http://schemas.microsoft.com/office/word/2010/wordml" xmlns:w15="http://schemas.microsoft.com/office/word/2012/wordml" xmlns:w16cex="http://schemas.microsoft.com/office/word/2018/wordml/cex" xmlns:w16cid="http://schemas.microsoft.com/office/word/2016/wordml/cid" xmlns:w16="http://schemas.microsoft.com/office/word/2018/wordml" xmlns:w16du="http://schemas.microsoft.com/office/word/2023/wordml/word16du" xmlns:w16sdtdh="http://schemas.microsoft.com/office/word/2020/wordml/sdtdatahash" xmlns:w16sdtfl="http://schemas.microsoft.com/office/word/2024/wordml/sdtformatlock" xmlns:w16se="http://schemas.microsoft.com/office/word/2015/wordml/symex" xmlns:wpg="http://schemas.microsoft.com/office/word/2010/wordprocessingGroup" xmlns:wpi="http://schemas.microsoft.com/office/word/2010/wordprocessingInk" xmlns:wne="http://schemas.microsoft.com/office/word/2006/wordml" xmlns:wps="http://schemas.microsoft.com/office/word/2010/wordprocessingShape" mc:Ignorable="w14 w15 w16se w16cid w16 w16cex w16sdtdh w16sdtfl w16du wp14">
   <w:footnote w:type="separator" w:id="-1">
@@ -2320,16 +2602,6 @@
 </file>
 
 <file path=word/header1.xml><?xml version="1.0" encoding="utf-8"?>
-<w:hdr xmlns:wpc="http://schemas.microsoft.com/office/word/2010/wordprocessingCanvas" xmlns:cx="http://schemas.microsoft.com/office/drawing/2014/chartex" xmlns:cx1="http://schemas.microsoft.com/office/drawing/2015/9/8/chartex" xmlns:cx2="http://schemas.microsoft.com/office/drawing/2015/10/21/chartex" xmlns:cx3="http://schemas.microsoft.com/office/drawing/2016/5/9/chartex" xmlns:cx4="http://schemas.microsoft.com/office/drawing/2016/5/10/chartex" xmlns:cx5="http://schemas.microsoft.com/office/drawing/2016/5/11/chartex" xmlns:cx6="http://schemas.microsoft.com/office/drawing/2016/5/12/chartex" xmlns:cx7="http://schemas.microsoft.com/office/drawing/2016/5/13/chartex" xmlns:cx8="http://schemas.microsoft.com/office/drawing/2016/5/14/chartex" xmlns:mc="http://schemas.openxmlformats.org/markup-compatibility/2006" xmlns:aink="http://schemas.microsoft.com/office/drawing/2016/ink" xmlns:am3d="http://schemas.microsoft.com/office/drawing/2017/model3d" xmlns:o="urn:schemas-microsoft-com:office:office" xmlns:oel="http://schemas.microsoft.com/office/2019/extlst" xmlns:r="http://schemas.openxmlformats.org/officeDocument/2006/relationships" xmlns:m="http://schemas.openxmlformats.org/officeDocument/2006/math" xmlns:v="urn:schemas-microsoft-com:vml" xmlns:wp14="http://schemas.microsoft.com/office/word/2010/wordprocessingDrawing" xmlns:wp="http://schemas.openxmlformats.org/drawingml/2006/wordprocessingDrawing" xmlns:w10="urn:schemas-microsoft-com:office:word" xmlns:w="http://schemas.openxmlformats.org/wordprocessingml/2006/main" xmlns:w14="http://schemas.microsoft.com/office/word/2010/wordml" xmlns:w15="http://schemas.microsoft.com/office/word/2012/wordml" xmlns:w16cex="http://schemas.microsoft.com/office/word/2018/wordml/cex" xmlns:w16cid="http://schemas.microsoft.com/office/word/2016/wordml/cid" xmlns:w16="http://schemas.microsoft.com/office/word/2018/wordml" xmlns:w16du="http://schemas.microsoft.com/office/word/2023/wordml/word16du" xmlns:w16sdtdh="http://schemas.microsoft.com/office/word/2020/wordml/sdtdatahash" xmlns:w16sdtfl="http://schemas.microsoft.com/office/word/2024/wordml/sdtformatlock" xmlns:w16se="http://schemas.microsoft.com/office/word/2015/wordml/symex" xmlns:wpg="http://schemas.microsoft.com/office/word/2010/wordprocessingGroup" xmlns:wpi="http://schemas.microsoft.com/office/word/2010/wordprocessingInk" xmlns:wne="http://schemas.microsoft.com/office/word/2006/wordml" xmlns:wps="http://schemas.microsoft.com/office/word/2010/wordprocessingShape" mc:Ignorable="w14 w15 w16se w16cid w16 w16cex w16sdtdh w16sdtfl w16du wp14">
-  <w:p>
-    <w:pPr>
-      <w:pStyle w:val="Header"/>
-    </w:pPr>
-  </w:p>
-</w:hdr>
-</file>
-
-<file path=word/header2.xml><?xml version="1.0" encoding="utf-8"?>
 <w:hdr xmlns:wpc="http://schemas.microsoft.com/office/word/2010/wordprocessingCanvas" xmlns:cx="http://schemas.microsoft.com/office/drawing/2014/chartex" xmlns:cx1="http://schemas.microsoft.com/office/drawing/2015/9/8/chartex" xmlns:cx2="http://schemas.microsoft.com/office/drawing/2015/10/21/chartex" xmlns:cx3="http://schemas.microsoft.com/office/drawing/2016/5/9/chartex" xmlns:cx4="http://schemas.microsoft.com/office/drawing/2016/5/10/chartex" xmlns:cx5="http://schemas.microsoft.com/office/drawing/2016/5/11/chartex" xmlns:cx6="http://schemas.microsoft.com/office/drawing/2016/5/12/chartex" xmlns:cx7="http://schemas.microsoft.com/office/drawing/2016/5/13/chartex" xmlns:cx8="http://schemas.microsoft.com/office/drawing/2016/5/14/chartex" xmlns:mc="http://schemas.openxmlformats.org/markup-compatibility/2006" xmlns:aink="http://schemas.microsoft.com/office/drawing/2016/ink" xmlns:am3d="http://schemas.microsoft.com/office/drawing/2017/model3d" xmlns:o="urn:schemas-microsoft-com:office:office" xmlns:oel="http://schemas.microsoft.com/office/2019/extlst" xmlns:r="http://schemas.openxmlformats.org/officeDocument/2006/relationships" xmlns:m="http://schemas.openxmlformats.org/officeDocument/2006/math" xmlns:v="urn:schemas-microsoft-com:vml" xmlns:wp14="http://schemas.microsoft.com/office/word/2010/wordprocessingDrawing" xmlns:wp="http://schemas.openxmlformats.org/drawingml/2006/wordprocessingDrawing" xmlns:w10="urn:schemas-microsoft-com:office:word" xmlns:w="http://schemas.openxmlformats.org/wordprocessingml/2006/main" xmlns:w14="http://schemas.microsoft.com/office/word/2010/wordml" xmlns:w15="http://schemas.microsoft.com/office/word/2012/wordml" xmlns:w16cex="http://schemas.microsoft.com/office/word/2018/wordml/cex" xmlns:w16cid="http://schemas.microsoft.com/office/word/2016/wordml/cid" xmlns:w16="http://schemas.microsoft.com/office/word/2018/wordml" xmlns:w16du="http://schemas.microsoft.com/office/word/2023/wordml/word16du" xmlns:w16sdtdh="http://schemas.microsoft.com/office/word/2020/wordml/sdtdatahash" xmlns:w16sdtfl="http://schemas.microsoft.com/office/word/2024/wordml/sdtformatlock" xmlns:w16se="http://schemas.microsoft.com/office/word/2015/wordml/symex" xmlns:wpg="http://schemas.microsoft.com/office/word/2010/wordprocessingGroup" xmlns:wpi="http://schemas.microsoft.com/office/word/2010/wordprocessingInk" xmlns:wne="http://schemas.microsoft.com/office/word/2006/wordml" xmlns:wps="http://schemas.microsoft.com/office/word/2010/wordprocessingShape" mc:Ignorable="w14 w15 w16se w16cid w16 w16cex w16sdtdh w16sdtfl w16du wp14">
   <w:p>
     <w:pPr>
@@ -2342,13 +2614,49 @@
     </w:pPr>
     <w:r>
       <w:rPr>
-        <w:b/>
-        <w:bCs/>
-        <w:color w:val="65AADB"/>
-        <w:sz w:val="24"/>
-        <w:szCs w:val="24"/>
+        <w:noProof/>
       </w:rPr>
-      <w:t>BlechTek Software Solutions LLP</w:t>
+      <w:drawing>
+        <wp:anchor distT="0" distB="0" distL="114300" distR="114300" simplePos="0" relativeHeight="251659264" behindDoc="0" locked="0" layoutInCell="1" allowOverlap="0" wp14:anchorId="72C9EF95" wp14:editId="652DBCE7">
+          <wp:simplePos x="0" y="0"/>
+          <wp:positionH relativeFrom="margin">
+            <wp:align>left</wp:align>
+          </wp:positionH>
+          <wp:positionV relativeFrom="page">
+            <wp:posOffset>384589</wp:posOffset>
+          </wp:positionV>
+          <wp:extent cx="1475232" cy="438912"/>
+          <wp:effectExtent l="0" t="0" r="0" b="0"/>
+          <wp:wrapSquare wrapText="bothSides"/>
+          <wp:docPr id="1637576006" name="Picture 1637576006"/>
+          <wp:cNvGraphicFramePr/>
+          <a:graphic xmlns:a="http://schemas.openxmlformats.org/drawingml/2006/main">
+            <a:graphicData uri="http://schemas.openxmlformats.org/drawingml/2006/picture">
+              <pic:pic xmlns:pic="http://schemas.openxmlformats.org/drawingml/2006/picture">
+                <pic:nvPicPr>
+                  <pic:cNvPr id="11" name="Picture 11"/>
+                  <pic:cNvPicPr/>
+                </pic:nvPicPr>
+                <pic:blipFill>
+                  <a:blip r:embed="rId1"/>
+                  <a:stretch>
+                    <a:fillRect/>
+                  </a:stretch>
+                </pic:blipFill>
+                <pic:spPr>
+                  <a:xfrm>
+                    <a:off x="0" y="0"/>
+                    <a:ext cx="1475232" cy="438912"/>
+                  </a:xfrm>
+                  <a:prstGeom prst="rect">
+                    <a:avLst/>
+                  </a:prstGeom>
+                </pic:spPr>
+              </pic:pic>
+            </a:graphicData>
+          </a:graphic>
+        </wp:anchor>
+      </w:drawing>
     </w:r>
     <w:r>
       <w:rPr>
@@ -2360,24 +2668,13 @@
     </w:r>
     <w:r>
       <w:rPr>
-        <w:b/>
-        <w:bCs/>
-        <w:color w:val="65AADB"/>
-        <w:sz w:val="28"/>
-        <w:szCs w:val="28"/>
+        <w:rFonts w:ascii="Times New Roman" w:hAnsi="Times New Roman" w:cs="Times New Roman"/>
+        <w:color w:val="000000" w:themeColor="text1"/>
+        <w:sz w:val="36"/>
+        <w:szCs w:val="36"/>
       </w:rPr>
       <w:t>QUOTATION</w:t>
     </w:r>
-  </w:p>
-</w:hdr>
-</file>
-
-<file path=word/header3.xml><?xml version="1.0" encoding="utf-8"?>
-<w:hdr xmlns:wpc="http://schemas.microsoft.com/office/word/2010/wordprocessingCanvas" xmlns:cx="http://schemas.microsoft.com/office/drawing/2014/chartex" xmlns:cx1="http://schemas.microsoft.com/office/drawing/2015/9/8/chartex" xmlns:cx2="http://schemas.microsoft.com/office/drawing/2015/10/21/chartex" xmlns:cx3="http://schemas.microsoft.com/office/drawing/2016/5/9/chartex" xmlns:cx4="http://schemas.microsoft.com/office/drawing/2016/5/10/chartex" xmlns:cx5="http://schemas.microsoft.com/office/drawing/2016/5/11/chartex" xmlns:cx6="http://schemas.microsoft.com/office/drawing/2016/5/12/chartex" xmlns:cx7="http://schemas.microsoft.com/office/drawing/2016/5/13/chartex" xmlns:cx8="http://schemas.microsoft.com/office/drawing/2016/5/14/chartex" xmlns:mc="http://schemas.openxmlformats.org/markup-compatibility/2006" xmlns:aink="http://schemas.microsoft.com/office/drawing/2016/ink" xmlns:am3d="http://schemas.microsoft.com/office/drawing/2017/model3d" xmlns:o="urn:schemas-microsoft-com:office:office" xmlns:oel="http://schemas.microsoft.com/office/2019/extlst" xmlns:r="http://schemas.openxmlformats.org/officeDocument/2006/relationships" xmlns:m="http://schemas.openxmlformats.org/officeDocument/2006/math" xmlns:v="urn:schemas-microsoft-com:vml" xmlns:wp14="http://schemas.microsoft.com/office/word/2010/wordprocessingDrawing" xmlns:wp="http://schemas.openxmlformats.org/drawingml/2006/wordprocessingDrawing" xmlns:w10="urn:schemas-microsoft-com:office:word" xmlns:w="http://schemas.openxmlformats.org/wordprocessingml/2006/main" xmlns:w14="http://schemas.microsoft.com/office/word/2010/wordml" xmlns:w15="http://schemas.microsoft.com/office/word/2012/wordml" xmlns:w16cex="http://schemas.microsoft.com/office/word/2018/wordml/cex" xmlns:w16cid="http://schemas.microsoft.com/office/word/2016/wordml/cid" xmlns:w16="http://schemas.microsoft.com/office/word/2018/wordml" xmlns:w16du="http://schemas.microsoft.com/office/word/2023/wordml/word16du" xmlns:w16sdtdh="http://schemas.microsoft.com/office/word/2020/wordml/sdtdatahash" xmlns:w16sdtfl="http://schemas.microsoft.com/office/word/2024/wordml/sdtformatlock" xmlns:w16se="http://schemas.microsoft.com/office/word/2015/wordml/symex" xmlns:wpg="http://schemas.microsoft.com/office/word/2010/wordprocessingGroup" xmlns:wpi="http://schemas.microsoft.com/office/word/2010/wordprocessingInk" xmlns:wne="http://schemas.microsoft.com/office/word/2006/wordml" xmlns:wps="http://schemas.microsoft.com/office/word/2010/wordprocessingShape" mc:Ignorable="w14 w15 w16se w16cid w16 w16cex w16sdtdh w16sdtfl w16du wp14">
-  <w:p>
-    <w:pPr>
-      <w:pStyle w:val="Header"/>
-    </w:pPr>
   </w:p>
 </w:hdr>
 </file>

</xml_diff>

<commit_message>
updates about pdfconverterservice.cs page for using the whole word template
</commit_message>
<xml_diff>
--- a/QuotationApp.API/Templates/QuotationTemplate_Updated.docx
+++ b/QuotationApp.API/Templates/QuotationTemplate_Updated.docx
@@ -6,6 +6,7 @@
       <w:pPr>
         <w:spacing w:after="120"/>
         <w:rPr>
+          <w:rFonts w:ascii="Times New Roman" w:hAnsi="Times New Roman" w:cs="Times New Roman"/>
           <w:b/>
           <w:bCs/>
           <w:color w:val="65AADB"/>
@@ -16,426 +17,577 @@
       <w:pPr>
         <w:spacing w:after="120"/>
         <w:rPr>
+          <w:rFonts w:ascii="Times New Roman" w:hAnsi="Times New Roman" w:cs="Times New Roman"/>
+          <w:color w:val="000000" w:themeColor="text1"/>
+          <w:sz w:val="22"/>
+          <w:szCs w:val="22"/>
+        </w:rPr>
+      </w:pPr>
+      <w:r>
+        <w:rPr>
+          <w:rFonts w:ascii="Times New Roman" w:hAnsi="Times New Roman" w:cs="Times New Roman"/>
+          <w:color w:val="000000" w:themeColor="text1"/>
+          <w:sz w:val="22"/>
+          <w:szCs w:val="22"/>
+        </w:rPr>
+        <w:t>QUOTATION TO</w:t>
+      </w:r>
+      <w:r>
+        <w:rPr>
+          <w:rFonts w:ascii="Times New Roman" w:hAnsi="Times New Roman" w:cs="Times New Roman"/>
+          <w:color w:val="000000" w:themeColor="text1"/>
+          <w:sz w:val="22"/>
+          <w:szCs w:val="22"/>
+        </w:rPr>
+        <w:t xml:space="preserve"> - {{</w:t>
+      </w:r>
+      <w:proofErr w:type="spellStart"/>
+      <w:r>
+        <w:rPr>
+          <w:rFonts w:ascii="Times New Roman" w:hAnsi="Times New Roman" w:cs="Times New Roman"/>
+          <w:color w:val="000000" w:themeColor="text1"/>
+          <w:sz w:val="22"/>
+          <w:szCs w:val="22"/>
+        </w:rPr>
+        <w:t>OrganizationName</w:t>
+      </w:r>
+      <w:proofErr w:type="spellEnd"/>
+      <w:r>
+        <w:rPr>
+          <w:rFonts w:ascii="Times New Roman" w:hAnsi="Times New Roman" w:cs="Times New Roman"/>
+          <w:color w:val="000000" w:themeColor="text1"/>
+          <w:sz w:val="22"/>
+          <w:szCs w:val="22"/>
+        </w:rPr>
+        <w:t>}}</w:t>
+      </w:r>
+    </w:p>
+    <w:p>
+      <w:pPr>
+        <w:rPr>
+          <w:rFonts w:ascii="Times New Roman" w:hAnsi="Times New Roman" w:cs="Times New Roman"/>
+          <w:color w:val="000000" w:themeColor="text1"/>
+          <w:sz w:val="18"/>
+          <w:szCs w:val="18"/>
+        </w:rPr>
+      </w:pPr>
+      <w:r>
+        <w:rPr>
+          <w:rFonts w:ascii="Times New Roman" w:hAnsi="Times New Roman" w:cs="Times New Roman"/>
+          <w:color w:val="000000" w:themeColor="text1"/>
+          <w:sz w:val="18"/>
+          <w:szCs w:val="18"/>
+        </w:rPr>
+        <w:t>Name: {{CONTACT_NAME}}</w:t>
+      </w:r>
+      <w:r>
+        <w:rPr>
+          <w:rFonts w:ascii="Times New Roman" w:hAnsi="Times New Roman" w:cs="Times New Roman"/>
+          <w:color w:val="000000" w:themeColor="text1"/>
+          <w:sz w:val="18"/>
+          <w:szCs w:val="18"/>
+        </w:rPr>
+        <w:tab/>
+      </w:r>
+      <w:r>
+        <w:rPr>
+          <w:rFonts w:ascii="Times New Roman" w:hAnsi="Times New Roman" w:cs="Times New Roman"/>
+          <w:color w:val="000000" w:themeColor="text1"/>
+          <w:sz w:val="18"/>
+          <w:szCs w:val="18"/>
+        </w:rPr>
+        <w:tab/>
+      </w:r>
+      <w:r>
+        <w:rPr>
+          <w:rFonts w:ascii="Times New Roman" w:hAnsi="Times New Roman" w:cs="Times New Roman"/>
+          <w:color w:val="000000" w:themeColor="text1"/>
+          <w:sz w:val="18"/>
+          <w:szCs w:val="18"/>
+        </w:rPr>
+        <w:tab/>
+      </w:r>
+      <w:r>
+        <w:rPr>
+          <w:rFonts w:ascii="Times New Roman" w:hAnsi="Times New Roman" w:cs="Times New Roman"/>
+          <w:color w:val="000000" w:themeColor="text1"/>
+          <w:sz w:val="18"/>
+          <w:szCs w:val="18"/>
+        </w:rPr>
+        <w:tab/>
+      </w:r>
+      <w:r>
+        <w:rPr>
+          <w:rFonts w:ascii="Times New Roman" w:hAnsi="Times New Roman" w:cs="Times New Roman"/>
+          <w:color w:val="000000" w:themeColor="text1"/>
+          <w:sz w:val="18"/>
+          <w:szCs w:val="18"/>
+        </w:rPr>
+        <w:tab/>
+      </w:r>
+      <w:r>
+        <w:rPr>
+          <w:rFonts w:ascii="Times New Roman" w:hAnsi="Times New Roman" w:cs="Times New Roman"/>
+          <w:color w:val="000000" w:themeColor="text1"/>
+          <w:sz w:val="18"/>
+          <w:szCs w:val="18"/>
+        </w:rPr>
+        <w:tab/>
+      </w:r>
+      <w:r>
+        <w:rPr>
+          <w:rFonts w:ascii="Times New Roman" w:hAnsi="Times New Roman" w:cs="Times New Roman"/>
+          <w:color w:val="000000" w:themeColor="text1"/>
+          <w:sz w:val="18"/>
+          <w:szCs w:val="18"/>
+        </w:rPr>
+        <w:tab/>
+      </w:r>
+      <w:r>
+        <w:rPr>
+          <w:rFonts w:ascii="Times New Roman" w:hAnsi="Times New Roman" w:cs="Times New Roman"/>
+          <w:color w:val="000000" w:themeColor="text1"/>
+          <w:sz w:val="18"/>
+          <w:szCs w:val="18"/>
+          <w:lang w:val="en-US"/>
+        </w:rPr>
+        <w:t>Quotation No:</w:t>
+      </w:r>
+      <w:r>
+        <w:rPr>
+          <w:rFonts w:ascii="Times New Roman" w:hAnsi="Times New Roman" w:cs="Times New Roman"/>
+          <w:color w:val="000000" w:themeColor="text1"/>
+          <w:sz w:val="18"/>
+          <w:szCs w:val="18"/>
+          <w:lang w:val="en-US"/>
+        </w:rPr>
+        <w:t xml:space="preserve"> </w:t>
+      </w:r>
+      <w:r>
+        <w:rPr>
+          <w:rFonts w:ascii="Times New Roman" w:hAnsi="Times New Roman" w:cs="Times New Roman"/>
+          <w:color w:val="000000" w:themeColor="text1"/>
+          <w:sz w:val="18"/>
+          <w:szCs w:val="18"/>
+        </w:rPr>
+        <w:t>{{</w:t>
+      </w:r>
+      <w:proofErr w:type="spellStart"/>
+      <w:r>
+        <w:rPr>
+          <w:rFonts w:ascii="Times New Roman" w:hAnsi="Times New Roman" w:cs="Times New Roman"/>
+          <w:color w:val="000000" w:themeColor="text1"/>
+          <w:sz w:val="18"/>
+          <w:szCs w:val="18"/>
+        </w:rPr>
+        <w:t>QuotationNo</w:t>
+      </w:r>
+      <w:proofErr w:type="spellEnd"/>
+      <w:r>
+        <w:rPr>
+          <w:rFonts w:ascii="Times New Roman" w:hAnsi="Times New Roman" w:cs="Times New Roman"/>
+          <w:color w:val="000000" w:themeColor="text1"/>
+          <w:sz w:val="18"/>
+          <w:szCs w:val="18"/>
+        </w:rPr>
+        <w:t>}}</w:t>
+      </w:r>
+    </w:p>
+    <w:p>
+      <w:pPr>
+        <w:rPr>
+          <w:rFonts w:ascii="Times New Roman" w:hAnsi="Times New Roman" w:cs="Times New Roman"/>
+          <w:color w:val="000000" w:themeColor="text1"/>
+          <w:sz w:val="18"/>
+          <w:szCs w:val="18"/>
+        </w:rPr>
+      </w:pPr>
+      <w:r>
+        <w:rPr>
+          <w:rFonts w:ascii="Times New Roman" w:hAnsi="Times New Roman" w:cs="Times New Roman"/>
+          <w:color w:val="000000" w:themeColor="text1"/>
+          <w:sz w:val="18"/>
+          <w:szCs w:val="18"/>
+          <w:lang w:val="en-US"/>
+        </w:rPr>
+        <w:t xml:space="preserve">  </w:t>
+      </w:r>
+      <w:r>
+        <w:rPr>
+          <w:rFonts w:ascii="Times New Roman" w:hAnsi="Times New Roman" w:cs="Times New Roman"/>
+          <w:color w:val="000000" w:themeColor="text1"/>
+          <w:sz w:val="18"/>
+          <w:szCs w:val="18"/>
+          <w:lang w:val="en-US"/>
+        </w:rPr>
+        <w:tab/>
+      </w:r>
+      <w:r>
+        <w:rPr>
+          <w:rFonts w:ascii="Times New Roman" w:hAnsi="Times New Roman" w:cs="Times New Roman"/>
+          <w:color w:val="000000" w:themeColor="text1"/>
+          <w:sz w:val="18"/>
+          <w:szCs w:val="18"/>
+          <w:lang w:val="en-US"/>
+        </w:rPr>
+        <w:tab/>
+      </w:r>
+      <w:r>
+        <w:rPr>
+          <w:rFonts w:ascii="Times New Roman" w:hAnsi="Times New Roman" w:cs="Times New Roman"/>
+          <w:color w:val="000000" w:themeColor="text1"/>
+          <w:sz w:val="18"/>
+          <w:szCs w:val="18"/>
+          <w:lang w:val="en-US"/>
+        </w:rPr>
+        <w:tab/>
+      </w:r>
+      <w:r>
+        <w:rPr>
+          <w:rFonts w:ascii="Times New Roman" w:hAnsi="Times New Roman" w:cs="Times New Roman"/>
+          <w:color w:val="000000" w:themeColor="text1"/>
+          <w:sz w:val="18"/>
+          <w:szCs w:val="18"/>
+          <w:lang w:val="en-US"/>
+        </w:rPr>
+        <w:tab/>
+      </w:r>
+      <w:r>
+        <w:rPr>
+          <w:rFonts w:ascii="Times New Roman" w:hAnsi="Times New Roman" w:cs="Times New Roman"/>
+          <w:color w:val="000000" w:themeColor="text1"/>
+          <w:sz w:val="18"/>
+          <w:szCs w:val="18"/>
+          <w:lang w:val="en-US"/>
+        </w:rPr>
+        <w:tab/>
+      </w:r>
+      <w:r>
+        <w:rPr>
+          <w:rFonts w:ascii="Times New Roman" w:hAnsi="Times New Roman" w:cs="Times New Roman"/>
+          <w:color w:val="000000" w:themeColor="text1"/>
+          <w:sz w:val="18"/>
+          <w:szCs w:val="18"/>
+          <w:lang w:val="en-US"/>
+        </w:rPr>
+        <w:tab/>
+      </w:r>
+      <w:r>
+        <w:rPr>
+          <w:rFonts w:ascii="Times New Roman" w:hAnsi="Times New Roman" w:cs="Times New Roman"/>
+          <w:color w:val="000000" w:themeColor="text1"/>
+          <w:sz w:val="18"/>
+          <w:szCs w:val="18"/>
+          <w:lang w:val="en-US"/>
+        </w:rPr>
+        <w:tab/>
+      </w:r>
+      <w:r>
+        <w:rPr>
+          <w:rFonts w:ascii="Times New Roman" w:hAnsi="Times New Roman" w:cs="Times New Roman"/>
+          <w:color w:val="000000" w:themeColor="text1"/>
+          <w:sz w:val="18"/>
+          <w:szCs w:val="18"/>
+          <w:lang w:val="en-US"/>
+        </w:rPr>
+        <w:tab/>
+      </w:r>
+      <w:r>
+        <w:rPr>
+          <w:rFonts w:ascii="Times New Roman" w:hAnsi="Times New Roman" w:cs="Times New Roman"/>
+          <w:color w:val="000000" w:themeColor="text1"/>
+          <w:sz w:val="18"/>
+          <w:szCs w:val="18"/>
+          <w:lang w:val="en-US"/>
+        </w:rPr>
+        <w:tab/>
+      </w:r>
+      <w:r>
+        <w:rPr>
+          <w:rFonts w:ascii="Times New Roman" w:hAnsi="Times New Roman" w:cs="Times New Roman"/>
+          <w:color w:val="000000" w:themeColor="text1"/>
+          <w:sz w:val="18"/>
+          <w:szCs w:val="18"/>
+          <w:lang w:val="en-US"/>
+        </w:rPr>
+        <w:tab/>
+      </w:r>
+      <w:proofErr w:type="gramStart"/>
+      <w:r>
+        <w:rPr>
+          <w:rFonts w:ascii="Times New Roman" w:hAnsi="Times New Roman" w:cs="Times New Roman"/>
+          <w:color w:val="000000" w:themeColor="text1"/>
+          <w:sz w:val="18"/>
+          <w:szCs w:val="18"/>
+          <w:lang w:val="en-US"/>
+        </w:rPr>
+        <w:t xml:space="preserve">Date: </w:t>
+      </w:r>
+      <w:r>
+        <w:rPr>
+          <w:rFonts w:ascii="Times New Roman" w:hAnsi="Times New Roman" w:cs="Times New Roman"/>
+          <w:color w:val="000000" w:themeColor="text1"/>
+          <w:sz w:val="18"/>
+          <w:szCs w:val="18"/>
+        </w:rPr>
+        <w:t>{{</w:t>
+      </w:r>
+      <w:proofErr w:type="gramEnd"/>
+      <w:r>
+        <w:rPr>
+          <w:rFonts w:ascii="Times New Roman" w:hAnsi="Times New Roman" w:cs="Times New Roman"/>
+          <w:color w:val="000000" w:themeColor="text1"/>
+          <w:sz w:val="18"/>
+          <w:szCs w:val="18"/>
+        </w:rPr>
+        <w:t>Date}}</w:t>
+      </w:r>
+    </w:p>
+    <w:p>
+      <w:pPr>
+        <w:spacing w:after="120"/>
+        <w:rPr>
+          <w:rFonts w:ascii="Times New Roman" w:hAnsi="Times New Roman" w:cs="Times New Roman"/>
+          <w:color w:val="000000" w:themeColor="text1"/>
+          <w:sz w:val="18"/>
+          <w:szCs w:val="18"/>
+        </w:rPr>
+      </w:pPr>
+      <w:r>
+        <w:rPr>
+          <w:rFonts w:ascii="Times New Roman" w:hAnsi="Times New Roman" w:cs="Times New Roman"/>
+          <w:color w:val="000000" w:themeColor="text1"/>
+          <w:sz w:val="18"/>
+          <w:szCs w:val="18"/>
+        </w:rPr>
+        <w:t>Address: {{CONTACT_ADDRESS}}</w:t>
+      </w:r>
+    </w:p>
+    <w:p>
+      <w:pPr>
+        <w:spacing w:after="200"/>
+        <w:rPr>
+          <w:rFonts w:ascii="Times New Roman" w:hAnsi="Times New Roman" w:cs="Times New Roman"/>
+          <w:color w:val="000000" w:themeColor="text1"/>
+          <w:sz w:val="18"/>
+          <w:szCs w:val="18"/>
+        </w:rPr>
+      </w:pPr>
+      <w:r>
+        <w:rPr>
+          <w:rFonts w:ascii="Times New Roman" w:hAnsi="Times New Roman" w:cs="Times New Roman"/>
+          <w:color w:val="000000" w:themeColor="text1"/>
+          <w:sz w:val="18"/>
+          <w:szCs w:val="18"/>
+        </w:rPr>
+        <w:t>Contact No.: {{CONTACT_PHONE</w:t>
+      </w:r>
+      <w:proofErr w:type="gramStart"/>
+      <w:r>
+        <w:rPr>
+          <w:rFonts w:ascii="Times New Roman" w:hAnsi="Times New Roman" w:cs="Times New Roman"/>
+          <w:color w:val="000000" w:themeColor="text1"/>
+          <w:sz w:val="18"/>
+          <w:szCs w:val="18"/>
+        </w:rPr>
+        <w:t xml:space="preserve">}}   </w:t>
+      </w:r>
+      <w:proofErr w:type="gramEnd"/>
+      <w:r>
+        <w:rPr>
+          <w:rFonts w:ascii="Times New Roman" w:hAnsi="Times New Roman" w:cs="Times New Roman"/>
+          <w:color w:val="000000" w:themeColor="text1"/>
+          <w:sz w:val="18"/>
+          <w:szCs w:val="18"/>
+        </w:rPr>
+        <w:t>|   Email: {{CONTACT_EMAIL}}</w:t>
+      </w:r>
+    </w:p>
+    <w:p>
+      <w:pPr>
+        <w:spacing w:after="80"/>
+        <w:rPr>
+          <w:rFonts w:ascii="Times New Roman" w:hAnsi="Times New Roman" w:cs="Times New Roman"/>
+          <w:color w:val="000000" w:themeColor="text1"/>
+        </w:rPr>
+      </w:pPr>
+      <w:r>
+        <w:rPr>
+          <w:rFonts w:ascii="Times New Roman" w:hAnsi="Times New Roman" w:cs="Times New Roman"/>
+          <w:color w:val="000000" w:themeColor="text1"/>
+        </w:rPr>
+        <w:t>Reference:</w:t>
+      </w:r>
+      <w:r>
+        <w:rPr>
+          <w:rFonts w:ascii="Times New Roman" w:hAnsi="Times New Roman" w:cs="Times New Roman"/>
           <w:b/>
           <w:bCs/>
-          <w:color w:val="65AADB"/>
-        </w:rPr>
-      </w:pPr>
-      <w:r>
-        <w:rPr>
+          <w:color w:val="000000" w:themeColor="text1"/>
+        </w:rPr>
+        <w:t xml:space="preserve"> </w:t>
+      </w:r>
+      <w:r>
+        <w:rPr>
+          <w:rFonts w:ascii="Times New Roman" w:hAnsi="Times New Roman" w:cs="Times New Roman"/>
+          <w:color w:val="000000" w:themeColor="text1"/>
+        </w:rPr>
+        <w:t xml:space="preserve">Our discussions on implementation of </w:t>
+      </w:r>
+      <w:r>
+        <w:rPr>
+          <w:rFonts w:ascii="Times New Roman" w:hAnsi="Times New Roman" w:cs="Times New Roman"/>
           <w:b/>
           <w:bCs/>
-          <w:color w:val="65AADB"/>
-        </w:rPr>
-        <w:t>QUOTATION TO</w:t>
-      </w:r>
-      <w:r>
-        <w:rPr>
+          <w:color w:val="000000" w:themeColor="text1"/>
+        </w:rPr>
+        <w:t>{{MODULE_LIST}}</w:t>
+      </w:r>
+      <w:r>
+        <w:rPr>
+          <w:rFonts w:ascii="Times New Roman" w:hAnsi="Times New Roman" w:cs="Times New Roman"/>
+          <w:color w:val="000000" w:themeColor="text1"/>
+        </w:rPr>
+        <w:t xml:space="preserve"> in your organization.</w:t>
+      </w:r>
+    </w:p>
+    <w:p>
+      <w:pPr>
+        <w:spacing w:after="200"/>
+        <w:rPr>
+          <w:rFonts w:ascii="Times New Roman" w:hAnsi="Times New Roman" w:cs="Times New Roman"/>
+          <w:color w:val="000000" w:themeColor="text1"/>
+        </w:rPr>
+      </w:pPr>
+      <w:r>
+        <w:rPr>
+          <w:rFonts w:ascii="Times New Roman" w:hAnsi="Times New Roman" w:cs="Times New Roman"/>
+          <w:color w:val="000000" w:themeColor="text1"/>
+        </w:rPr>
+        <w:t>Subject:</w:t>
+      </w:r>
+      <w:r>
+        <w:rPr>
+          <w:rFonts w:ascii="Times New Roman" w:hAnsi="Times New Roman" w:cs="Times New Roman"/>
           <w:b/>
           <w:bCs/>
-          <w:color w:val="65AADB"/>
-        </w:rPr>
-        <w:t xml:space="preserve"> - </w:t>
-      </w:r>
-      <w:r>
-        <w:rPr>
+          <w:color w:val="000000" w:themeColor="text1"/>
+        </w:rPr>
+        <w:t xml:space="preserve"> </w:t>
+      </w:r>
+      <w:r>
+        <w:rPr>
+          <w:rFonts w:ascii="Times New Roman" w:hAnsi="Times New Roman" w:cs="Times New Roman"/>
+          <w:color w:val="000000" w:themeColor="text1"/>
+        </w:rPr>
+        <w:t xml:space="preserve">Business proposal for IT &amp; Operations changeover consultancy and implementation of </w:t>
+      </w:r>
+      <w:r>
+        <w:rPr>
+          <w:rFonts w:ascii="Times New Roman" w:hAnsi="Times New Roman" w:cs="Times New Roman"/>
           <w:b/>
           <w:bCs/>
-          <w:color w:val="65AADB"/>
-        </w:rPr>
-        <w:t>{{</w:t>
-      </w:r>
-      <w:proofErr w:type="spellStart"/>
-      <w:r>
-        <w:rPr>
+          <w:color w:val="000000" w:themeColor="text1"/>
+        </w:rPr>
+        <w:t>{{MODULE_LIST}}</w:t>
+      </w:r>
+      <w:r>
+        <w:rPr>
+          <w:rFonts w:ascii="Times New Roman" w:hAnsi="Times New Roman" w:cs="Times New Roman"/>
+          <w:color w:val="000000" w:themeColor="text1"/>
+        </w:rPr>
+        <w:t>.</w:t>
+      </w:r>
+    </w:p>
+    <w:p>
+      <w:pPr>
+        <w:spacing w:after="160"/>
+        <w:rPr>
+          <w:rFonts w:ascii="Times New Roman" w:hAnsi="Times New Roman" w:cs="Times New Roman"/>
+          <w:color w:val="000000" w:themeColor="text1"/>
+        </w:rPr>
+      </w:pPr>
+      <w:r>
+        <w:rPr>
+          <w:rFonts w:ascii="Times New Roman" w:hAnsi="Times New Roman" w:cs="Times New Roman"/>
+          <w:color w:val="000000" w:themeColor="text1"/>
+        </w:rPr>
+        <w:t>Dear Sir,</w:t>
+      </w:r>
+    </w:p>
+    <w:p>
+      <w:pPr>
+        <w:spacing w:after="160"/>
+        <w:rPr>
+          <w:rFonts w:ascii="Times New Roman" w:hAnsi="Times New Roman" w:cs="Times New Roman"/>
+          <w:color w:val="000000" w:themeColor="text1"/>
+        </w:rPr>
+      </w:pPr>
+      <w:r>
+        <w:rPr>
+          <w:rFonts w:ascii="Times New Roman" w:hAnsi="Times New Roman" w:cs="Times New Roman"/>
+          <w:color w:val="000000" w:themeColor="text1"/>
+        </w:rPr>
+        <w:t>This is in reference to our discussions during our visit to your office. We thank you and your team for your valuable time during the presentation of CQUAL.</w:t>
+      </w:r>
+    </w:p>
+    <w:p>
+      <w:pPr>
+        <w:spacing w:after="200"/>
+        <w:rPr>
+          <w:rFonts w:ascii="Times New Roman" w:hAnsi="Times New Roman" w:cs="Times New Roman"/>
+        </w:rPr>
+      </w:pPr>
+      <w:r>
+        <w:rPr>
+          <w:rFonts w:ascii="Times New Roman" w:hAnsi="Times New Roman" w:cs="Times New Roman"/>
+          <w:color w:val="000000" w:themeColor="text1"/>
+          <w:lang w:val="en-US"/>
+        </w:rPr>
+        <w:t>We discussed the current challenges and solutions CQUAL can provide</w:t>
+      </w:r>
+      <w:proofErr w:type="gramStart"/>
+      <w:r>
+        <w:rPr>
+          <w:rFonts w:ascii="Times New Roman" w:hAnsi="Times New Roman" w:cs="Times New Roman"/>
+          <w:color w:val="000000" w:themeColor="text1"/>
+          <w:lang w:val="en-US"/>
+        </w:rPr>
+        <w:t>, based</w:t>
+      </w:r>
+      <w:proofErr w:type="gramEnd"/>
+      <w:r>
+        <w:rPr>
+          <w:rFonts w:ascii="Times New Roman" w:hAnsi="Times New Roman" w:cs="Times New Roman"/>
+          <w:color w:val="000000" w:themeColor="text1"/>
+          <w:lang w:val="en-US"/>
+        </w:rPr>
+        <w:t xml:space="preserve"> on our brief discussions, please find attached a Preliminary Business Proposal for the required changeover at </w:t>
+      </w:r>
+      <w:r>
+        <w:rPr>
+          <w:rFonts w:ascii="Times New Roman" w:hAnsi="Times New Roman" w:cs="Times New Roman"/>
           <w:b/>
           <w:bCs/>
-          <w:color w:val="65AADB"/>
-        </w:rPr>
-        <w:t>OrganizationName</w:t>
-      </w:r>
-      <w:proofErr w:type="spellEnd"/>
-      <w:r>
-        <w:rPr>
+          <w:color w:val="000000" w:themeColor="text1"/>
+        </w:rPr>
+        <w:t>{{ORG_</w:t>
+      </w:r>
+      <w:proofErr w:type="gramStart"/>
+      <w:r>
+        <w:rPr>
+          <w:rFonts w:ascii="Times New Roman" w:hAnsi="Times New Roman" w:cs="Times New Roman"/>
           <w:b/>
           <w:bCs/>
-          <w:color w:val="65AADB"/>
-        </w:rPr>
-        <w:t>}}</w:t>
-      </w:r>
-    </w:p>
-    <w:p>
-      <w:pPr>
-        <w:rPr>
-          <w:b/>
-        </w:rPr>
-      </w:pPr>
-      <w:r>
-        <w:rPr>
-          <w:b/>
-          <w:bCs/>
-          <w:color w:val="65AADB"/>
-        </w:rPr>
-        <w:t>Name: {{CONTACT_NAME}}</w:t>
-      </w:r>
-      <w:r>
-        <w:rPr>
-          <w:b/>
-          <w:bCs/>
-          <w:color w:val="65AADB"/>
-        </w:rPr>
-        <w:tab/>
-      </w:r>
-      <w:r>
-        <w:rPr>
-          <w:b/>
-          <w:bCs/>
-          <w:color w:val="65AADB"/>
-        </w:rPr>
-        <w:tab/>
-      </w:r>
-      <w:r>
-        <w:rPr>
-          <w:b/>
-          <w:bCs/>
-          <w:color w:val="65AADB"/>
-        </w:rPr>
-        <w:tab/>
-      </w:r>
-      <w:r>
-        <w:rPr>
-          <w:b/>
-          <w:bCs/>
-          <w:color w:val="65AADB"/>
-        </w:rPr>
-        <w:tab/>
-      </w:r>
-      <w:r>
-        <w:rPr>
-          <w:b/>
-          <w:bCs/>
-          <w:color w:val="65AADB"/>
-        </w:rPr>
-        <w:tab/>
-      </w:r>
-      <w:r>
-        <w:rPr>
-          <w:b/>
-          <w:bCs/>
-          <w:color w:val="65AADB"/>
-        </w:rPr>
-        <w:tab/>
-      </w:r>
-      <w:r>
-        <w:rPr>
-          <w:b/>
-          <w:bCs/>
-          <w:color w:val="65AADB"/>
-        </w:rPr>
-        <w:tab/>
-      </w:r>
-      <w:r>
-        <w:rPr>
-          <w:b/>
-          <w:lang w:val="en-US"/>
-        </w:rPr>
-        <w:t>Quotation No:</w:t>
-      </w:r>
-      <w:r>
-        <w:rPr>
-          <w:b/>
-          <w:lang w:val="en-US"/>
-        </w:rPr>
-        <w:t xml:space="preserve"> </w:t>
-      </w:r>
-      <w:r>
-        <w:rPr>
-          <w:b/>
-        </w:rPr>
-        <w:t>{{</w:t>
-      </w:r>
-      <w:proofErr w:type="spellStart"/>
-      <w:r>
-        <w:rPr>
-          <w:b/>
-        </w:rPr>
-        <w:t>QuotationNo</w:t>
-      </w:r>
-      <w:proofErr w:type="spellEnd"/>
-      <w:r>
-        <w:rPr>
-          <w:b/>
-        </w:rPr>
-        <w:t>}}</w:t>
-      </w:r>
-    </w:p>
-    <w:p>
-      <w:pPr>
-        <w:rPr>
-          <w:sz w:val="18"/>
-        </w:rPr>
-      </w:pPr>
-      <w:r>
-        <w:rPr>
-          <w:b/>
-          <w:lang w:val="en-US"/>
-        </w:rPr>
-        <w:t xml:space="preserve">  </w:t>
-      </w:r>
-      <w:r>
-        <w:rPr>
-          <w:b/>
-          <w:lang w:val="en-US"/>
-        </w:rPr>
-        <w:tab/>
-      </w:r>
-      <w:r>
-        <w:rPr>
-          <w:b/>
-          <w:lang w:val="en-US"/>
-        </w:rPr>
-        <w:tab/>
-      </w:r>
-      <w:r>
-        <w:rPr>
-          <w:b/>
-          <w:lang w:val="en-US"/>
-        </w:rPr>
-        <w:tab/>
-      </w:r>
-      <w:r>
-        <w:rPr>
-          <w:b/>
-          <w:lang w:val="en-US"/>
-        </w:rPr>
-        <w:tab/>
-      </w:r>
-      <w:r>
-        <w:rPr>
-          <w:b/>
-          <w:lang w:val="en-US"/>
-        </w:rPr>
-        <w:tab/>
-      </w:r>
-      <w:r>
-        <w:rPr>
-          <w:b/>
-          <w:lang w:val="en-US"/>
-        </w:rPr>
-        <w:tab/>
-      </w:r>
-      <w:r>
-        <w:rPr>
-          <w:b/>
-          <w:lang w:val="en-US"/>
-        </w:rPr>
-        <w:tab/>
-      </w:r>
-      <w:r>
-        <w:rPr>
-          <w:b/>
-          <w:lang w:val="en-US"/>
-        </w:rPr>
-        <w:tab/>
-      </w:r>
-      <w:r>
-        <w:rPr>
-          <w:b/>
-          <w:lang w:val="en-US"/>
-        </w:rPr>
-        <w:tab/>
-      </w:r>
-      <w:r>
-        <w:rPr>
-          <w:b/>
-          <w:lang w:val="en-US"/>
-        </w:rPr>
-        <w:tab/>
-      </w:r>
-      <w:proofErr w:type="gramStart"/>
-      <w:r>
-        <w:rPr>
-          <w:b/>
-          <w:lang w:val="en-US"/>
-        </w:rPr>
-        <w:t>Date:</w:t>
-      </w:r>
-      <w:r>
-        <w:rPr>
-          <w:lang w:val="en-US"/>
-        </w:rPr>
-        <w:t xml:space="preserve"> </w:t>
-      </w:r>
-      <w:r>
-        <w:t>{{</w:t>
-      </w:r>
-      <w:proofErr w:type="gramEnd"/>
-      <w:r>
-        <w:t>Date}}</w:t>
-      </w:r>
-    </w:p>
-    <w:p>
-      <w:pPr>
-        <w:spacing w:after="120"/>
-      </w:pPr>
-      <w:r>
-        <w:rPr>
-          <w:b/>
-          <w:bCs/>
-          <w:color w:val="65AADB"/>
-        </w:rPr>
-        <w:t>Address: {{CONTACT_ADDRESS}}</w:t>
-      </w:r>
-    </w:p>
-    <w:p>
-      <w:pPr>
-        <w:spacing w:after="200"/>
-      </w:pPr>
-      <w:r>
-        <w:rPr>
-          <w:b/>
-          <w:bCs/>
-          <w:color w:val="65AADB"/>
-        </w:rPr>
-        <w:t>Contact No.: {{CONTACT_PHONE</w:t>
-      </w:r>
-      <w:proofErr w:type="gramStart"/>
-      <w:r>
-        <w:rPr>
-          <w:b/>
-          <w:bCs/>
-          <w:color w:val="65AADB"/>
-        </w:rPr>
-        <w:t>}}</w:t>
-      </w:r>
-      <w:r>
-        <w:t xml:space="preserve">   </w:t>
-      </w:r>
-      <w:proofErr w:type="gramEnd"/>
-      <w:r>
-        <w:t xml:space="preserve">|   </w:t>
-      </w:r>
-      <w:r>
-        <w:rPr>
-          <w:b/>
-          <w:bCs/>
-          <w:color w:val="65AADB"/>
-        </w:rPr>
-        <w:t>Email: {{CONTACT_EMAIL}}</w:t>
-      </w:r>
-    </w:p>
-    <w:p>
-      <w:pPr>
-        <w:spacing w:after="80"/>
-      </w:pPr>
-      <w:r>
-        <w:rPr>
-          <w:b/>
-          <w:bCs/>
-          <w:color w:val="65AADB"/>
-        </w:rPr>
-        <w:t xml:space="preserve">Reference: </w:t>
-      </w:r>
-      <w:r>
-        <w:t xml:space="preserve">Our discussions on implementation of </w:t>
-      </w:r>
-      <w:r>
-        <w:rPr>
-          <w:b/>
-          <w:bCs/>
-          <w:color w:val="65AADB"/>
-        </w:rPr>
-        <w:t>{{MODULE_LIST}}</w:t>
-      </w:r>
-      <w:r>
-        <w:t xml:space="preserve"> in your organization.</w:t>
-      </w:r>
-    </w:p>
-    <w:p>
-      <w:pPr>
-        <w:spacing w:after="200"/>
-      </w:pPr>
-      <w:r>
-        <w:rPr>
-          <w:b/>
-          <w:bCs/>
-          <w:color w:val="65AADB"/>
-        </w:rPr>
-        <w:t xml:space="preserve">Subject: </w:t>
-      </w:r>
-      <w:r>
-        <w:t xml:space="preserve">Business proposal for IT &amp; Operations changeover consultancy and implementation of </w:t>
-      </w:r>
-      <w:r>
-        <w:rPr>
-          <w:b/>
-          <w:bCs/>
-          <w:color w:val="65AADB"/>
-        </w:rPr>
-        <w:t>{{MODULE_LIST}}</w:t>
-      </w:r>
-      <w:r>
-        <w:t>.</w:t>
-      </w:r>
-    </w:p>
-    <w:p>
-      <w:pPr>
-        <w:spacing w:after="160"/>
-      </w:pPr>
-      <w:r>
-        <w:t>Dear Sir / Madam,</w:t>
-      </w:r>
-    </w:p>
-    <w:p>
-      <w:pPr>
-        <w:spacing w:after="160"/>
-      </w:pPr>
-      <w:r>
-        <w:t>This is in reference to our discussions during our visit to your office. We thank you and your team for your valuable time during the presentation of CQUAL.</w:t>
-      </w:r>
-    </w:p>
-    <w:p>
-      <w:pPr>
-        <w:spacing w:after="200"/>
-      </w:pPr>
-      <w:r>
-        <w:rPr>
-          <w:lang w:val="en-US"/>
-        </w:rPr>
-        <w:t>We discussed the current challenges and solutions CQUAL can provide</w:t>
-      </w:r>
-      <w:proofErr w:type="gramStart"/>
-      <w:r>
-        <w:rPr>
-          <w:lang w:val="en-US"/>
-        </w:rPr>
-        <w:t>, based</w:t>
-      </w:r>
-      <w:proofErr w:type="gramEnd"/>
-      <w:r>
-        <w:rPr>
-          <w:lang w:val="en-US"/>
-        </w:rPr>
-        <w:t xml:space="preserve"> on our brief discussions, please find attached a Preliminary Business Proposal for the required changeover at </w:t>
-      </w:r>
-      <w:r>
-        <w:rPr>
-          <w:b/>
-          <w:bCs/>
-          <w:color w:val="65AADB"/>
-        </w:rPr>
-        <w:t>{{ORG_</w:t>
-      </w:r>
-      <w:proofErr w:type="gramStart"/>
-      <w:r>
-        <w:rPr>
-          <w:b/>
-          <w:bCs/>
-          <w:color w:val="65AADB"/>
+          <w:color w:val="000000" w:themeColor="text1"/>
         </w:rPr>
         <w:t>NAME}}</w:t>
       </w:r>
       <w:r>
+        <w:rPr>
+          <w:rFonts w:ascii="Times New Roman" w:hAnsi="Times New Roman" w:cs="Times New Roman"/>
+          <w:color w:val="000000" w:themeColor="text1"/>
+        </w:rPr>
         <w:t>.</w:t>
       </w:r>
       <w:proofErr w:type="gramEnd"/>
@@ -446,15 +598,17 @@
           <w:bottom w:val="single" w:sz="6" w:space="4" w:color="65AADB"/>
         </w:pBdr>
         <w:spacing w:before="300" w:after="150"/>
-      </w:pPr>
-      <w:r>
-        <w:rPr>
+        <w:rPr>
+          <w:rFonts w:ascii="Times New Roman" w:hAnsi="Times New Roman" w:cs="Times New Roman"/>
+        </w:rPr>
+      </w:pPr>
+      <w:r>
+        <w:rPr>
+          <w:rFonts w:ascii="Times New Roman" w:hAnsi="Times New Roman" w:cs="Times New Roman"/>
           <w:b/>
           <w:bCs/>
           <w:caps/>
           <w:color w:val="65AADB"/>
-          <w:sz w:val="26"/>
-          <w:szCs w:val="26"/>
         </w:rPr>
         <w:t>Goals and Expectations</w:t>
       </w:r>
@@ -462,12 +616,19 @@
     <w:p>
       <w:pPr>
         <w:spacing w:after="120"/>
-      </w:pPr>
-      <w:r>
+        <w:rPr>
+          <w:rFonts w:ascii="Times New Roman" w:hAnsi="Times New Roman" w:cs="Times New Roman"/>
+        </w:rPr>
+      </w:pPr>
+      <w:r>
+        <w:rPr>
+          <w:rFonts w:ascii="Times New Roman" w:hAnsi="Times New Roman" w:cs="Times New Roman"/>
+        </w:rPr>
         <w:t xml:space="preserve">Our experts will be involved in redefining the operations setup for sustainable growth and required digitalization at </w:t>
       </w:r>
       <w:r>
         <w:rPr>
+          <w:rFonts w:ascii="Times New Roman" w:hAnsi="Times New Roman" w:cs="Times New Roman"/>
           <w:b/>
           <w:bCs/>
           <w:color w:val="65AADB"/>
@@ -475,18 +636,28 @@
         <w:t>{{ORG_NAME}}</w:t>
       </w:r>
       <w:r>
+        <w:rPr>
+          <w:rFonts w:ascii="Times New Roman" w:hAnsi="Times New Roman" w:cs="Times New Roman"/>
+        </w:rPr>
         <w:t>.</w:t>
       </w:r>
     </w:p>
     <w:p>
       <w:pPr>
         <w:spacing w:after="100"/>
-      </w:pPr>
-      <w:r>
+        <w:rPr>
+          <w:rFonts w:ascii="Times New Roman" w:hAnsi="Times New Roman" w:cs="Times New Roman"/>
+        </w:rPr>
+      </w:pPr>
+      <w:r>
+        <w:rPr>
+          <w:rFonts w:ascii="Times New Roman" w:hAnsi="Times New Roman" w:cs="Times New Roman"/>
+        </w:rPr>
         <w:t xml:space="preserve">Digitization of </w:t>
       </w:r>
       <w:r>
         <w:rPr>
+          <w:rFonts w:ascii="Times New Roman" w:hAnsi="Times New Roman" w:cs="Times New Roman"/>
           <w:b/>
           <w:bCs/>
           <w:color w:val="65AADB"/>
@@ -494,6 +665,9 @@
         <w:t>{{MODULE_LIST}}</w:t>
       </w:r>
       <w:r>
+        <w:rPr>
+          <w:rFonts w:ascii="Times New Roman" w:hAnsi="Times New Roman" w:cs="Times New Roman"/>
+        </w:rPr>
         <w:t xml:space="preserve"> replaces manual documentation, significantly accelerates approval process with centralized data management and improved traceability, reduced and lower administrative interfaces.</w:t>
       </w:r>
     </w:p>
@@ -503,15 +677,17 @@
           <w:bottom w:val="single" w:sz="6" w:space="4" w:color="65AADB"/>
         </w:pBdr>
         <w:spacing w:before="300" w:after="150"/>
-      </w:pPr>
-      <w:r>
-        <w:rPr>
+        <w:rPr>
+          <w:rFonts w:ascii="Times New Roman" w:hAnsi="Times New Roman" w:cs="Times New Roman"/>
+        </w:rPr>
+      </w:pPr>
+      <w:r>
+        <w:rPr>
+          <w:rFonts w:ascii="Times New Roman" w:hAnsi="Times New Roman" w:cs="Times New Roman"/>
           <w:b/>
           <w:bCs/>
           <w:caps/>
           <w:color w:val="65AADB"/>
-          <w:sz w:val="26"/>
-          <w:szCs w:val="26"/>
         </w:rPr>
         <w:t>Scope of Work</w:t>
       </w:r>
@@ -524,8 +700,14 @@
           <w:numId w:val="1"/>
         </w:numPr>
         <w:spacing w:after="80"/>
-      </w:pPr>
-      <w:r>
+        <w:rPr>
+          <w:rFonts w:ascii="Times New Roman" w:hAnsi="Times New Roman" w:cs="Times New Roman"/>
+        </w:rPr>
+      </w:pPr>
+      <w:r>
+        <w:rPr>
+          <w:rFonts w:ascii="Times New Roman" w:hAnsi="Times New Roman" w:cs="Times New Roman"/>
+        </w:rPr>
         <w:t>Confirmation of your requirement specifications</w:t>
       </w:r>
     </w:p>
@@ -537,8 +719,14 @@
           <w:numId w:val="1"/>
         </w:numPr>
         <w:spacing w:after="80"/>
-      </w:pPr>
-      <w:r>
+        <w:rPr>
+          <w:rFonts w:ascii="Times New Roman" w:hAnsi="Times New Roman" w:cs="Times New Roman"/>
+        </w:rPr>
+      </w:pPr>
+      <w:r>
+        <w:rPr>
+          <w:rFonts w:ascii="Times New Roman" w:hAnsi="Times New Roman" w:cs="Times New Roman"/>
+        </w:rPr>
         <w:t>Requirement analysis</w:t>
       </w:r>
     </w:p>
@@ -550,8 +738,14 @@
           <w:numId w:val="1"/>
         </w:numPr>
         <w:spacing w:after="80"/>
-      </w:pPr>
-      <w:r>
+        <w:rPr>
+          <w:rFonts w:ascii="Times New Roman" w:hAnsi="Times New Roman" w:cs="Times New Roman"/>
+        </w:rPr>
+      </w:pPr>
+      <w:r>
+        <w:rPr>
+          <w:rFonts w:ascii="Times New Roman" w:hAnsi="Times New Roman" w:cs="Times New Roman"/>
+        </w:rPr>
         <w:t>Delivery of the required solution</w:t>
       </w:r>
     </w:p>
@@ -563,12 +757,19 @@
           <w:numId w:val="1"/>
         </w:numPr>
         <w:spacing w:after="200"/>
-      </w:pPr>
-      <w:r>
+        <w:rPr>
+          <w:rFonts w:ascii="Times New Roman" w:hAnsi="Times New Roman" w:cs="Times New Roman"/>
+        </w:rPr>
+      </w:pPr>
+      <w:r>
+        <w:rPr>
+          <w:rFonts w:ascii="Times New Roman" w:hAnsi="Times New Roman" w:cs="Times New Roman"/>
+        </w:rPr>
         <w:t xml:space="preserve">Training and implementation using CQUAL </w:t>
       </w:r>
       <w:r>
         <w:rPr>
+          <w:rFonts w:ascii="Times New Roman" w:hAnsi="Times New Roman" w:cs="Times New Roman"/>
           <w:b/>
           <w:bCs/>
           <w:color w:val="65AADB"/>
@@ -579,16 +780,28 @@
     <w:p>
       <w:pPr>
         <w:spacing w:after="200"/>
-      </w:pPr>
-      <w:r>
+        <w:rPr>
+          <w:rFonts w:ascii="Times New Roman" w:hAnsi="Times New Roman" w:cs="Times New Roman"/>
+        </w:rPr>
+      </w:pPr>
+      <w:r>
+        <w:rPr>
+          <w:rFonts w:ascii="Times New Roman" w:hAnsi="Times New Roman" w:cs="Times New Roman"/>
+        </w:rPr>
         <w:t xml:space="preserve">Deliverables do not include the source code. Use of the solution is under license from </w:t>
       </w:r>
       <w:proofErr w:type="spellStart"/>
       <w:r>
+        <w:rPr>
+          <w:rFonts w:ascii="Times New Roman" w:hAnsi="Times New Roman" w:cs="Times New Roman"/>
+        </w:rPr>
         <w:t>BlechTek</w:t>
       </w:r>
       <w:proofErr w:type="spellEnd"/>
       <w:r>
+        <w:rPr>
+          <w:rFonts w:ascii="Times New Roman" w:hAnsi="Times New Roman" w:cs="Times New Roman"/>
+        </w:rPr>
         <w:t xml:space="preserve"> Software Solutions LLP.</w:t>
       </w:r>
     </w:p>
@@ -596,11 +809,13 @@
       <w:pPr>
         <w:spacing w:line="240" w:lineRule="auto"/>
         <w:rPr>
+          <w:rFonts w:ascii="Times New Roman" w:hAnsi="Times New Roman" w:cs="Times New Roman"/>
           <w:lang w:val="en-US"/>
         </w:rPr>
       </w:pPr>
       <w:r>
         <w:rPr>
+          <w:rFonts w:ascii="Times New Roman" w:hAnsi="Times New Roman" w:cs="Times New Roman"/>
           <w:lang w:val="en-US"/>
         </w:rPr>
         <w:t>We hope that this Document along with the enclosed Business Proposal is in line with your requirements. In case of any query, please feel free to call us.</w:t>
@@ -609,17 +824,22 @@
     <w:p>
       <w:pPr>
         <w:spacing w:line="240" w:lineRule="auto"/>
+        <w:rPr>
+          <w:rFonts w:ascii="Times New Roman" w:hAnsi="Times New Roman" w:cs="Times New Roman"/>
+        </w:rPr>
       </w:pPr>
     </w:p>
     <w:p>
       <w:pPr>
         <w:spacing w:line="240" w:lineRule="auto"/>
         <w:rPr>
+          <w:rFonts w:ascii="Times New Roman" w:hAnsi="Times New Roman" w:cs="Times New Roman"/>
           <w:lang w:val="en-US"/>
         </w:rPr>
       </w:pPr>
       <w:r>
         <w:rPr>
+          <w:rFonts w:ascii="Times New Roman" w:hAnsi="Times New Roman" w:cs="Times New Roman"/>
           <w:lang w:val="en-US"/>
         </w:rPr>
         <w:t>Sincerely,</w:t>
@@ -628,12 +848,48 @@
     <w:p>
       <w:pPr>
         <w:spacing w:line="240" w:lineRule="auto"/>
+        <w:rPr>
+          <w:rFonts w:ascii="Times New Roman" w:hAnsi="Times New Roman" w:cs="Times New Roman"/>
+        </w:rPr>
       </w:pPr>
     </w:p>
     <w:p>
       <w:pPr>
         <w:spacing w:line="240" w:lineRule="auto"/>
         <w:rPr>
+          <w:rFonts w:ascii="Times New Roman" w:hAnsi="Times New Roman" w:cs="Times New Roman"/>
+          <w:lang w:val="en-US"/>
+        </w:rPr>
+      </w:pPr>
+      <w:r>
+        <w:rPr>
+          <w:rFonts w:ascii="Times New Roman" w:hAnsi="Times New Roman" w:cs="Times New Roman"/>
+          <w:lang w:val="en-US"/>
+        </w:rPr>
+        <w:t xml:space="preserve">For </w:t>
+      </w:r>
+      <w:proofErr w:type="spellStart"/>
+      <w:r>
+        <w:rPr>
+          <w:rFonts w:ascii="Times New Roman" w:hAnsi="Times New Roman" w:cs="Times New Roman"/>
+          <w:lang w:val="en-US"/>
+        </w:rPr>
+        <w:t>BlechTek</w:t>
+      </w:r>
+      <w:proofErr w:type="spellEnd"/>
+      <w:r>
+        <w:rPr>
+          <w:rFonts w:ascii="Times New Roman" w:hAnsi="Times New Roman" w:cs="Times New Roman"/>
+          <w:lang w:val="en-US"/>
+        </w:rPr>
+        <w:t xml:space="preserve"> Software Solutions LLP.</w:t>
+      </w:r>
+    </w:p>
+    <w:p>
+      <w:pPr>
+        <w:spacing w:line="240" w:lineRule="auto"/>
+        <w:rPr>
+          <w:rFonts w:ascii="Times New Roman" w:hAnsi="Times New Roman" w:cs="Times New Roman"/>
           <w:b/>
           <w:bCs/>
           <w:lang w:val="en-US"/>
@@ -641,45 +897,9 @@
       </w:pPr>
       <w:r>
         <w:rPr>
-          <w:b/>
-          <w:bCs/>
-          <w:lang w:val="en-US"/>
-        </w:rPr>
-        <w:t xml:space="preserve">For </w:t>
-      </w:r>
-      <w:proofErr w:type="spellStart"/>
-      <w:r>
-        <w:rPr>
-          <w:b/>
-          <w:bCs/>
-          <w:lang w:val="en-US"/>
-        </w:rPr>
-        <w:t>BlechTek</w:t>
-      </w:r>
-      <w:proofErr w:type="spellEnd"/>
-      <w:r>
-        <w:rPr>
-          <w:b/>
-          <w:bCs/>
-          <w:lang w:val="en-US"/>
-        </w:rPr>
-        <w:t xml:space="preserve"> Software Solutions LLP.</w:t>
-      </w:r>
-    </w:p>
-    <w:p>
-      <w:pPr>
-        <w:spacing w:line="240" w:lineRule="auto"/>
-        <w:rPr>
-          <w:b/>
-          <w:bCs/>
-          <w:lang w:val="en-US"/>
-        </w:rPr>
-      </w:pPr>
-      <w:r>
-        <w:rPr>
+          <w:rFonts w:ascii="Times New Roman" w:hAnsi="Times New Roman" w:cs="Times New Roman"/>
           <w:noProof/>
         </w:rPr>
-        <w:lastRenderedPageBreak/>
         <w:drawing>
           <wp:inline distT="0" distB="0" distL="0" distR="0" wp14:anchorId="3D41E2FB" wp14:editId="23AD92E6">
             <wp:extent cx="1045464" cy="1033272"/>
@@ -694,7 +914,7 @@
                     <pic:cNvPicPr/>
                   </pic:nvPicPr>
                   <pic:blipFill>
-                    <a:blip r:embed="rId7"/>
+                    <a:blip r:embed="rId8"/>
                     <a:stretch>
                       <a:fillRect/>
                     </a:stretch>
@@ -719,21 +939,20 @@
       <w:pPr>
         <w:spacing w:after="200"/>
         <w:rPr>
-          <w:b/>
-          <w:bCs/>
+          <w:rFonts w:ascii="Times New Roman" w:hAnsi="Times New Roman" w:cs="Times New Roman"/>
           <w:lang w:val="en-US"/>
         </w:rPr>
       </w:pPr>
       <w:r>
         <w:rPr>
+          <w:rFonts w:ascii="Times New Roman" w:hAnsi="Times New Roman" w:cs="Times New Roman"/>
           <w:lang w:val="en-US"/>
         </w:rPr>
         <w:t> </w:t>
       </w:r>
       <w:r>
         <w:rPr>
-          <w:b/>
-          <w:bCs/>
+          <w:rFonts w:ascii="Times New Roman" w:hAnsi="Times New Roman" w:cs="Times New Roman"/>
           <w:lang w:val="en-US"/>
         </w:rPr>
         <w:t>Sushama Inamdar</w:t>
@@ -745,16 +964,19 @@
           <w:bottom w:val="single" w:sz="6" w:space="4" w:color="65AADB"/>
         </w:pBdr>
         <w:spacing w:before="300" w:after="150"/>
-      </w:pPr>
-      <w:r>
-        <w:rPr>
+        <w:rPr>
+          <w:rFonts w:ascii="Times New Roman" w:hAnsi="Times New Roman" w:cs="Times New Roman"/>
+        </w:rPr>
+      </w:pPr>
+      <w:r>
+        <w:rPr>
+          <w:rFonts w:ascii="Times New Roman" w:hAnsi="Times New Roman" w:cs="Times New Roman"/>
           <w:b/>
           <w:bCs/>
           <w:caps/>
           <w:color w:val="65AADB"/>
-          <w:sz w:val="26"/>
-          <w:szCs w:val="26"/>
-        </w:rPr>
+        </w:rPr>
+        <w:lastRenderedPageBreak/>
         <w:t>Scope</w:t>
       </w:r>
     </w:p>
@@ -776,9 +998,9 @@
         <w:tblLook w:val="04A0" w:firstRow="1" w:lastRow="0" w:firstColumn="1" w:lastColumn="0" w:noHBand="0" w:noVBand="1"/>
       </w:tblPr>
       <w:tblGrid>
-        <w:gridCol w:w="2089"/>
-        <w:gridCol w:w="4789"/>
-        <w:gridCol w:w="1577"/>
+        <w:gridCol w:w="2080"/>
+        <w:gridCol w:w="4752"/>
+        <w:gridCol w:w="1623"/>
       </w:tblGrid>
       <w:tr>
         <w:trPr>
@@ -797,8 +1019,14 @@
             <w:vAlign w:val="center"/>
           </w:tcPr>
           <w:p>
-            <w:r>
-              <w:rPr>
+            <w:pPr>
+              <w:rPr>
+                <w:rFonts w:ascii="Times New Roman" w:hAnsi="Times New Roman" w:cs="Times New Roman"/>
+              </w:rPr>
+            </w:pPr>
+            <w:r>
+              <w:rPr>
+                <w:rFonts w:ascii="Times New Roman" w:hAnsi="Times New Roman" w:cs="Times New Roman"/>
                 <w:b/>
                 <w:bCs/>
                 <w:color w:val="FFFFFF"/>
@@ -823,8 +1051,14 @@
             <w:vAlign w:val="center"/>
           </w:tcPr>
           <w:p>
-            <w:r>
-              <w:rPr>
+            <w:pPr>
+              <w:rPr>
+                <w:rFonts w:ascii="Times New Roman" w:hAnsi="Times New Roman" w:cs="Times New Roman"/>
+              </w:rPr>
+            </w:pPr>
+            <w:r>
+              <w:rPr>
+                <w:rFonts w:ascii="Times New Roman" w:hAnsi="Times New Roman" w:cs="Times New Roman"/>
                 <w:b/>
                 <w:bCs/>
                 <w:color w:val="FFFFFF"/>
@@ -846,8 +1080,14 @@
             <w:vAlign w:val="center"/>
           </w:tcPr>
           <w:p>
-            <w:r>
-              <w:rPr>
+            <w:pPr>
+              <w:rPr>
+                <w:rFonts w:ascii="Times New Roman" w:hAnsi="Times New Roman" w:cs="Times New Roman"/>
+              </w:rPr>
+            </w:pPr>
+            <w:r>
+              <w:rPr>
+                <w:rFonts w:ascii="Times New Roman" w:hAnsi="Times New Roman" w:cs="Times New Roman"/>
                 <w:b/>
                 <w:bCs/>
                 <w:color w:val="FFFFFF"/>
@@ -876,6 +1116,7 @@
           <w:p>
             <w:pPr>
               <w:rPr>
+                <w:rFonts w:ascii="Times New Roman" w:hAnsi="Times New Roman" w:cs="Times New Roman"/>
                 <w:b/>
                 <w:bCs/>
                 <w:color w:val="FFFFFF"/>
@@ -883,6 +1124,7 @@
             </w:pPr>
             <w:r>
               <w:rPr>
+                <w:rFonts w:ascii="Times New Roman" w:hAnsi="Times New Roman" w:cs="Times New Roman"/>
                 <w:b/>
                 <w:bCs/>
               </w:rPr>
@@ -908,6 +1150,7 @@
           <w:p>
             <w:pPr>
               <w:rPr>
+                <w:rFonts w:ascii="Times New Roman" w:hAnsi="Times New Roman" w:cs="Times New Roman"/>
                 <w:b/>
                 <w:bCs/>
                 <w:color w:val="FFFFFF"/>
@@ -915,6 +1158,7 @@
             </w:pPr>
             <w:r>
               <w:rPr>
+                <w:rFonts w:ascii="Times New Roman" w:hAnsi="Times New Roman" w:cs="Times New Roman"/>
                 <w:b/>
                 <w:bCs/>
               </w:rPr>
@@ -937,6 +1181,7 @@
           <w:p>
             <w:pPr>
               <w:rPr>
+                <w:rFonts w:ascii="Times New Roman" w:hAnsi="Times New Roman" w:cs="Times New Roman"/>
                 <w:b/>
                 <w:bCs/>
                 <w:color w:val="FFFFFF"/>
@@ -944,6 +1189,7 @@
             </w:pPr>
             <w:r>
               <w:rPr>
+                <w:rFonts w:ascii="Times New Roman" w:hAnsi="Times New Roman" w:cs="Times New Roman"/>
                 <w:b/>
                 <w:bCs/>
               </w:rPr>
@@ -956,6 +1202,9 @@
     <w:p>
       <w:pPr>
         <w:spacing w:after="200"/>
+        <w:rPr>
+          <w:rFonts w:ascii="Times New Roman" w:hAnsi="Times New Roman" w:cs="Times New Roman"/>
+        </w:rPr>
       </w:pPr>
     </w:p>
     <w:p>
@@ -964,35 +1213,41 @@
           <w:bottom w:val="single" w:sz="6" w:space="4" w:color="65AADB"/>
         </w:pBdr>
         <w:spacing w:before="300" w:after="150"/>
-      </w:pPr>
-      <w:r>
-        <w:rPr>
+        <w:rPr>
+          <w:rFonts w:ascii="Times New Roman" w:hAnsi="Times New Roman" w:cs="Times New Roman"/>
+        </w:rPr>
+      </w:pPr>
+      <w:r>
+        <w:rPr>
+          <w:rFonts w:ascii="Times New Roman" w:hAnsi="Times New Roman" w:cs="Times New Roman"/>
           <w:b/>
           <w:bCs/>
           <w:caps/>
           <w:color w:val="65AADB"/>
-          <w:sz w:val="26"/>
-          <w:szCs w:val="26"/>
         </w:rPr>
         <w:t>Price for Implementation</w:t>
       </w:r>
       <w:r>
         <w:rPr>
+          <w:rFonts w:ascii="Times New Roman" w:hAnsi="Times New Roman" w:cs="Times New Roman"/>
           <w:b/>
           <w:bCs/>
           <w:caps/>
           <w:color w:val="65AADB"/>
-          <w:sz w:val="26"/>
-          <w:szCs w:val="26"/>
         </w:rPr>
         <w:t xml:space="preserve"> of cqual - </w:t>
       </w:r>
       <w:r>
+        <w:rPr>
+          <w:rFonts w:ascii="Times New Roman" w:hAnsi="Times New Roman" w:cs="Times New Roman"/>
+        </w:rPr>
         <w:t>{{MODULE_LIST}}</w:t>
       </w:r>
     </w:p>
     <w:tbl>
       <w:tblPr>
+        <w:tblpPr w:leftFromText="180" w:rightFromText="180" w:vertAnchor="text" w:tblpY="1"/>
+        <w:tblOverlap w:val="never"/>
         <w:tblW w:w="9000" w:type="dxa"/>
         <w:tblBorders>
           <w:top w:val="single" w:sz="4" w:space="0" w:color="auto"/>
@@ -1031,8 +1286,14 @@
             <w:vAlign w:val="center"/>
           </w:tcPr>
           <w:p>
-            <w:r>
-              <w:rPr>
+            <w:pPr>
+              <w:rPr>
+                <w:rFonts w:ascii="Times New Roman" w:hAnsi="Times New Roman" w:cs="Times New Roman"/>
+              </w:rPr>
+            </w:pPr>
+            <w:r>
+              <w:rPr>
+                <w:rFonts w:ascii="Times New Roman" w:hAnsi="Times New Roman" w:cs="Times New Roman"/>
                 <w:b/>
                 <w:bCs/>
                 <w:color w:val="FFFFFF"/>
@@ -1054,8 +1315,14 @@
             <w:vAlign w:val="center"/>
           </w:tcPr>
           <w:p>
-            <w:r>
-              <w:rPr>
+            <w:pPr>
+              <w:rPr>
+                <w:rFonts w:ascii="Times New Roman" w:hAnsi="Times New Roman" w:cs="Times New Roman"/>
+              </w:rPr>
+            </w:pPr>
+            <w:r>
+              <w:rPr>
+                <w:rFonts w:ascii="Times New Roman" w:hAnsi="Times New Roman" w:cs="Times New Roman"/>
                 <w:b/>
                 <w:bCs/>
                 <w:color w:val="FFFFFF"/>
@@ -1077,8 +1344,14 @@
             <w:vAlign w:val="center"/>
           </w:tcPr>
           <w:p>
-            <w:r>
-              <w:rPr>
+            <w:pPr>
+              <w:rPr>
+                <w:rFonts w:ascii="Times New Roman" w:hAnsi="Times New Roman" w:cs="Times New Roman"/>
+              </w:rPr>
+            </w:pPr>
+            <w:r>
+              <w:rPr>
+                <w:rFonts w:ascii="Times New Roman" w:hAnsi="Times New Roman" w:cs="Times New Roman"/>
                 <w:b/>
                 <w:bCs/>
                 <w:color w:val="FFFFFF"/>
@@ -1101,7 +1374,15 @@
             </w:tcMar>
           </w:tcPr>
           <w:p>
-            <w:r>
+            <w:pPr>
+              <w:rPr>
+                <w:rFonts w:ascii="Times New Roman" w:hAnsi="Times New Roman" w:cs="Times New Roman"/>
+              </w:rPr>
+            </w:pPr>
+            <w:r>
+              <w:rPr>
+                <w:rFonts w:ascii="Times New Roman" w:hAnsi="Times New Roman" w:cs="Times New Roman"/>
+              </w:rPr>
               <w:t>1</w:t>
             </w:r>
           </w:p>
@@ -1118,19 +1399,36 @@
             </w:tcMar>
           </w:tcPr>
           <w:p>
-            <w:r>
-              <w:rPr>
+            <w:pPr>
+              <w:rPr>
+                <w:rFonts w:ascii="Times New Roman" w:hAnsi="Times New Roman" w:cs="Times New Roman"/>
+              </w:rPr>
+            </w:pPr>
+            <w:r>
+              <w:rPr>
+                <w:rFonts w:ascii="Times New Roman" w:hAnsi="Times New Roman" w:cs="Times New Roman"/>
                 <w:b/>
                 <w:bCs/>
               </w:rPr>
               <w:t>Product License</w:t>
             </w:r>
             <w:r>
+              <w:rPr>
+                <w:rFonts w:ascii="Times New Roman" w:hAnsi="Times New Roman" w:cs="Times New Roman"/>
+              </w:rPr>
               <w:t xml:space="preserve"> - {{MODULE_LIST}} (single installation). Scope as listed above.</w:t>
             </w:r>
           </w:p>
           <w:p>
-            <w:r>
+            <w:pPr>
+              <w:rPr>
+                <w:rFonts w:ascii="Times New Roman" w:hAnsi="Times New Roman" w:cs="Times New Roman"/>
+              </w:rPr>
+            </w:pPr>
+            <w:r>
+              <w:rPr>
+                <w:rFonts w:ascii="Times New Roman" w:hAnsi="Times New Roman" w:cs="Times New Roman"/>
+              </w:rPr>
               <w:t>{{MODULE_DETAILS}}</w:t>
             </w:r>
           </w:p>
@@ -1147,12 +1445,28 @@
             </w:tcMar>
           </w:tcPr>
           <w:p>
-            <w:r>
+            <w:pPr>
+              <w:rPr>
+                <w:rFonts w:ascii="Times New Roman" w:hAnsi="Times New Roman" w:cs="Times New Roman"/>
+              </w:rPr>
+            </w:pPr>
+            <w:r>
+              <w:rPr>
+                <w:rFonts w:ascii="Times New Roman" w:hAnsi="Times New Roman" w:cs="Times New Roman"/>
+              </w:rPr>
               <w:t>{{MODULE_PRICING}}</w:t>
             </w:r>
           </w:p>
           <w:p>
-            <w:r>
+            <w:pPr>
+              <w:rPr>
+                <w:rFonts w:ascii="Times New Roman" w:hAnsi="Times New Roman" w:cs="Times New Roman"/>
+              </w:rPr>
+            </w:pPr>
+            <w:r>
+              <w:rPr>
+                <w:rFonts w:ascii="Times New Roman" w:hAnsi="Times New Roman" w:cs="Times New Roman"/>
+              </w:rPr>
               <w:t>{{OVERALL_PRICING}}</w:t>
             </w:r>
           </w:p>
@@ -1171,7 +1485,15 @@
             </w:tcMar>
           </w:tcPr>
           <w:p>
-            <w:r>
+            <w:pPr>
+              <w:rPr>
+                <w:rFonts w:ascii="Times New Roman" w:hAnsi="Times New Roman" w:cs="Times New Roman"/>
+              </w:rPr>
+            </w:pPr>
+            <w:r>
+              <w:rPr>
+                <w:rFonts w:ascii="Times New Roman" w:hAnsi="Times New Roman" w:cs="Times New Roman"/>
+              </w:rPr>
               <w:t>2</w:t>
             </w:r>
           </w:p>
@@ -1188,20 +1510,35 @@
             </w:tcMar>
           </w:tcPr>
           <w:p>
-            <w:r>
-              <w:rPr>
+            <w:pPr>
+              <w:rPr>
+                <w:rFonts w:ascii="Times New Roman" w:hAnsi="Times New Roman" w:cs="Times New Roman"/>
+              </w:rPr>
+            </w:pPr>
+            <w:r>
+              <w:rPr>
+                <w:rFonts w:ascii="Times New Roman" w:hAnsi="Times New Roman" w:cs="Times New Roman"/>
                 <w:b/>
                 <w:bCs/>
               </w:rPr>
               <w:t>Customization</w:t>
             </w:r>
             <w:r>
+              <w:rPr>
+                <w:rFonts w:ascii="Times New Roman" w:hAnsi="Times New Roman" w:cs="Times New Roman"/>
+              </w:rPr>
               <w:t xml:space="preserve"> - any additional development beyond scope, charged at INR </w:t>
             </w:r>
             <w:r>
+              <w:rPr>
+                <w:rFonts w:ascii="Times New Roman" w:hAnsi="Times New Roman" w:cs="Times New Roman"/>
+              </w:rPr>
               <w:t>8</w:t>
             </w:r>
             <w:r>
+              <w:rPr>
+                <w:rFonts w:ascii="Times New Roman" w:hAnsi="Times New Roman" w:cs="Times New Roman"/>
+              </w:rPr>
               <w:t>,000 / man-day.</w:t>
             </w:r>
           </w:p>
@@ -1218,7 +1555,15 @@
             </w:tcMar>
           </w:tcPr>
           <w:p>
-            <w:r>
+            <w:pPr>
+              <w:rPr>
+                <w:rFonts w:ascii="Times New Roman" w:hAnsi="Times New Roman" w:cs="Times New Roman"/>
+              </w:rPr>
+            </w:pPr>
+            <w:r>
+              <w:rPr>
+                <w:rFonts w:ascii="Times New Roman" w:hAnsi="Times New Roman" w:cs="Times New Roman"/>
+              </w:rPr>
               <w:t>TBD</w:t>
             </w:r>
           </w:p>
@@ -1237,7 +1582,15 @@
             </w:tcMar>
           </w:tcPr>
           <w:p>
-            <w:r>
+            <w:pPr>
+              <w:rPr>
+                <w:rFonts w:ascii="Times New Roman" w:hAnsi="Times New Roman" w:cs="Times New Roman"/>
+              </w:rPr>
+            </w:pPr>
+            <w:r>
+              <w:rPr>
+                <w:rFonts w:ascii="Times New Roman" w:hAnsi="Times New Roman" w:cs="Times New Roman"/>
+              </w:rPr>
               <w:t>3</w:t>
             </w:r>
           </w:p>
@@ -1254,14 +1607,23 @@
             </w:tcMar>
           </w:tcPr>
           <w:p>
-            <w:r>
-              <w:rPr>
+            <w:pPr>
+              <w:rPr>
+                <w:rFonts w:ascii="Times New Roman" w:hAnsi="Times New Roman" w:cs="Times New Roman"/>
+              </w:rPr>
+            </w:pPr>
+            <w:r>
+              <w:rPr>
+                <w:rFonts w:ascii="Times New Roman" w:hAnsi="Times New Roman" w:cs="Times New Roman"/>
                 <w:b/>
                 <w:bCs/>
               </w:rPr>
               <w:t>Annual License Renewal</w:t>
             </w:r>
             <w:r>
+              <w:rPr>
+                <w:rFonts w:ascii="Times New Roman" w:hAnsi="Times New Roman" w:cs="Times New Roman"/>
+              </w:rPr>
               <w:t xml:space="preserve"> - covers upgrades, bug fixes &amp; statutory changes. Includes 7 man-days; excess is chargeable.</w:t>
             </w:r>
           </w:p>
@@ -1277,7 +1639,13 @@
               <w:right w:w="120" w:type="dxa"/>
             </w:tcMar>
           </w:tcPr>
-          <w:p/>
+          <w:p>
+            <w:pPr>
+              <w:rPr>
+                <w:rFonts w:ascii="Times New Roman" w:hAnsi="Times New Roman" w:cs="Times New Roman"/>
+              </w:rPr>
+            </w:pPr>
+          </w:p>
         </w:tc>
       </w:tr>
       <w:tr>
@@ -1293,7 +1661,15 @@
             </w:tcMar>
           </w:tcPr>
           <w:p>
-            <w:r>
+            <w:pPr>
+              <w:rPr>
+                <w:rFonts w:ascii="Times New Roman" w:hAnsi="Times New Roman" w:cs="Times New Roman"/>
+              </w:rPr>
+            </w:pPr>
+            <w:r>
+              <w:rPr>
+                <w:rFonts w:ascii="Times New Roman" w:hAnsi="Times New Roman" w:cs="Times New Roman"/>
+              </w:rPr>
               <w:t>4</w:t>
             </w:r>
           </w:p>
@@ -1310,14 +1686,23 @@
             </w:tcMar>
           </w:tcPr>
           <w:p>
-            <w:r>
-              <w:rPr>
+            <w:pPr>
+              <w:rPr>
+                <w:rFonts w:ascii="Times New Roman" w:hAnsi="Times New Roman" w:cs="Times New Roman"/>
+              </w:rPr>
+            </w:pPr>
+            <w:r>
+              <w:rPr>
+                <w:rFonts w:ascii="Times New Roman" w:hAnsi="Times New Roman" w:cs="Times New Roman"/>
                 <w:b/>
                 <w:bCs/>
               </w:rPr>
               <w:t>Support Services</w:t>
             </w:r>
             <w:r>
+              <w:rPr>
+                <w:rFonts w:ascii="Times New Roman" w:hAnsi="Times New Roman" w:cs="Times New Roman"/>
+              </w:rPr>
               <w:t xml:space="preserve"> - commence 1 month after Go-Live.</w:t>
             </w:r>
           </w:p>
@@ -1333,7 +1718,13 @@
               <w:right w:w="120" w:type="dxa"/>
             </w:tcMar>
           </w:tcPr>
-          <w:p/>
+          <w:p>
+            <w:pPr>
+              <w:rPr>
+                <w:rFonts w:ascii="Times New Roman" w:hAnsi="Times New Roman" w:cs="Times New Roman"/>
+              </w:rPr>
+            </w:pPr>
+          </w:p>
         </w:tc>
       </w:tr>
       <w:tr>
@@ -1349,7 +1740,15 @@
             </w:tcMar>
           </w:tcPr>
           <w:p>
-            <w:r>
+            <w:pPr>
+              <w:rPr>
+                <w:rFonts w:ascii="Times New Roman" w:hAnsi="Times New Roman" w:cs="Times New Roman"/>
+              </w:rPr>
+            </w:pPr>
+            <w:r>
+              <w:rPr>
+                <w:rFonts w:ascii="Times New Roman" w:hAnsi="Times New Roman" w:cs="Times New Roman"/>
+              </w:rPr>
               <w:t>5</w:t>
             </w:r>
           </w:p>
@@ -1366,35 +1765,74 @@
             </w:tcMar>
           </w:tcPr>
           <w:p>
-            <w:r>
-              <w:rPr>
+            <w:pPr>
+              <w:rPr>
+                <w:rFonts w:ascii="Times New Roman" w:hAnsi="Times New Roman" w:cs="Times New Roman"/>
+              </w:rPr>
+            </w:pPr>
+            <w:r>
+              <w:rPr>
+                <w:rFonts w:ascii="Times New Roman" w:hAnsi="Times New Roman" w:cs="Times New Roman"/>
                 <w:b/>
                 <w:bCs/>
               </w:rPr>
               <w:t>Payment Terms</w:t>
             </w:r>
             <w:r>
+              <w:rPr>
+                <w:rFonts w:ascii="Times New Roman" w:hAnsi="Times New Roman" w:cs="Times New Roman"/>
+              </w:rPr>
               <w:t xml:space="preserve"> </w:t>
             </w:r>
             <w:r>
+              <w:rPr>
+                <w:rFonts w:ascii="Times New Roman" w:hAnsi="Times New Roman" w:cs="Times New Roman"/>
+              </w:rPr>
               <w:t>–</w:t>
             </w:r>
             <w:r>
+              <w:rPr>
+                <w:rFonts w:ascii="Times New Roman" w:hAnsi="Times New Roman" w:cs="Times New Roman"/>
+              </w:rPr>
               <w:t xml:space="preserve"> </w:t>
             </w:r>
           </w:p>
           <w:p>
-            <w:r>
+            <w:pPr>
+              <w:rPr>
+                <w:rFonts w:ascii="Times New Roman" w:hAnsi="Times New Roman" w:cs="Times New Roman"/>
+              </w:rPr>
+            </w:pPr>
+            <w:r>
+              <w:rPr>
+                <w:rFonts w:ascii="Times New Roman" w:hAnsi="Times New Roman" w:cs="Times New Roman"/>
+              </w:rPr>
               <w:t>70% advance with PO</w:t>
             </w:r>
           </w:p>
           <w:p>
-            <w:r>
+            <w:pPr>
+              <w:rPr>
+                <w:rFonts w:ascii="Times New Roman" w:hAnsi="Times New Roman" w:cs="Times New Roman"/>
+              </w:rPr>
+            </w:pPr>
+            <w:r>
+              <w:rPr>
+                <w:rFonts w:ascii="Times New Roman" w:hAnsi="Times New Roman" w:cs="Times New Roman"/>
+              </w:rPr>
               <w:t>20% on implementation</w:t>
             </w:r>
           </w:p>
           <w:p>
-            <w:r>
+            <w:pPr>
+              <w:rPr>
+                <w:rFonts w:ascii="Times New Roman" w:hAnsi="Times New Roman" w:cs="Times New Roman"/>
+              </w:rPr>
+            </w:pPr>
+            <w:r>
+              <w:rPr>
+                <w:rFonts w:ascii="Times New Roman" w:hAnsi="Times New Roman" w:cs="Times New Roman"/>
+              </w:rPr>
               <w:t>10% on Go-Live.</w:t>
             </w:r>
           </w:p>
@@ -1410,7 +1848,13 @@
               <w:right w:w="120" w:type="dxa"/>
             </w:tcMar>
           </w:tcPr>
-          <w:p/>
+          <w:p>
+            <w:pPr>
+              <w:rPr>
+                <w:rFonts w:ascii="Times New Roman" w:hAnsi="Times New Roman" w:cs="Times New Roman"/>
+              </w:rPr>
+            </w:pPr>
+          </w:p>
         </w:tc>
       </w:tr>
       <w:tr>
@@ -1426,8 +1870,14 @@
             </w:tcMar>
           </w:tcPr>
           <w:p>
-            <w:r>
-              <w:rPr>
+            <w:pPr>
+              <w:rPr>
+                <w:rFonts w:ascii="Times New Roman" w:hAnsi="Times New Roman" w:cs="Times New Roman"/>
+              </w:rPr>
+            </w:pPr>
+            <w:r>
+              <w:rPr>
+                <w:rFonts w:ascii="Times New Roman" w:hAnsi="Times New Roman" w:cs="Times New Roman"/>
                 <w:b/>
                 <w:bCs/>
               </w:rPr>
@@ -1447,8 +1897,14 @@
             </w:tcMar>
           </w:tcPr>
           <w:p>
-            <w:r>
-              <w:rPr>
+            <w:pPr>
+              <w:rPr>
+                <w:rFonts w:ascii="Times New Roman" w:hAnsi="Times New Roman" w:cs="Times New Roman"/>
+              </w:rPr>
+            </w:pPr>
+            <w:r>
+              <w:rPr>
+                <w:rFonts w:ascii="Times New Roman" w:hAnsi="Times New Roman" w:cs="Times New Roman"/>
                 <w:b/>
                 <w:bCs/>
               </w:rPr>
@@ -1467,7 +1923,13 @@
               <w:right w:w="120" w:type="dxa"/>
             </w:tcMar>
           </w:tcPr>
-          <w:p/>
+          <w:p>
+            <w:pPr>
+              <w:rPr>
+                <w:rFonts w:ascii="Times New Roman" w:hAnsi="Times New Roman" w:cs="Times New Roman"/>
+              </w:rPr>
+            </w:pPr>
+          </w:p>
         </w:tc>
       </w:tr>
       <w:tr>
@@ -1482,7 +1944,13 @@
               <w:right w:w="120" w:type="dxa"/>
             </w:tcMar>
           </w:tcPr>
-          <w:p/>
+          <w:p>
+            <w:pPr>
+              <w:rPr>
+                <w:rFonts w:ascii="Times New Roman" w:hAnsi="Times New Roman" w:cs="Times New Roman"/>
+              </w:rPr>
+            </w:pPr>
+          </w:p>
         </w:tc>
         <w:tc>
           <w:tcPr>
@@ -1496,18 +1964,28 @@
             </w:tcMar>
           </w:tcPr>
           <w:p>
-            <w:r>
-              <w:rPr>
+            <w:pPr>
+              <w:rPr>
+                <w:rFonts w:ascii="Times New Roman" w:hAnsi="Times New Roman" w:cs="Times New Roman"/>
+              </w:rPr>
+            </w:pPr>
+            <w:r>
+              <w:rPr>
+                <w:rFonts w:ascii="Times New Roman" w:hAnsi="Times New Roman" w:cs="Times New Roman"/>
                 <w:b/>
                 <w:bCs/>
               </w:rPr>
               <w:t>L1:</w:t>
             </w:r>
             <w:r>
+              <w:rPr>
+                <w:rFonts w:ascii="Times New Roman" w:hAnsi="Times New Roman" w:cs="Times New Roman"/>
+              </w:rPr>
               <w:t xml:space="preserve"> </w:t>
             </w:r>
             <w:r>
               <w:rPr>
+                <w:rFonts w:ascii="Times New Roman" w:hAnsi="Times New Roman" w:cs="Times New Roman"/>
                 <w:b/>
                 <w:bCs/>
               </w:rPr>
@@ -1515,17 +1993,29 @@
             </w:r>
             <w:r>
               <w:rPr>
+                <w:rFonts w:ascii="Times New Roman" w:hAnsi="Times New Roman" w:cs="Times New Roman"/>
                 <w:b/>
                 <w:bCs/>
               </w:rPr>
               <w:t>–</w:t>
             </w:r>
             <w:r>
+              <w:rPr>
+                <w:rFonts w:ascii="Times New Roman" w:hAnsi="Times New Roman" w:cs="Times New Roman"/>
+              </w:rPr>
               <w:t xml:space="preserve"> </w:t>
             </w:r>
           </w:p>
           <w:p>
-            <w:r>
+            <w:pPr>
+              <w:rPr>
+                <w:rFonts w:ascii="Times New Roman" w:hAnsi="Times New Roman" w:cs="Times New Roman"/>
+              </w:rPr>
+            </w:pPr>
+            <w:r>
+              <w:rPr>
+                <w:rFonts w:ascii="Times New Roman" w:hAnsi="Times New Roman" w:cs="Times New Roman"/>
+              </w:rPr>
               <w:t>Queries, understanding a feature, problem solving, etc.</w:t>
             </w:r>
           </w:p>
@@ -1542,7 +2032,15 @@
             </w:tcMar>
           </w:tcPr>
           <w:p>
-            <w:r>
+            <w:pPr>
+              <w:rPr>
+                <w:rFonts w:ascii="Times New Roman" w:hAnsi="Times New Roman" w:cs="Times New Roman"/>
+              </w:rPr>
+            </w:pPr>
+            <w:r>
+              <w:rPr>
+                <w:rFonts w:ascii="Times New Roman" w:hAnsi="Times New Roman" w:cs="Times New Roman"/>
+              </w:rPr>
               <w:t>Chargeable</w:t>
             </w:r>
           </w:p>
@@ -1560,7 +2058,13 @@
               <w:right w:w="120" w:type="dxa"/>
             </w:tcMar>
           </w:tcPr>
-          <w:p/>
+          <w:p>
+            <w:pPr>
+              <w:rPr>
+                <w:rFonts w:ascii="Times New Roman" w:hAnsi="Times New Roman" w:cs="Times New Roman"/>
+              </w:rPr>
+            </w:pPr>
+          </w:p>
         </w:tc>
         <w:tc>
           <w:tcPr>
@@ -1574,18 +2078,28 @@
             </w:tcMar>
           </w:tcPr>
           <w:p>
-            <w:r>
-              <w:rPr>
+            <w:pPr>
+              <w:rPr>
+                <w:rFonts w:ascii="Times New Roman" w:hAnsi="Times New Roman" w:cs="Times New Roman"/>
+              </w:rPr>
+            </w:pPr>
+            <w:r>
+              <w:rPr>
+                <w:rFonts w:ascii="Times New Roman" w:hAnsi="Times New Roman" w:cs="Times New Roman"/>
                 <w:b/>
                 <w:bCs/>
               </w:rPr>
               <w:t>L2:</w:t>
             </w:r>
             <w:r>
+              <w:rPr>
+                <w:rFonts w:ascii="Times New Roman" w:hAnsi="Times New Roman" w:cs="Times New Roman"/>
+              </w:rPr>
               <w:t xml:space="preserve"> </w:t>
             </w:r>
             <w:r>
               <w:rPr>
+                <w:rFonts w:ascii="Times New Roman" w:hAnsi="Times New Roman" w:cs="Times New Roman"/>
                 <w:b/>
                 <w:bCs/>
               </w:rPr>
@@ -1593,6 +2107,7 @@
             </w:r>
             <w:r>
               <w:rPr>
+                <w:rFonts w:ascii="Times New Roman" w:hAnsi="Times New Roman" w:cs="Times New Roman"/>
                 <w:b/>
                 <w:bCs/>
               </w:rPr>
@@ -1600,15 +2115,29 @@
             </w:r>
           </w:p>
           <w:p>
-            <w:r>
+            <w:pPr>
+              <w:rPr>
+                <w:rFonts w:ascii="Times New Roman" w:hAnsi="Times New Roman" w:cs="Times New Roman"/>
+              </w:rPr>
+            </w:pPr>
+            <w:r>
+              <w:rPr>
+                <w:rFonts w:ascii="Times New Roman" w:hAnsi="Times New Roman" w:cs="Times New Roman"/>
+              </w:rPr>
               <w:t xml:space="preserve">Identified by you or by </w:t>
             </w:r>
             <w:proofErr w:type="spellStart"/>
             <w:r>
+              <w:rPr>
+                <w:rFonts w:ascii="Times New Roman" w:hAnsi="Times New Roman" w:cs="Times New Roman"/>
+              </w:rPr>
               <w:t>BlechTek</w:t>
             </w:r>
             <w:proofErr w:type="spellEnd"/>
             <w:r>
+              <w:rPr>
+                <w:rFonts w:ascii="Times New Roman" w:hAnsi="Times New Roman" w:cs="Times New Roman"/>
+              </w:rPr>
               <w:t xml:space="preserve"> Software Solutions LLP.</w:t>
             </w:r>
           </w:p>
@@ -1625,7 +2154,15 @@
             </w:tcMar>
           </w:tcPr>
           <w:p>
-            <w:r>
+            <w:pPr>
+              <w:rPr>
+                <w:rFonts w:ascii="Times New Roman" w:hAnsi="Times New Roman" w:cs="Times New Roman"/>
+              </w:rPr>
+            </w:pPr>
+            <w:r>
+              <w:rPr>
+                <w:rFonts w:ascii="Times New Roman" w:hAnsi="Times New Roman" w:cs="Times New Roman"/>
+              </w:rPr>
               <w:t>Free, under License Fee Renewal</w:t>
             </w:r>
           </w:p>
@@ -1643,7 +2180,13 @@
               <w:right w:w="120" w:type="dxa"/>
             </w:tcMar>
           </w:tcPr>
-          <w:p/>
+          <w:p>
+            <w:pPr>
+              <w:rPr>
+                <w:rFonts w:ascii="Times New Roman" w:hAnsi="Times New Roman" w:cs="Times New Roman"/>
+              </w:rPr>
+            </w:pPr>
+          </w:p>
         </w:tc>
         <w:tc>
           <w:tcPr>
@@ -1657,18 +2200,28 @@
             </w:tcMar>
           </w:tcPr>
           <w:p>
-            <w:r>
-              <w:rPr>
+            <w:pPr>
+              <w:rPr>
+                <w:rFonts w:ascii="Times New Roman" w:hAnsi="Times New Roman" w:cs="Times New Roman"/>
+              </w:rPr>
+            </w:pPr>
+            <w:r>
+              <w:rPr>
+                <w:rFonts w:ascii="Times New Roman" w:hAnsi="Times New Roman" w:cs="Times New Roman"/>
                 <w:b/>
                 <w:bCs/>
               </w:rPr>
               <w:t>L3:</w:t>
             </w:r>
             <w:r>
+              <w:rPr>
+                <w:rFonts w:ascii="Times New Roman" w:hAnsi="Times New Roman" w:cs="Times New Roman"/>
+              </w:rPr>
               <w:t xml:space="preserve"> </w:t>
             </w:r>
             <w:r>
               <w:rPr>
+                <w:rFonts w:ascii="Times New Roman" w:hAnsi="Times New Roman" w:cs="Times New Roman"/>
                 <w:b/>
                 <w:bCs/>
               </w:rPr>
@@ -1676,17 +2229,29 @@
             </w:r>
             <w:r>
               <w:rPr>
+                <w:rFonts w:ascii="Times New Roman" w:hAnsi="Times New Roman" w:cs="Times New Roman"/>
                 <w:b/>
                 <w:bCs/>
               </w:rPr>
               <w:t>–</w:t>
             </w:r>
             <w:r>
+              <w:rPr>
+                <w:rFonts w:ascii="Times New Roman" w:hAnsi="Times New Roman" w:cs="Times New Roman"/>
+              </w:rPr>
               <w:t xml:space="preserve"> </w:t>
             </w:r>
           </w:p>
           <w:p>
-            <w:r>
+            <w:pPr>
+              <w:rPr>
+                <w:rFonts w:ascii="Times New Roman" w:hAnsi="Times New Roman" w:cs="Times New Roman"/>
+              </w:rPr>
+            </w:pPr>
+            <w:r>
+              <w:rPr>
+                <w:rFonts w:ascii="Times New Roman" w:hAnsi="Times New Roman" w:cs="Times New Roman"/>
+              </w:rPr>
               <w:t>New/change in document printing format, new/change in reports.</w:t>
             </w:r>
           </w:p>
@@ -1703,7 +2268,15 @@
             </w:tcMar>
           </w:tcPr>
           <w:p>
-            <w:r>
+            <w:pPr>
+              <w:rPr>
+                <w:rFonts w:ascii="Times New Roman" w:hAnsi="Times New Roman" w:cs="Times New Roman"/>
+              </w:rPr>
+            </w:pPr>
+            <w:r>
+              <w:rPr>
+                <w:rFonts w:ascii="Times New Roman" w:hAnsi="Times New Roman" w:cs="Times New Roman"/>
+              </w:rPr>
               <w:t>Chargeable</w:t>
             </w:r>
           </w:p>
@@ -1721,7 +2294,13 @@
               <w:right w:w="120" w:type="dxa"/>
             </w:tcMar>
           </w:tcPr>
-          <w:p/>
+          <w:p>
+            <w:pPr>
+              <w:rPr>
+                <w:rFonts w:ascii="Times New Roman" w:hAnsi="Times New Roman" w:cs="Times New Roman"/>
+              </w:rPr>
+            </w:pPr>
+          </w:p>
         </w:tc>
         <w:tc>
           <w:tcPr>
@@ -1735,18 +2314,28 @@
             </w:tcMar>
           </w:tcPr>
           <w:p>
-            <w:r>
-              <w:rPr>
+            <w:pPr>
+              <w:rPr>
+                <w:rFonts w:ascii="Times New Roman" w:hAnsi="Times New Roman" w:cs="Times New Roman"/>
+              </w:rPr>
+            </w:pPr>
+            <w:r>
+              <w:rPr>
+                <w:rFonts w:ascii="Times New Roman" w:hAnsi="Times New Roman" w:cs="Times New Roman"/>
                 <w:b/>
                 <w:bCs/>
               </w:rPr>
               <w:t>L4:</w:t>
             </w:r>
             <w:r>
+              <w:rPr>
+                <w:rFonts w:ascii="Times New Roman" w:hAnsi="Times New Roman" w:cs="Times New Roman"/>
+              </w:rPr>
               <w:t xml:space="preserve"> </w:t>
             </w:r>
             <w:r>
               <w:rPr>
+                <w:rFonts w:ascii="Times New Roman" w:hAnsi="Times New Roman" w:cs="Times New Roman"/>
                 <w:b/>
                 <w:bCs/>
               </w:rPr>
@@ -1754,25 +2343,43 @@
             </w:r>
             <w:r>
               <w:rPr>
+                <w:rFonts w:ascii="Times New Roman" w:hAnsi="Times New Roman" w:cs="Times New Roman"/>
                 <w:b/>
                 <w:bCs/>
               </w:rPr>
               <w:t>–</w:t>
             </w:r>
             <w:r>
+              <w:rPr>
+                <w:rFonts w:ascii="Times New Roman" w:hAnsi="Times New Roman" w:cs="Times New Roman"/>
+              </w:rPr>
               <w:t xml:space="preserve"> </w:t>
             </w:r>
           </w:p>
           <w:p>
-            <w:r>
+            <w:pPr>
+              <w:rPr>
+                <w:rFonts w:ascii="Times New Roman" w:hAnsi="Times New Roman" w:cs="Times New Roman"/>
+              </w:rPr>
+            </w:pPr>
+            <w:r>
+              <w:rPr>
+                <w:rFonts w:ascii="Times New Roman" w:hAnsi="Times New Roman" w:cs="Times New Roman"/>
+              </w:rPr>
               <w:t xml:space="preserve">As done by </w:t>
             </w:r>
             <w:proofErr w:type="spellStart"/>
             <w:r>
+              <w:rPr>
+                <w:rFonts w:ascii="Times New Roman" w:hAnsi="Times New Roman" w:cs="Times New Roman"/>
+              </w:rPr>
               <w:t>BlechTek</w:t>
             </w:r>
             <w:proofErr w:type="spellEnd"/>
             <w:r>
+              <w:rPr>
+                <w:rFonts w:ascii="Times New Roman" w:hAnsi="Times New Roman" w:cs="Times New Roman"/>
+              </w:rPr>
               <w:t xml:space="preserve"> Software Solutions LLP on its own.</w:t>
             </w:r>
           </w:p>
@@ -1789,7 +2396,15 @@
             </w:tcMar>
           </w:tcPr>
           <w:p>
-            <w:r>
+            <w:pPr>
+              <w:rPr>
+                <w:rFonts w:ascii="Times New Roman" w:hAnsi="Times New Roman" w:cs="Times New Roman"/>
+              </w:rPr>
+            </w:pPr>
+            <w:r>
+              <w:rPr>
+                <w:rFonts w:ascii="Times New Roman" w:hAnsi="Times New Roman" w:cs="Times New Roman"/>
+              </w:rPr>
               <w:t>Free, under License Fee Renewal</w:t>
             </w:r>
           </w:p>
@@ -1807,7 +2422,13 @@
               <w:right w:w="120" w:type="dxa"/>
             </w:tcMar>
           </w:tcPr>
-          <w:p/>
+          <w:p>
+            <w:pPr>
+              <w:rPr>
+                <w:rFonts w:ascii="Times New Roman" w:hAnsi="Times New Roman" w:cs="Times New Roman"/>
+              </w:rPr>
+            </w:pPr>
+          </w:p>
         </w:tc>
         <w:tc>
           <w:tcPr>
@@ -1821,18 +2442,28 @@
             </w:tcMar>
           </w:tcPr>
           <w:p>
-            <w:r>
-              <w:rPr>
+            <w:pPr>
+              <w:rPr>
+                <w:rFonts w:ascii="Times New Roman" w:hAnsi="Times New Roman" w:cs="Times New Roman"/>
+              </w:rPr>
+            </w:pPr>
+            <w:r>
+              <w:rPr>
+                <w:rFonts w:ascii="Times New Roman" w:hAnsi="Times New Roman" w:cs="Times New Roman"/>
                 <w:b/>
                 <w:bCs/>
               </w:rPr>
               <w:t>L5:</w:t>
             </w:r>
             <w:r>
+              <w:rPr>
+                <w:rFonts w:ascii="Times New Roman" w:hAnsi="Times New Roman" w:cs="Times New Roman"/>
+              </w:rPr>
               <w:t xml:space="preserve"> </w:t>
             </w:r>
             <w:r>
               <w:rPr>
+                <w:rFonts w:ascii="Times New Roman" w:hAnsi="Times New Roman" w:cs="Times New Roman"/>
                 <w:b/>
                 <w:bCs/>
               </w:rPr>
@@ -1840,6 +2471,7 @@
             </w:r>
             <w:r>
               <w:rPr>
+                <w:rFonts w:ascii="Times New Roman" w:hAnsi="Times New Roman" w:cs="Times New Roman"/>
                 <w:b/>
                 <w:bCs/>
               </w:rPr>
@@ -1847,15 +2479,29 @@
             </w:r>
           </w:p>
           <w:p>
-            <w:r>
+            <w:pPr>
+              <w:rPr>
+                <w:rFonts w:ascii="Times New Roman" w:hAnsi="Times New Roman" w:cs="Times New Roman"/>
+              </w:rPr>
+            </w:pPr>
+            <w:r>
+              <w:rPr>
+                <w:rFonts w:ascii="Times New Roman" w:hAnsi="Times New Roman" w:cs="Times New Roman"/>
+              </w:rPr>
               <w:t xml:space="preserve">Master </w:t>
             </w:r>
             <w:proofErr w:type="spellStart"/>
             <w:r>
+              <w:rPr>
+                <w:rFonts w:ascii="Times New Roman" w:hAnsi="Times New Roman" w:cs="Times New Roman"/>
+              </w:rPr>
               <w:t>updation</w:t>
             </w:r>
             <w:proofErr w:type="spellEnd"/>
             <w:r>
+              <w:rPr>
+                <w:rFonts w:ascii="Times New Roman" w:hAnsi="Times New Roman" w:cs="Times New Roman"/>
+              </w:rPr>
               <w:t>, new feature implementation.</w:t>
             </w:r>
           </w:p>
@@ -1872,7 +2518,15 @@
             </w:tcMar>
           </w:tcPr>
           <w:p>
-            <w:r>
+            <w:pPr>
+              <w:rPr>
+                <w:rFonts w:ascii="Times New Roman" w:hAnsi="Times New Roman" w:cs="Times New Roman"/>
+              </w:rPr>
+            </w:pPr>
+            <w:r>
+              <w:rPr>
+                <w:rFonts w:ascii="Times New Roman" w:hAnsi="Times New Roman" w:cs="Times New Roman"/>
+              </w:rPr>
               <w:t>Chargeable</w:t>
             </w:r>
           </w:p>
@@ -1891,7 +2545,15 @@
             </w:tcMar>
           </w:tcPr>
           <w:p>
-            <w:r>
+            <w:pPr>
+              <w:rPr>
+                <w:rFonts w:ascii="Times New Roman" w:hAnsi="Times New Roman" w:cs="Times New Roman"/>
+              </w:rPr>
+            </w:pPr>
+            <w:r>
+              <w:rPr>
+                <w:rFonts w:ascii="Times New Roman" w:hAnsi="Times New Roman" w:cs="Times New Roman"/>
+              </w:rPr>
               <w:t>7</w:t>
             </w:r>
           </w:p>
@@ -1908,7 +2570,15 @@
             </w:tcMar>
           </w:tcPr>
           <w:p>
-            <w:r>
+            <w:pPr>
+              <w:rPr>
+                <w:rFonts w:ascii="Times New Roman" w:hAnsi="Times New Roman" w:cs="Times New Roman"/>
+              </w:rPr>
+            </w:pPr>
+            <w:r>
+              <w:rPr>
+                <w:rFonts w:ascii="Times New Roman" w:hAnsi="Times New Roman" w:cs="Times New Roman"/>
+              </w:rPr>
               <w:t>Taxes</w:t>
             </w:r>
           </w:p>
@@ -1925,9 +2595,14 @@
             </w:tcMar>
           </w:tcPr>
           <w:p>
-            <w:r>
-              <w:rPr>
-                <w:rFonts w:cstheme="minorHAnsi"/>
+            <w:pPr>
+              <w:rPr>
+                <w:rFonts w:ascii="Times New Roman" w:hAnsi="Times New Roman" w:cs="Times New Roman"/>
+              </w:rPr>
+            </w:pPr>
+            <w:r>
+              <w:rPr>
+                <w:rFonts w:ascii="Times New Roman" w:hAnsi="Times New Roman" w:cs="Times New Roman"/>
               </w:rPr>
               <w:t>As Applicable</w:t>
             </w:r>
@@ -1938,6 +2613,31 @@
     <w:p>
       <w:pPr>
         <w:spacing w:after="200"/>
+        <w:rPr>
+          <w:rFonts w:ascii="Times New Roman" w:hAnsi="Times New Roman" w:cs="Times New Roman"/>
+        </w:rPr>
+      </w:pPr>
+      <w:r>
+        <w:rPr>
+          <w:rFonts w:ascii="Times New Roman" w:hAnsi="Times New Roman" w:cs="Times New Roman"/>
+        </w:rPr>
+        <w:br w:type="textWrapping" w:clear="all"/>
+      </w:r>
+    </w:p>
+    <w:p>
+      <w:pPr>
+        <w:spacing w:after="200"/>
+        <w:rPr>
+          <w:rFonts w:ascii="Times New Roman" w:hAnsi="Times New Roman" w:cs="Times New Roman"/>
+        </w:rPr>
+      </w:pPr>
+    </w:p>
+    <w:p>
+      <w:pPr>
+        <w:spacing w:after="200"/>
+        <w:rPr>
+          <w:rFonts w:ascii="Times New Roman" w:hAnsi="Times New Roman" w:cs="Times New Roman"/>
+        </w:rPr>
       </w:pPr>
     </w:p>
     <w:p>
@@ -1946,15 +2646,17 @@
           <w:bottom w:val="single" w:sz="6" w:space="4" w:color="65AADB"/>
         </w:pBdr>
         <w:spacing w:before="300" w:after="150"/>
-      </w:pPr>
-      <w:r>
-        <w:rPr>
+        <w:rPr>
+          <w:rFonts w:ascii="Times New Roman" w:hAnsi="Times New Roman" w:cs="Times New Roman"/>
+        </w:rPr>
+      </w:pPr>
+      <w:r>
+        <w:rPr>
+          <w:rFonts w:ascii="Times New Roman" w:hAnsi="Times New Roman" w:cs="Times New Roman"/>
           <w:b/>
           <w:bCs/>
           <w:caps/>
           <w:color w:val="65AADB"/>
-          <w:sz w:val="26"/>
-          <w:szCs w:val="26"/>
         </w:rPr>
         <w:t>Terms and Conditions</w:t>
       </w:r>
@@ -1962,12 +2664,15 @@
     <w:p>
       <w:pPr>
         <w:spacing w:before="160" w:after="40"/>
-      </w:pPr>
-      <w:r>
-        <w:rPr>
-          <w:b/>
-          <w:bCs/>
-          <w:color w:val="65AADB"/>
+        <w:rPr>
+          <w:rFonts w:ascii="Times New Roman" w:hAnsi="Times New Roman" w:cs="Times New Roman"/>
+          <w:color w:val="000000" w:themeColor="text1"/>
+        </w:rPr>
+      </w:pPr>
+      <w:r>
+        <w:rPr>
+          <w:rFonts w:ascii="Times New Roman" w:hAnsi="Times New Roman" w:cs="Times New Roman"/>
+          <w:color w:val="000000" w:themeColor="text1"/>
         </w:rPr>
         <w:t>1. Confidentiality</w:t>
       </w:r>
@@ -1975,25 +2680,37 @@
     <w:p>
       <w:pPr>
         <w:spacing w:after="60"/>
+        <w:rPr>
+          <w:rFonts w:ascii="Times New Roman" w:hAnsi="Times New Roman" w:cs="Times New Roman"/>
+        </w:rPr>
       </w:pPr>
       <w:proofErr w:type="spellStart"/>
       <w:r>
+        <w:rPr>
+          <w:rFonts w:ascii="Times New Roman" w:hAnsi="Times New Roman" w:cs="Times New Roman"/>
+        </w:rPr>
         <w:t>BlechTek</w:t>
       </w:r>
       <w:proofErr w:type="spellEnd"/>
       <w:r>
+        <w:rPr>
+          <w:rFonts w:ascii="Times New Roman" w:hAnsi="Times New Roman" w:cs="Times New Roman"/>
+        </w:rPr>
         <w:t xml:space="preserve"> Software Solutions LLP agrees to maintain the confidentiality of all insights gained into your organization.</w:t>
       </w:r>
     </w:p>
     <w:p>
       <w:pPr>
         <w:spacing w:before="160" w:after="40"/>
-      </w:pPr>
-      <w:r>
-        <w:rPr>
-          <w:b/>
-          <w:bCs/>
-          <w:color w:val="65AADB"/>
+        <w:rPr>
+          <w:rFonts w:ascii="Times New Roman" w:hAnsi="Times New Roman" w:cs="Times New Roman"/>
+          <w:color w:val="000000" w:themeColor="text1"/>
+        </w:rPr>
+      </w:pPr>
+      <w:r>
+        <w:rPr>
+          <w:rFonts w:ascii="Times New Roman" w:hAnsi="Times New Roman" w:cs="Times New Roman"/>
+          <w:color w:val="000000" w:themeColor="text1"/>
         </w:rPr>
         <w:t>2. License</w:t>
       </w:r>
@@ -2001,20 +2718,29 @@
     <w:p>
       <w:pPr>
         <w:spacing w:after="60"/>
-      </w:pPr>
-      <w:r>
+        <w:rPr>
+          <w:rFonts w:ascii="Times New Roman" w:hAnsi="Times New Roman" w:cs="Times New Roman"/>
+        </w:rPr>
+      </w:pPr>
+      <w:r>
+        <w:rPr>
+          <w:rFonts w:ascii="Times New Roman" w:hAnsi="Times New Roman" w:cs="Times New Roman"/>
+        </w:rPr>
         <w:t>You are responsible for holding valid licenses for any Operating System software required.</w:t>
       </w:r>
     </w:p>
     <w:p>
       <w:pPr>
         <w:spacing w:before="160" w:after="40"/>
-      </w:pPr>
-      <w:r>
-        <w:rPr>
-          <w:b/>
-          <w:bCs/>
-          <w:color w:val="65AADB"/>
+        <w:rPr>
+          <w:rFonts w:ascii="Times New Roman" w:hAnsi="Times New Roman" w:cs="Times New Roman"/>
+          <w:color w:val="000000" w:themeColor="text1"/>
+        </w:rPr>
+      </w:pPr>
+      <w:r>
+        <w:rPr>
+          <w:rFonts w:ascii="Times New Roman" w:hAnsi="Times New Roman" w:cs="Times New Roman"/>
+          <w:color w:val="000000" w:themeColor="text1"/>
         </w:rPr>
         <w:t>3. Ownership of Source Code</w:t>
       </w:r>
@@ -2022,28 +2748,43 @@
     <w:p>
       <w:pPr>
         <w:spacing w:after="60"/>
-      </w:pPr>
-      <w:r>
+        <w:rPr>
+          <w:rFonts w:ascii="Times New Roman" w:hAnsi="Times New Roman" w:cs="Times New Roman"/>
+        </w:rPr>
+      </w:pPr>
+      <w:r>
+        <w:rPr>
+          <w:rFonts w:ascii="Times New Roman" w:hAnsi="Times New Roman" w:cs="Times New Roman"/>
+        </w:rPr>
         <w:t xml:space="preserve">Source Code remains the property of </w:t>
       </w:r>
       <w:proofErr w:type="spellStart"/>
       <w:r>
+        <w:rPr>
+          <w:rFonts w:ascii="Times New Roman" w:hAnsi="Times New Roman" w:cs="Times New Roman"/>
+        </w:rPr>
         <w:t>BlechTek</w:t>
       </w:r>
       <w:proofErr w:type="spellEnd"/>
       <w:r>
+        <w:rPr>
+          <w:rFonts w:ascii="Times New Roman" w:hAnsi="Times New Roman" w:cs="Times New Roman"/>
+        </w:rPr>
         <w:t xml:space="preserve"> Software Solutions LLP. The customer shall not claim any right in or to any patent, copyright, trademark or other proprietary right of the original manufacturer, developer or licensor. The software, hardware or other goods supplied are in accordance with the export laws of the respective countries, and diversion contrary to these laws or regulations is prohibited.</w:t>
       </w:r>
     </w:p>
     <w:p>
       <w:pPr>
         <w:spacing w:before="160" w:after="40"/>
-      </w:pPr>
-      <w:r>
-        <w:rPr>
-          <w:b/>
-          <w:bCs/>
-          <w:color w:val="65AADB"/>
+        <w:rPr>
+          <w:rFonts w:ascii="Times New Roman" w:hAnsi="Times New Roman" w:cs="Times New Roman"/>
+          <w:color w:val="000000" w:themeColor="text1"/>
+        </w:rPr>
+      </w:pPr>
+      <w:r>
+        <w:rPr>
+          <w:rFonts w:ascii="Times New Roman" w:hAnsi="Times New Roman" w:cs="Times New Roman"/>
+          <w:color w:val="000000" w:themeColor="text1"/>
         </w:rPr>
         <w:t>4. Warranty</w:t>
       </w:r>
@@ -2051,33 +2792,51 @@
     <w:p>
       <w:pPr>
         <w:spacing w:after="60"/>
+        <w:rPr>
+          <w:rFonts w:ascii="Times New Roman" w:hAnsi="Times New Roman" w:cs="Times New Roman"/>
+        </w:rPr>
       </w:pPr>
       <w:proofErr w:type="spellStart"/>
       <w:r>
+        <w:rPr>
+          <w:rFonts w:ascii="Times New Roman" w:hAnsi="Times New Roman" w:cs="Times New Roman"/>
+        </w:rPr>
         <w:t>BlechTek</w:t>
       </w:r>
       <w:proofErr w:type="spellEnd"/>
       <w:r>
+        <w:rPr>
+          <w:rFonts w:ascii="Times New Roman" w:hAnsi="Times New Roman" w:cs="Times New Roman"/>
+        </w:rPr>
         <w:t xml:space="preserve"> offers a standard warranty against development defects for 3 months from the date of installation. </w:t>
       </w:r>
       <w:proofErr w:type="spellStart"/>
       <w:r>
+        <w:rPr>
+          <w:rFonts w:ascii="Times New Roman" w:hAnsi="Times New Roman" w:cs="Times New Roman"/>
+        </w:rPr>
         <w:t>BlechTek</w:t>
       </w:r>
       <w:proofErr w:type="spellEnd"/>
       <w:r>
+        <w:rPr>
+          <w:rFonts w:ascii="Times New Roman" w:hAnsi="Times New Roman" w:cs="Times New Roman"/>
+        </w:rPr>
         <w:t xml:space="preserve"> is not responsible for data loss due to platform, cyber-security or virus issues.</w:t>
       </w:r>
     </w:p>
     <w:p>
       <w:pPr>
         <w:spacing w:before="160" w:after="40"/>
-      </w:pPr>
-      <w:r>
-        <w:rPr>
-          <w:b/>
-          <w:bCs/>
-          <w:color w:val="65AADB"/>
+        <w:rPr>
+          <w:rFonts w:ascii="Times New Roman" w:hAnsi="Times New Roman" w:cs="Times New Roman"/>
+          <w:color w:val="000000" w:themeColor="text1"/>
+        </w:rPr>
+      </w:pPr>
+      <w:r>
+        <w:rPr>
+          <w:rFonts w:ascii="Times New Roman" w:hAnsi="Times New Roman" w:cs="Times New Roman"/>
+          <w:color w:val="000000" w:themeColor="text1"/>
         </w:rPr>
         <w:t>5. Installation of Software</w:t>
       </w:r>
@@ -2085,28 +2844,43 @@
     <w:p>
       <w:pPr>
         <w:spacing w:after="60"/>
-      </w:pPr>
-      <w:r>
+        <w:rPr>
+          <w:rFonts w:ascii="Times New Roman" w:hAnsi="Times New Roman" w:cs="Times New Roman"/>
+        </w:rPr>
+      </w:pPr>
+      <w:r>
+        <w:rPr>
+          <w:rFonts w:ascii="Times New Roman" w:hAnsi="Times New Roman" w:cs="Times New Roman"/>
+        </w:rPr>
         <w:t xml:space="preserve">The software is considered installed once loaded on the server. For </w:t>
       </w:r>
       <w:proofErr w:type="gramStart"/>
       <w:r>
+        <w:rPr>
+          <w:rFonts w:ascii="Times New Roman" w:hAnsi="Times New Roman" w:cs="Times New Roman"/>
+        </w:rPr>
         <w:t>on-premise</w:t>
       </w:r>
       <w:proofErr w:type="gramEnd"/>
       <w:r>
+        <w:rPr>
+          <w:rFonts w:ascii="Times New Roman" w:hAnsi="Times New Roman" w:cs="Times New Roman"/>
+        </w:rPr>
         <w:t xml:space="preserve"> servers, installation will be carried out only after receipt of a Site Readiness report from you, a copy of which will be forwarded to you along with our Order Acceptance / Request for Installation.</w:t>
       </w:r>
     </w:p>
     <w:p>
       <w:pPr>
         <w:spacing w:before="160" w:after="40"/>
-      </w:pPr>
-      <w:r>
-        <w:rPr>
-          <w:b/>
-          <w:bCs/>
-          <w:color w:val="65AADB"/>
+        <w:rPr>
+          <w:rFonts w:ascii="Times New Roman" w:hAnsi="Times New Roman" w:cs="Times New Roman"/>
+          <w:color w:val="000000" w:themeColor="text1"/>
+        </w:rPr>
+      </w:pPr>
+      <w:r>
+        <w:rPr>
+          <w:rFonts w:ascii="Times New Roman" w:hAnsi="Times New Roman" w:cs="Times New Roman"/>
+          <w:color w:val="000000" w:themeColor="text1"/>
         </w:rPr>
         <w:t>6. Excused Performance</w:t>
       </w:r>
@@ -2114,25 +2888,37 @@
     <w:p>
       <w:pPr>
         <w:spacing w:after="60"/>
+        <w:rPr>
+          <w:rFonts w:ascii="Times New Roman" w:hAnsi="Times New Roman" w:cs="Times New Roman"/>
+        </w:rPr>
       </w:pPr>
       <w:proofErr w:type="spellStart"/>
       <w:r>
+        <w:rPr>
+          <w:rFonts w:ascii="Times New Roman" w:hAnsi="Times New Roman" w:cs="Times New Roman"/>
+        </w:rPr>
         <w:t>BlechTek</w:t>
       </w:r>
       <w:proofErr w:type="spellEnd"/>
       <w:r>
+        <w:rPr>
+          <w:rFonts w:ascii="Times New Roman" w:hAnsi="Times New Roman" w:cs="Times New Roman"/>
+        </w:rPr>
         <w:t xml:space="preserve"> is not liable for delay or failure in performance due to strikes, riots, war, fire, acts of God, governmental regulation, or failure of hardware/network outside its control.</w:t>
       </w:r>
     </w:p>
     <w:p>
       <w:pPr>
         <w:spacing w:before="160" w:after="40"/>
-      </w:pPr>
-      <w:r>
-        <w:rPr>
-          <w:b/>
-          <w:bCs/>
-          <w:color w:val="65AADB"/>
+        <w:rPr>
+          <w:rFonts w:ascii="Times New Roman" w:hAnsi="Times New Roman" w:cs="Times New Roman"/>
+          <w:color w:val="000000" w:themeColor="text1"/>
+        </w:rPr>
+      </w:pPr>
+      <w:r>
+        <w:rPr>
+          <w:rFonts w:ascii="Times New Roman" w:hAnsi="Times New Roman" w:cs="Times New Roman"/>
+          <w:color w:val="000000" w:themeColor="text1"/>
         </w:rPr>
         <w:t>7. Discontinuation of Contract</w:t>
       </w:r>
@@ -2140,44 +2926,71 @@
     <w:p>
       <w:pPr>
         <w:spacing w:after="60"/>
-      </w:pPr>
-      <w:r>
+        <w:rPr>
+          <w:rFonts w:ascii="Times New Roman" w:hAnsi="Times New Roman" w:cs="Times New Roman"/>
+        </w:rPr>
+      </w:pPr>
+      <w:r>
+        <w:rPr>
+          <w:rFonts w:ascii="Times New Roman" w:hAnsi="Times New Roman" w:cs="Times New Roman"/>
+        </w:rPr>
         <w:t xml:space="preserve">You will be required to pay the balance amount to </w:t>
       </w:r>
       <w:proofErr w:type="spellStart"/>
       <w:r>
+        <w:rPr>
+          <w:rFonts w:ascii="Times New Roman" w:hAnsi="Times New Roman" w:cs="Times New Roman"/>
+        </w:rPr>
         <w:t>BlechTek</w:t>
       </w:r>
       <w:proofErr w:type="spellEnd"/>
       <w:r>
+        <w:rPr>
+          <w:rFonts w:ascii="Times New Roman" w:hAnsi="Times New Roman" w:cs="Times New Roman"/>
+        </w:rPr>
         <w:t xml:space="preserve"> immediately in case of the following: (</w:t>
       </w:r>
       <w:proofErr w:type="spellStart"/>
       <w:r>
+        <w:rPr>
+          <w:rFonts w:ascii="Times New Roman" w:hAnsi="Times New Roman" w:cs="Times New Roman"/>
+        </w:rPr>
         <w:t>i</w:t>
       </w:r>
       <w:proofErr w:type="spellEnd"/>
       <w:r>
+        <w:rPr>
+          <w:rFonts w:ascii="Times New Roman" w:hAnsi="Times New Roman" w:cs="Times New Roman"/>
+        </w:rPr>
         <w:t xml:space="preserve">) discontinuation of the contract for reasons that are not related to </w:t>
       </w:r>
       <w:proofErr w:type="spellStart"/>
       <w:r>
+        <w:rPr>
+          <w:rFonts w:ascii="Times New Roman" w:hAnsi="Times New Roman" w:cs="Times New Roman"/>
+        </w:rPr>
         <w:t>BlechTek</w:t>
       </w:r>
       <w:proofErr w:type="spellEnd"/>
       <w:r>
+        <w:rPr>
+          <w:rFonts w:ascii="Times New Roman" w:hAnsi="Times New Roman" w:cs="Times New Roman"/>
+        </w:rPr>
         <w:t>; or (ii) the contract is stalled by you at any stage for a period of more than 60 days.</w:t>
       </w:r>
     </w:p>
     <w:p>
       <w:pPr>
         <w:spacing w:before="160" w:after="40"/>
-      </w:pPr>
-      <w:r>
-        <w:rPr>
-          <w:b/>
-          <w:bCs/>
-          <w:color w:val="65AADB"/>
+        <w:rPr>
+          <w:rFonts w:ascii="Times New Roman" w:hAnsi="Times New Roman" w:cs="Times New Roman"/>
+          <w:color w:val="000000" w:themeColor="text1"/>
+        </w:rPr>
+      </w:pPr>
+      <w:r>
+        <w:rPr>
+          <w:rFonts w:ascii="Times New Roman" w:hAnsi="Times New Roman" w:cs="Times New Roman"/>
+          <w:color w:val="000000" w:themeColor="text1"/>
         </w:rPr>
         <w:t>8. TDS</w:t>
       </w:r>
@@ -2185,93 +2998,141 @@
     <w:p>
       <w:pPr>
         <w:spacing w:after="60"/>
-      </w:pPr>
-      <w:r>
+        <w:rPr>
+          <w:rFonts w:ascii="Times New Roman" w:hAnsi="Times New Roman" w:cs="Times New Roman"/>
+        </w:rPr>
+      </w:pPr>
+      <w:r>
+        <w:rPr>
+          <w:rFonts w:ascii="Times New Roman" w:hAnsi="Times New Roman" w:cs="Times New Roman"/>
+        </w:rPr>
         <w:t>Any TDS deducted must be supported by a certificate within 6 months or by the end of the financial year, failing which the deducted amount becomes payable.</w:t>
       </w:r>
     </w:p>
     <w:p>
       <w:pPr>
         <w:spacing w:before="160" w:after="40"/>
-      </w:pPr>
-      <w:r>
-        <w:rPr>
-          <w:b/>
-          <w:bCs/>
-          <w:color w:val="65AADB"/>
+        <w:rPr>
+          <w:rFonts w:ascii="Times New Roman" w:hAnsi="Times New Roman" w:cs="Times New Roman"/>
+          <w:color w:val="000000" w:themeColor="text1"/>
+        </w:rPr>
+      </w:pPr>
+      <w:r>
+        <w:rPr>
+          <w:rFonts w:ascii="Times New Roman" w:hAnsi="Times New Roman" w:cs="Times New Roman"/>
+          <w:color w:val="000000" w:themeColor="text1"/>
+        </w:rPr>
+        <w:t>9. Validity of the Offer</w:t>
+      </w:r>
+    </w:p>
+    <w:p>
+      <w:pPr>
+        <w:spacing w:after="60"/>
+        <w:rPr>
+          <w:rFonts w:ascii="Times New Roman" w:hAnsi="Times New Roman" w:cs="Times New Roman"/>
+        </w:rPr>
+      </w:pPr>
+      <w:r>
+        <w:rPr>
+          <w:rFonts w:ascii="Times New Roman" w:hAnsi="Times New Roman" w:cs="Times New Roman"/>
+        </w:rPr>
+        <w:t>This offer is valid up to {{VALIDATION_DATE}}.</w:t>
+      </w:r>
+    </w:p>
+    <w:p>
+      <w:pPr>
+        <w:spacing w:before="160" w:after="40"/>
+        <w:rPr>
+          <w:rFonts w:ascii="Times New Roman" w:hAnsi="Times New Roman" w:cs="Times New Roman"/>
+          <w:color w:val="000000" w:themeColor="text1"/>
+        </w:rPr>
+      </w:pPr>
+      <w:r>
+        <w:rPr>
+          <w:rFonts w:ascii="Times New Roman" w:hAnsi="Times New Roman" w:cs="Times New Roman"/>
+          <w:color w:val="000000" w:themeColor="text1"/>
+        </w:rPr>
+        <w:t>10. Suggestions by Auditors / Consultants</w:t>
+      </w:r>
+    </w:p>
+    <w:p>
+      <w:pPr>
+        <w:spacing w:after="60"/>
+        <w:rPr>
+          <w:rFonts w:ascii="Times New Roman" w:hAnsi="Times New Roman" w:cs="Times New Roman"/>
+        </w:rPr>
+      </w:pPr>
+      <w:r>
+        <w:rPr>
+          <w:rFonts w:ascii="Times New Roman" w:hAnsi="Times New Roman" w:cs="Times New Roman"/>
+        </w:rPr>
+        <w:t>Any changes suggested by auditors or consultants must be raised before order finalization; later changes are chargeable separately.</w:t>
+      </w:r>
+    </w:p>
+    <w:p>
+      <w:pPr>
+        <w:spacing w:before="160" w:after="40"/>
+        <w:rPr>
+          <w:rFonts w:ascii="Times New Roman" w:hAnsi="Times New Roman" w:cs="Times New Roman"/>
+          <w:color w:val="000000" w:themeColor="text1"/>
+        </w:rPr>
+      </w:pPr>
+      <w:r>
+        <w:rPr>
+          <w:rFonts w:ascii="Times New Roman" w:hAnsi="Times New Roman" w:cs="Times New Roman"/>
+          <w:color w:val="000000" w:themeColor="text1"/>
+        </w:rPr>
+        <w:t>11. Legal</w:t>
+      </w:r>
+    </w:p>
+    <w:p>
+      <w:pPr>
+        <w:spacing w:after="60"/>
+        <w:rPr>
+          <w:rFonts w:ascii="Times New Roman" w:hAnsi="Times New Roman" w:cs="Times New Roman"/>
+        </w:rPr>
+      </w:pPr>
+      <w:r>
+        <w:rPr>
+          <w:rFonts w:ascii="Times New Roman" w:hAnsi="Times New Roman" w:cs="Times New Roman"/>
+        </w:rPr>
+        <w:t>Disputes arising from this order are subject to the jurisdiction of courts at Pune, Maharashtra.</w:t>
+      </w:r>
+    </w:p>
+    <w:p>
+      <w:pPr>
+        <w:spacing w:before="300" w:after="40"/>
+        <w:rPr>
+          <w:rFonts w:ascii="Times New Roman" w:hAnsi="Times New Roman" w:cs="Times New Roman"/>
+        </w:rPr>
+      </w:pPr>
+    </w:p>
+    <w:p>
+      <w:pPr>
+        <w:spacing w:before="300" w:after="40"/>
+        <w:rPr>
+          <w:rFonts w:ascii="Times New Roman" w:hAnsi="Times New Roman" w:cs="Times New Roman"/>
+        </w:rPr>
+      </w:pPr>
+      <w:r>
+        <w:rPr>
+          <w:rFonts w:ascii="Times New Roman" w:hAnsi="Times New Roman" w:cs="Times New Roman"/>
         </w:rPr>
         <w:lastRenderedPageBreak/>
-        <w:t>9. Validity of the Offer</w:t>
-      </w:r>
-    </w:p>
-    <w:p>
-      <w:pPr>
-        <w:spacing w:after="60"/>
-      </w:pPr>
-      <w:r>
-        <w:t>This offer is valid up to {{VALIDATION_DATE}}.</w:t>
-      </w:r>
-    </w:p>
-    <w:p>
-      <w:pPr>
-        <w:spacing w:before="160" w:after="40"/>
-      </w:pPr>
-      <w:r>
-        <w:rPr>
-          <w:b/>
-          <w:bCs/>
-          <w:color w:val="65AADB"/>
-        </w:rPr>
-        <w:t>10. Suggestions by Auditors / Consultants</w:t>
-      </w:r>
-    </w:p>
-    <w:p>
-      <w:pPr>
-        <w:spacing w:after="60"/>
-      </w:pPr>
-      <w:r>
-        <w:t>Any changes suggested by auditors or consultants must be raised before order finalization; later changes are chargeable separately.</w:t>
-      </w:r>
-    </w:p>
-    <w:p>
-      <w:pPr>
-        <w:spacing w:before="160" w:after="40"/>
-      </w:pPr>
-      <w:r>
-        <w:rPr>
-          <w:b/>
-          <w:bCs/>
-          <w:color w:val="65AADB"/>
-        </w:rPr>
-        <w:t>11. Legal</w:t>
-      </w:r>
-    </w:p>
-    <w:p>
-      <w:pPr>
-        <w:spacing w:after="60"/>
-      </w:pPr>
-      <w:r>
-        <w:t>Disputes arising from this order are subject to the jurisdiction of courts at Pune, Maharashtra.</w:t>
-      </w:r>
-    </w:p>
-    <w:p>
-      <w:pPr>
-        <w:spacing w:before="300" w:after="40"/>
-      </w:pPr>
-    </w:p>
-    <w:p>
-      <w:pPr>
-        <w:spacing w:before="300" w:after="40"/>
-      </w:pPr>
-      <w:r>
         <w:t>We hope this document aligns with our discussions. Please feel free to reach out for any clarification. Thanking you in anticipation.</w:t>
       </w:r>
     </w:p>
     <w:p>
       <w:pPr>
         <w:spacing w:before="200" w:after="40"/>
-      </w:pPr>
-      <w:r>
+        <w:rPr>
+          <w:rFonts w:ascii="Times New Roman" w:hAnsi="Times New Roman" w:cs="Times New Roman"/>
+        </w:rPr>
+      </w:pPr>
+      <w:r>
+        <w:rPr>
+          <w:rFonts w:ascii="Times New Roman" w:hAnsi="Times New Roman" w:cs="Times New Roman"/>
+        </w:rPr>
         <w:t>Sincerely,</w:t>
       </w:r>
     </w:p>
@@ -2279,34 +3140,30 @@
       <w:pPr>
         <w:spacing w:after="20"/>
         <w:rPr>
-          <w:b/>
-          <w:bCs/>
-          <w:color w:val="65AADB"/>
-        </w:rPr>
-      </w:pPr>
-      <w:r>
-        <w:rPr>
-          <w:b/>
-          <w:bCs/>
-          <w:color w:val="65AADB"/>
+          <w:rFonts w:ascii="Times New Roman" w:hAnsi="Times New Roman" w:cs="Times New Roman"/>
+          <w:color w:val="000000" w:themeColor="text1"/>
+        </w:rPr>
+      </w:pPr>
+      <w:r>
+        <w:rPr>
+          <w:rFonts w:ascii="Times New Roman" w:hAnsi="Times New Roman" w:cs="Times New Roman"/>
+          <w:color w:val="000000" w:themeColor="text1"/>
         </w:rPr>
         <w:t xml:space="preserve">For </w:t>
       </w:r>
       <w:proofErr w:type="spellStart"/>
       <w:r>
         <w:rPr>
-          <w:b/>
-          <w:bCs/>
-          <w:color w:val="65AADB"/>
+          <w:rFonts w:ascii="Times New Roman" w:hAnsi="Times New Roman" w:cs="Times New Roman"/>
+          <w:color w:val="000000" w:themeColor="text1"/>
         </w:rPr>
         <w:t>BlechTek</w:t>
       </w:r>
       <w:proofErr w:type="spellEnd"/>
       <w:r>
         <w:rPr>
-          <w:b/>
-          <w:bCs/>
-          <w:color w:val="65AADB"/>
+          <w:rFonts w:ascii="Times New Roman" w:hAnsi="Times New Roman" w:cs="Times New Roman"/>
+          <w:color w:val="000000" w:themeColor="text1"/>
         </w:rPr>
         <w:t xml:space="preserve"> Software Solutions LLP</w:t>
       </w:r>
@@ -2314,9 +3171,13 @@
     <w:p>
       <w:pPr>
         <w:spacing w:after="20"/>
-      </w:pPr>
-      <w:r>
-        <w:rPr>
+        <w:rPr>
+          <w:rFonts w:ascii="Times New Roman" w:hAnsi="Times New Roman" w:cs="Times New Roman"/>
+        </w:rPr>
+      </w:pPr>
+      <w:r>
+        <w:rPr>
+          <w:rFonts w:ascii="Times New Roman" w:hAnsi="Times New Roman" w:cs="Times New Roman"/>
           <w:noProof/>
         </w:rPr>
         <w:drawing>
@@ -2333,7 +3194,7 @@
                     <pic:cNvPicPr/>
                   </pic:nvPicPr>
                   <pic:blipFill>
-                    <a:blip r:embed="rId7"/>
+                    <a:blip r:embed="rId8"/>
                     <a:stretch>
                       <a:fillRect/>
                     </a:stretch>
@@ -2357,19 +3218,36 @@
     <w:p>
       <w:pPr>
         <w:spacing w:after="20"/>
-      </w:pPr>
-      <w:r>
-        <w:rPr>
-          <w:b/>
-          <w:bCs/>
-          <w:color w:val="65AADB"/>
+        <w:rPr>
+          <w:rFonts w:ascii="Times New Roman" w:hAnsi="Times New Roman" w:cs="Times New Roman"/>
+        </w:rPr>
+      </w:pPr>
+      <w:r>
+        <w:rPr>
+          <w:rFonts w:ascii="Times New Roman" w:hAnsi="Times New Roman" w:cs="Times New Roman"/>
+        </w:rPr>
+        <w:t>should pay us the deducted TDS amount immediately.</w:t>
+      </w:r>
+    </w:p>
+    <w:p>
+      <w:pPr>
+        <w:spacing w:after="20"/>
+        <w:rPr>
+          <w:rFonts w:ascii="Times New Roman" w:hAnsi="Times New Roman" w:cs="Times New Roman"/>
+          <w:color w:val="000000" w:themeColor="text1"/>
+        </w:rPr>
+      </w:pPr>
+      <w:r>
+        <w:rPr>
+          <w:rFonts w:ascii="Times New Roman" w:hAnsi="Times New Roman" w:cs="Times New Roman"/>
+          <w:color w:val="000000" w:themeColor="text1"/>
         </w:rPr>
         <w:t>Sushama Inamdar</w:t>
       </w:r>
     </w:p>
     <w:sectPr>
-      <w:headerReference w:type="default" r:id="rId8"/>
-      <w:footerReference w:type="default" r:id="rId9"/>
+      <w:headerReference w:type="default" r:id="rId9"/>
+      <w:footerReference w:type="default" r:id="rId10"/>
       <w:pgSz w:w="12240" w:h="15840"/>
       <w:pgMar w:top="1000" w:right="1100" w:bottom="1000" w:left="1100" w:header="708" w:footer="737" w:gutter="0"/>
       <w:cols w:space="720"/>
@@ -2409,48 +3287,7 @@
   <w:p>
     <w:pPr>
       <w:spacing w:after="60"/>
-      <w:jc w:val="center"/>
     </w:pPr>
-    <w:r>
-      <w:rPr>
-        <w:noProof/>
-      </w:rPr>
-      <w:drawing>
-        <wp:inline distT="0" distB="0" distL="0" distR="0" wp14:anchorId="1A2B3C4D" wp14:editId="1A2B3C4E">
-          <wp:extent cx="6375400" cy="48007"/>
-          <wp:effectExtent l="0" t="0" r="0" b="0"/>
-          <wp:docPr id="1" name="Footer Line"/>
-          <wp:cNvGraphicFramePr>
-            <a:graphicFrameLocks xmlns:a="http://schemas.openxmlformats.org/drawingml/2006/main" noChangeAspect="1"/>
-          </wp:cNvGraphicFramePr>
-          <a:graphic xmlns:a="http://schemas.openxmlformats.org/drawingml/2006/main">
-            <a:graphicData uri="http://schemas.openxmlformats.org/drawingml/2006/picture">
-              <pic:pic xmlns:pic="http://schemas.openxmlformats.org/drawingml/2006/picture">
-                <pic:nvPicPr>
-                  <pic:cNvPr id="1" name="Footer Line"/>
-                  <pic:cNvPicPr/>
-                </pic:nvPicPr>
-                <pic:blipFill>
-                  <a:blip r:embed="rId1"/>
-                  <a:stretch>
-                    <a:fillRect/>
-                  </a:stretch>
-                </pic:blipFill>
-                <pic:spPr>
-                  <a:xfrm>
-                    <a:off x="0" y="0"/>
-                    <a:ext cx="6375400" cy="48007"/>
-                  </a:xfrm>
-                  <a:prstGeom prst="rect">
-                    <a:avLst/>
-                  </a:prstGeom>
-                </pic:spPr>
-              </pic:pic>
-            </a:graphicData>
-          </a:graphic>
-        </wp:inline>
-      </w:drawing>
-    </w:r>
   </w:p>
   <w:p>
     <w:pPr>
@@ -2478,6 +3315,11 @@
   <w:p>
     <w:pPr>
       <w:jc w:val="center"/>
+      <w:rPr>
+        <w:color w:val="5B6478"/>
+        <w:sz w:val="14"/>
+        <w:szCs w:val="14"/>
+      </w:rPr>
     </w:pPr>
     <w:r>
       <w:rPr>
@@ -2558,6 +3400,46 @@
         <w:szCs w:val="14"/>
       </w:rPr>
       <w:t>, Pune 411021, Maharashtra</w:t>
+    </w:r>
+    <w:r>
+      <w:rPr>
+        <w:noProof/>
+      </w:rPr>
+      <w:drawing>
+        <wp:inline distT="0" distB="0" distL="0" distR="0" wp14:anchorId="0C7DB755" wp14:editId="4C568021">
+          <wp:extent cx="6375400" cy="47625"/>
+          <wp:effectExtent l="0" t="0" r="6350" b="9525"/>
+          <wp:docPr id="1" name="Footer Line"/>
+          <wp:cNvGraphicFramePr>
+            <a:graphicFrameLocks xmlns:a="http://schemas.openxmlformats.org/drawingml/2006/main" noChangeAspect="1"/>
+          </wp:cNvGraphicFramePr>
+          <a:graphic xmlns:a="http://schemas.openxmlformats.org/drawingml/2006/main">
+            <a:graphicData uri="http://schemas.openxmlformats.org/drawingml/2006/picture">
+              <pic:pic xmlns:pic="http://schemas.openxmlformats.org/drawingml/2006/picture">
+                <pic:nvPicPr>
+                  <pic:cNvPr id="1" name="Footer Line"/>
+                  <pic:cNvPicPr/>
+                </pic:nvPicPr>
+                <pic:blipFill>
+                  <a:blip r:embed="rId1"/>
+                  <a:stretch>
+                    <a:fillRect/>
+                  </a:stretch>
+                </pic:blipFill>
+                <pic:spPr>
+                  <a:xfrm>
+                    <a:off x="0" y="0"/>
+                    <a:ext cx="6375400" cy="47625"/>
+                  </a:xfrm>
+                  <a:prstGeom prst="rect">
+                    <a:avLst/>
+                  </a:prstGeom>
+                </pic:spPr>
+              </pic:pic>
+            </a:graphicData>
+          </a:graphic>
+        </wp:inline>
+      </w:drawing>
     </w:r>
   </w:p>
   <w:p>
@@ -3734,4 +4616,16 @@
     </a:ext>
   </a:extLst>
 </a:theme>
+</file>
+
+<file path=customXml/item1.xml><?xml version="1.0" encoding="utf-8"?>
+<b:Sources xmlns:b="http://schemas.openxmlformats.org/officeDocument/2006/bibliography" xmlns="http://schemas.openxmlformats.org/officeDocument/2006/bibliography" SelectedStyle="\APASixthEditionOfficeOnline.xsl" StyleName="APA" Version="6"/>
+</file>
+
+<file path=customXml/itemProps1.xml><?xml version="1.0" encoding="utf-8"?>
+<ds:datastoreItem xmlns:ds="http://schemas.openxmlformats.org/officeDocument/2006/customXml" ds:itemID="{5E9A604C-DCBE-4FA7-8134-7A5CFE84147D}">
+  <ds:schemaRefs>
+    <ds:schemaRef ds:uri="http://schemas.openxmlformats.org/officeDocument/2006/bibliography"/>
+  </ds:schemaRefs>
+</ds:datastoreItem>
 </file>
</xml_diff>

<commit_message>
updates about additional scope point
</commit_message>
<xml_diff>
--- a/QuotationApp.API/Templates/QuotationTemplate_Updated.docx
+++ b/QuotationApp.API/Templates/QuotationTemplate_Updated.docx
@@ -1163,6 +1163,308 @@
         </w:rPr>
       </w:pPr>
     </w:p>
+    <w:p>
+      <w:pPr>
+        <w:spacing w:after="200"/>
+        <w:rPr>
+          <w:rFonts w:ascii="Times New Roman" w:hAnsi="Times New Roman" w:cs="Times New Roman"/>
+        </w:rPr>
+      </w:pPr>
+      <w:r>
+        <w:rPr>
+          <w:rFonts w:ascii="Times New Roman" w:hAnsi="Times New Roman" w:cs="Times New Roman"/>
+        </w:rPr>
+        <w:t>Additional Scope:</w:t>
+      </w:r>
+    </w:p>
+    <w:tbl>
+      <w:tblPr>
+        <w:tblStyle w:val="TableGrid0"/>
+        <w:tblW w:w="9837" w:type="dxa"/>
+        <w:tblInd w:w="-5" w:type="dxa"/>
+        <w:tblLayout w:type="fixed"/>
+        <w:tblLook w:val="04A0" w:firstRow="1" w:lastRow="0" w:firstColumn="1" w:lastColumn="0" w:noHBand="0" w:noVBand="1"/>
+      </w:tblPr>
+      <w:tblGrid>
+        <w:gridCol w:w="1802"/>
+        <w:gridCol w:w="2218"/>
+        <w:gridCol w:w="1802"/>
+        <w:gridCol w:w="1248"/>
+        <w:gridCol w:w="1386"/>
+        <w:gridCol w:w="1381"/>
+      </w:tblGrid>
+      <w:tr>
+        <w:trPr>
+          <w:trHeight w:val="514"/>
+        </w:trPr>
+        <w:tc>
+          <w:tcPr>
+            <w:tcW w:w="1802" w:type="dxa"/>
+          </w:tcPr>
+          <w:p>
+            <w:pPr>
+              <w:spacing w:after="240" w:line="276" w:lineRule="auto"/>
+              <w:rPr>
+                <w:rFonts w:ascii="Times New Roman" w:hAnsi="Times New Roman" w:cs="Times New Roman"/>
+                <w:color w:val="000000" w:themeColor="text1"/>
+              </w:rPr>
+            </w:pPr>
+            <w:r>
+              <w:rPr>
+                <w:rFonts w:ascii="Times New Roman" w:hAnsi="Times New Roman" w:cs="Times New Roman"/>
+                <w:color w:val="000000" w:themeColor="text1"/>
+              </w:rPr>
+              <w:t>Requirements</w:t>
+            </w:r>
+          </w:p>
+        </w:tc>
+        <w:tc>
+          <w:tcPr>
+            <w:tcW w:w="2218" w:type="dxa"/>
+          </w:tcPr>
+          <w:p>
+            <w:pPr>
+              <w:spacing w:after="240" w:line="276" w:lineRule="auto"/>
+              <w:rPr>
+                <w:rFonts w:ascii="Times New Roman" w:hAnsi="Times New Roman" w:cs="Times New Roman"/>
+                <w:color w:val="000000" w:themeColor="text1"/>
+              </w:rPr>
+            </w:pPr>
+            <w:r>
+              <w:rPr>
+                <w:rFonts w:ascii="Times New Roman" w:hAnsi="Times New Roman" w:cs="Times New Roman"/>
+                <w:color w:val="000000" w:themeColor="text1"/>
+              </w:rPr>
+              <w:t>Module</w:t>
+            </w:r>
+          </w:p>
+        </w:tc>
+        <w:tc>
+          <w:tcPr>
+            <w:tcW w:w="1802" w:type="dxa"/>
+          </w:tcPr>
+          <w:p>
+            <w:pPr>
+              <w:spacing w:after="240" w:line="276" w:lineRule="auto"/>
+              <w:rPr>
+                <w:rFonts w:ascii="Times New Roman" w:hAnsi="Times New Roman" w:cs="Times New Roman"/>
+                <w:color w:val="000000" w:themeColor="text1"/>
+              </w:rPr>
+            </w:pPr>
+            <w:r>
+              <w:rPr>
+                <w:rFonts w:ascii="Times New Roman" w:hAnsi="Times New Roman" w:cs="Times New Roman"/>
+                <w:color w:val="000000" w:themeColor="text1"/>
+              </w:rPr>
+              <w:t xml:space="preserve">No. of </w:t>
+            </w:r>
+            <w:proofErr w:type="gramStart"/>
+            <w:r>
+              <w:rPr>
+                <w:rFonts w:ascii="Times New Roman" w:hAnsi="Times New Roman" w:cs="Times New Roman"/>
+                <w:color w:val="000000" w:themeColor="text1"/>
+              </w:rPr>
+              <w:t>Man Power</w:t>
+            </w:r>
+            <w:proofErr w:type="gramEnd"/>
+          </w:p>
+        </w:tc>
+        <w:tc>
+          <w:tcPr>
+            <w:tcW w:w="1248" w:type="dxa"/>
+          </w:tcPr>
+          <w:p>
+            <w:pPr>
+              <w:spacing w:after="240" w:line="276" w:lineRule="auto"/>
+              <w:rPr>
+                <w:rFonts w:ascii="Times New Roman" w:hAnsi="Times New Roman" w:cs="Times New Roman"/>
+                <w:color w:val="000000" w:themeColor="text1"/>
+              </w:rPr>
+            </w:pPr>
+            <w:r>
+              <w:rPr>
+                <w:rFonts w:ascii="Times New Roman" w:hAnsi="Times New Roman" w:cs="Times New Roman"/>
+                <w:color w:val="000000" w:themeColor="text1"/>
+              </w:rPr>
+              <w:t>No. of Days</w:t>
+            </w:r>
+          </w:p>
+        </w:tc>
+        <w:tc>
+          <w:tcPr>
+            <w:tcW w:w="1386" w:type="dxa"/>
+          </w:tcPr>
+          <w:p>
+            <w:pPr>
+              <w:spacing w:after="240" w:line="276" w:lineRule="auto"/>
+              <w:rPr>
+                <w:rFonts w:ascii="Times New Roman" w:hAnsi="Times New Roman" w:cs="Times New Roman"/>
+                <w:color w:val="000000" w:themeColor="text1"/>
+              </w:rPr>
+            </w:pPr>
+            <w:r>
+              <w:rPr>
+                <w:rFonts w:ascii="Times New Roman" w:hAnsi="Times New Roman" w:cs="Times New Roman"/>
+                <w:color w:val="000000" w:themeColor="text1"/>
+              </w:rPr>
+              <w:t xml:space="preserve">Rate </w:t>
+            </w:r>
+          </w:p>
+        </w:tc>
+        <w:tc>
+          <w:tcPr>
+            <w:tcW w:w="1381" w:type="dxa"/>
+          </w:tcPr>
+          <w:p>
+            <w:pPr>
+              <w:spacing w:after="240" w:line="276" w:lineRule="auto"/>
+              <w:rPr>
+                <w:rFonts w:ascii="Times New Roman" w:hAnsi="Times New Roman" w:cs="Times New Roman"/>
+                <w:color w:val="000000" w:themeColor="text1"/>
+              </w:rPr>
+            </w:pPr>
+            <w:r>
+              <w:rPr>
+                <w:rFonts w:ascii="Times New Roman" w:hAnsi="Times New Roman" w:cs="Times New Roman"/>
+                <w:color w:val="000000" w:themeColor="text1"/>
+              </w:rPr>
+              <w:t>Amount</w:t>
+            </w:r>
+          </w:p>
+        </w:tc>
+      </w:tr>
+      <w:tr>
+        <w:trPr>
+          <w:trHeight w:val="1028"/>
+        </w:trPr>
+        <w:tc>
+          <w:tcPr>
+            <w:tcW w:w="1802" w:type="dxa"/>
+          </w:tcPr>
+          <w:p>
+            <w:pPr>
+              <w:spacing w:after="240" w:line="276" w:lineRule="auto"/>
+              <w:rPr>
+                <w:rFonts w:ascii="Times New Roman" w:hAnsi="Times New Roman" w:cs="Times New Roman"/>
+                <w:color w:val="000000" w:themeColor="text1"/>
+              </w:rPr>
+            </w:pPr>
+            <w:r>
+              <w:rPr>
+                <w:rFonts w:ascii="Times New Roman" w:hAnsi="Times New Roman" w:cs="Times New Roman"/>
+                <w:color w:val="000000" w:themeColor="text1"/>
+              </w:rPr>
+              <w:t>{{ADD_SCOPE_REQUIREMENT}}</w:t>
+            </w:r>
+          </w:p>
+        </w:tc>
+        <w:tc>
+          <w:tcPr>
+            <w:tcW w:w="2218" w:type="dxa"/>
+          </w:tcPr>
+          <w:p>
+            <w:pPr>
+              <w:spacing w:after="240" w:line="276" w:lineRule="auto"/>
+              <w:rPr>
+                <w:rFonts w:ascii="Times New Roman" w:hAnsi="Times New Roman" w:cs="Times New Roman"/>
+                <w:color w:val="000000" w:themeColor="text1"/>
+              </w:rPr>
+            </w:pPr>
+            <w:r>
+              <w:rPr>
+                <w:rFonts w:ascii="Times New Roman" w:hAnsi="Times New Roman" w:cs="Times New Roman"/>
+                <w:color w:val="000000" w:themeColor="text1"/>
+              </w:rPr>
+              <w:t>{{ADD_SCOPE_MODULE}}</w:t>
+            </w:r>
+          </w:p>
+        </w:tc>
+        <w:tc>
+          <w:tcPr>
+            <w:tcW w:w="1802" w:type="dxa"/>
+          </w:tcPr>
+          <w:p>
+            <w:pPr>
+              <w:spacing w:after="240" w:line="276" w:lineRule="auto"/>
+              <w:rPr>
+                <w:rFonts w:ascii="Times New Roman" w:hAnsi="Times New Roman" w:cs="Times New Roman"/>
+                <w:color w:val="000000" w:themeColor="text1"/>
+              </w:rPr>
+            </w:pPr>
+            <w:r>
+              <w:rPr>
+                <w:rFonts w:ascii="Times New Roman" w:hAnsi="Times New Roman" w:cs="Times New Roman"/>
+                <w:color w:val="000000" w:themeColor="text1"/>
+              </w:rPr>
+              <w:t>{{ADD_SCOPE_MANPOWER}}</w:t>
+            </w:r>
+          </w:p>
+        </w:tc>
+        <w:tc>
+          <w:tcPr>
+            <w:tcW w:w="1248" w:type="dxa"/>
+          </w:tcPr>
+          <w:p>
+            <w:pPr>
+              <w:spacing w:after="240" w:line="276" w:lineRule="auto"/>
+              <w:rPr>
+                <w:rFonts w:ascii="Times New Roman" w:hAnsi="Times New Roman" w:cs="Times New Roman"/>
+                <w:color w:val="000000" w:themeColor="text1"/>
+              </w:rPr>
+            </w:pPr>
+            <w:r>
+              <w:rPr>
+                <w:rFonts w:ascii="Times New Roman" w:hAnsi="Times New Roman" w:cs="Times New Roman"/>
+                <w:color w:val="000000" w:themeColor="text1"/>
+              </w:rPr>
+              <w:t>{{ADD_SCOPE_DAYS}}</w:t>
+            </w:r>
+          </w:p>
+        </w:tc>
+        <w:tc>
+          <w:tcPr>
+            <w:tcW w:w="1386" w:type="dxa"/>
+          </w:tcPr>
+          <w:p>
+            <w:pPr>
+              <w:spacing w:after="240" w:line="276" w:lineRule="auto"/>
+              <w:rPr>
+                <w:rFonts w:ascii="Times New Roman" w:hAnsi="Times New Roman" w:cs="Times New Roman"/>
+                <w:color w:val="000000" w:themeColor="text1"/>
+              </w:rPr>
+            </w:pPr>
+            <w:r>
+              <w:rPr>
+                <w:rFonts w:ascii="Times New Roman" w:hAnsi="Times New Roman" w:cs="Times New Roman"/>
+                <w:color w:val="000000" w:themeColor="text1"/>
+              </w:rPr>
+              <w:t>{{ADD_SCOPE_RATE}}</w:t>
+            </w:r>
+          </w:p>
+        </w:tc>
+        <w:tc>
+          <w:tcPr>
+            <w:tcW w:w="1381" w:type="dxa"/>
+          </w:tcPr>
+          <w:p>
+            <w:pPr>
+              <w:spacing w:after="240" w:line="276" w:lineRule="auto"/>
+              <w:rPr>
+                <w:rFonts w:ascii="Times New Roman" w:hAnsi="Times New Roman" w:cs="Times New Roman"/>
+                <w:color w:val="000000" w:themeColor="text1"/>
+              </w:rPr>
+            </w:pPr>
+            <w:r>
+              <w:rPr>
+                <w:rFonts w:ascii="Times New Roman" w:hAnsi="Times New Roman" w:cs="Times New Roman"/>
+                <w:color w:val="000000" w:themeColor="text1"/>
+              </w:rPr>
+              <w:t>{{ADD_SCOPE_AMOUNT}}</w:t>
+            </w:r>
+          </w:p>
+        </w:tc>
+      </w:tr>
+    </w:tbl>
     <w:p>
       <w:pPr>
         <w:spacing w:before="300" w:after="150"/>
@@ -2248,6 +2550,7 @@
               <w:rPr>
                 <w:rFonts w:ascii="Times New Roman" w:hAnsi="Times New Roman" w:cs="Times New Roman"/>
               </w:rPr>
+              <w:lastRenderedPageBreak/>
               <w:t>New/Change in Document Prin ng format, New/Changes in Reports, New/Change in Reports</w:t>
             </w:r>
           </w:p>
@@ -2275,6 +2578,7 @@
               <w:rPr>
                 <w:rFonts w:ascii="Times New Roman" w:hAnsi="Times New Roman" w:cs="Times New Roman"/>
               </w:rPr>
+              <w:lastRenderedPageBreak/>
               <w:t xml:space="preserve">Chargeable  </w:t>
             </w:r>
           </w:p>
@@ -2551,7 +2855,6 @@
               <w:rPr>
                 <w:rFonts w:ascii="Times New Roman" w:hAnsi="Times New Roman" w:cs="Times New Roman"/>
               </w:rPr>
-              <w:lastRenderedPageBreak/>
               <w:t>7</w:t>
             </w:r>
           </w:p>
@@ -3468,15 +3771,20 @@
     <w:p>
       <w:pPr>
         <w:spacing w:after="160" w:line="259" w:lineRule="auto"/>
-      </w:pPr>
-      <w:r>
-        <w:rPr>
+        <w:rPr>
+          <w:rFonts w:ascii="Times New Roman" w:hAnsi="Times New Roman" w:cs="Times New Roman"/>
+        </w:rPr>
+      </w:pPr>
+      <w:r>
+        <w:rPr>
+          <w:rFonts w:ascii="Times New Roman" w:hAnsi="Times New Roman" w:cs="Times New Roman"/>
           <w:w w:val="101"/>
         </w:rPr>
         <w:t>Time</w:t>
       </w:r>
       <w:r>
         <w:rPr>
+          <w:rFonts w:ascii="Times New Roman" w:hAnsi="Times New Roman" w:cs="Times New Roman"/>
           <w:spacing w:val="-3"/>
           <w:w w:val="101"/>
         </w:rPr>
@@ -3484,12 +3792,14 @@
       </w:r>
       <w:r>
         <w:rPr>
+          <w:rFonts w:ascii="Times New Roman" w:hAnsi="Times New Roman" w:cs="Times New Roman"/>
           <w:w w:val="101"/>
         </w:rPr>
         <w:t>Estimate</w:t>
       </w:r>
       <w:r>
         <w:rPr>
+          <w:rFonts w:ascii="Times New Roman" w:hAnsi="Times New Roman" w:cs="Times New Roman"/>
           <w:spacing w:val="-5"/>
           <w:w w:val="101"/>
         </w:rPr>
@@ -4333,6 +4643,7 @@
         <w:rPr>
           <w:rFonts w:ascii="Times New Roman" w:hAnsi="Times New Roman" w:cs="Times New Roman"/>
         </w:rPr>
+        <w:lastRenderedPageBreak/>
         <w:t>You</w:t>
       </w:r>
       <w:r>
@@ -4834,6 +5145,7 @@
           <w:rFonts w:ascii="Times New Roman" w:hAnsi="Times New Roman" w:cs="Times New Roman"/>
           <w:color w:val="000000" w:themeColor="text1"/>
         </w:rPr>
+        <w:lastRenderedPageBreak/>
         <w:t>8. TDS</w:t>
       </w:r>
     </w:p>

</xml_diff>

<commit_message>
updates about price of implementation part for showing the module wise data is sr no 1 row only.
</commit_message>
<xml_diff>
--- a/QuotationApp.API/Templates/QuotationTemplate_Updated.docx
+++ b/QuotationApp.API/Templates/QuotationTemplate_Updated.docx
@@ -1195,7 +1195,7 @@
       </w:tblGrid>
       <w:tr>
         <w:trPr>
-          <w:trHeight w:val="568"/>
+          <w:trHeight w:val="308"/>
         </w:trPr>
         <w:tc>
           <w:tcPr>
@@ -1203,7 +1203,7 @@
           </w:tcPr>
           <w:p>
             <w:pPr>
-              <w:spacing w:after="240" w:line="276" w:lineRule="auto"/>
+              <w:spacing w:line="276" w:lineRule="auto"/>
               <w:rPr>
                 <w:rFonts w:ascii="Times New Roman" w:hAnsi="Times New Roman" w:cs="Times New Roman"/>
                 <w:color w:val="000000" w:themeColor="text1"/>
@@ -1224,7 +1224,7 @@
           </w:tcPr>
           <w:p>
             <w:pPr>
-              <w:spacing w:after="240" w:line="276" w:lineRule="auto"/>
+              <w:spacing w:line="276" w:lineRule="auto"/>
               <w:rPr>
                 <w:rFonts w:ascii="Times New Roman" w:hAnsi="Times New Roman" w:cs="Times New Roman"/>
                 <w:color w:val="000000" w:themeColor="text1"/>
@@ -1245,7 +1245,7 @@
           </w:tcPr>
           <w:p>
             <w:pPr>
-              <w:spacing w:after="240" w:line="276" w:lineRule="auto"/>
+              <w:spacing w:line="276" w:lineRule="auto"/>
               <w:rPr>
                 <w:rFonts w:ascii="Times New Roman" w:hAnsi="Times New Roman" w:cs="Times New Roman"/>
                 <w:color w:val="000000" w:themeColor="text1"/>
@@ -1256,58 +1256,49 @@
                 <w:rFonts w:ascii="Times New Roman" w:hAnsi="Times New Roman" w:cs="Times New Roman"/>
                 <w:color w:val="000000" w:themeColor="text1"/>
               </w:rPr>
-              <w:t xml:space="preserve">No. of </w:t>
-            </w:r>
-            <w:proofErr w:type="gramStart"/>
-            <w:r>
+              <w:t>No. of Man Power</w:t>
+            </w:r>
+          </w:p>
+        </w:tc>
+        <w:tc>
+          <w:tcPr>
+            <w:tcW w:w="1270" w:type="dxa"/>
+          </w:tcPr>
+          <w:p>
+            <w:pPr>
+              <w:spacing w:line="276" w:lineRule="auto"/>
               <w:rPr>
                 <w:rFonts w:ascii="Times New Roman" w:hAnsi="Times New Roman" w:cs="Times New Roman"/>
                 <w:color w:val="000000" w:themeColor="text1"/>
               </w:rPr>
-              <w:t>Man Power</w:t>
-            </w:r>
-            <w:proofErr w:type="gramEnd"/>
-          </w:p>
-        </w:tc>
-        <w:tc>
-          <w:tcPr>
-            <w:tcW w:w="1270" w:type="dxa"/>
-          </w:tcPr>
-          <w:p>
-            <w:pPr>
-              <w:spacing w:after="240" w:line="276" w:lineRule="auto"/>
+            </w:pPr>
+            <w:r>
               <w:rPr>
                 <w:rFonts w:ascii="Times New Roman" w:hAnsi="Times New Roman" w:cs="Times New Roman"/>
                 <w:color w:val="000000" w:themeColor="text1"/>
               </w:rPr>
-            </w:pPr>
-            <w:r>
+              <w:t>No. of Days</w:t>
+            </w:r>
+          </w:p>
+        </w:tc>
+        <w:tc>
+          <w:tcPr>
+            <w:tcW w:w="1411" w:type="dxa"/>
+          </w:tcPr>
+          <w:p>
+            <w:pPr>
+              <w:spacing w:line="276" w:lineRule="auto"/>
               <w:rPr>
                 <w:rFonts w:ascii="Times New Roman" w:hAnsi="Times New Roman" w:cs="Times New Roman"/>
                 <w:color w:val="000000" w:themeColor="text1"/>
               </w:rPr>
-              <w:t>No. of Days</w:t>
-            </w:r>
-          </w:p>
-        </w:tc>
-        <w:tc>
-          <w:tcPr>
-            <w:tcW w:w="1411" w:type="dxa"/>
-          </w:tcPr>
-          <w:p>
-            <w:pPr>
-              <w:spacing w:after="240" w:line="276" w:lineRule="auto"/>
+            </w:pPr>
+            <w:r>
               <w:rPr>
                 <w:rFonts w:ascii="Times New Roman" w:hAnsi="Times New Roman" w:cs="Times New Roman"/>
                 <w:color w:val="000000" w:themeColor="text1"/>
               </w:rPr>
-            </w:pPr>
-            <w:r>
-              <w:rPr>
-                <w:rFonts w:ascii="Times New Roman" w:hAnsi="Times New Roman" w:cs="Times New Roman"/>
-                <w:color w:val="000000" w:themeColor="text1"/>
-              </w:rPr>
-              <w:t xml:space="preserve">Rate </w:t>
+              <w:t>Rate</w:t>
             </w:r>
           </w:p>
         </w:tc>
@@ -1317,7 +1308,7 @@
           </w:tcPr>
           <w:p>
             <w:pPr>
-              <w:spacing w:after="240" w:line="276" w:lineRule="auto"/>
+              <w:spacing w:line="276" w:lineRule="auto"/>
               <w:rPr>
                 <w:rFonts w:ascii="Times New Roman" w:hAnsi="Times New Roman" w:cs="Times New Roman"/>
                 <w:color w:val="000000" w:themeColor="text1"/>
@@ -1343,7 +1334,7 @@
           </w:tcPr>
           <w:p>
             <w:pPr>
-              <w:spacing w:after="240" w:line="276" w:lineRule="auto"/>
+              <w:spacing w:before="240" w:after="240"/>
               <w:rPr>
                 <w:rFonts w:ascii="Times New Roman" w:hAnsi="Times New Roman" w:cs="Times New Roman"/>
                 <w:color w:val="000000" w:themeColor="text1"/>
@@ -1364,7 +1355,7 @@
           </w:tcPr>
           <w:p>
             <w:pPr>
-              <w:spacing w:after="240" w:line="276" w:lineRule="auto"/>
+              <w:spacing w:before="240" w:after="240"/>
               <w:rPr>
                 <w:rFonts w:ascii="Times New Roman" w:hAnsi="Times New Roman" w:cs="Times New Roman"/>
                 <w:color w:val="000000" w:themeColor="text1"/>
@@ -1385,7 +1376,7 @@
           </w:tcPr>
           <w:p>
             <w:pPr>
-              <w:spacing w:after="240" w:line="276" w:lineRule="auto"/>
+              <w:spacing w:before="240" w:after="240"/>
               <w:rPr>
                 <w:rFonts w:ascii="Times New Roman" w:hAnsi="Times New Roman" w:cs="Times New Roman"/>
                 <w:color w:val="000000" w:themeColor="text1"/>
@@ -1406,7 +1397,7 @@
           </w:tcPr>
           <w:p>
             <w:pPr>
-              <w:spacing w:after="240" w:line="276" w:lineRule="auto"/>
+              <w:spacing w:before="240" w:after="240"/>
               <w:rPr>
                 <w:rFonts w:ascii="Times New Roman" w:hAnsi="Times New Roman" w:cs="Times New Roman"/>
                 <w:color w:val="000000" w:themeColor="text1"/>
@@ -1427,7 +1418,7 @@
           </w:tcPr>
           <w:p>
             <w:pPr>
-              <w:spacing w:after="240" w:line="276" w:lineRule="auto"/>
+              <w:spacing w:before="240" w:after="240"/>
               <w:rPr>
                 <w:rFonts w:ascii="Times New Roman" w:hAnsi="Times New Roman" w:cs="Times New Roman"/>
                 <w:color w:val="000000" w:themeColor="text1"/>
@@ -1448,7 +1439,7 @@
           </w:tcPr>
           <w:p>
             <w:pPr>
-              <w:spacing w:after="240" w:line="276" w:lineRule="auto"/>
+              <w:spacing w:before="240" w:after="240"/>
               <w:rPr>
                 <w:rFonts w:ascii="Times New Roman" w:hAnsi="Times New Roman" w:cs="Times New Roman"/>
                 <w:color w:val="000000" w:themeColor="text1"/>
@@ -1562,6 +1553,7 @@
           </w:tcPr>
           <w:p>
             <w:pPr>
+              <w:spacing w:line="240" w:lineRule="auto"/>
               <w:rPr>
                 <w:rFonts w:ascii="Times New Roman" w:hAnsi="Times New Roman" w:cs="Times New Roman"/>
                 <w:color w:val="000000" w:themeColor="text1"/>
@@ -1590,6 +1582,7 @@
           </w:tcPr>
           <w:p>
             <w:pPr>
+              <w:spacing w:line="240" w:lineRule="auto"/>
               <w:rPr>
                 <w:rFonts w:ascii="Times New Roman" w:hAnsi="Times New Roman" w:cs="Times New Roman"/>
                 <w:color w:val="000000" w:themeColor="text1"/>
@@ -1618,6 +1611,7 @@
           </w:tcPr>
           <w:p>
             <w:pPr>
+              <w:spacing w:line="240" w:lineRule="auto"/>
               <w:rPr>
                 <w:rFonts w:ascii="Times New Roman" w:hAnsi="Times New Roman" w:cs="Times New Roman"/>
                 <w:color w:val="000000" w:themeColor="text1"/>
@@ -1728,13 +1722,25 @@
               <w:rPr>
                 <w:rFonts w:ascii="Times New Roman" w:hAnsi="Times New Roman" w:cs="Times New Roman"/>
               </w:rPr>
+              <w:t xml:space="preserve"> </w:t>
+            </w:r>
+            <w:r>
+              <w:rPr>
+                <w:rFonts w:ascii="Times New Roman" w:hAnsi="Times New Roman" w:cs="Times New Roman"/>
+              </w:rPr>
+              <w:t>{{NO_OF_USERS</w:t>
+            </w:r>
+            <w:r>
+              <w:rPr>
+                <w:rFonts w:ascii="Times New Roman" w:hAnsi="Times New Roman" w:cs="Times New Roman"/>
+              </w:rPr>
+              <w:t>}}</w:t>
+            </w:r>
+            <w:r>
+              <w:rPr>
+                <w:rFonts w:ascii="Times New Roman" w:hAnsi="Times New Roman" w:cs="Times New Roman"/>
+              </w:rPr>
               <w:t xml:space="preserve"> Users</w:t>
-            </w:r>
-            <w:r>
-              <w:rPr>
-                <w:rFonts w:ascii="Times New Roman" w:hAnsi="Times New Roman" w:cs="Times New Roman"/>
-              </w:rPr>
-              <w:t>{{MODULE_DETAILS}}</w:t>
             </w:r>
           </w:p>
         </w:tc>
@@ -1759,20 +1765,7 @@
               <w:rPr>
                 <w:rFonts w:ascii="Times New Roman" w:hAnsi="Times New Roman" w:cs="Times New Roman"/>
               </w:rPr>
-              <w:t>{{MODULE_PRICING}}</w:t>
-            </w:r>
-          </w:p>
-          <w:p>
-            <w:pPr>
-              <w:rPr>
-                <w:rFonts w:ascii="Times New Roman" w:hAnsi="Times New Roman" w:cs="Times New Roman"/>
-              </w:rPr>
-            </w:pPr>
-            <w:r>
-              <w:rPr>
-                <w:rFonts w:ascii="Times New Roman" w:hAnsi="Times New Roman" w:cs="Times New Roman"/>
-              </w:rPr>
-              <w:t>{{OVERALL_PRICING}}</w:t>
+              <w:t>{{MODULE_PRICE}}</w:t>
             </w:r>
           </w:p>
         </w:tc>
@@ -1802,7 +1795,7 @@
               <w:rPr>
                 <w:rFonts w:ascii="Times New Roman" w:hAnsi="Times New Roman" w:cs="Times New Roman"/>
               </w:rPr>
-              <w:t>2</w:t>
+              <w:t xml:space="preserve"> 1.1</w:t>
             </w:r>
           </w:p>
         </w:tc>
@@ -1827,7 +1820,49 @@
               <w:rPr>
                 <w:rFonts w:ascii="Times New Roman" w:hAnsi="Times New Roman" w:cs="Times New Roman"/>
               </w:rPr>
-              <w:t>Customization</w:t>
+              <w:t>Implementation (</w:t>
+            </w:r>
+            <w:r>
+              <w:rPr>
+                <w:rFonts w:ascii="Times New Roman" w:hAnsi="Times New Roman" w:cs="Times New Roman"/>
+              </w:rPr>
+              <w:t>{{NO_OF_USERS</w:t>
+            </w:r>
+            <w:r>
+              <w:rPr>
+                <w:rFonts w:ascii="Times New Roman" w:hAnsi="Times New Roman" w:cs="Times New Roman"/>
+              </w:rPr>
+              <w:t>}}</w:t>
+            </w:r>
+            <w:r>
+              <w:rPr>
+                <w:rFonts w:ascii="Times New Roman" w:hAnsi="Times New Roman" w:cs="Times New Roman"/>
+              </w:rPr>
+              <w:t xml:space="preserve"> Man</w:t>
+            </w:r>
+            <w:r>
+              <w:rPr>
+                <w:rFonts w:ascii="Times New Roman" w:hAnsi="Times New Roman" w:cs="Times New Roman"/>
+              </w:rPr>
+              <w:t xml:space="preserve"> Day * </w:t>
+            </w:r>
+            <w:r>
+              <w:rPr>
+                <w:rFonts w:ascii="Times New Roman" w:hAnsi="Times New Roman" w:cs="Times New Roman"/>
+              </w:rPr>
+              <w:t>{{IMPL_RATE}}</w:t>
+            </w:r>
+            <w:r>
+              <w:rPr>
+                <w:rFonts w:ascii="Times New Roman" w:hAnsi="Times New Roman" w:cs="Times New Roman"/>
+              </w:rPr>
+              <w:t xml:space="preserve"> </w:t>
+            </w:r>
+            <w:r>
+              <w:rPr>
+                <w:rFonts w:ascii="Times New Roman" w:hAnsi="Times New Roman" w:cs="Times New Roman"/>
+              </w:rPr>
+              <w:t>per Man Day)</w:t>
             </w:r>
           </w:p>
         </w:tc>
@@ -1852,7 +1887,7 @@
               <w:rPr>
                 <w:rFonts w:ascii="Times New Roman" w:hAnsi="Times New Roman" w:cs="Times New Roman"/>
               </w:rPr>
-              <w:t>TBD</w:t>
+              <w:t>{{IMPL_TOTAL}}</w:t>
             </w:r>
           </w:p>
         </w:tc>
@@ -1882,7 +1917,7 @@
               <w:rPr>
                 <w:rFonts w:ascii="Times New Roman" w:hAnsi="Times New Roman" w:cs="Times New Roman"/>
               </w:rPr>
-              <w:t xml:space="preserve"> 2.1</w:t>
+              <w:t>2</w:t>
             </w:r>
           </w:p>
         </w:tc>
@@ -1907,7 +1942,7 @@
               <w:rPr>
                 <w:rFonts w:ascii="Times New Roman" w:hAnsi="Times New Roman" w:cs="Times New Roman"/>
               </w:rPr>
-              <w:t>In case of any additional development required which will be consider 8000 per man day additional to above proposal.</w:t>
+              <w:t>Customization</w:t>
             </w:r>
           </w:p>
         </w:tc>
@@ -1928,6 +1963,12 @@
                 <w:rFonts w:ascii="Times New Roman" w:hAnsi="Times New Roman" w:cs="Times New Roman"/>
               </w:rPr>
             </w:pPr>
+            <w:r>
+              <w:rPr>
+                <w:rFonts w:ascii="Times New Roman" w:hAnsi="Times New Roman" w:cs="Times New Roman"/>
+              </w:rPr>
+              <w:t>TBD</w:t>
+            </w:r>
           </w:p>
         </w:tc>
       </w:tr>
@@ -1956,7 +1997,7 @@
               <w:rPr>
                 <w:rFonts w:ascii="Times New Roman" w:hAnsi="Times New Roman" w:cs="Times New Roman"/>
               </w:rPr>
-              <w:t>3</w:t>
+              <w:t xml:space="preserve"> 2.1</w:t>
             </w:r>
           </w:p>
         </w:tc>
@@ -1981,7 +2022,7 @@
               <w:rPr>
                 <w:rFonts w:ascii="Times New Roman" w:hAnsi="Times New Roman" w:cs="Times New Roman"/>
               </w:rPr>
-              <w:t>Renewal and Support from next year onwards</w:t>
+              <w:t>In case of any additional development required which will be consider 8000 per man day additional to above proposal.</w:t>
             </w:r>
           </w:p>
         </w:tc>
@@ -2030,19 +2071,7 @@
               <w:rPr>
                 <w:rFonts w:ascii="Times New Roman" w:hAnsi="Times New Roman" w:cs="Times New Roman"/>
               </w:rPr>
-              <w:t xml:space="preserve"> </w:t>
-            </w:r>
-            <w:r>
-              <w:rPr>
-                <w:rFonts w:ascii="Times New Roman" w:hAnsi="Times New Roman" w:cs="Times New Roman"/>
-              </w:rPr>
               <w:t>3</w:t>
-            </w:r>
-            <w:r>
-              <w:rPr>
-                <w:rFonts w:ascii="Times New Roman" w:hAnsi="Times New Roman" w:cs="Times New Roman"/>
-              </w:rPr>
-              <w:t>.1</w:t>
             </w:r>
           </w:p>
         </w:tc>
@@ -2067,20 +2096,7 @@
               <w:rPr>
                 <w:rFonts w:ascii="Times New Roman" w:hAnsi="Times New Roman" w:cs="Times New Roman"/>
               </w:rPr>
-              <w:t xml:space="preserve">The License renewal would be required to be done every Year These renewal fees will facilitate to have the Product Upgrades, which would cover improvements, bug fixes, and changes in AIAG VDA compliances. </w:t>
-            </w:r>
-          </w:p>
-          <w:p>
-            <w:pPr>
-              <w:rPr>
-                <w:rFonts w:ascii="Times New Roman" w:hAnsi="Times New Roman" w:cs="Times New Roman"/>
-              </w:rPr>
-            </w:pPr>
-            <w:r>
-              <w:rPr>
-                <w:rFonts w:ascii="Times New Roman" w:hAnsi="Times New Roman" w:cs="Times New Roman"/>
-              </w:rPr>
-              <w:t xml:space="preserve">Support of 7 Man days is included in this price.  </w:t>
+              <w:t>Renewal and Support from next year onwards</w:t>
             </w:r>
           </w:p>
         </w:tc>
@@ -2101,31 +2117,6 @@
                 <w:rFonts w:ascii="Times New Roman" w:hAnsi="Times New Roman" w:cs="Times New Roman"/>
               </w:rPr>
             </w:pPr>
-            <w:r>
-              <w:rPr>
-                <w:rFonts w:ascii="Times New Roman" w:hAnsi="Times New Roman" w:cs="Times New Roman"/>
-              </w:rPr>
-              <w:t>{{MODULE_</w:t>
-            </w:r>
-            <w:r>
-              <w:rPr>
-                <w:rFonts w:ascii="Times New Roman" w:hAnsi="Times New Roman" w:cs="Times New Roman"/>
-              </w:rPr>
-              <w:t>NAME</w:t>
-            </w:r>
-            <w:r>
-              <w:rPr>
-                <w:rFonts w:ascii="Times New Roman" w:hAnsi="Times New Roman" w:cs="Times New Roman"/>
-              </w:rPr>
-              <w:t>}}</w:t>
-            </w:r>
-          </w:p>
-          <w:p>
-            <w:pPr>
-              <w:rPr>
-                <w:rFonts w:ascii="Times New Roman" w:hAnsi="Times New Roman" w:cs="Times New Roman"/>
-              </w:rPr>
-            </w:pPr>
           </w:p>
         </w:tc>
       </w:tr>
@@ -2154,7 +2145,19 @@
               <w:rPr>
                 <w:rFonts w:ascii="Times New Roman" w:hAnsi="Times New Roman" w:cs="Times New Roman"/>
               </w:rPr>
-              <w:t>4</w:t>
+              <w:t xml:space="preserve"> </w:t>
+            </w:r>
+            <w:r>
+              <w:rPr>
+                <w:rFonts w:ascii="Times New Roman" w:hAnsi="Times New Roman" w:cs="Times New Roman"/>
+              </w:rPr>
+              <w:t>3</w:t>
+            </w:r>
+            <w:r>
+              <w:rPr>
+                <w:rFonts w:ascii="Times New Roman" w:hAnsi="Times New Roman" w:cs="Times New Roman"/>
+              </w:rPr>
+              <w:t>.1</w:t>
             </w:r>
           </w:p>
         </w:tc>
@@ -2179,7 +2182,20 @@
               <w:rPr>
                 <w:rFonts w:ascii="Times New Roman" w:hAnsi="Times New Roman" w:cs="Times New Roman"/>
               </w:rPr>
-              <w:t>Support Services</w:t>
+              <w:t xml:space="preserve">The License renewal would be required to be done every Year These renewal fees will facilitate to have the Product Upgrades, which would cover improvements, bug fixes, and changes in AIAG VDA compliances. </w:t>
+            </w:r>
+          </w:p>
+          <w:p>
+            <w:pPr>
+              <w:rPr>
+                <w:rFonts w:ascii="Times New Roman" w:hAnsi="Times New Roman" w:cs="Times New Roman"/>
+              </w:rPr>
+            </w:pPr>
+            <w:r>
+              <w:rPr>
+                <w:rFonts w:ascii="Times New Roman" w:hAnsi="Times New Roman" w:cs="Times New Roman"/>
+              </w:rPr>
+              <w:t xml:space="preserve">Support of 7 Man days is included in this price.  </w:t>
             </w:r>
           </w:p>
         </w:tc>
@@ -2204,8 +2220,27 @@
               <w:rPr>
                 <w:rFonts w:ascii="Times New Roman" w:hAnsi="Times New Roman" w:cs="Times New Roman"/>
               </w:rPr>
-              <w:t>8000 per Man Day</w:t>
-            </w:r>
+              <w:t>{{MODULE_</w:t>
+            </w:r>
+            <w:r>
+              <w:rPr>
+                <w:rFonts w:ascii="Times New Roman" w:hAnsi="Times New Roman" w:cs="Times New Roman"/>
+              </w:rPr>
+              <w:t>NAME</w:t>
+            </w:r>
+            <w:r>
+              <w:rPr>
+                <w:rFonts w:ascii="Times New Roman" w:hAnsi="Times New Roman" w:cs="Times New Roman"/>
+              </w:rPr>
+              <w:t>}}</w:t>
+            </w:r>
+          </w:p>
+          <w:p>
+            <w:pPr>
+              <w:rPr>
+                <w:rFonts w:ascii="Times New Roman" w:hAnsi="Times New Roman" w:cs="Times New Roman"/>
+              </w:rPr>
+            </w:pPr>
           </w:p>
         </w:tc>
       </w:tr>
@@ -2234,7 +2269,7 @@
               <w:rPr>
                 <w:rFonts w:ascii="Times New Roman" w:hAnsi="Times New Roman" w:cs="Times New Roman"/>
               </w:rPr>
-              <w:t xml:space="preserve"> 4.1</w:t>
+              <w:t>4</w:t>
             </w:r>
           </w:p>
         </w:tc>
@@ -2259,21 +2294,7 @@
               <w:rPr>
                 <w:rFonts w:ascii="Times New Roman" w:hAnsi="Times New Roman" w:cs="Times New Roman"/>
               </w:rPr>
-              <w:t xml:space="preserve">First Year - These Services start a er 1 Month from start of Go Live. Subsequent Years – A er </w:t>
-            </w:r>
-            <w:proofErr w:type="spellStart"/>
-            <w:r>
-              <w:rPr>
-                <w:rFonts w:ascii="Times New Roman" w:hAnsi="Times New Roman" w:cs="Times New Roman"/>
-              </w:rPr>
-              <w:t>comple</w:t>
-            </w:r>
-            <w:proofErr w:type="spellEnd"/>
-            <w:r>
-              <w:rPr>
-                <w:rFonts w:ascii="Times New Roman" w:hAnsi="Times New Roman" w:cs="Times New Roman"/>
-              </w:rPr>
-              <w:t xml:space="preserve"> on of 7 Man Days</w:t>
+              <w:t>Support Services</w:t>
             </w:r>
           </w:p>
         </w:tc>
@@ -2294,6 +2315,12 @@
                 <w:rFonts w:ascii="Times New Roman" w:hAnsi="Times New Roman" w:cs="Times New Roman"/>
               </w:rPr>
             </w:pPr>
+            <w:r>
+              <w:rPr>
+                <w:rFonts w:ascii="Times New Roman" w:hAnsi="Times New Roman" w:cs="Times New Roman"/>
+              </w:rPr>
+              <w:t>8000 per Man Day</w:t>
+            </w:r>
           </w:p>
         </w:tc>
       </w:tr>
@@ -2322,7 +2349,7 @@
               <w:rPr>
                 <w:rFonts w:ascii="Times New Roman" w:hAnsi="Times New Roman" w:cs="Times New Roman"/>
               </w:rPr>
-              <w:t>5</w:t>
+              <w:t xml:space="preserve"> 4.1</w:t>
             </w:r>
           </w:p>
         </w:tc>
@@ -2347,7 +2374,21 @@
               <w:rPr>
                 <w:rFonts w:ascii="Times New Roman" w:hAnsi="Times New Roman" w:cs="Times New Roman"/>
               </w:rPr>
-              <w:t>Payment Terms</w:t>
+              <w:t xml:space="preserve">First Year - These Services start a er 1 Month from start of Go Live. Subsequent Years – A er </w:t>
+            </w:r>
+            <w:proofErr w:type="spellStart"/>
+            <w:r>
+              <w:rPr>
+                <w:rFonts w:ascii="Times New Roman" w:hAnsi="Times New Roman" w:cs="Times New Roman"/>
+              </w:rPr>
+              <w:t>comple</w:t>
+            </w:r>
+            <w:proofErr w:type="spellEnd"/>
+            <w:r>
+              <w:rPr>
+                <w:rFonts w:ascii="Times New Roman" w:hAnsi="Times New Roman" w:cs="Times New Roman"/>
+              </w:rPr>
+              <w:t xml:space="preserve"> on of 7 Man Days</w:t>
             </w:r>
           </w:p>
         </w:tc>
@@ -2396,7 +2437,7 @@
               <w:rPr>
                 <w:rFonts w:ascii="Times New Roman" w:hAnsi="Times New Roman" w:cs="Times New Roman"/>
               </w:rPr>
-              <w:t xml:space="preserve"> 5.1</w:t>
+              <w:t>5</w:t>
             </w:r>
           </w:p>
         </w:tc>
@@ -2421,7 +2462,7 @@
               <w:rPr>
                 <w:rFonts w:ascii="Times New Roman" w:hAnsi="Times New Roman" w:cs="Times New Roman"/>
               </w:rPr>
-              <w:t xml:space="preserve">70% in Advance along with Purchase Order </w:t>
+              <w:t>Payment Terms</w:t>
             </w:r>
           </w:p>
         </w:tc>
@@ -2470,7 +2511,7 @@
               <w:rPr>
                 <w:rFonts w:ascii="Times New Roman" w:hAnsi="Times New Roman" w:cs="Times New Roman"/>
               </w:rPr>
-              <w:t xml:space="preserve"> 5.2</w:t>
+              <w:t xml:space="preserve"> 5.1</w:t>
             </w:r>
           </w:p>
         </w:tc>
@@ -2495,19 +2536,7 @@
               <w:rPr>
                 <w:rFonts w:ascii="Times New Roman" w:hAnsi="Times New Roman" w:cs="Times New Roman"/>
               </w:rPr>
-              <w:t xml:space="preserve">20% on </w:t>
-            </w:r>
-            <w:r>
-              <w:rPr>
-                <w:rFonts w:ascii="Times New Roman" w:hAnsi="Times New Roman" w:cs="Times New Roman"/>
-              </w:rPr>
-              <w:t>I</w:t>
-            </w:r>
-            <w:r>
-              <w:rPr>
-                <w:rFonts w:ascii="Times New Roman" w:hAnsi="Times New Roman" w:cs="Times New Roman"/>
-              </w:rPr>
-              <w:t>mplementation</w:t>
+              <w:t xml:space="preserve">70% in Advance along with Purchase Order </w:t>
             </w:r>
           </w:p>
         </w:tc>
@@ -2556,7 +2585,7 @@
               <w:rPr>
                 <w:rFonts w:ascii="Times New Roman" w:hAnsi="Times New Roman" w:cs="Times New Roman"/>
               </w:rPr>
-              <w:t xml:space="preserve"> 5.3</w:t>
+              <w:t xml:space="preserve"> 5.2</w:t>
             </w:r>
           </w:p>
         </w:tc>
@@ -2581,7 +2610,19 @@
               <w:rPr>
                 <w:rFonts w:ascii="Times New Roman" w:hAnsi="Times New Roman" w:cs="Times New Roman"/>
               </w:rPr>
-              <w:t>10% against GO LIVE or One Month from completion of implementation.</w:t>
+              <w:t xml:space="preserve">20% on </w:t>
+            </w:r>
+            <w:r>
+              <w:rPr>
+                <w:rFonts w:ascii="Times New Roman" w:hAnsi="Times New Roman" w:cs="Times New Roman"/>
+              </w:rPr>
+              <w:t>I</w:t>
+            </w:r>
+            <w:r>
+              <w:rPr>
+                <w:rFonts w:ascii="Times New Roman" w:hAnsi="Times New Roman" w:cs="Times New Roman"/>
+              </w:rPr>
+              <w:t>mplementation</w:t>
             </w:r>
           </w:p>
         </w:tc>
@@ -2631,6 +2672,80 @@
                 <w:rFonts w:ascii="Times New Roman" w:hAnsi="Times New Roman" w:cs="Times New Roman"/>
               </w:rPr>
               <w:lastRenderedPageBreak/>
+              <w:t xml:space="preserve"> 5.3</w:t>
+            </w:r>
+          </w:p>
+        </w:tc>
+        <w:tc>
+          <w:tcPr>
+            <w:tcW w:w="6360" w:type="dxa"/>
+            <w:shd w:val="clear" w:color="auto" w:fill="FFFFFF" w:themeFill="background1"/>
+            <w:tcMar>
+              <w:top w:w="80" w:type="dxa"/>
+              <w:left w:w="120" w:type="dxa"/>
+              <w:bottom w:w="80" w:type="dxa"/>
+              <w:right w:w="120" w:type="dxa"/>
+            </w:tcMar>
+          </w:tcPr>
+          <w:p>
+            <w:pPr>
+              <w:rPr>
+                <w:rFonts w:ascii="Times New Roman" w:hAnsi="Times New Roman" w:cs="Times New Roman"/>
+              </w:rPr>
+            </w:pPr>
+            <w:r>
+              <w:rPr>
+                <w:rFonts w:ascii="Times New Roman" w:hAnsi="Times New Roman" w:cs="Times New Roman"/>
+              </w:rPr>
+              <w:t>10% against GO LIVE or One Month from completion of implementation.</w:t>
+            </w:r>
+          </w:p>
+        </w:tc>
+        <w:tc>
+          <w:tcPr>
+            <w:tcW w:w="2625" w:type="dxa"/>
+            <w:shd w:val="clear" w:color="auto" w:fill="FFFFFF" w:themeFill="background1"/>
+            <w:tcMar>
+              <w:top w:w="80" w:type="dxa"/>
+              <w:left w:w="120" w:type="dxa"/>
+              <w:bottom w:w="80" w:type="dxa"/>
+              <w:right w:w="120" w:type="dxa"/>
+            </w:tcMar>
+          </w:tcPr>
+          <w:p>
+            <w:pPr>
+              <w:rPr>
+                <w:rFonts w:ascii="Times New Roman" w:hAnsi="Times New Roman" w:cs="Times New Roman"/>
+              </w:rPr>
+            </w:pPr>
+          </w:p>
+        </w:tc>
+      </w:tr>
+      <w:tr>
+        <w:trPr>
+          <w:trHeight w:val="20"/>
+        </w:trPr>
+        <w:tc>
+          <w:tcPr>
+            <w:tcW w:w="1007" w:type="dxa"/>
+            <w:shd w:val="clear" w:color="auto" w:fill="FFFFFF" w:themeFill="background1"/>
+            <w:tcMar>
+              <w:top w:w="80" w:type="dxa"/>
+              <w:left w:w="120" w:type="dxa"/>
+              <w:bottom w:w="80" w:type="dxa"/>
+              <w:right w:w="120" w:type="dxa"/>
+            </w:tcMar>
+          </w:tcPr>
+          <w:p>
+            <w:pPr>
+              <w:rPr>
+                <w:rFonts w:ascii="Times New Roman" w:hAnsi="Times New Roman" w:cs="Times New Roman"/>
+              </w:rPr>
+            </w:pPr>
+            <w:r>
+              <w:rPr>
+                <w:rFonts w:ascii="Times New Roman" w:hAnsi="Times New Roman" w:cs="Times New Roman"/>
+              </w:rPr>
               <w:t>6</w:t>
             </w:r>
           </w:p>
@@ -4993,6 +5108,7 @@
               <w:rPr>
                 <w:rFonts w:ascii="Times New Roman" w:hAnsi="Times New Roman" w:cs="Times New Roman"/>
               </w:rPr>
+              <w:lastRenderedPageBreak/>
               <w:t>Data Preparation for Go-Live</w:t>
             </w:r>
           </w:p>
@@ -5043,7 +5159,6 @@
               <w:rPr>
                 <w:rFonts w:ascii="Times New Roman" w:hAnsi="Times New Roman" w:cs="Times New Roman"/>
               </w:rPr>
-              <w:lastRenderedPageBreak/>
               <w:t>Go-Live</w:t>
             </w:r>
           </w:p>
@@ -5667,6 +5782,7 @@
           <w:rFonts w:ascii="Times New Roman" w:hAnsi="Times New Roman" w:cs="Times New Roman"/>
           <w:color w:val="000000" w:themeColor="text1"/>
         </w:rPr>
+        <w:lastRenderedPageBreak/>
         <w:t>6. Excused Performance</w:t>
       </w:r>
     </w:p>
@@ -5681,7 +5797,6 @@
         <w:rPr>
           <w:rFonts w:ascii="Times New Roman" w:hAnsi="Times New Roman" w:cs="Times New Roman"/>
         </w:rPr>
-        <w:lastRenderedPageBreak/>
         <w:t xml:space="preserve">BlechTek shall not be liable or deemed to be in default for any delay or failure in performance under this Contract or interruption of services due to strike or </w:t>
       </w:r>
       <w:r>
@@ -7239,7 +7354,7 @@
   <w:style w:type="paragraph" w:default="1" w:styleId="Normal">
     <w:name w:val="Normal"/>
     <w:qFormat/>
-    <w:rsid w:val="003779C6"/>
+    <w:rsid w:val="00E84263"/>
   </w:style>
   <w:style w:type="paragraph" w:styleId="Heading1">
     <w:name w:val="heading 1"/>

</xml_diff>

<commit_message>
updates about price of implementation table for showing the discount %
</commit_message>
<xml_diff>
--- a/QuotationApp.API/Templates/QuotationTemplate_Updated.docx
+++ b/QuotationApp.API/Templates/QuotationTemplate_Updated.docx
@@ -550,26 +550,15 @@
           <w:bCs/>
           <w:color w:val="65AADB"/>
         </w:rPr>
-        <w:t>{{ORG_</w:t>
-      </w:r>
-      <w:proofErr w:type="gramStart"/>
-      <w:r>
-        <w:rPr>
-          <w:rFonts w:ascii="Times New Roman" w:hAnsi="Times New Roman" w:cs="Times New Roman"/>
-          <w:b/>
-          <w:bCs/>
+        <w:t>{{ORG_NAME}}</w:t>
+      </w:r>
+      <w:r>
+        <w:rPr>
+          <w:rFonts w:ascii="Times New Roman" w:hAnsi="Times New Roman" w:cs="Times New Roman"/>
           <w:color w:val="65AADB"/>
         </w:rPr>
-        <w:t>NAME}}</w:t>
-      </w:r>
-      <w:r>
-        <w:rPr>
-          <w:rFonts w:ascii="Times New Roman" w:hAnsi="Times New Roman" w:cs="Times New Roman"/>
-          <w:color w:val="65AADB"/>
-        </w:rPr>
         <w:t>.</w:t>
       </w:r>
-      <w:proofErr w:type="gramEnd"/>
     </w:p>
     <w:p>
       <w:pPr>
@@ -1743,6 +1732,31 @@
               <w:t xml:space="preserve"> Users</w:t>
             </w:r>
           </w:p>
+          <w:p>
+            <w:pPr>
+              <w:rPr>
+                <w:rFonts w:ascii="Times New Roman" w:hAnsi="Times New Roman" w:cs="Times New Roman"/>
+              </w:rPr>
+            </w:pPr>
+            <w:r>
+              <w:rPr>
+                <w:rFonts w:ascii="Times New Roman" w:hAnsi="Times New Roman" w:cs="Times New Roman"/>
+              </w:rPr>
+              <w:t>Discount ({{MODULE_DISCOUNT_PCT</w:t>
+            </w:r>
+            <w:r>
+              <w:rPr>
+                <w:rFonts w:ascii="Times New Roman" w:hAnsi="Times New Roman" w:cs="Times New Roman"/>
+              </w:rPr>
+              <w:t>}} %</w:t>
+            </w:r>
+            <w:r>
+              <w:rPr>
+                <w:rFonts w:ascii="Times New Roman" w:hAnsi="Times New Roman" w:cs="Times New Roman"/>
+              </w:rPr>
+              <w:t>):</w:t>
+            </w:r>
+          </w:p>
         </w:tc>
         <w:tc>
           <w:tcPr>
@@ -1768,6 +1782,19 @@
               <w:t>{{MODULE_PRICE}}</w:t>
             </w:r>
           </w:p>
+          <w:p>
+            <w:pPr>
+              <w:rPr>
+                <w:rFonts w:ascii="Times New Roman" w:hAnsi="Times New Roman" w:cs="Times New Roman"/>
+              </w:rPr>
+            </w:pPr>
+            <w:r>
+              <w:rPr>
+                <w:rFonts w:ascii="Times New Roman" w:hAnsi="Times New Roman" w:cs="Times New Roman"/>
+              </w:rPr>
+              <w:t>{{MODULE_DISCOUNT}}</w:t>
+            </w:r>
+          </w:p>
         </w:tc>
       </w:tr>
       <w:tr>
@@ -2374,21 +2401,7 @@
               <w:rPr>
                 <w:rFonts w:ascii="Times New Roman" w:hAnsi="Times New Roman" w:cs="Times New Roman"/>
               </w:rPr>
-              <w:t xml:space="preserve">First Year - These Services start a er 1 Month from start of Go Live. Subsequent Years – A er </w:t>
-            </w:r>
-            <w:proofErr w:type="spellStart"/>
-            <w:r>
-              <w:rPr>
-                <w:rFonts w:ascii="Times New Roman" w:hAnsi="Times New Roman" w:cs="Times New Roman"/>
-              </w:rPr>
-              <w:t>comple</w:t>
-            </w:r>
-            <w:proofErr w:type="spellEnd"/>
-            <w:r>
-              <w:rPr>
-                <w:rFonts w:ascii="Times New Roman" w:hAnsi="Times New Roman" w:cs="Times New Roman"/>
-              </w:rPr>
-              <w:t xml:space="preserve"> on of 7 Man Days</w:t>
+              <w:t>First Year - These Services start a er 1 Month from start of Go Live. Subsequent Years – A er comple on of 7 Man Days</w:t>
             </w:r>
           </w:p>
         </w:tc>
@@ -5246,15 +5259,6 @@
         <w:spacing w:before="300" w:after="150"/>
         <w:rPr>
           <w:rFonts w:ascii="Times New Roman" w:hAnsi="Times New Roman" w:cs="Times New Roman"/>
-          <w:color w:val="000000" w:themeColor="text1"/>
-        </w:rPr>
-      </w:pPr>
-    </w:p>
-    <w:p>
-      <w:pPr>
-        <w:spacing w:before="300" w:after="150"/>
-        <w:rPr>
-          <w:rFonts w:ascii="Times New Roman" w:hAnsi="Times New Roman" w:cs="Times New Roman"/>
           <w:w w:val="101"/>
         </w:rPr>
       </w:pPr>
@@ -5568,22 +5572,6 @@
           <w:rFonts w:ascii="Times New Roman" w:hAnsi="Times New Roman" w:cs="Times New Roman"/>
         </w:rPr>
       </w:pPr>
-    </w:p>
-    <w:p>
-      <w:pPr>
-        <w:spacing w:before="300" w:after="150"/>
-        <w:rPr>
-          <w:rFonts w:ascii="Times New Roman" w:hAnsi="Times New Roman" w:cs="Times New Roman"/>
-        </w:rPr>
-      </w:pPr>
-    </w:p>
-    <w:p>
-      <w:pPr>
-        <w:spacing w:before="300" w:after="150"/>
-        <w:rPr>
-          <w:rFonts w:ascii="Times New Roman" w:hAnsi="Times New Roman" w:cs="Times New Roman"/>
-        </w:rPr>
-      </w:pPr>
       <w:r>
         <w:rPr>
           <w:rFonts w:ascii="Times New Roman" w:hAnsi="Times New Roman" w:cs="Times New Roman"/>
@@ -5782,7 +5770,6 @@
           <w:rFonts w:ascii="Times New Roman" w:hAnsi="Times New Roman" w:cs="Times New Roman"/>
           <w:color w:val="000000" w:themeColor="text1"/>
         </w:rPr>
-        <w:lastRenderedPageBreak/>
         <w:t>6. Excused Performance</w:t>
       </w:r>
     </w:p>
@@ -5823,6 +5810,15 @@
         </w:rPr>
         <w:t xml:space="preserve"> of our software due to failure or malfunction of computer or telecommunications hardware, network or related equipment at your installation site.</w:t>
       </w:r>
+    </w:p>
+    <w:p>
+      <w:pPr>
+        <w:spacing w:before="160" w:after="40"/>
+        <w:rPr>
+          <w:rFonts w:ascii="Times New Roman" w:hAnsi="Times New Roman" w:cs="Times New Roman"/>
+          <w:color w:val="000000" w:themeColor="text1"/>
+        </w:rPr>
+      </w:pPr>
     </w:p>
     <w:p>
       <w:pPr>
@@ -5975,24 +5971,6 @@
         </w:rPr>
         <w:t>This offer is valid up to {{VALIDATION_DATE}}.</w:t>
       </w:r>
-    </w:p>
-    <w:p>
-      <w:pPr>
-        <w:spacing w:before="160" w:after="40"/>
-        <w:rPr>
-          <w:rFonts w:ascii="Times New Roman" w:hAnsi="Times New Roman" w:cs="Times New Roman"/>
-          <w:color w:val="000000" w:themeColor="text1"/>
-        </w:rPr>
-      </w:pPr>
-    </w:p>
-    <w:p>
-      <w:pPr>
-        <w:spacing w:before="160" w:after="40"/>
-        <w:rPr>
-          <w:rFonts w:ascii="Times New Roman" w:hAnsi="Times New Roman" w:cs="Times New Roman"/>
-          <w:color w:val="000000" w:themeColor="text1"/>
-        </w:rPr>
-      </w:pPr>
     </w:p>
     <w:p>
       <w:pPr>

</xml_diff>

<commit_message>
updates about price of implementation table for showing the module subtotal and overall price
</commit_message>
<xml_diff>
--- a/QuotationApp.API/Templates/QuotationTemplate_Updated.docx
+++ b/QuotationApp.API/Templates/QuotationTemplate_Updated.docx
@@ -1680,19 +1680,31 @@
               <w:rPr>
                 <w:rFonts w:ascii="Times New Roman" w:hAnsi="Times New Roman" w:cs="Times New Roman"/>
               </w:rPr>
-              <w:t>CQUAL</w:t>
-            </w:r>
-            <w:r>
-              <w:rPr>
-                <w:rFonts w:ascii="Times New Roman" w:hAnsi="Times New Roman" w:cs="Times New Roman"/>
-              </w:rPr>
-              <w:t xml:space="preserve"> </w:t>
-            </w:r>
-            <w:r>
-              <w:rPr>
-                <w:rFonts w:ascii="Times New Roman" w:hAnsi="Times New Roman" w:cs="Times New Roman"/>
-              </w:rPr>
-              <w:t xml:space="preserve"> {{MODULE_LIST}} </w:t>
+              <w:t xml:space="preserve">CQUAL </w:t>
+            </w:r>
+            <w:r>
+              <w:rPr>
+                <w:rFonts w:ascii="Times New Roman" w:hAnsi="Times New Roman" w:cs="Times New Roman"/>
+              </w:rPr>
+              <w:t>{</w:t>
+            </w:r>
+            <w:r>
+              <w:rPr>
+                <w:rFonts w:ascii="Times New Roman" w:hAnsi="Times New Roman" w:cs="Times New Roman"/>
+              </w:rPr>
+              <w:t>{MODULE_</w:t>
+            </w:r>
+            <w:r>
+              <w:rPr>
+                <w:rFonts w:ascii="Times New Roman" w:hAnsi="Times New Roman" w:cs="Times New Roman"/>
+              </w:rPr>
+              <w:t>NAME</w:t>
+            </w:r>
+            <w:r>
+              <w:rPr>
+                <w:rFonts w:ascii="Times New Roman" w:hAnsi="Times New Roman" w:cs="Times New Roman"/>
+              </w:rPr>
+              <w:t>}}</w:t>
             </w:r>
           </w:p>
           <w:p>
@@ -1788,6 +1800,13 @@
                 <w:rFonts w:ascii="Times New Roman" w:hAnsi="Times New Roman" w:cs="Times New Roman"/>
               </w:rPr>
             </w:pPr>
+          </w:p>
+          <w:p>
+            <w:pPr>
+              <w:rPr>
+                <w:rFonts w:ascii="Times New Roman" w:hAnsi="Times New Roman" w:cs="Times New Roman"/>
+              </w:rPr>
+            </w:pPr>
             <w:r>
               <w:rPr>
                 <w:rFonts w:ascii="Times New Roman" w:hAnsi="Times New Roman" w:cs="Times New Roman"/>
@@ -1818,12 +1837,6 @@
                 <w:rFonts w:ascii="Times New Roman" w:hAnsi="Times New Roman" w:cs="Times New Roman"/>
               </w:rPr>
             </w:pPr>
-            <w:r>
-              <w:rPr>
-                <w:rFonts w:ascii="Times New Roman" w:hAnsi="Times New Roman" w:cs="Times New Roman"/>
-              </w:rPr>
-              <w:t xml:space="preserve"> 1.1</w:t>
-            </w:r>
           </w:p>
         </w:tc>
         <w:tc>
@@ -1847,49 +1860,13 @@
               <w:rPr>
                 <w:rFonts w:ascii="Times New Roman" w:hAnsi="Times New Roman" w:cs="Times New Roman"/>
               </w:rPr>
-              <w:t>Implementation (</w:t>
-            </w:r>
-            <w:r>
-              <w:rPr>
-                <w:rFonts w:ascii="Times New Roman" w:hAnsi="Times New Roman" w:cs="Times New Roman"/>
-              </w:rPr>
-              <w:t>{{NO_OF_USERS</w:t>
-            </w:r>
-            <w:r>
-              <w:rPr>
-                <w:rFonts w:ascii="Times New Roman" w:hAnsi="Times New Roman" w:cs="Times New Roman"/>
-              </w:rPr>
-              <w:t>}}</w:t>
-            </w:r>
-            <w:r>
-              <w:rPr>
-                <w:rFonts w:ascii="Times New Roman" w:hAnsi="Times New Roman" w:cs="Times New Roman"/>
-              </w:rPr>
-              <w:t xml:space="preserve"> Man</w:t>
-            </w:r>
-            <w:r>
-              <w:rPr>
-                <w:rFonts w:ascii="Times New Roman" w:hAnsi="Times New Roman" w:cs="Times New Roman"/>
-              </w:rPr>
-              <w:t xml:space="preserve"> Day * </w:t>
-            </w:r>
-            <w:r>
-              <w:rPr>
-                <w:rFonts w:ascii="Times New Roman" w:hAnsi="Times New Roman" w:cs="Times New Roman"/>
-              </w:rPr>
-              <w:t>{{IMPL_RATE}}</w:t>
-            </w:r>
-            <w:r>
-              <w:rPr>
-                <w:rFonts w:ascii="Times New Roman" w:hAnsi="Times New Roman" w:cs="Times New Roman"/>
-              </w:rPr>
-              <w:t xml:space="preserve"> </w:t>
-            </w:r>
-            <w:r>
-              <w:rPr>
-                <w:rFonts w:ascii="Times New Roman" w:hAnsi="Times New Roman" w:cs="Times New Roman"/>
-              </w:rPr>
-              <w:t>per Man Day)</w:t>
+              <w:t>Module Subtotal</w:t>
+            </w:r>
+            <w:r>
+              <w:rPr>
+                <w:rFonts w:ascii="Times New Roman" w:hAnsi="Times New Roman" w:cs="Times New Roman"/>
+              </w:rPr>
+              <w:t>:</w:t>
             </w:r>
           </w:p>
         </w:tc>
@@ -1914,7 +1891,7 @@
               <w:rPr>
                 <w:rFonts w:ascii="Times New Roman" w:hAnsi="Times New Roman" w:cs="Times New Roman"/>
               </w:rPr>
-              <w:t>{{IMPL_TOTAL}}</w:t>
+              <w:t>{{MODULE_SUBTOTAL}}</w:t>
             </w:r>
           </w:p>
         </w:tc>
@@ -1944,7 +1921,7 @@
               <w:rPr>
                 <w:rFonts w:ascii="Times New Roman" w:hAnsi="Times New Roman" w:cs="Times New Roman"/>
               </w:rPr>
-              <w:t>2</w:t>
+              <w:t xml:space="preserve"> 1.1</w:t>
             </w:r>
           </w:p>
         </w:tc>
@@ -1969,7 +1946,49 @@
               <w:rPr>
                 <w:rFonts w:ascii="Times New Roman" w:hAnsi="Times New Roman" w:cs="Times New Roman"/>
               </w:rPr>
-              <w:t>Customization</w:t>
+              <w:t>Implementation (</w:t>
+            </w:r>
+            <w:r>
+              <w:rPr>
+                <w:rFonts w:ascii="Times New Roman" w:hAnsi="Times New Roman" w:cs="Times New Roman"/>
+              </w:rPr>
+              <w:t>{{NO_OF_USERS</w:t>
+            </w:r>
+            <w:r>
+              <w:rPr>
+                <w:rFonts w:ascii="Times New Roman" w:hAnsi="Times New Roman" w:cs="Times New Roman"/>
+              </w:rPr>
+              <w:t>}}</w:t>
+            </w:r>
+            <w:r>
+              <w:rPr>
+                <w:rFonts w:ascii="Times New Roman" w:hAnsi="Times New Roman" w:cs="Times New Roman"/>
+              </w:rPr>
+              <w:t xml:space="preserve"> Man</w:t>
+            </w:r>
+            <w:r>
+              <w:rPr>
+                <w:rFonts w:ascii="Times New Roman" w:hAnsi="Times New Roman" w:cs="Times New Roman"/>
+              </w:rPr>
+              <w:t xml:space="preserve"> Day * </w:t>
+            </w:r>
+            <w:r>
+              <w:rPr>
+                <w:rFonts w:ascii="Times New Roman" w:hAnsi="Times New Roman" w:cs="Times New Roman"/>
+              </w:rPr>
+              <w:t>{{IMPL_RATE}}</w:t>
+            </w:r>
+            <w:r>
+              <w:rPr>
+                <w:rFonts w:ascii="Times New Roman" w:hAnsi="Times New Roman" w:cs="Times New Roman"/>
+              </w:rPr>
+              <w:t xml:space="preserve"> </w:t>
+            </w:r>
+            <w:r>
+              <w:rPr>
+                <w:rFonts w:ascii="Times New Roman" w:hAnsi="Times New Roman" w:cs="Times New Roman"/>
+              </w:rPr>
+              <w:t>per Man Day)</w:t>
             </w:r>
           </w:p>
         </w:tc>
@@ -1994,7 +2013,7 @@
               <w:rPr>
                 <w:rFonts w:ascii="Times New Roman" w:hAnsi="Times New Roman" w:cs="Times New Roman"/>
               </w:rPr>
-              <w:t>TBD</w:t>
+              <w:t>{{IMPL_TOTAL}}</w:t>
             </w:r>
           </w:p>
         </w:tc>
@@ -2020,12 +2039,6 @@
                 <w:rFonts w:ascii="Times New Roman" w:hAnsi="Times New Roman" w:cs="Times New Roman"/>
               </w:rPr>
             </w:pPr>
-            <w:r>
-              <w:rPr>
-                <w:rFonts w:ascii="Times New Roman" w:hAnsi="Times New Roman" w:cs="Times New Roman"/>
-              </w:rPr>
-              <w:t xml:space="preserve"> 2.1</w:t>
-            </w:r>
           </w:p>
         </w:tc>
         <w:tc>
@@ -2049,7 +2062,7 @@
               <w:rPr>
                 <w:rFonts w:ascii="Times New Roman" w:hAnsi="Times New Roman" w:cs="Times New Roman"/>
               </w:rPr>
-              <w:t>In case of any additional development required which will be consider 8000 per man day additional to above proposal.</w:t>
+              <w:t>Total of All Modules Final Price:</w:t>
             </w:r>
           </w:p>
         </w:tc>
@@ -2070,6 +2083,12 @@
                 <w:rFonts w:ascii="Times New Roman" w:hAnsi="Times New Roman" w:cs="Times New Roman"/>
               </w:rPr>
             </w:pPr>
+            <w:r>
+              <w:rPr>
+                <w:rFonts w:ascii="Times New Roman" w:hAnsi="Times New Roman" w:cs="Times New Roman"/>
+              </w:rPr>
+              <w:t>{{OVERALL_VALUE}}</w:t>
+            </w:r>
           </w:p>
         </w:tc>
       </w:tr>
@@ -2098,7 +2117,7 @@
               <w:rPr>
                 <w:rFonts w:ascii="Times New Roman" w:hAnsi="Times New Roman" w:cs="Times New Roman"/>
               </w:rPr>
-              <w:t>3</w:t>
+              <w:t>2</w:t>
             </w:r>
           </w:p>
         </w:tc>
@@ -2123,7 +2142,7 @@
               <w:rPr>
                 <w:rFonts w:ascii="Times New Roman" w:hAnsi="Times New Roman" w:cs="Times New Roman"/>
               </w:rPr>
-              <w:t>Renewal and Support from next year onwards</w:t>
+              <w:t>Customization</w:t>
             </w:r>
           </w:p>
         </w:tc>
@@ -2144,6 +2163,12 @@
                 <w:rFonts w:ascii="Times New Roman" w:hAnsi="Times New Roman" w:cs="Times New Roman"/>
               </w:rPr>
             </w:pPr>
+            <w:r>
+              <w:rPr>
+                <w:rFonts w:ascii="Times New Roman" w:hAnsi="Times New Roman" w:cs="Times New Roman"/>
+              </w:rPr>
+              <w:t>TBD</w:t>
+            </w:r>
           </w:p>
         </w:tc>
       </w:tr>
@@ -2172,19 +2197,7 @@
               <w:rPr>
                 <w:rFonts w:ascii="Times New Roman" w:hAnsi="Times New Roman" w:cs="Times New Roman"/>
               </w:rPr>
-              <w:t xml:space="preserve"> </w:t>
-            </w:r>
-            <w:r>
-              <w:rPr>
-                <w:rFonts w:ascii="Times New Roman" w:hAnsi="Times New Roman" w:cs="Times New Roman"/>
-              </w:rPr>
-              <w:t>3</w:t>
-            </w:r>
-            <w:r>
-              <w:rPr>
-                <w:rFonts w:ascii="Times New Roman" w:hAnsi="Times New Roman" w:cs="Times New Roman"/>
-              </w:rPr>
-              <w:t>.1</w:t>
+              <w:t xml:space="preserve"> 2.1</w:t>
             </w:r>
           </w:p>
         </w:tc>
@@ -2209,20 +2222,7 @@
               <w:rPr>
                 <w:rFonts w:ascii="Times New Roman" w:hAnsi="Times New Roman" w:cs="Times New Roman"/>
               </w:rPr>
-              <w:t xml:space="preserve">The License renewal would be required to be done every Year These renewal fees will facilitate to have the Product Upgrades, which would cover improvements, bug fixes, and changes in AIAG VDA compliances. </w:t>
-            </w:r>
-          </w:p>
-          <w:p>
-            <w:pPr>
-              <w:rPr>
-                <w:rFonts w:ascii="Times New Roman" w:hAnsi="Times New Roman" w:cs="Times New Roman"/>
-              </w:rPr>
-            </w:pPr>
-            <w:r>
-              <w:rPr>
-                <w:rFonts w:ascii="Times New Roman" w:hAnsi="Times New Roman" w:cs="Times New Roman"/>
-              </w:rPr>
-              <w:t xml:space="preserve">Support of 7 Man days is included in this price.  </w:t>
+              <w:t>In case of any additional development required which will be consider 8000 per man day additional to above proposal.</w:t>
             </w:r>
           </w:p>
         </w:tc>
@@ -2243,31 +2243,6 @@
                 <w:rFonts w:ascii="Times New Roman" w:hAnsi="Times New Roman" w:cs="Times New Roman"/>
               </w:rPr>
             </w:pPr>
-            <w:r>
-              <w:rPr>
-                <w:rFonts w:ascii="Times New Roman" w:hAnsi="Times New Roman" w:cs="Times New Roman"/>
-              </w:rPr>
-              <w:t>{{MODULE_</w:t>
-            </w:r>
-            <w:r>
-              <w:rPr>
-                <w:rFonts w:ascii="Times New Roman" w:hAnsi="Times New Roman" w:cs="Times New Roman"/>
-              </w:rPr>
-              <w:t>NAME</w:t>
-            </w:r>
-            <w:r>
-              <w:rPr>
-                <w:rFonts w:ascii="Times New Roman" w:hAnsi="Times New Roman" w:cs="Times New Roman"/>
-              </w:rPr>
-              <w:t>}}</w:t>
-            </w:r>
-          </w:p>
-          <w:p>
-            <w:pPr>
-              <w:rPr>
-                <w:rFonts w:ascii="Times New Roman" w:hAnsi="Times New Roman" w:cs="Times New Roman"/>
-              </w:rPr>
-            </w:pPr>
           </w:p>
         </w:tc>
       </w:tr>
@@ -2296,7 +2271,7 @@
               <w:rPr>
                 <w:rFonts w:ascii="Times New Roman" w:hAnsi="Times New Roman" w:cs="Times New Roman"/>
               </w:rPr>
-              <w:t>4</w:t>
+              <w:t>3</w:t>
             </w:r>
           </w:p>
         </w:tc>
@@ -2321,7 +2296,7 @@
               <w:rPr>
                 <w:rFonts w:ascii="Times New Roman" w:hAnsi="Times New Roman" w:cs="Times New Roman"/>
               </w:rPr>
-              <w:t>Support Services</w:t>
+              <w:t>Renewal and Support from next year onwards</w:t>
             </w:r>
           </w:p>
         </w:tc>
@@ -2342,12 +2317,6 @@
                 <w:rFonts w:ascii="Times New Roman" w:hAnsi="Times New Roman" w:cs="Times New Roman"/>
               </w:rPr>
             </w:pPr>
-            <w:r>
-              <w:rPr>
-                <w:rFonts w:ascii="Times New Roman" w:hAnsi="Times New Roman" w:cs="Times New Roman"/>
-              </w:rPr>
-              <w:t>8000 per Man Day</w:t>
-            </w:r>
           </w:p>
         </w:tc>
       </w:tr>
@@ -2376,7 +2345,19 @@
               <w:rPr>
                 <w:rFonts w:ascii="Times New Roman" w:hAnsi="Times New Roman" w:cs="Times New Roman"/>
               </w:rPr>
-              <w:t xml:space="preserve"> 4.1</w:t>
+              <w:t xml:space="preserve"> </w:t>
+            </w:r>
+            <w:r>
+              <w:rPr>
+                <w:rFonts w:ascii="Times New Roman" w:hAnsi="Times New Roman" w:cs="Times New Roman"/>
+              </w:rPr>
+              <w:t>3</w:t>
+            </w:r>
+            <w:r>
+              <w:rPr>
+                <w:rFonts w:ascii="Times New Roman" w:hAnsi="Times New Roman" w:cs="Times New Roman"/>
+              </w:rPr>
+              <w:t>.1</w:t>
             </w:r>
           </w:p>
         </w:tc>
@@ -2401,7 +2382,20 @@
               <w:rPr>
                 <w:rFonts w:ascii="Times New Roman" w:hAnsi="Times New Roman" w:cs="Times New Roman"/>
               </w:rPr>
-              <w:t>First Year - These Services start a er 1 Month from start of Go Live. Subsequent Years – A er comple on of 7 Man Days</w:t>
+              <w:t xml:space="preserve">The License renewal would be required to be done every Year These renewal fees will facilitate to have the Product Upgrades, which would cover improvements, bug fixes, and changes in AIAG VDA compliances. </w:t>
+            </w:r>
+          </w:p>
+          <w:p>
+            <w:pPr>
+              <w:rPr>
+                <w:rFonts w:ascii="Times New Roman" w:hAnsi="Times New Roman" w:cs="Times New Roman"/>
+              </w:rPr>
+            </w:pPr>
+            <w:r>
+              <w:rPr>
+                <w:rFonts w:ascii="Times New Roman" w:hAnsi="Times New Roman" w:cs="Times New Roman"/>
+              </w:rPr>
+              <w:t xml:space="preserve">Support of 7 Man days is included in this price.  </w:t>
             </w:r>
           </w:p>
         </w:tc>
@@ -2422,6 +2416,31 @@
                 <w:rFonts w:ascii="Times New Roman" w:hAnsi="Times New Roman" w:cs="Times New Roman"/>
               </w:rPr>
             </w:pPr>
+            <w:r>
+              <w:rPr>
+                <w:rFonts w:ascii="Times New Roman" w:hAnsi="Times New Roman" w:cs="Times New Roman"/>
+              </w:rPr>
+              <w:t>{{MODULE_</w:t>
+            </w:r>
+            <w:r>
+              <w:rPr>
+                <w:rFonts w:ascii="Times New Roman" w:hAnsi="Times New Roman" w:cs="Times New Roman"/>
+              </w:rPr>
+              <w:t>NAME</w:t>
+            </w:r>
+            <w:r>
+              <w:rPr>
+                <w:rFonts w:ascii="Times New Roman" w:hAnsi="Times New Roman" w:cs="Times New Roman"/>
+              </w:rPr>
+              <w:t>}}</w:t>
+            </w:r>
+          </w:p>
+          <w:p>
+            <w:pPr>
+              <w:rPr>
+                <w:rFonts w:ascii="Times New Roman" w:hAnsi="Times New Roman" w:cs="Times New Roman"/>
+              </w:rPr>
+            </w:pPr>
           </w:p>
         </w:tc>
       </w:tr>
@@ -2450,7 +2469,7 @@
               <w:rPr>
                 <w:rFonts w:ascii="Times New Roman" w:hAnsi="Times New Roman" w:cs="Times New Roman"/>
               </w:rPr>
-              <w:t>5</w:t>
+              <w:t>4</w:t>
             </w:r>
           </w:p>
         </w:tc>
@@ -2475,7 +2494,7 @@
               <w:rPr>
                 <w:rFonts w:ascii="Times New Roman" w:hAnsi="Times New Roman" w:cs="Times New Roman"/>
               </w:rPr>
-              <w:t>Payment Terms</w:t>
+              <w:t>Support Services</w:t>
             </w:r>
           </w:p>
         </w:tc>
@@ -2496,6 +2515,12 @@
                 <w:rFonts w:ascii="Times New Roman" w:hAnsi="Times New Roman" w:cs="Times New Roman"/>
               </w:rPr>
             </w:pPr>
+            <w:r>
+              <w:rPr>
+                <w:rFonts w:ascii="Times New Roman" w:hAnsi="Times New Roman" w:cs="Times New Roman"/>
+              </w:rPr>
+              <w:t>8000 per Man Day</w:t>
+            </w:r>
           </w:p>
         </w:tc>
       </w:tr>
@@ -2524,7 +2549,7 @@
               <w:rPr>
                 <w:rFonts w:ascii="Times New Roman" w:hAnsi="Times New Roman" w:cs="Times New Roman"/>
               </w:rPr>
-              <w:t xml:space="preserve"> 5.1</w:t>
+              <w:t xml:space="preserve"> 4.1</w:t>
             </w:r>
           </w:p>
         </w:tc>
@@ -2549,7 +2574,7 @@
               <w:rPr>
                 <w:rFonts w:ascii="Times New Roman" w:hAnsi="Times New Roman" w:cs="Times New Roman"/>
               </w:rPr>
-              <w:t xml:space="preserve">70% in Advance along with Purchase Order </w:t>
+              <w:t>First Year - These Services start a er 1 Month from start of Go Live. Subsequent Years – A er comple on of 7 Man Days</w:t>
             </w:r>
           </w:p>
         </w:tc>
@@ -2598,7 +2623,7 @@
               <w:rPr>
                 <w:rFonts w:ascii="Times New Roman" w:hAnsi="Times New Roman" w:cs="Times New Roman"/>
               </w:rPr>
-              <w:t xml:space="preserve"> 5.2</w:t>
+              <w:t>5</w:t>
             </w:r>
           </w:p>
         </w:tc>
@@ -2623,19 +2648,7 @@
               <w:rPr>
                 <w:rFonts w:ascii="Times New Roman" w:hAnsi="Times New Roman" w:cs="Times New Roman"/>
               </w:rPr>
-              <w:t xml:space="preserve">20% on </w:t>
-            </w:r>
-            <w:r>
-              <w:rPr>
-                <w:rFonts w:ascii="Times New Roman" w:hAnsi="Times New Roman" w:cs="Times New Roman"/>
-              </w:rPr>
-              <w:t>I</w:t>
-            </w:r>
-            <w:r>
-              <w:rPr>
-                <w:rFonts w:ascii="Times New Roman" w:hAnsi="Times New Roman" w:cs="Times New Roman"/>
-              </w:rPr>
-              <w:t>mplementation</w:t>
+              <w:t>Payment Terms</w:t>
             </w:r>
           </w:p>
         </w:tc>
@@ -2685,6 +2698,166 @@
                 <w:rFonts w:ascii="Times New Roman" w:hAnsi="Times New Roman" w:cs="Times New Roman"/>
               </w:rPr>
               <w:lastRenderedPageBreak/>
+              <w:t xml:space="preserve"> 5.1</w:t>
+            </w:r>
+          </w:p>
+        </w:tc>
+        <w:tc>
+          <w:tcPr>
+            <w:tcW w:w="6360" w:type="dxa"/>
+            <w:shd w:val="clear" w:color="auto" w:fill="FFFFFF" w:themeFill="background1"/>
+            <w:tcMar>
+              <w:top w:w="80" w:type="dxa"/>
+              <w:left w:w="120" w:type="dxa"/>
+              <w:bottom w:w="80" w:type="dxa"/>
+              <w:right w:w="120" w:type="dxa"/>
+            </w:tcMar>
+          </w:tcPr>
+          <w:p>
+            <w:pPr>
+              <w:rPr>
+                <w:rFonts w:ascii="Times New Roman" w:hAnsi="Times New Roman" w:cs="Times New Roman"/>
+              </w:rPr>
+            </w:pPr>
+            <w:r>
+              <w:rPr>
+                <w:rFonts w:ascii="Times New Roman" w:hAnsi="Times New Roman" w:cs="Times New Roman"/>
+              </w:rPr>
+              <w:t xml:space="preserve">70% in Advance along with Purchase Order </w:t>
+            </w:r>
+          </w:p>
+        </w:tc>
+        <w:tc>
+          <w:tcPr>
+            <w:tcW w:w="2625" w:type="dxa"/>
+            <w:shd w:val="clear" w:color="auto" w:fill="FFFFFF" w:themeFill="background1"/>
+            <w:tcMar>
+              <w:top w:w="80" w:type="dxa"/>
+              <w:left w:w="120" w:type="dxa"/>
+              <w:bottom w:w="80" w:type="dxa"/>
+              <w:right w:w="120" w:type="dxa"/>
+            </w:tcMar>
+          </w:tcPr>
+          <w:p>
+            <w:pPr>
+              <w:rPr>
+                <w:rFonts w:ascii="Times New Roman" w:hAnsi="Times New Roman" w:cs="Times New Roman"/>
+              </w:rPr>
+            </w:pPr>
+          </w:p>
+        </w:tc>
+      </w:tr>
+      <w:tr>
+        <w:trPr>
+          <w:trHeight w:val="20"/>
+        </w:trPr>
+        <w:tc>
+          <w:tcPr>
+            <w:tcW w:w="1007" w:type="dxa"/>
+            <w:shd w:val="clear" w:color="auto" w:fill="FFFFFF" w:themeFill="background1"/>
+            <w:tcMar>
+              <w:top w:w="80" w:type="dxa"/>
+              <w:left w:w="120" w:type="dxa"/>
+              <w:bottom w:w="80" w:type="dxa"/>
+              <w:right w:w="120" w:type="dxa"/>
+            </w:tcMar>
+          </w:tcPr>
+          <w:p>
+            <w:pPr>
+              <w:rPr>
+                <w:rFonts w:ascii="Times New Roman" w:hAnsi="Times New Roman" w:cs="Times New Roman"/>
+              </w:rPr>
+            </w:pPr>
+            <w:r>
+              <w:rPr>
+                <w:rFonts w:ascii="Times New Roman" w:hAnsi="Times New Roman" w:cs="Times New Roman"/>
+              </w:rPr>
+              <w:t xml:space="preserve"> 5.2</w:t>
+            </w:r>
+          </w:p>
+        </w:tc>
+        <w:tc>
+          <w:tcPr>
+            <w:tcW w:w="6360" w:type="dxa"/>
+            <w:shd w:val="clear" w:color="auto" w:fill="FFFFFF" w:themeFill="background1"/>
+            <w:tcMar>
+              <w:top w:w="80" w:type="dxa"/>
+              <w:left w:w="120" w:type="dxa"/>
+              <w:bottom w:w="80" w:type="dxa"/>
+              <w:right w:w="120" w:type="dxa"/>
+            </w:tcMar>
+          </w:tcPr>
+          <w:p>
+            <w:pPr>
+              <w:rPr>
+                <w:rFonts w:ascii="Times New Roman" w:hAnsi="Times New Roman" w:cs="Times New Roman"/>
+              </w:rPr>
+            </w:pPr>
+            <w:r>
+              <w:rPr>
+                <w:rFonts w:ascii="Times New Roman" w:hAnsi="Times New Roman" w:cs="Times New Roman"/>
+              </w:rPr>
+              <w:t xml:space="preserve">20% on </w:t>
+            </w:r>
+            <w:r>
+              <w:rPr>
+                <w:rFonts w:ascii="Times New Roman" w:hAnsi="Times New Roman" w:cs="Times New Roman"/>
+              </w:rPr>
+              <w:t>I</w:t>
+            </w:r>
+            <w:r>
+              <w:rPr>
+                <w:rFonts w:ascii="Times New Roman" w:hAnsi="Times New Roman" w:cs="Times New Roman"/>
+              </w:rPr>
+              <w:t>mplementation</w:t>
+            </w:r>
+          </w:p>
+        </w:tc>
+        <w:tc>
+          <w:tcPr>
+            <w:tcW w:w="2625" w:type="dxa"/>
+            <w:shd w:val="clear" w:color="auto" w:fill="FFFFFF" w:themeFill="background1"/>
+            <w:tcMar>
+              <w:top w:w="80" w:type="dxa"/>
+              <w:left w:w="120" w:type="dxa"/>
+              <w:bottom w:w="80" w:type="dxa"/>
+              <w:right w:w="120" w:type="dxa"/>
+            </w:tcMar>
+          </w:tcPr>
+          <w:p>
+            <w:pPr>
+              <w:rPr>
+                <w:rFonts w:ascii="Times New Roman" w:hAnsi="Times New Roman" w:cs="Times New Roman"/>
+              </w:rPr>
+            </w:pPr>
+          </w:p>
+        </w:tc>
+      </w:tr>
+      <w:tr>
+        <w:trPr>
+          <w:trHeight w:val="20"/>
+        </w:trPr>
+        <w:tc>
+          <w:tcPr>
+            <w:tcW w:w="1007" w:type="dxa"/>
+            <w:shd w:val="clear" w:color="auto" w:fill="FFFFFF" w:themeFill="background1"/>
+            <w:tcMar>
+              <w:top w:w="80" w:type="dxa"/>
+              <w:left w:w="120" w:type="dxa"/>
+              <w:bottom w:w="80" w:type="dxa"/>
+              <w:right w:w="120" w:type="dxa"/>
+            </w:tcMar>
+          </w:tcPr>
+          <w:p>
+            <w:pPr>
+              <w:rPr>
+                <w:rFonts w:ascii="Times New Roman" w:hAnsi="Times New Roman" w:cs="Times New Roman"/>
+              </w:rPr>
+            </w:pPr>
+            <w:r>
+              <w:rPr>
+                <w:rFonts w:ascii="Times New Roman" w:hAnsi="Times New Roman" w:cs="Times New Roman"/>
+              </w:rPr>
               <w:t xml:space="preserve"> 5.3</w:t>
             </w:r>
           </w:p>
@@ -5009,6 +5182,7 @@
               <w:rPr>
                 <w:rFonts w:ascii="Times New Roman" w:hAnsi="Times New Roman" w:cs="Times New Roman"/>
               </w:rPr>
+              <w:lastRenderedPageBreak/>
               <w:t>{{MODULE_LIST}}</w:t>
             </w:r>
             <w:r>
@@ -5121,7 +5295,6 @@
               <w:rPr>
                 <w:rFonts w:ascii="Times New Roman" w:hAnsi="Times New Roman" w:cs="Times New Roman"/>
               </w:rPr>
-              <w:lastRenderedPageBreak/>
               <w:t>Data Preparation for Go-Live</w:t>
             </w:r>
           </w:p>
@@ -5784,6 +5957,7 @@
         <w:rPr>
           <w:rFonts w:ascii="Times New Roman" w:hAnsi="Times New Roman" w:cs="Times New Roman"/>
         </w:rPr>
+        <w:lastRenderedPageBreak/>
         <w:t xml:space="preserve">BlechTek shall not be liable or deemed to be in default for any delay or failure in performance under this Contract or interruption of services due to strike or </w:t>
       </w:r>
       <w:r>
@@ -7332,7 +7506,7 @@
   <w:style w:type="paragraph" w:default="1" w:styleId="Normal">
     <w:name w:val="Normal"/>
     <w:qFormat/>
-    <w:rsid w:val="00E84263"/>
+    <w:rsid w:val="007F787B"/>
   </w:style>
   <w:style w:type="paragraph" w:styleId="Heading1">
     <w:name w:val="heading 1"/>

</xml_diff>

<commit_message>
updates about PO page for new cross verify pdf screen
</commit_message>
<xml_diff>
--- a/QuotationApp.API/Templates/QuotationTemplate_Updated.docx
+++ b/QuotationApp.API/Templates/QuotationTemplate_Updated.docx
@@ -4827,13 +4827,14 @@
     <w:tbl>
       <w:tblPr>
         <w:tblStyle w:val="TableGrid0"/>
-        <w:tblW w:w="0" w:type="auto"/>
+        <w:tblW w:w="10060" w:type="dxa"/>
+        <w:tblLayout w:type="fixed"/>
         <w:tblLook w:val="04A0" w:firstRow="1" w:lastRow="0" w:firstColumn="1" w:lastColumn="0" w:noHBand="0" w:noVBand="1"/>
       </w:tblPr>
       <w:tblGrid>
-        <w:gridCol w:w="2734"/>
-        <w:gridCol w:w="3626"/>
-        <w:gridCol w:w="3670"/>
+        <w:gridCol w:w="2689"/>
+        <w:gridCol w:w="3827"/>
+        <w:gridCol w:w="3544"/>
       </w:tblGrid>
       <w:tr>
         <w:trPr>
@@ -4841,7 +4842,7 @@
         </w:trPr>
         <w:tc>
           <w:tcPr>
-            <w:tcW w:w="2830" w:type="dxa"/>
+            <w:tcW w:w="2689" w:type="dxa"/>
           </w:tcPr>
           <w:p>
             <w:pPr>
@@ -4861,7 +4862,7 @@
         </w:tc>
         <w:tc>
           <w:tcPr>
-            <w:tcW w:w="3626" w:type="dxa"/>
+            <w:tcW w:w="3827" w:type="dxa"/>
             <w:tcBorders>
               <w:bottom w:val="single" w:sz="2" w:space="0" w:color="auto"/>
             </w:tcBorders>
@@ -4871,11 +4872,15 @@
               <w:spacing w:after="160" w:line="259" w:lineRule="auto"/>
               <w:rPr>
                 <w:rFonts w:ascii="Times New Roman" w:hAnsi="Times New Roman" w:cs="Times New Roman"/>
-              </w:rPr>
-            </w:pPr>
-            <w:r>
-              <w:rPr>
-                <w:rFonts w:ascii="Times New Roman" w:hAnsi="Times New Roman" w:cs="Times New Roman"/>
+                <w:sz w:val="18"/>
+                <w:szCs w:val="18"/>
+              </w:rPr>
+            </w:pPr>
+            <w:r>
+              <w:rPr>
+                <w:rFonts w:ascii="Times New Roman" w:hAnsi="Times New Roman" w:cs="Times New Roman"/>
+                <w:sz w:val="18"/>
+                <w:szCs w:val="18"/>
               </w:rPr>
               <w:t>Month 1</w:t>
             </w:r>
@@ -4883,16 +4888,17 @@
           <w:tbl>
             <w:tblPr>
               <w:tblStyle w:val="TableGrid0"/>
-              <w:tblpPr w:leftFromText="180" w:rightFromText="180" w:vertAnchor="text" w:horzAnchor="margin" w:tblpY="40"/>
+              <w:tblpPr w:leftFromText="180" w:rightFromText="180" w:vertAnchor="text" w:horzAnchor="margin" w:tblpX="-147" w:tblpY="40"/>
               <w:tblOverlap w:val="never"/>
-              <w:tblW w:w="3397" w:type="dxa"/>
+              <w:tblW w:w="3823" w:type="dxa"/>
+              <w:tblLayout w:type="fixed"/>
               <w:tblLook w:val="04A0" w:firstRow="1" w:lastRow="0" w:firstColumn="1" w:lastColumn="0" w:noHBand="0" w:noVBand="1"/>
             </w:tblPr>
             <w:tblGrid>
-              <w:gridCol w:w="952"/>
+              <w:gridCol w:w="1099"/>
               <w:gridCol w:w="886"/>
               <w:gridCol w:w="851"/>
-              <w:gridCol w:w="708"/>
+              <w:gridCol w:w="987"/>
             </w:tblGrid>
             <w:tr>
               <w:trPr>
@@ -4900,18 +4906,22 @@
               </w:trPr>
               <w:tc>
                 <w:tcPr>
-                  <w:tcW w:w="952" w:type="dxa"/>
+                  <w:tcW w:w="1099" w:type="dxa"/>
                 </w:tcPr>
                 <w:p>
                   <w:pPr>
                     <w:spacing w:after="160" w:line="259" w:lineRule="auto"/>
                     <w:rPr>
                       <w:rFonts w:ascii="Times New Roman" w:hAnsi="Times New Roman" w:cs="Times New Roman"/>
+                      <w:sz w:val="18"/>
+                      <w:szCs w:val="18"/>
                     </w:rPr>
                   </w:pPr>
                   <w:r>
                     <w:rPr>
                       <w:rFonts w:ascii="Times New Roman" w:hAnsi="Times New Roman" w:cs="Times New Roman"/>
+                      <w:sz w:val="18"/>
+                      <w:szCs w:val="18"/>
                     </w:rPr>
                     <w:t>WK1</w:t>
                   </w:r>
@@ -4926,11 +4936,15 @@
                     <w:spacing w:after="160" w:line="259" w:lineRule="auto"/>
                     <w:rPr>
                       <w:rFonts w:ascii="Times New Roman" w:hAnsi="Times New Roman" w:cs="Times New Roman"/>
+                      <w:sz w:val="18"/>
+                      <w:szCs w:val="18"/>
                     </w:rPr>
                   </w:pPr>
                   <w:r>
                     <w:rPr>
                       <w:rFonts w:ascii="Times New Roman" w:hAnsi="Times New Roman" w:cs="Times New Roman"/>
+                      <w:sz w:val="18"/>
+                      <w:szCs w:val="18"/>
                     </w:rPr>
                     <w:t>WK2</w:t>
                   </w:r>
@@ -4945,11 +4959,15 @@
                     <w:spacing w:after="160" w:line="259" w:lineRule="auto"/>
                     <w:rPr>
                       <w:rFonts w:ascii="Times New Roman" w:hAnsi="Times New Roman" w:cs="Times New Roman"/>
+                      <w:sz w:val="18"/>
+                      <w:szCs w:val="18"/>
                     </w:rPr>
                   </w:pPr>
                   <w:r>
                     <w:rPr>
                       <w:rFonts w:ascii="Times New Roman" w:hAnsi="Times New Roman" w:cs="Times New Roman"/>
+                      <w:sz w:val="18"/>
+                      <w:szCs w:val="18"/>
                     </w:rPr>
                     <w:t>WK3</w:t>
                   </w:r>
@@ -4957,18 +4975,22 @@
               </w:tc>
               <w:tc>
                 <w:tcPr>
-                  <w:tcW w:w="708" w:type="dxa"/>
+                  <w:tcW w:w="987" w:type="dxa"/>
                 </w:tcPr>
                 <w:p>
                   <w:pPr>
                     <w:spacing w:after="160" w:line="259" w:lineRule="auto"/>
                     <w:rPr>
                       <w:rFonts w:ascii="Times New Roman" w:hAnsi="Times New Roman" w:cs="Times New Roman"/>
+                      <w:sz w:val="18"/>
+                      <w:szCs w:val="18"/>
                     </w:rPr>
                   </w:pPr>
                   <w:r>
                     <w:rPr>
                       <w:rFonts w:ascii="Times New Roman" w:hAnsi="Times New Roman" w:cs="Times New Roman"/>
+                      <w:sz w:val="18"/>
+                      <w:szCs w:val="18"/>
                     </w:rPr>
                     <w:t>WK4</w:t>
                   </w:r>
@@ -4981,24 +5003,30 @@
               <w:spacing w:after="160" w:line="259" w:lineRule="auto"/>
               <w:rPr>
                 <w:rFonts w:ascii="Times New Roman" w:hAnsi="Times New Roman" w:cs="Times New Roman"/>
-              </w:rPr>
-            </w:pPr>
-          </w:p>
-        </w:tc>
-        <w:tc>
-          <w:tcPr>
-            <w:tcW w:w="3574" w:type="dxa"/>
+                <w:sz w:val="18"/>
+                <w:szCs w:val="18"/>
+              </w:rPr>
+            </w:pPr>
+          </w:p>
+        </w:tc>
+        <w:tc>
+          <w:tcPr>
+            <w:tcW w:w="3544" w:type="dxa"/>
           </w:tcPr>
           <w:p>
             <w:pPr>
               <w:spacing w:after="160" w:line="259" w:lineRule="auto"/>
               <w:rPr>
                 <w:rFonts w:ascii="Times New Roman" w:hAnsi="Times New Roman" w:cs="Times New Roman"/>
-              </w:rPr>
-            </w:pPr>
-            <w:r>
-              <w:rPr>
-                <w:rFonts w:ascii="Times New Roman" w:hAnsi="Times New Roman" w:cs="Times New Roman"/>
+                <w:sz w:val="18"/>
+                <w:szCs w:val="18"/>
+              </w:rPr>
+            </w:pPr>
+            <w:r>
+              <w:rPr>
+                <w:rFonts w:ascii="Times New Roman" w:hAnsi="Times New Roman" w:cs="Times New Roman"/>
+                <w:sz w:val="18"/>
+                <w:szCs w:val="18"/>
               </w:rPr>
               <w:t>Month 2</w:t>
             </w:r>
@@ -5006,13 +5034,14 @@
           <w:tbl>
             <w:tblPr>
               <w:tblStyle w:val="TableGrid0"/>
-              <w:tblpPr w:leftFromText="180" w:rightFromText="180" w:vertAnchor="text" w:tblpY="25"/>
+              <w:tblpPr w:leftFromText="180" w:rightFromText="180" w:vertAnchor="text" w:horzAnchor="margin" w:tblpY="24"/>
               <w:tblOverlap w:val="never"/>
-              <w:tblW w:w="3444" w:type="dxa"/>
+              <w:tblW w:w="3591" w:type="dxa"/>
+              <w:tblLayout w:type="fixed"/>
               <w:tblLook w:val="04A0" w:firstRow="1" w:lastRow="0" w:firstColumn="1" w:lastColumn="0" w:noHBand="0" w:noVBand="1"/>
             </w:tblPr>
             <w:tblGrid>
-              <w:gridCol w:w="861"/>
+              <w:gridCol w:w="1008"/>
               <w:gridCol w:w="861"/>
               <w:gridCol w:w="861"/>
               <w:gridCol w:w="861"/>
@@ -5023,18 +5052,22 @@
               </w:trPr>
               <w:tc>
                 <w:tcPr>
-                  <w:tcW w:w="861" w:type="dxa"/>
+                  <w:tcW w:w="1008" w:type="dxa"/>
                 </w:tcPr>
                 <w:p>
                   <w:pPr>
                     <w:spacing w:after="160" w:line="259" w:lineRule="auto"/>
                     <w:rPr>
                       <w:rFonts w:ascii="Times New Roman" w:hAnsi="Times New Roman" w:cs="Times New Roman"/>
+                      <w:sz w:val="18"/>
+                      <w:szCs w:val="18"/>
                     </w:rPr>
                   </w:pPr>
                   <w:r>
                     <w:rPr>
                       <w:rFonts w:ascii="Times New Roman" w:hAnsi="Times New Roman" w:cs="Times New Roman"/>
+                      <w:sz w:val="18"/>
+                      <w:szCs w:val="18"/>
                     </w:rPr>
                     <w:t>WK1</w:t>
                   </w:r>
@@ -5049,11 +5082,15 @@
                     <w:spacing w:after="160" w:line="259" w:lineRule="auto"/>
                     <w:rPr>
                       <w:rFonts w:ascii="Times New Roman" w:hAnsi="Times New Roman" w:cs="Times New Roman"/>
+                      <w:sz w:val="18"/>
+                      <w:szCs w:val="18"/>
                     </w:rPr>
                   </w:pPr>
                   <w:r>
                     <w:rPr>
                       <w:rFonts w:ascii="Times New Roman" w:hAnsi="Times New Roman" w:cs="Times New Roman"/>
+                      <w:sz w:val="18"/>
+                      <w:szCs w:val="18"/>
                     </w:rPr>
                     <w:t>WK2</w:t>
                   </w:r>
@@ -5068,11 +5105,15 @@
                     <w:spacing w:after="160" w:line="259" w:lineRule="auto"/>
                     <w:rPr>
                       <w:rFonts w:ascii="Times New Roman" w:hAnsi="Times New Roman" w:cs="Times New Roman"/>
+                      <w:sz w:val="18"/>
+                      <w:szCs w:val="18"/>
                     </w:rPr>
                   </w:pPr>
                   <w:r>
                     <w:rPr>
                       <w:rFonts w:ascii="Times New Roman" w:hAnsi="Times New Roman" w:cs="Times New Roman"/>
+                      <w:sz w:val="18"/>
+                      <w:szCs w:val="18"/>
                     </w:rPr>
                     <w:t>WK3</w:t>
                   </w:r>
@@ -5087,11 +5128,15 @@
                     <w:spacing w:after="160" w:line="259" w:lineRule="auto"/>
                     <w:rPr>
                       <w:rFonts w:ascii="Times New Roman" w:hAnsi="Times New Roman" w:cs="Times New Roman"/>
+                      <w:sz w:val="18"/>
+                      <w:szCs w:val="18"/>
                     </w:rPr>
                   </w:pPr>
                   <w:r>
                     <w:rPr>
                       <w:rFonts w:ascii="Times New Roman" w:hAnsi="Times New Roman" w:cs="Times New Roman"/>
+                      <w:sz w:val="18"/>
+                      <w:szCs w:val="18"/>
                     </w:rPr>
                     <w:t>WK4</w:t>
                   </w:r>
@@ -5104,6 +5149,8 @@
               <w:spacing w:after="160" w:line="259" w:lineRule="auto"/>
               <w:rPr>
                 <w:rFonts w:ascii="Times New Roman" w:hAnsi="Times New Roman" w:cs="Times New Roman"/>
+                <w:sz w:val="18"/>
+                <w:szCs w:val="18"/>
               </w:rPr>
             </w:pPr>
           </w:p>
@@ -5115,7 +5162,7 @@
         </w:trPr>
         <w:tc>
           <w:tcPr>
-            <w:tcW w:w="2830" w:type="dxa"/>
+            <w:tcW w:w="2689" w:type="dxa"/>
           </w:tcPr>
           <w:p>
             <w:pPr>
@@ -5134,7 +5181,7 @@
         </w:tc>
         <w:tc>
           <w:tcPr>
-            <w:tcW w:w="3626" w:type="dxa"/>
+            <w:tcW w:w="3827" w:type="dxa"/>
             <w:tcBorders>
               <w:top w:val="single" w:sz="2" w:space="0" w:color="auto"/>
             </w:tcBorders>
@@ -5150,7 +5197,7 @@
         </w:tc>
         <w:tc>
           <w:tcPr>
-            <w:tcW w:w="3574" w:type="dxa"/>
+            <w:tcW w:w="3544" w:type="dxa"/>
           </w:tcPr>
           <w:p>
             <w:pPr>
@@ -5168,7 +5215,7 @@
         </w:trPr>
         <w:tc>
           <w:tcPr>
-            <w:tcW w:w="2830" w:type="dxa"/>
+            <w:tcW w:w="2689" w:type="dxa"/>
           </w:tcPr>
           <w:p>
             <w:pPr>
@@ -5187,7 +5234,7 @@
         </w:tc>
         <w:tc>
           <w:tcPr>
-            <w:tcW w:w="3626" w:type="dxa"/>
+            <w:tcW w:w="3827" w:type="dxa"/>
           </w:tcPr>
           <w:p>
             <w:pPr>
@@ -5200,7 +5247,7 @@
         </w:tc>
         <w:tc>
           <w:tcPr>
-            <w:tcW w:w="3574" w:type="dxa"/>
+            <w:tcW w:w="3544" w:type="dxa"/>
           </w:tcPr>
           <w:p>
             <w:pPr>
@@ -5218,7 +5265,7 @@
         </w:trPr>
         <w:tc>
           <w:tcPr>
-            <w:tcW w:w="2830" w:type="dxa"/>
+            <w:tcW w:w="2689" w:type="dxa"/>
           </w:tcPr>
           <w:p>
             <w:pPr>
@@ -5250,7 +5297,7 @@
         </w:tc>
         <w:tc>
           <w:tcPr>
-            <w:tcW w:w="3626" w:type="dxa"/>
+            <w:tcW w:w="3827" w:type="dxa"/>
           </w:tcPr>
           <w:p>
             <w:pPr>
@@ -5263,7 +5310,7 @@
         </w:tc>
         <w:tc>
           <w:tcPr>
-            <w:tcW w:w="3574" w:type="dxa"/>
+            <w:tcW w:w="3544" w:type="dxa"/>
           </w:tcPr>
           <w:p>
             <w:pPr>
@@ -5281,7 +5328,7 @@
         </w:trPr>
         <w:tc>
           <w:tcPr>
-            <w:tcW w:w="2830" w:type="dxa"/>
+            <w:tcW w:w="2689" w:type="dxa"/>
           </w:tcPr>
           <w:p>
             <w:pPr>
@@ -5300,7 +5347,7 @@
         </w:tc>
         <w:tc>
           <w:tcPr>
-            <w:tcW w:w="3626" w:type="dxa"/>
+            <w:tcW w:w="3827" w:type="dxa"/>
           </w:tcPr>
           <w:p>
             <w:pPr>
@@ -5313,7 +5360,7 @@
         </w:tc>
         <w:tc>
           <w:tcPr>
-            <w:tcW w:w="3574" w:type="dxa"/>
+            <w:tcW w:w="3544" w:type="dxa"/>
           </w:tcPr>
           <w:p>
             <w:pPr>
@@ -5331,7 +5378,7 @@
         </w:trPr>
         <w:tc>
           <w:tcPr>
-            <w:tcW w:w="2830" w:type="dxa"/>
+            <w:tcW w:w="2689" w:type="dxa"/>
           </w:tcPr>
           <w:p>
             <w:pPr>
@@ -5350,7 +5397,7 @@
         </w:tc>
         <w:tc>
           <w:tcPr>
-            <w:tcW w:w="3626" w:type="dxa"/>
+            <w:tcW w:w="3827" w:type="dxa"/>
           </w:tcPr>
           <w:p>
             <w:pPr>
@@ -5363,7 +5410,7 @@
         </w:tc>
         <w:tc>
           <w:tcPr>
-            <w:tcW w:w="3574" w:type="dxa"/>
+            <w:tcW w:w="3544" w:type="dxa"/>
           </w:tcPr>
           <w:p>
             <w:pPr>
@@ -5381,7 +5428,7 @@
         </w:trPr>
         <w:tc>
           <w:tcPr>
-            <w:tcW w:w="2830" w:type="dxa"/>
+            <w:tcW w:w="2689" w:type="dxa"/>
           </w:tcPr>
           <w:p>
             <w:pPr>
@@ -5400,7 +5447,7 @@
         </w:tc>
         <w:tc>
           <w:tcPr>
-            <w:tcW w:w="3626" w:type="dxa"/>
+            <w:tcW w:w="3827" w:type="dxa"/>
           </w:tcPr>
           <w:p>
             <w:pPr>
@@ -5413,7 +5460,7 @@
         </w:tc>
         <w:tc>
           <w:tcPr>
-            <w:tcW w:w="3574" w:type="dxa"/>
+            <w:tcW w:w="3544" w:type="dxa"/>
           </w:tcPr>
           <w:p>
             <w:pPr>
@@ -5431,7 +5478,7 @@
         </w:trPr>
         <w:tc>
           <w:tcPr>
-            <w:tcW w:w="2830" w:type="dxa"/>
+            <w:tcW w:w="2689" w:type="dxa"/>
           </w:tcPr>
           <w:p>
             <w:pPr>
@@ -5450,7 +5497,7 @@
         </w:tc>
         <w:tc>
           <w:tcPr>
-            <w:tcW w:w="3626" w:type="dxa"/>
+            <w:tcW w:w="3827" w:type="dxa"/>
           </w:tcPr>
           <w:p>
             <w:pPr>
@@ -5463,7 +5510,7 @@
         </w:tc>
         <w:tc>
           <w:tcPr>
-            <w:tcW w:w="3574" w:type="dxa"/>
+            <w:tcW w:w="3544" w:type="dxa"/>
           </w:tcPr>
           <w:p>
             <w:pPr>

</xml_diff>

<commit_message>
updates in quotation pdf about the discount % hide and show
</commit_message>
<xml_diff>
--- a/QuotationApp.API/Templates/QuotationTemplate_Updated.docx
+++ b/QuotationApp.API/Templates/QuotationTemplate_Updated.docx
@@ -550,26 +550,15 @@
           <w:bCs/>
           <w:color w:val="65AADB"/>
         </w:rPr>
-        <w:t>{{ORG_</w:t>
-      </w:r>
-      <w:proofErr w:type="gramStart"/>
-      <w:r>
-        <w:rPr>
-          <w:rFonts w:ascii="Times New Roman" w:hAnsi="Times New Roman" w:cs="Times New Roman"/>
-          <w:b/>
-          <w:bCs/>
+        <w:t>{{ORG_NAME}}</w:t>
+      </w:r>
+      <w:r>
+        <w:rPr>
+          <w:rFonts w:ascii="Times New Roman" w:hAnsi="Times New Roman" w:cs="Times New Roman"/>
           <w:color w:val="65AADB"/>
         </w:rPr>
-        <w:t>NAME}}</w:t>
-      </w:r>
-      <w:r>
-        <w:rPr>
-          <w:rFonts w:ascii="Times New Roman" w:hAnsi="Times New Roman" w:cs="Times New Roman"/>
-          <w:color w:val="65AADB"/>
-        </w:rPr>
         <w:t>.</w:t>
       </w:r>
-      <w:proofErr w:type="gramEnd"/>
     </w:p>
     <w:p>
       <w:pPr>
@@ -1779,31 +1768,6 @@
               <w:t xml:space="preserve"> Users</w:t>
             </w:r>
           </w:p>
-          <w:p>
-            <w:pPr>
-              <w:rPr>
-                <w:rFonts w:ascii="Times New Roman" w:hAnsi="Times New Roman" w:cs="Times New Roman"/>
-              </w:rPr>
-            </w:pPr>
-            <w:r>
-              <w:rPr>
-                <w:rFonts w:ascii="Times New Roman" w:hAnsi="Times New Roman" w:cs="Times New Roman"/>
-              </w:rPr>
-              <w:t>Discount ({{MODULE_DISCOUNT_PCT</w:t>
-            </w:r>
-            <w:r>
-              <w:rPr>
-                <w:rFonts w:ascii="Times New Roman" w:hAnsi="Times New Roman" w:cs="Times New Roman"/>
-              </w:rPr>
-              <w:t>}} %</w:t>
-            </w:r>
-            <w:r>
-              <w:rPr>
-                <w:rFonts w:ascii="Times New Roman" w:hAnsi="Times New Roman" w:cs="Times New Roman"/>
-              </w:rPr>
-              <w:t>):</w:t>
-            </w:r>
-          </w:p>
         </w:tc>
         <w:tc>
           <w:tcPr>
@@ -1836,19 +1800,6 @@
               </w:rPr>
             </w:pPr>
           </w:p>
-          <w:p>
-            <w:pPr>
-              <w:rPr>
-                <w:rFonts w:ascii="Times New Roman" w:hAnsi="Times New Roman" w:cs="Times New Roman"/>
-              </w:rPr>
-            </w:pPr>
-            <w:r>
-              <w:rPr>
-                <w:rFonts w:ascii="Times New Roman" w:hAnsi="Times New Roman" w:cs="Times New Roman"/>
-              </w:rPr>
-              <w:t>{{MODULE_DISCOUNT}}</w:t>
-            </w:r>
-          </w:p>
         </w:tc>
       </w:tr>
       <w:tr>
@@ -1872,12 +1823,6 @@
                 <w:rFonts w:ascii="Times New Roman" w:hAnsi="Times New Roman" w:cs="Times New Roman"/>
               </w:rPr>
             </w:pPr>
-            <w:r>
-              <w:rPr>
-                <w:rFonts w:ascii="Times New Roman" w:hAnsi="Times New Roman" w:cs="Times New Roman"/>
-              </w:rPr>
-              <w:t xml:space="preserve"> 1.1</w:t>
-            </w:r>
           </w:p>
         </w:tc>
         <w:tc>
@@ -1901,49 +1846,7 @@
               <w:rPr>
                 <w:rFonts w:ascii="Times New Roman" w:hAnsi="Times New Roman" w:cs="Times New Roman"/>
               </w:rPr>
-              <w:t>Implementation (</w:t>
-            </w:r>
-            <w:r>
-              <w:rPr>
-                <w:rFonts w:ascii="Times New Roman" w:hAnsi="Times New Roman" w:cs="Times New Roman"/>
-              </w:rPr>
-              <w:t>{{NO_OF_USERS</w:t>
-            </w:r>
-            <w:r>
-              <w:rPr>
-                <w:rFonts w:ascii="Times New Roman" w:hAnsi="Times New Roman" w:cs="Times New Roman"/>
-              </w:rPr>
-              <w:t>}}</w:t>
-            </w:r>
-            <w:r>
-              <w:rPr>
-                <w:rFonts w:ascii="Times New Roman" w:hAnsi="Times New Roman" w:cs="Times New Roman"/>
-              </w:rPr>
-              <w:t xml:space="preserve"> Man</w:t>
-            </w:r>
-            <w:r>
-              <w:rPr>
-                <w:rFonts w:ascii="Times New Roman" w:hAnsi="Times New Roman" w:cs="Times New Roman"/>
-              </w:rPr>
-              <w:t xml:space="preserve"> Day * </w:t>
-            </w:r>
-            <w:r>
-              <w:rPr>
-                <w:rFonts w:ascii="Times New Roman" w:hAnsi="Times New Roman" w:cs="Times New Roman"/>
-              </w:rPr>
-              <w:t>{{IMPL_RATE}}</w:t>
-            </w:r>
-            <w:r>
-              <w:rPr>
-                <w:rFonts w:ascii="Times New Roman" w:hAnsi="Times New Roman" w:cs="Times New Roman"/>
-              </w:rPr>
-              <w:t xml:space="preserve"> </w:t>
-            </w:r>
-            <w:r>
-              <w:rPr>
-                <w:rFonts w:ascii="Times New Roman" w:hAnsi="Times New Roman" w:cs="Times New Roman"/>
-              </w:rPr>
-              <w:t>per Man Day)</w:t>
+              <w:t>Discount ({{MODULE_DISCOUNT_PCT}} %):</w:t>
             </w:r>
           </w:p>
         </w:tc>
@@ -1968,7 +1871,7 @@
               <w:rPr>
                 <w:rFonts w:ascii="Times New Roman" w:hAnsi="Times New Roman" w:cs="Times New Roman"/>
               </w:rPr>
-              <w:t>{{IMPL_TOTAL}}</w:t>
+              <w:t>{{MODULE_DISCOUNT}}</w:t>
             </w:r>
           </w:p>
         </w:tc>
@@ -1994,6 +1897,12 @@
                 <w:rFonts w:ascii="Times New Roman" w:hAnsi="Times New Roman" w:cs="Times New Roman"/>
               </w:rPr>
             </w:pPr>
+            <w:r>
+              <w:rPr>
+                <w:rFonts w:ascii="Times New Roman" w:hAnsi="Times New Roman" w:cs="Times New Roman"/>
+              </w:rPr>
+              <w:t xml:space="preserve"> 1.1</w:t>
+            </w:r>
           </w:p>
         </w:tc>
         <w:tc>
@@ -2017,13 +1926,49 @@
               <w:rPr>
                 <w:rFonts w:ascii="Times New Roman" w:hAnsi="Times New Roman" w:cs="Times New Roman"/>
               </w:rPr>
-              <w:t>Module Subtotal</w:t>
-            </w:r>
-            <w:r>
-              <w:rPr>
-                <w:rFonts w:ascii="Times New Roman" w:hAnsi="Times New Roman" w:cs="Times New Roman"/>
-              </w:rPr>
-              <w:t>:</w:t>
+              <w:t>Implementation (</w:t>
+            </w:r>
+            <w:r>
+              <w:rPr>
+                <w:rFonts w:ascii="Times New Roman" w:hAnsi="Times New Roman" w:cs="Times New Roman"/>
+              </w:rPr>
+              <w:t>{{NO_OF_USERS</w:t>
+            </w:r>
+            <w:r>
+              <w:rPr>
+                <w:rFonts w:ascii="Times New Roman" w:hAnsi="Times New Roman" w:cs="Times New Roman"/>
+              </w:rPr>
+              <w:t>}}</w:t>
+            </w:r>
+            <w:r>
+              <w:rPr>
+                <w:rFonts w:ascii="Times New Roman" w:hAnsi="Times New Roman" w:cs="Times New Roman"/>
+              </w:rPr>
+              <w:t xml:space="preserve"> Man</w:t>
+            </w:r>
+            <w:r>
+              <w:rPr>
+                <w:rFonts w:ascii="Times New Roman" w:hAnsi="Times New Roman" w:cs="Times New Roman"/>
+              </w:rPr>
+              <w:t xml:space="preserve"> Day * </w:t>
+            </w:r>
+            <w:r>
+              <w:rPr>
+                <w:rFonts w:ascii="Times New Roman" w:hAnsi="Times New Roman" w:cs="Times New Roman"/>
+              </w:rPr>
+              <w:t>{{IMPL_RATE}}</w:t>
+            </w:r>
+            <w:r>
+              <w:rPr>
+                <w:rFonts w:ascii="Times New Roman" w:hAnsi="Times New Roman" w:cs="Times New Roman"/>
+              </w:rPr>
+              <w:t xml:space="preserve"> </w:t>
+            </w:r>
+            <w:r>
+              <w:rPr>
+                <w:rFonts w:ascii="Times New Roman" w:hAnsi="Times New Roman" w:cs="Times New Roman"/>
+              </w:rPr>
+              <w:t>per Man Day)</w:t>
             </w:r>
           </w:p>
         </w:tc>
@@ -2048,7 +1993,7 @@
               <w:rPr>
                 <w:rFonts w:ascii="Times New Roman" w:hAnsi="Times New Roman" w:cs="Times New Roman"/>
               </w:rPr>
-              <w:t>{{MODULE_SUBTOTAL}}</w:t>
+              <w:t>{{IMPL_TOTAL}}</w:t>
             </w:r>
           </w:p>
         </w:tc>
@@ -2097,7 +2042,13 @@
               <w:rPr>
                 <w:rFonts w:ascii="Times New Roman" w:hAnsi="Times New Roman" w:cs="Times New Roman"/>
               </w:rPr>
-              <w:t>Total of All Modules Final Price:</w:t>
+              <w:t>Module Subtotal</w:t>
+            </w:r>
+            <w:r>
+              <w:rPr>
+                <w:rFonts w:ascii="Times New Roman" w:hAnsi="Times New Roman" w:cs="Times New Roman"/>
+              </w:rPr>
+              <w:t>:</w:t>
             </w:r>
           </w:p>
         </w:tc>
@@ -2122,7 +2073,7 @@
               <w:rPr>
                 <w:rFonts w:ascii="Times New Roman" w:hAnsi="Times New Roman" w:cs="Times New Roman"/>
               </w:rPr>
-              <w:t>{{OVERALL_VALUE}}</w:t>
+              <w:t>{{MODULE_SUBTOTAL}}</w:t>
             </w:r>
           </w:p>
         </w:tc>
@@ -2148,12 +2099,6 @@
                 <w:rFonts w:ascii="Times New Roman" w:hAnsi="Times New Roman" w:cs="Times New Roman"/>
               </w:rPr>
             </w:pPr>
-            <w:r>
-              <w:rPr>
-                <w:rFonts w:ascii="Times New Roman" w:hAnsi="Times New Roman" w:cs="Times New Roman"/>
-              </w:rPr>
-              <w:t>2</w:t>
-            </w:r>
           </w:p>
         </w:tc>
         <w:tc>
@@ -2177,7 +2122,7 @@
               <w:rPr>
                 <w:rFonts w:ascii="Times New Roman" w:hAnsi="Times New Roman" w:cs="Times New Roman"/>
               </w:rPr>
-              <w:t>Customization</w:t>
+              <w:t>Total of All Modules Final Price:</w:t>
             </w:r>
           </w:p>
         </w:tc>
@@ -2202,7 +2147,7 @@
               <w:rPr>
                 <w:rFonts w:ascii="Times New Roman" w:hAnsi="Times New Roman" w:cs="Times New Roman"/>
               </w:rPr>
-              <w:t>TBD</w:t>
+              <w:t>{{OVERALL_VALUE}}</w:t>
             </w:r>
           </w:p>
         </w:tc>
@@ -2232,7 +2177,7 @@
               <w:rPr>
                 <w:rFonts w:ascii="Times New Roman" w:hAnsi="Times New Roman" w:cs="Times New Roman"/>
               </w:rPr>
-              <w:t xml:space="preserve"> 2.1</w:t>
+              <w:t>2</w:t>
             </w:r>
           </w:p>
         </w:tc>
@@ -2257,7 +2202,7 @@
               <w:rPr>
                 <w:rFonts w:ascii="Times New Roman" w:hAnsi="Times New Roman" w:cs="Times New Roman"/>
               </w:rPr>
-              <w:t>In case of any additional development required which will be consider 8000 per man day additional to above proposal.</w:t>
+              <w:t>Customization</w:t>
             </w:r>
           </w:p>
         </w:tc>
@@ -2278,6 +2223,12 @@
                 <w:rFonts w:ascii="Times New Roman" w:hAnsi="Times New Roman" w:cs="Times New Roman"/>
               </w:rPr>
             </w:pPr>
+            <w:r>
+              <w:rPr>
+                <w:rFonts w:ascii="Times New Roman" w:hAnsi="Times New Roman" w:cs="Times New Roman"/>
+              </w:rPr>
+              <w:t>TBD</w:t>
+            </w:r>
           </w:p>
         </w:tc>
       </w:tr>
@@ -2306,7 +2257,7 @@
               <w:rPr>
                 <w:rFonts w:ascii="Times New Roman" w:hAnsi="Times New Roman" w:cs="Times New Roman"/>
               </w:rPr>
-              <w:t>3</w:t>
+              <w:t xml:space="preserve"> 2.1</w:t>
             </w:r>
           </w:p>
         </w:tc>
@@ -2331,7 +2282,7 @@
               <w:rPr>
                 <w:rFonts w:ascii="Times New Roman" w:hAnsi="Times New Roman" w:cs="Times New Roman"/>
               </w:rPr>
-              <w:t>Renewal and Support from next year onwards</w:t>
+              <w:t>In case of any additional development required which will be consider 8000 per man day additional to above proposal.</w:t>
             </w:r>
           </w:p>
         </w:tc>
@@ -2380,19 +2331,7 @@
               <w:rPr>
                 <w:rFonts w:ascii="Times New Roman" w:hAnsi="Times New Roman" w:cs="Times New Roman"/>
               </w:rPr>
-              <w:t xml:space="preserve"> </w:t>
-            </w:r>
-            <w:r>
-              <w:rPr>
-                <w:rFonts w:ascii="Times New Roman" w:hAnsi="Times New Roman" w:cs="Times New Roman"/>
-              </w:rPr>
               <w:t>3</w:t>
-            </w:r>
-            <w:r>
-              <w:rPr>
-                <w:rFonts w:ascii="Times New Roman" w:hAnsi="Times New Roman" w:cs="Times New Roman"/>
-              </w:rPr>
-              <w:t>.1</w:t>
             </w:r>
           </w:p>
         </w:tc>
@@ -2417,20 +2356,7 @@
               <w:rPr>
                 <w:rFonts w:ascii="Times New Roman" w:hAnsi="Times New Roman" w:cs="Times New Roman"/>
               </w:rPr>
-              <w:t xml:space="preserve">The License renewal would be required to be done every Year These renewal fees will facilitate to have the Product Upgrades, which would cover improvements, bug fixes, and changes in AIAG VDA compliances. </w:t>
-            </w:r>
-          </w:p>
-          <w:p>
-            <w:pPr>
-              <w:rPr>
-                <w:rFonts w:ascii="Times New Roman" w:hAnsi="Times New Roman" w:cs="Times New Roman"/>
-              </w:rPr>
-            </w:pPr>
-            <w:r>
-              <w:rPr>
-                <w:rFonts w:ascii="Times New Roman" w:hAnsi="Times New Roman" w:cs="Times New Roman"/>
-              </w:rPr>
-              <w:t xml:space="preserve">Support of 7 Man days is included in this price.  </w:t>
+              <w:t>Renewal and Support from next year onwards</w:t>
             </w:r>
           </w:p>
         </w:tc>
@@ -2451,31 +2377,6 @@
                 <w:rFonts w:ascii="Times New Roman" w:hAnsi="Times New Roman" w:cs="Times New Roman"/>
               </w:rPr>
             </w:pPr>
-            <w:r>
-              <w:rPr>
-                <w:rFonts w:ascii="Times New Roman" w:hAnsi="Times New Roman" w:cs="Times New Roman"/>
-              </w:rPr>
-              <w:t>{{MODULE_</w:t>
-            </w:r>
-            <w:r>
-              <w:rPr>
-                <w:rFonts w:ascii="Times New Roman" w:hAnsi="Times New Roman" w:cs="Times New Roman"/>
-              </w:rPr>
-              <w:t>NAME</w:t>
-            </w:r>
-            <w:r>
-              <w:rPr>
-                <w:rFonts w:ascii="Times New Roman" w:hAnsi="Times New Roman" w:cs="Times New Roman"/>
-              </w:rPr>
-              <w:t>}}</w:t>
-            </w:r>
-          </w:p>
-          <w:p>
-            <w:pPr>
-              <w:rPr>
-                <w:rFonts w:ascii="Times New Roman" w:hAnsi="Times New Roman" w:cs="Times New Roman"/>
-              </w:rPr>
-            </w:pPr>
           </w:p>
         </w:tc>
       </w:tr>
@@ -2504,7 +2405,19 @@
               <w:rPr>
                 <w:rFonts w:ascii="Times New Roman" w:hAnsi="Times New Roman" w:cs="Times New Roman"/>
               </w:rPr>
-              <w:t>4</w:t>
+              <w:t xml:space="preserve"> </w:t>
+            </w:r>
+            <w:r>
+              <w:rPr>
+                <w:rFonts w:ascii="Times New Roman" w:hAnsi="Times New Roman" w:cs="Times New Roman"/>
+              </w:rPr>
+              <w:t>3</w:t>
+            </w:r>
+            <w:r>
+              <w:rPr>
+                <w:rFonts w:ascii="Times New Roman" w:hAnsi="Times New Roman" w:cs="Times New Roman"/>
+              </w:rPr>
+              <w:t>.1</w:t>
             </w:r>
           </w:p>
         </w:tc>
@@ -2529,7 +2442,20 @@
               <w:rPr>
                 <w:rFonts w:ascii="Times New Roman" w:hAnsi="Times New Roman" w:cs="Times New Roman"/>
               </w:rPr>
-              <w:t>Support Services</w:t>
+              <w:t xml:space="preserve">The License renewal would be required to be done every Year These renewal fees will facilitate to have the Product Upgrades, which would cover improvements, bug fixes, and changes in AIAG VDA compliances. </w:t>
+            </w:r>
+          </w:p>
+          <w:p>
+            <w:pPr>
+              <w:rPr>
+                <w:rFonts w:ascii="Times New Roman" w:hAnsi="Times New Roman" w:cs="Times New Roman"/>
+              </w:rPr>
+            </w:pPr>
+            <w:r>
+              <w:rPr>
+                <w:rFonts w:ascii="Times New Roman" w:hAnsi="Times New Roman" w:cs="Times New Roman"/>
+              </w:rPr>
+              <w:t xml:space="preserve">Support of 7 Man days is included in this price.  </w:t>
             </w:r>
           </w:p>
         </w:tc>
@@ -2554,8 +2480,27 @@
               <w:rPr>
                 <w:rFonts w:ascii="Times New Roman" w:hAnsi="Times New Roman" w:cs="Times New Roman"/>
               </w:rPr>
-              <w:t>8000 per Man Day</w:t>
-            </w:r>
+              <w:t>{{MODULE_</w:t>
+            </w:r>
+            <w:r>
+              <w:rPr>
+                <w:rFonts w:ascii="Times New Roman" w:hAnsi="Times New Roman" w:cs="Times New Roman"/>
+              </w:rPr>
+              <w:t>NAME</w:t>
+            </w:r>
+            <w:r>
+              <w:rPr>
+                <w:rFonts w:ascii="Times New Roman" w:hAnsi="Times New Roman" w:cs="Times New Roman"/>
+              </w:rPr>
+              <w:t>}}</w:t>
+            </w:r>
+          </w:p>
+          <w:p>
+            <w:pPr>
+              <w:rPr>
+                <w:rFonts w:ascii="Times New Roman" w:hAnsi="Times New Roman" w:cs="Times New Roman"/>
+              </w:rPr>
+            </w:pPr>
           </w:p>
         </w:tc>
       </w:tr>
@@ -2584,7 +2529,7 @@
               <w:rPr>
                 <w:rFonts w:ascii="Times New Roman" w:hAnsi="Times New Roman" w:cs="Times New Roman"/>
               </w:rPr>
-              <w:t xml:space="preserve"> 4.1</w:t>
+              <w:t>4</w:t>
             </w:r>
           </w:p>
         </w:tc>
@@ -2609,21 +2554,7 @@
               <w:rPr>
                 <w:rFonts w:ascii="Times New Roman" w:hAnsi="Times New Roman" w:cs="Times New Roman"/>
               </w:rPr>
-              <w:t xml:space="preserve">First Year - These Services start a er 1 Month from start of Go Live. Subsequent Years – A er </w:t>
-            </w:r>
-            <w:proofErr w:type="spellStart"/>
-            <w:r>
-              <w:rPr>
-                <w:rFonts w:ascii="Times New Roman" w:hAnsi="Times New Roman" w:cs="Times New Roman"/>
-              </w:rPr>
-              <w:t>comple</w:t>
-            </w:r>
-            <w:proofErr w:type="spellEnd"/>
-            <w:r>
-              <w:rPr>
-                <w:rFonts w:ascii="Times New Roman" w:hAnsi="Times New Roman" w:cs="Times New Roman"/>
-              </w:rPr>
-              <w:t xml:space="preserve"> on of 7 Man Days</w:t>
+              <w:t>Support Services</w:t>
             </w:r>
           </w:p>
         </w:tc>
@@ -2644,6 +2575,12 @@
                 <w:rFonts w:ascii="Times New Roman" w:hAnsi="Times New Roman" w:cs="Times New Roman"/>
               </w:rPr>
             </w:pPr>
+            <w:r>
+              <w:rPr>
+                <w:rFonts w:ascii="Times New Roman" w:hAnsi="Times New Roman" w:cs="Times New Roman"/>
+              </w:rPr>
+              <w:t>8000 per Man Day</w:t>
+            </w:r>
           </w:p>
         </w:tc>
       </w:tr>
@@ -2672,7 +2609,7 @@
               <w:rPr>
                 <w:rFonts w:ascii="Times New Roman" w:hAnsi="Times New Roman" w:cs="Times New Roman"/>
               </w:rPr>
-              <w:t>5</w:t>
+              <w:t xml:space="preserve"> 4.1</w:t>
             </w:r>
           </w:p>
         </w:tc>
@@ -2697,7 +2634,21 @@
               <w:rPr>
                 <w:rFonts w:ascii="Times New Roman" w:hAnsi="Times New Roman" w:cs="Times New Roman"/>
               </w:rPr>
-              <w:t>Payment Terms</w:t>
+              <w:t xml:space="preserve">First Year - These Services start a er 1 Month from start of Go Live. Subsequent Years – A er </w:t>
+            </w:r>
+            <w:proofErr w:type="spellStart"/>
+            <w:r>
+              <w:rPr>
+                <w:rFonts w:ascii="Times New Roman" w:hAnsi="Times New Roman" w:cs="Times New Roman"/>
+              </w:rPr>
+              <w:t>comple</w:t>
+            </w:r>
+            <w:proofErr w:type="spellEnd"/>
+            <w:r>
+              <w:rPr>
+                <w:rFonts w:ascii="Times New Roman" w:hAnsi="Times New Roman" w:cs="Times New Roman"/>
+              </w:rPr>
+              <w:t xml:space="preserve"> on of 7 Man Days</w:t>
             </w:r>
           </w:p>
         </w:tc>
@@ -2747,6 +2698,80 @@
                 <w:rFonts w:ascii="Times New Roman" w:hAnsi="Times New Roman" w:cs="Times New Roman"/>
               </w:rPr>
               <w:lastRenderedPageBreak/>
+              <w:t>5</w:t>
+            </w:r>
+          </w:p>
+        </w:tc>
+        <w:tc>
+          <w:tcPr>
+            <w:tcW w:w="6360" w:type="dxa"/>
+            <w:shd w:val="clear" w:color="auto" w:fill="FFFFFF" w:themeFill="background1"/>
+            <w:tcMar>
+              <w:top w:w="80" w:type="dxa"/>
+              <w:left w:w="120" w:type="dxa"/>
+              <w:bottom w:w="80" w:type="dxa"/>
+              <w:right w:w="120" w:type="dxa"/>
+            </w:tcMar>
+          </w:tcPr>
+          <w:p>
+            <w:pPr>
+              <w:rPr>
+                <w:rFonts w:ascii="Times New Roman" w:hAnsi="Times New Roman" w:cs="Times New Roman"/>
+              </w:rPr>
+            </w:pPr>
+            <w:r>
+              <w:rPr>
+                <w:rFonts w:ascii="Times New Roman" w:hAnsi="Times New Roman" w:cs="Times New Roman"/>
+              </w:rPr>
+              <w:t>Payment Terms</w:t>
+            </w:r>
+          </w:p>
+        </w:tc>
+        <w:tc>
+          <w:tcPr>
+            <w:tcW w:w="2625" w:type="dxa"/>
+            <w:shd w:val="clear" w:color="auto" w:fill="FFFFFF" w:themeFill="background1"/>
+            <w:tcMar>
+              <w:top w:w="80" w:type="dxa"/>
+              <w:left w:w="120" w:type="dxa"/>
+              <w:bottom w:w="80" w:type="dxa"/>
+              <w:right w:w="120" w:type="dxa"/>
+            </w:tcMar>
+          </w:tcPr>
+          <w:p>
+            <w:pPr>
+              <w:rPr>
+                <w:rFonts w:ascii="Times New Roman" w:hAnsi="Times New Roman" w:cs="Times New Roman"/>
+              </w:rPr>
+            </w:pPr>
+          </w:p>
+        </w:tc>
+      </w:tr>
+      <w:tr>
+        <w:trPr>
+          <w:trHeight w:val="20"/>
+        </w:trPr>
+        <w:tc>
+          <w:tcPr>
+            <w:tcW w:w="1007" w:type="dxa"/>
+            <w:shd w:val="clear" w:color="auto" w:fill="FFFFFF" w:themeFill="background1"/>
+            <w:tcMar>
+              <w:top w:w="80" w:type="dxa"/>
+              <w:left w:w="120" w:type="dxa"/>
+              <w:bottom w:w="80" w:type="dxa"/>
+              <w:right w:w="120" w:type="dxa"/>
+            </w:tcMar>
+          </w:tcPr>
+          <w:p>
+            <w:pPr>
+              <w:rPr>
+                <w:rFonts w:ascii="Times New Roman" w:hAnsi="Times New Roman" w:cs="Times New Roman"/>
+              </w:rPr>
+            </w:pPr>
+            <w:r>
+              <w:rPr>
+                <w:rFonts w:ascii="Times New Roman" w:hAnsi="Times New Roman" w:cs="Times New Roman"/>
+              </w:rPr>
               <w:t xml:space="preserve"> 5.1</w:t>
             </w:r>
           </w:p>
@@ -5228,6 +5253,7 @@
               <w:rPr>
                 <w:rFonts w:ascii="Times New Roman" w:hAnsi="Times New Roman" w:cs="Times New Roman"/>
               </w:rPr>
+              <w:lastRenderedPageBreak/>
               <w:t>Master Preparations</w:t>
             </w:r>
           </w:p>
@@ -5278,7 +5304,6 @@
               <w:rPr>
                 <w:rFonts w:ascii="Times New Roman" w:hAnsi="Times New Roman" w:cs="Times New Roman"/>
               </w:rPr>
-              <w:lastRenderedPageBreak/>
               <w:t>{{MODULE_LIST}}</w:t>
             </w:r>
             <w:r>
@@ -5681,7 +5706,6 @@
         </w:rPr>
         <w:t xml:space="preserve"> </w:t>
       </w:r>
-      <w:proofErr w:type="gramStart"/>
       <w:r>
         <w:rPr>
           <w:rFonts w:ascii="Times New Roman" w:hAnsi="Times New Roman" w:cs="Times New Roman"/>
@@ -5689,7 +5713,6 @@
         </w:rPr>
         <w:t>Organization</w:t>
       </w:r>
-      <w:proofErr w:type="gramEnd"/>
     </w:p>
     <w:p>
       <w:pPr>
@@ -6041,6 +6064,7 @@
           <w:rFonts w:ascii="Times New Roman" w:hAnsi="Times New Roman" w:cs="Times New Roman"/>
           <w:color w:val="000000" w:themeColor="text1"/>
         </w:rPr>
+        <w:lastRenderedPageBreak/>
         <w:t>6. Excused Performance</w:t>
       </w:r>
     </w:p>
@@ -6055,7 +6079,6 @@
         <w:rPr>
           <w:rFonts w:ascii="Times New Roman" w:hAnsi="Times New Roman" w:cs="Times New Roman"/>
         </w:rPr>
-        <w:lastRenderedPageBreak/>
         <w:t xml:space="preserve">BlechTek shall not be liable or deemed to be in default for any delay or failure in performance under this Contract or interruption of services due to strike or </w:t>
       </w:r>
       <w:r>

</xml_diff>

<commit_message>
updates in sqlquotationservice page for showing the fetched data module wise in the price summary table
</commit_message>
<xml_diff>
--- a/QuotationApp.API/Templates/QuotationTemplate_Updated.docx
+++ b/QuotationApp.API/Templates/QuotationTemplate_Updated.docx
@@ -550,15 +550,26 @@
           <w:bCs/>
           <w:color w:val="65AADB"/>
         </w:rPr>
-        <w:t>{{ORG_NAME}}</w:t>
-      </w:r>
-      <w:r>
-        <w:rPr>
-          <w:rFonts w:ascii="Times New Roman" w:hAnsi="Times New Roman" w:cs="Times New Roman"/>
+        <w:t>{{ORG_</w:t>
+      </w:r>
+      <w:proofErr w:type="gramStart"/>
+      <w:r>
+        <w:rPr>
+          <w:rFonts w:ascii="Times New Roman" w:hAnsi="Times New Roman" w:cs="Times New Roman"/>
+          <w:b/>
+          <w:bCs/>
           <w:color w:val="65AADB"/>
         </w:rPr>
+        <w:t>NAME}}</w:t>
+      </w:r>
+      <w:r>
+        <w:rPr>
+          <w:rFonts w:ascii="Times New Roman" w:hAnsi="Times New Roman" w:cs="Times New Roman"/>
+          <w:color w:val="65AADB"/>
+        </w:rPr>
         <w:t>.</w:t>
       </w:r>
+      <w:proofErr w:type="gramEnd"/>
     </w:p>
     <w:p>
       <w:pPr>
@@ -3751,14 +3762,6 @@
           <w:rFonts w:ascii="Times New Roman" w:hAnsi="Times New Roman" w:cs="Times New Roman"/>
         </w:rPr>
       </w:pPr>
-    </w:p>
-    <w:p>
-      <w:pPr>
-        <w:spacing w:after="200"/>
-        <w:rPr>
-          <w:rFonts w:ascii="Times New Roman" w:hAnsi="Times New Roman" w:cs="Times New Roman"/>
-        </w:rPr>
-      </w:pPr>
       <w:r>
         <w:rPr>
           <w:rFonts w:ascii="Times New Roman" w:hAnsi="Times New Roman" w:cs="Times New Roman"/>
@@ -3779,15 +3782,15 @@
         <w:tblLook w:val="04A0" w:firstRow="1" w:lastRow="0" w:firstColumn="1" w:lastColumn="0" w:noHBand="0" w:noVBand="1"/>
       </w:tblPr>
       <w:tblGrid>
-        <w:gridCol w:w="1980"/>
-        <w:gridCol w:w="886"/>
+        <w:gridCol w:w="1918"/>
+        <w:gridCol w:w="1591"/>
+        <w:gridCol w:w="916"/>
         <w:gridCol w:w="851"/>
         <w:gridCol w:w="850"/>
-        <w:gridCol w:w="851"/>
-        <w:gridCol w:w="850"/>
-        <w:gridCol w:w="851"/>
-        <w:gridCol w:w="1417"/>
-        <w:gridCol w:w="1389"/>
+        <w:gridCol w:w="709"/>
+        <w:gridCol w:w="809"/>
+        <w:gridCol w:w="1077"/>
+        <w:gridCol w:w="1204"/>
       </w:tblGrid>
       <w:tr>
         <w:trPr>
@@ -3795,7 +3798,7 @@
         </w:trPr>
         <w:tc>
           <w:tcPr>
-            <w:tcW w:w="1980" w:type="dxa"/>
+            <w:tcW w:w="1918" w:type="dxa"/>
             <w:tcBorders>
               <w:top w:val="single" w:sz="4" w:space="0" w:color="000000"/>
               <w:left w:val="single" w:sz="4" w:space="0" w:color="000000"/>
@@ -3825,7 +3828,7 @@
         </w:tc>
         <w:tc>
           <w:tcPr>
-            <w:tcW w:w="886" w:type="dxa"/>
+            <w:tcW w:w="1591" w:type="dxa"/>
             <w:tcBorders>
               <w:top w:val="single" w:sz="4" w:space="0" w:color="000000"/>
               <w:left w:val="single" w:sz="4" w:space="0" w:color="000000"/>
@@ -3851,6 +3854,38 @@
                 <w:szCs w:val="20"/>
               </w:rPr>
               <w:t>No of Users</w:t>
+            </w:r>
+          </w:p>
+        </w:tc>
+        <w:tc>
+          <w:tcPr>
+            <w:tcW w:w="916" w:type="dxa"/>
+            <w:tcBorders>
+              <w:top w:val="single" w:sz="4" w:space="0" w:color="000000"/>
+              <w:left w:val="single" w:sz="4" w:space="0" w:color="000000"/>
+              <w:bottom w:val="single" w:sz="5" w:space="0" w:color="000000"/>
+              <w:right w:val="single" w:sz="4" w:space="0" w:color="000000"/>
+            </w:tcBorders>
+            <w:shd w:val="clear" w:color="auto" w:fill="D9D9D9"/>
+          </w:tcPr>
+          <w:p>
+            <w:pPr>
+              <w:spacing w:line="259" w:lineRule="auto"/>
+              <w:ind w:left="28"/>
+              <w:jc w:val="center"/>
+              <w:rPr>
+                <w:rFonts w:ascii="Times New Roman" w:hAnsi="Times New Roman" w:cs="Times New Roman"/>
+                <w:sz w:val="20"/>
+                <w:szCs w:val="20"/>
+              </w:rPr>
+            </w:pPr>
+            <w:r>
+              <w:rPr>
+                <w:rFonts w:ascii="Times New Roman" w:hAnsi="Times New Roman" w:cs="Times New Roman"/>
+                <w:sz w:val="20"/>
+                <w:szCs w:val="20"/>
+              </w:rPr>
+              <w:t>Y1</w:t>
             </w:r>
           </w:p>
         </w:tc>
@@ -3868,7 +3903,7 @@
           <w:p>
             <w:pPr>
               <w:spacing w:line="259" w:lineRule="auto"/>
-              <w:ind w:left="28"/>
+              <w:ind w:left="32"/>
               <w:jc w:val="center"/>
               <w:rPr>
                 <w:rFonts w:ascii="Times New Roman" w:hAnsi="Times New Roman" w:cs="Times New Roman"/>
@@ -3882,7 +3917,7 @@
                 <w:sz w:val="20"/>
                 <w:szCs w:val="20"/>
               </w:rPr>
-              <w:t>Y1</w:t>
+              <w:t>Y2</w:t>
             </w:r>
           </w:p>
         </w:tc>
@@ -3900,7 +3935,7 @@
           <w:p>
             <w:pPr>
               <w:spacing w:line="259" w:lineRule="auto"/>
-              <w:ind w:left="32"/>
+              <w:ind w:left="33"/>
               <w:jc w:val="center"/>
               <w:rPr>
                 <w:rFonts w:ascii="Times New Roman" w:hAnsi="Times New Roman" w:cs="Times New Roman"/>
@@ -3914,13 +3949,13 @@
                 <w:sz w:val="20"/>
                 <w:szCs w:val="20"/>
               </w:rPr>
-              <w:t>Y2</w:t>
-            </w:r>
-          </w:p>
-        </w:tc>
-        <w:tc>
-          <w:tcPr>
-            <w:tcW w:w="851" w:type="dxa"/>
+              <w:t>Y3</w:t>
+            </w:r>
+          </w:p>
+        </w:tc>
+        <w:tc>
+          <w:tcPr>
+            <w:tcW w:w="709" w:type="dxa"/>
             <w:tcBorders>
               <w:top w:val="single" w:sz="4" w:space="0" w:color="000000"/>
               <w:left w:val="single" w:sz="4" w:space="0" w:color="000000"/>
@@ -3932,7 +3967,7 @@
           <w:p>
             <w:pPr>
               <w:spacing w:line="259" w:lineRule="auto"/>
-              <w:ind w:left="33"/>
+              <w:ind w:left="31"/>
               <w:jc w:val="center"/>
               <w:rPr>
                 <w:rFonts w:ascii="Times New Roman" w:hAnsi="Times New Roman" w:cs="Times New Roman"/>
@@ -3946,13 +3981,13 @@
                 <w:sz w:val="20"/>
                 <w:szCs w:val="20"/>
               </w:rPr>
-              <w:t>Y3</w:t>
-            </w:r>
-          </w:p>
-        </w:tc>
-        <w:tc>
-          <w:tcPr>
-            <w:tcW w:w="850" w:type="dxa"/>
+              <w:t>Y4</w:t>
+            </w:r>
+          </w:p>
+        </w:tc>
+        <w:tc>
+          <w:tcPr>
+            <w:tcW w:w="809" w:type="dxa"/>
             <w:tcBorders>
               <w:top w:val="single" w:sz="4" w:space="0" w:color="000000"/>
               <w:left w:val="single" w:sz="4" w:space="0" w:color="000000"/>
@@ -3964,7 +3999,7 @@
           <w:p>
             <w:pPr>
               <w:spacing w:line="259" w:lineRule="auto"/>
-              <w:ind w:left="31"/>
+              <w:ind w:left="32"/>
               <w:jc w:val="center"/>
               <w:rPr>
                 <w:rFonts w:ascii="Times New Roman" w:hAnsi="Times New Roman" w:cs="Times New Roman"/>
@@ -3978,45 +4013,13 @@
                 <w:sz w:val="20"/>
                 <w:szCs w:val="20"/>
               </w:rPr>
-              <w:t>Y4</w:t>
-            </w:r>
-          </w:p>
-        </w:tc>
-        <w:tc>
-          <w:tcPr>
-            <w:tcW w:w="851" w:type="dxa"/>
-            <w:tcBorders>
-              <w:top w:val="single" w:sz="4" w:space="0" w:color="000000"/>
-              <w:left w:val="single" w:sz="4" w:space="0" w:color="000000"/>
-              <w:bottom w:val="single" w:sz="5" w:space="0" w:color="000000"/>
-              <w:right w:val="single" w:sz="4" w:space="0" w:color="000000"/>
-            </w:tcBorders>
-            <w:shd w:val="clear" w:color="auto" w:fill="D9D9D9"/>
-          </w:tcPr>
-          <w:p>
-            <w:pPr>
-              <w:spacing w:line="259" w:lineRule="auto"/>
-              <w:ind w:left="32"/>
-              <w:jc w:val="center"/>
-              <w:rPr>
-                <w:rFonts w:ascii="Times New Roman" w:hAnsi="Times New Roman" w:cs="Times New Roman"/>
-                <w:sz w:val="20"/>
-                <w:szCs w:val="20"/>
-              </w:rPr>
-            </w:pPr>
-            <w:r>
-              <w:rPr>
-                <w:rFonts w:ascii="Times New Roman" w:hAnsi="Times New Roman" w:cs="Times New Roman"/>
-                <w:sz w:val="20"/>
-                <w:szCs w:val="20"/>
-              </w:rPr>
               <w:t>Y5</w:t>
             </w:r>
           </w:p>
         </w:tc>
         <w:tc>
           <w:tcPr>
-            <w:tcW w:w="1417" w:type="dxa"/>
+            <w:tcW w:w="1077" w:type="dxa"/>
             <w:tcBorders>
               <w:top w:val="single" w:sz="4" w:space="0" w:color="000000"/>
               <w:left w:val="single" w:sz="4" w:space="0" w:color="000000"/>
@@ -4048,7 +4051,7 @@
         </w:tc>
         <w:tc>
           <w:tcPr>
-            <w:tcW w:w="1389" w:type="dxa"/>
+            <w:tcW w:w="1204" w:type="dxa"/>
             <w:tcBorders>
               <w:top w:val="single" w:sz="4" w:space="0" w:color="000000"/>
               <w:left w:val="single" w:sz="5" w:space="0" w:color="000000"/>
@@ -4085,7 +4088,7 @@
         </w:trPr>
         <w:tc>
           <w:tcPr>
-            <w:tcW w:w="1980" w:type="dxa"/>
+            <w:tcW w:w="1918" w:type="dxa"/>
             <w:tcBorders>
               <w:top w:val="single" w:sz="5" w:space="0" w:color="000000"/>
               <w:left w:val="single" w:sz="4" w:space="0" w:color="000000"/>
@@ -4096,26 +4099,25 @@
           </w:tcPr>
           <w:p>
             <w:pPr>
-              <w:spacing w:line="259" w:lineRule="auto"/>
-              <w:rPr>
-                <w:rFonts w:ascii="Times New Roman" w:hAnsi="Times New Roman" w:cs="Times New Roman"/>
-                <w:sz w:val="20"/>
-                <w:szCs w:val="20"/>
-              </w:rPr>
-            </w:pPr>
-            <w:r>
-              <w:rPr>
-                <w:rFonts w:ascii="Times New Roman" w:hAnsi="Times New Roman" w:cs="Times New Roman"/>
-                <w:sz w:val="20"/>
-                <w:szCs w:val="20"/>
-              </w:rPr>
-              <w:t>LPA</w:t>
-            </w:r>
-          </w:p>
-        </w:tc>
-        <w:tc>
-          <w:tcPr>
-            <w:tcW w:w="886" w:type="dxa"/>
+              <w:rPr>
+                <w:rFonts w:ascii="Times New Roman" w:hAnsi="Times New Roman" w:cs="Times New Roman"/>
+                <w:sz w:val="18"/>
+                <w:szCs w:val="18"/>
+              </w:rPr>
+            </w:pPr>
+            <w:r>
+              <w:rPr>
+                <w:rFonts w:ascii="Times New Roman" w:hAnsi="Times New Roman" w:cs="Times New Roman"/>
+                <w:sz w:val="18"/>
+                <w:szCs w:val="18"/>
+              </w:rPr>
+              <w:t>{{MODULE_NAME}}</w:t>
+            </w:r>
+          </w:p>
+        </w:tc>
+        <w:tc>
+          <w:tcPr>
+            <w:tcW w:w="1591" w:type="dxa"/>
             <w:tcBorders>
               <w:top w:val="single" w:sz="5" w:space="0" w:color="000000"/>
               <w:left w:val="single" w:sz="4" w:space="0" w:color="000000"/>
@@ -4131,6 +4133,40 @@
               <w:jc w:val="center"/>
               <w:rPr>
                 <w:rFonts w:ascii="Times New Roman" w:hAnsi="Times New Roman" w:cs="Times New Roman"/>
+                <w:sz w:val="18"/>
+                <w:szCs w:val="18"/>
+              </w:rPr>
+            </w:pPr>
+            <w:r>
+              <w:rPr>
+                <w:rFonts w:ascii="Times New Roman" w:hAnsi="Times New Roman" w:cs="Times New Roman"/>
+                <w:i/>
+                <w:iCs/>
+                <w:sz w:val="18"/>
+                <w:szCs w:val="18"/>
+              </w:rPr>
+              <w:t>{{NO_OF_USERS}}</w:t>
+            </w:r>
+          </w:p>
+        </w:tc>
+        <w:tc>
+          <w:tcPr>
+            <w:tcW w:w="916" w:type="dxa"/>
+            <w:tcBorders>
+              <w:top w:val="single" w:sz="5" w:space="0" w:color="000000"/>
+              <w:left w:val="single" w:sz="4" w:space="0" w:color="000000"/>
+              <w:bottom w:val="single" w:sz="5" w:space="0" w:color="000000"/>
+              <w:right w:val="single" w:sz="4" w:space="0" w:color="000000"/>
+            </w:tcBorders>
+            <w:shd w:val="clear" w:color="auto" w:fill="DAE9F8"/>
+          </w:tcPr>
+          <w:p>
+            <w:pPr>
+              <w:spacing w:line="259" w:lineRule="auto"/>
+              <w:ind w:left="25"/>
+              <w:jc w:val="both"/>
+              <w:rPr>
+                <w:rFonts w:ascii="Times New Roman" w:hAnsi="Times New Roman" w:cs="Times New Roman"/>
                 <w:sz w:val="20"/>
                 <w:szCs w:val="20"/>
               </w:rPr>
@@ -4141,7 +4177,7 @@
                 <w:sz w:val="20"/>
                 <w:szCs w:val="20"/>
               </w:rPr>
-              <w:t>20</w:t>
+              <w:t xml:space="preserve">    </w:t>
             </w:r>
           </w:p>
         </w:tc>
@@ -4173,7 +4209,7 @@
                 <w:sz w:val="20"/>
                 <w:szCs w:val="20"/>
               </w:rPr>
-              <w:t xml:space="preserve">    </w:t>
+              <w:t xml:space="preserve"> </w:t>
             </w:r>
           </w:p>
         </w:tc>
@@ -4199,19 +4235,11 @@
                 <w:szCs w:val="20"/>
               </w:rPr>
             </w:pPr>
-            <w:r>
-              <w:rPr>
-                <w:rFonts w:ascii="Times New Roman" w:hAnsi="Times New Roman" w:cs="Times New Roman"/>
-                <w:sz w:val="20"/>
-                <w:szCs w:val="20"/>
-              </w:rPr>
-              <w:t xml:space="preserve"> </w:t>
-            </w:r>
-          </w:p>
-        </w:tc>
-        <w:tc>
-          <w:tcPr>
-            <w:tcW w:w="851" w:type="dxa"/>
+          </w:p>
+        </w:tc>
+        <w:tc>
+          <w:tcPr>
+            <w:tcW w:w="709" w:type="dxa"/>
             <w:tcBorders>
               <w:top w:val="single" w:sz="5" w:space="0" w:color="000000"/>
               <w:left w:val="single" w:sz="4" w:space="0" w:color="000000"/>
@@ -4235,7 +4263,7 @@
         </w:tc>
         <w:tc>
           <w:tcPr>
-            <w:tcW w:w="850" w:type="dxa"/>
+            <w:tcW w:w="809" w:type="dxa"/>
             <w:tcBorders>
               <w:top w:val="single" w:sz="5" w:space="0" w:color="000000"/>
               <w:left w:val="single" w:sz="4" w:space="0" w:color="000000"/>
@@ -4259,31 +4287,7 @@
         </w:tc>
         <w:tc>
           <w:tcPr>
-            <w:tcW w:w="851" w:type="dxa"/>
-            <w:tcBorders>
-              <w:top w:val="single" w:sz="5" w:space="0" w:color="000000"/>
-              <w:left w:val="single" w:sz="4" w:space="0" w:color="000000"/>
-              <w:bottom w:val="single" w:sz="5" w:space="0" w:color="000000"/>
-              <w:right w:val="single" w:sz="4" w:space="0" w:color="000000"/>
-            </w:tcBorders>
-            <w:shd w:val="clear" w:color="auto" w:fill="DAE9F8"/>
-          </w:tcPr>
-          <w:p>
-            <w:pPr>
-              <w:spacing w:line="259" w:lineRule="auto"/>
-              <w:ind w:left="25"/>
-              <w:jc w:val="both"/>
-              <w:rPr>
-                <w:rFonts w:ascii="Times New Roman" w:hAnsi="Times New Roman" w:cs="Times New Roman"/>
-                <w:sz w:val="20"/>
-                <w:szCs w:val="20"/>
-              </w:rPr>
-            </w:pPr>
-          </w:p>
-        </w:tc>
-        <w:tc>
-          <w:tcPr>
-            <w:tcW w:w="1417" w:type="dxa"/>
+            <w:tcW w:w="1077" w:type="dxa"/>
             <w:tcBorders>
               <w:top w:val="single" w:sz="5" w:space="0" w:color="000000"/>
               <w:left w:val="single" w:sz="4" w:space="0" w:color="000000"/>
@@ -4306,7 +4310,7 @@
         </w:tc>
         <w:tc>
           <w:tcPr>
-            <w:tcW w:w="1389" w:type="dxa"/>
+            <w:tcW w:w="1204" w:type="dxa"/>
             <w:tcBorders>
               <w:top w:val="single" w:sz="5" w:space="0" w:color="000000"/>
               <w:left w:val="single" w:sz="5" w:space="0" w:color="000000"/>
@@ -4328,551 +4332,60 @@
           </w:p>
         </w:tc>
       </w:tr>
-      <w:tr>
-        <w:trPr>
-          <w:trHeight w:val="250"/>
-        </w:trPr>
-        <w:tc>
-          <w:tcPr>
-            <w:tcW w:w="1980" w:type="dxa"/>
-            <w:tcBorders>
-              <w:top w:val="single" w:sz="5" w:space="0" w:color="000000"/>
-              <w:left w:val="single" w:sz="4" w:space="0" w:color="000000"/>
-              <w:bottom w:val="single" w:sz="5" w:space="0" w:color="000000"/>
-              <w:right w:val="single" w:sz="4" w:space="0" w:color="000000"/>
-            </w:tcBorders>
-            <w:shd w:val="clear" w:color="auto" w:fill="DAE9F8"/>
-          </w:tcPr>
-          <w:p>
-            <w:pPr>
-              <w:spacing w:line="259" w:lineRule="auto"/>
-              <w:rPr>
-                <w:rFonts w:ascii="Times New Roman" w:hAnsi="Times New Roman" w:cs="Times New Roman"/>
-                <w:sz w:val="20"/>
-                <w:szCs w:val="20"/>
-              </w:rPr>
-            </w:pPr>
-            <w:r>
-              <w:rPr>
-                <w:rFonts w:ascii="Times New Roman" w:hAnsi="Times New Roman" w:cs="Times New Roman"/>
-                <w:sz w:val="20"/>
-                <w:szCs w:val="20"/>
-              </w:rPr>
-              <w:t>Internal Audit Management</w:t>
-            </w:r>
-          </w:p>
-        </w:tc>
-        <w:tc>
-          <w:tcPr>
-            <w:tcW w:w="886" w:type="dxa"/>
-            <w:tcBorders>
-              <w:top w:val="single" w:sz="5" w:space="0" w:color="000000"/>
-              <w:left w:val="single" w:sz="4" w:space="0" w:color="000000"/>
-              <w:bottom w:val="single" w:sz="5" w:space="0" w:color="000000"/>
-              <w:right w:val="single" w:sz="4" w:space="0" w:color="000000"/>
-            </w:tcBorders>
-            <w:shd w:val="clear" w:color="auto" w:fill="DAE9F8"/>
-          </w:tcPr>
-          <w:p>
-            <w:pPr>
-              <w:spacing w:line="259" w:lineRule="auto"/>
-              <w:ind w:left="27"/>
-              <w:jc w:val="center"/>
-              <w:rPr>
-                <w:rFonts w:ascii="Times New Roman" w:hAnsi="Times New Roman" w:cs="Times New Roman"/>
-                <w:sz w:val="20"/>
-                <w:szCs w:val="20"/>
-              </w:rPr>
-            </w:pPr>
-            <w:r>
-              <w:rPr>
-                <w:rFonts w:ascii="Times New Roman" w:hAnsi="Times New Roman" w:cs="Times New Roman"/>
-                <w:sz w:val="20"/>
-                <w:szCs w:val="20"/>
-              </w:rPr>
-              <w:t>20</w:t>
-            </w:r>
-          </w:p>
-        </w:tc>
-        <w:tc>
-          <w:tcPr>
-            <w:tcW w:w="851" w:type="dxa"/>
-            <w:tcBorders>
-              <w:top w:val="single" w:sz="5" w:space="0" w:color="000000"/>
-              <w:left w:val="single" w:sz="4" w:space="0" w:color="000000"/>
-              <w:bottom w:val="single" w:sz="5" w:space="0" w:color="000000"/>
-              <w:right w:val="single" w:sz="4" w:space="0" w:color="000000"/>
-            </w:tcBorders>
-            <w:shd w:val="clear" w:color="auto" w:fill="DAE9F8"/>
-          </w:tcPr>
-          <w:p>
-            <w:pPr>
-              <w:spacing w:line="259" w:lineRule="auto"/>
-              <w:ind w:left="25"/>
-              <w:jc w:val="both"/>
-              <w:rPr>
-                <w:rFonts w:ascii="Times New Roman" w:hAnsi="Times New Roman" w:cs="Times New Roman"/>
-                <w:sz w:val="20"/>
-                <w:szCs w:val="20"/>
-              </w:rPr>
-            </w:pPr>
-          </w:p>
-        </w:tc>
-        <w:tc>
-          <w:tcPr>
-            <w:tcW w:w="850" w:type="dxa"/>
-            <w:tcBorders>
-              <w:top w:val="single" w:sz="5" w:space="0" w:color="000000"/>
-              <w:left w:val="single" w:sz="4" w:space="0" w:color="000000"/>
-              <w:bottom w:val="single" w:sz="5" w:space="0" w:color="000000"/>
-              <w:right w:val="single" w:sz="4" w:space="0" w:color="000000"/>
-            </w:tcBorders>
-            <w:shd w:val="clear" w:color="auto" w:fill="DAE9F8"/>
-          </w:tcPr>
-          <w:p>
-            <w:pPr>
-              <w:spacing w:line="259" w:lineRule="auto"/>
-              <w:ind w:left="25"/>
-              <w:rPr>
-                <w:rFonts w:ascii="Times New Roman" w:hAnsi="Times New Roman" w:cs="Times New Roman"/>
-                <w:sz w:val="20"/>
-                <w:szCs w:val="20"/>
-              </w:rPr>
-            </w:pPr>
-            <w:r>
-              <w:rPr>
-                <w:rFonts w:ascii="Times New Roman" w:hAnsi="Times New Roman" w:cs="Times New Roman"/>
-                <w:sz w:val="20"/>
-                <w:szCs w:val="20"/>
-              </w:rPr>
-              <w:t xml:space="preserve">      </w:t>
-            </w:r>
-          </w:p>
-        </w:tc>
-        <w:tc>
-          <w:tcPr>
-            <w:tcW w:w="851" w:type="dxa"/>
-            <w:tcBorders>
-              <w:top w:val="single" w:sz="5" w:space="0" w:color="000000"/>
-              <w:left w:val="single" w:sz="4" w:space="0" w:color="000000"/>
-              <w:bottom w:val="single" w:sz="5" w:space="0" w:color="000000"/>
-              <w:right w:val="single" w:sz="4" w:space="0" w:color="000000"/>
-            </w:tcBorders>
-            <w:shd w:val="clear" w:color="auto" w:fill="DAE9F8"/>
-          </w:tcPr>
-          <w:p>
-            <w:pPr>
-              <w:spacing w:line="259" w:lineRule="auto"/>
-              <w:ind w:left="25"/>
-              <w:rPr>
-                <w:rFonts w:ascii="Times New Roman" w:hAnsi="Times New Roman" w:cs="Times New Roman"/>
-                <w:sz w:val="20"/>
-                <w:szCs w:val="20"/>
-              </w:rPr>
-            </w:pPr>
-          </w:p>
-        </w:tc>
-        <w:tc>
-          <w:tcPr>
-            <w:tcW w:w="850" w:type="dxa"/>
-            <w:tcBorders>
-              <w:top w:val="single" w:sz="5" w:space="0" w:color="000000"/>
-              <w:left w:val="single" w:sz="4" w:space="0" w:color="000000"/>
-              <w:bottom w:val="single" w:sz="5" w:space="0" w:color="000000"/>
-              <w:right w:val="single" w:sz="4" w:space="0" w:color="000000"/>
-            </w:tcBorders>
-            <w:shd w:val="clear" w:color="auto" w:fill="DAE9F8"/>
-          </w:tcPr>
-          <w:p>
-            <w:pPr>
-              <w:spacing w:line="259" w:lineRule="auto"/>
-              <w:ind w:left="25"/>
-              <w:rPr>
-                <w:rFonts w:ascii="Times New Roman" w:hAnsi="Times New Roman" w:cs="Times New Roman"/>
-                <w:sz w:val="20"/>
-                <w:szCs w:val="20"/>
-              </w:rPr>
-            </w:pPr>
-          </w:p>
-        </w:tc>
-        <w:tc>
-          <w:tcPr>
-            <w:tcW w:w="851" w:type="dxa"/>
-            <w:tcBorders>
-              <w:top w:val="single" w:sz="5" w:space="0" w:color="000000"/>
-              <w:left w:val="single" w:sz="4" w:space="0" w:color="000000"/>
-              <w:bottom w:val="single" w:sz="5" w:space="0" w:color="000000"/>
-              <w:right w:val="single" w:sz="4" w:space="0" w:color="000000"/>
-            </w:tcBorders>
-            <w:shd w:val="clear" w:color="auto" w:fill="DAE9F8"/>
-          </w:tcPr>
-          <w:p>
-            <w:pPr>
-              <w:spacing w:line="259" w:lineRule="auto"/>
-              <w:ind w:left="25"/>
-              <w:rPr>
-                <w:rFonts w:ascii="Times New Roman" w:hAnsi="Times New Roman" w:cs="Times New Roman"/>
-                <w:sz w:val="20"/>
-                <w:szCs w:val="20"/>
-              </w:rPr>
-            </w:pPr>
-          </w:p>
-        </w:tc>
-        <w:tc>
-          <w:tcPr>
-            <w:tcW w:w="1417" w:type="dxa"/>
-            <w:tcBorders>
-              <w:top w:val="single" w:sz="5" w:space="0" w:color="000000"/>
-              <w:left w:val="single" w:sz="4" w:space="0" w:color="000000"/>
-              <w:bottom w:val="single" w:sz="5" w:space="0" w:color="000000"/>
-              <w:right w:val="single" w:sz="5" w:space="0" w:color="000000"/>
-            </w:tcBorders>
-            <w:shd w:val="clear" w:color="auto" w:fill="DAE9F8"/>
-          </w:tcPr>
-          <w:p>
-            <w:pPr>
-              <w:spacing w:line="259" w:lineRule="auto"/>
-              <w:ind w:left="25"/>
-              <w:rPr>
-                <w:rFonts w:ascii="Times New Roman" w:hAnsi="Times New Roman" w:cs="Times New Roman"/>
-                <w:sz w:val="20"/>
-                <w:szCs w:val="20"/>
-              </w:rPr>
-            </w:pPr>
-          </w:p>
-        </w:tc>
-        <w:tc>
-          <w:tcPr>
-            <w:tcW w:w="1389" w:type="dxa"/>
-            <w:tcBorders>
-              <w:top w:val="single" w:sz="5" w:space="0" w:color="000000"/>
-              <w:left w:val="single" w:sz="5" w:space="0" w:color="000000"/>
-              <w:bottom w:val="single" w:sz="5" w:space="0" w:color="000000"/>
-              <w:right w:val="single" w:sz="5" w:space="0" w:color="000000"/>
-            </w:tcBorders>
-            <w:shd w:val="clear" w:color="auto" w:fill="DAE9F8"/>
-          </w:tcPr>
-          <w:p>
-            <w:pPr>
-              <w:spacing w:line="259" w:lineRule="auto"/>
-              <w:ind w:left="26"/>
-              <w:rPr>
-                <w:rFonts w:ascii="Times New Roman" w:hAnsi="Times New Roman" w:cs="Times New Roman"/>
-                <w:sz w:val="20"/>
-                <w:szCs w:val="20"/>
-              </w:rPr>
-            </w:pPr>
-          </w:p>
-        </w:tc>
-      </w:tr>
-      <w:tr>
-        <w:trPr>
-          <w:trHeight w:val="252"/>
-        </w:trPr>
-        <w:tc>
-          <w:tcPr>
-            <w:tcW w:w="1980" w:type="dxa"/>
-            <w:tcBorders>
-              <w:top w:val="single" w:sz="5" w:space="0" w:color="000000"/>
-              <w:left w:val="single" w:sz="4" w:space="0" w:color="000000"/>
-              <w:bottom w:val="single" w:sz="5" w:space="0" w:color="000000"/>
-              <w:right w:val="single" w:sz="4" w:space="0" w:color="000000"/>
-            </w:tcBorders>
-            <w:shd w:val="clear" w:color="auto" w:fill="DAE9F8"/>
-          </w:tcPr>
-          <w:p>
-            <w:pPr>
-              <w:spacing w:line="259" w:lineRule="auto"/>
-              <w:rPr>
-                <w:rFonts w:ascii="Times New Roman" w:hAnsi="Times New Roman" w:cs="Times New Roman"/>
-                <w:sz w:val="20"/>
-                <w:szCs w:val="20"/>
-              </w:rPr>
-            </w:pPr>
-            <w:r>
-              <w:rPr>
-                <w:rFonts w:ascii="Times New Roman" w:hAnsi="Times New Roman" w:cs="Times New Roman"/>
-                <w:sz w:val="20"/>
-                <w:szCs w:val="20"/>
-              </w:rPr>
-              <w:t>KPI I MRM</w:t>
-            </w:r>
-          </w:p>
-        </w:tc>
-        <w:tc>
-          <w:tcPr>
-            <w:tcW w:w="886" w:type="dxa"/>
-            <w:tcBorders>
-              <w:top w:val="single" w:sz="5" w:space="0" w:color="000000"/>
-              <w:left w:val="single" w:sz="4" w:space="0" w:color="000000"/>
-              <w:bottom w:val="single" w:sz="5" w:space="0" w:color="000000"/>
-              <w:right w:val="single" w:sz="4" w:space="0" w:color="000000"/>
-            </w:tcBorders>
-            <w:shd w:val="clear" w:color="auto" w:fill="DAE9F8"/>
-          </w:tcPr>
-          <w:p>
-            <w:pPr>
-              <w:spacing w:line="259" w:lineRule="auto"/>
-              <w:ind w:left="27"/>
-              <w:jc w:val="center"/>
-              <w:rPr>
-                <w:rFonts w:ascii="Times New Roman" w:hAnsi="Times New Roman" w:cs="Times New Roman"/>
-                <w:sz w:val="20"/>
-                <w:szCs w:val="20"/>
-              </w:rPr>
-            </w:pPr>
-            <w:r>
-              <w:rPr>
-                <w:rFonts w:ascii="Times New Roman" w:hAnsi="Times New Roman" w:cs="Times New Roman"/>
-                <w:sz w:val="20"/>
-                <w:szCs w:val="20"/>
-              </w:rPr>
-              <w:t>20</w:t>
-            </w:r>
-          </w:p>
-        </w:tc>
-        <w:tc>
-          <w:tcPr>
-            <w:tcW w:w="851" w:type="dxa"/>
-            <w:tcBorders>
-              <w:top w:val="single" w:sz="5" w:space="0" w:color="000000"/>
-              <w:left w:val="single" w:sz="4" w:space="0" w:color="000000"/>
-              <w:bottom w:val="single" w:sz="5" w:space="0" w:color="000000"/>
-              <w:right w:val="single" w:sz="4" w:space="0" w:color="000000"/>
-            </w:tcBorders>
-            <w:shd w:val="clear" w:color="auto" w:fill="DAE9F8"/>
-          </w:tcPr>
-          <w:p>
-            <w:pPr>
-              <w:spacing w:line="259" w:lineRule="auto"/>
-              <w:ind w:left="25"/>
-              <w:jc w:val="both"/>
-              <w:rPr>
-                <w:rFonts w:ascii="Times New Roman" w:hAnsi="Times New Roman" w:cs="Times New Roman"/>
-                <w:sz w:val="20"/>
-                <w:szCs w:val="20"/>
-              </w:rPr>
-            </w:pPr>
-            <w:r>
-              <w:rPr>
-                <w:rFonts w:ascii="Times New Roman" w:hAnsi="Times New Roman" w:cs="Times New Roman"/>
-                <w:sz w:val="20"/>
-                <w:szCs w:val="20"/>
-              </w:rPr>
-              <w:t xml:space="preserve">    </w:t>
-            </w:r>
-          </w:p>
-        </w:tc>
-        <w:tc>
-          <w:tcPr>
-            <w:tcW w:w="850" w:type="dxa"/>
-            <w:tcBorders>
-              <w:top w:val="single" w:sz="5" w:space="0" w:color="000000"/>
-              <w:left w:val="single" w:sz="4" w:space="0" w:color="000000"/>
-              <w:bottom w:val="single" w:sz="5" w:space="0" w:color="000000"/>
-              <w:right w:val="single" w:sz="4" w:space="0" w:color="000000"/>
-            </w:tcBorders>
-            <w:shd w:val="clear" w:color="auto" w:fill="DAE9F8"/>
-          </w:tcPr>
-          <w:p>
-            <w:pPr>
-              <w:spacing w:line="259" w:lineRule="auto"/>
-              <w:ind w:left="25"/>
-              <w:rPr>
-                <w:rFonts w:ascii="Times New Roman" w:hAnsi="Times New Roman" w:cs="Times New Roman"/>
-                <w:sz w:val="20"/>
-                <w:szCs w:val="20"/>
-              </w:rPr>
-            </w:pPr>
-          </w:p>
-        </w:tc>
-        <w:tc>
-          <w:tcPr>
-            <w:tcW w:w="851" w:type="dxa"/>
-            <w:tcBorders>
-              <w:top w:val="single" w:sz="5" w:space="0" w:color="000000"/>
-              <w:left w:val="single" w:sz="4" w:space="0" w:color="000000"/>
-              <w:bottom w:val="single" w:sz="5" w:space="0" w:color="000000"/>
-              <w:right w:val="single" w:sz="4" w:space="0" w:color="000000"/>
-            </w:tcBorders>
-            <w:shd w:val="clear" w:color="auto" w:fill="DAE9F8"/>
-          </w:tcPr>
-          <w:p>
-            <w:pPr>
-              <w:spacing w:line="259" w:lineRule="auto"/>
-              <w:ind w:left="25"/>
-              <w:rPr>
-                <w:rFonts w:ascii="Times New Roman" w:hAnsi="Times New Roman" w:cs="Times New Roman"/>
-                <w:sz w:val="20"/>
-                <w:szCs w:val="20"/>
-              </w:rPr>
-            </w:pPr>
-          </w:p>
-        </w:tc>
-        <w:tc>
-          <w:tcPr>
-            <w:tcW w:w="850" w:type="dxa"/>
-            <w:tcBorders>
-              <w:top w:val="single" w:sz="5" w:space="0" w:color="000000"/>
-              <w:left w:val="single" w:sz="4" w:space="0" w:color="000000"/>
-              <w:bottom w:val="single" w:sz="5" w:space="0" w:color="000000"/>
-              <w:right w:val="single" w:sz="4" w:space="0" w:color="000000"/>
-            </w:tcBorders>
-            <w:shd w:val="clear" w:color="auto" w:fill="DAE9F8"/>
-          </w:tcPr>
-          <w:p>
-            <w:pPr>
-              <w:spacing w:line="259" w:lineRule="auto"/>
-              <w:ind w:left="25"/>
-              <w:rPr>
-                <w:rFonts w:ascii="Times New Roman" w:hAnsi="Times New Roman" w:cs="Times New Roman"/>
-                <w:sz w:val="20"/>
-                <w:szCs w:val="20"/>
-              </w:rPr>
-            </w:pPr>
-          </w:p>
-        </w:tc>
-        <w:tc>
-          <w:tcPr>
-            <w:tcW w:w="851" w:type="dxa"/>
-            <w:tcBorders>
-              <w:top w:val="single" w:sz="5" w:space="0" w:color="000000"/>
-              <w:left w:val="single" w:sz="4" w:space="0" w:color="000000"/>
-              <w:bottom w:val="single" w:sz="5" w:space="0" w:color="000000"/>
-              <w:right w:val="single" w:sz="4" w:space="0" w:color="000000"/>
-            </w:tcBorders>
-            <w:shd w:val="clear" w:color="auto" w:fill="DAE9F8"/>
-          </w:tcPr>
-          <w:p>
-            <w:pPr>
-              <w:spacing w:line="259" w:lineRule="auto"/>
-              <w:ind w:left="25"/>
-              <w:rPr>
-                <w:rFonts w:ascii="Times New Roman" w:hAnsi="Times New Roman" w:cs="Times New Roman"/>
-                <w:sz w:val="20"/>
-                <w:szCs w:val="20"/>
-              </w:rPr>
-            </w:pPr>
-          </w:p>
-        </w:tc>
-        <w:tc>
-          <w:tcPr>
-            <w:tcW w:w="1417" w:type="dxa"/>
-            <w:tcBorders>
-              <w:top w:val="single" w:sz="5" w:space="0" w:color="000000"/>
-              <w:left w:val="single" w:sz="4" w:space="0" w:color="000000"/>
-              <w:bottom w:val="single" w:sz="5" w:space="0" w:color="000000"/>
-              <w:right w:val="single" w:sz="5" w:space="0" w:color="000000"/>
-            </w:tcBorders>
-            <w:shd w:val="clear" w:color="auto" w:fill="DAE9F8"/>
-          </w:tcPr>
-          <w:p>
-            <w:pPr>
-              <w:spacing w:line="259" w:lineRule="auto"/>
-              <w:ind w:left="25"/>
-              <w:rPr>
-                <w:rFonts w:ascii="Times New Roman" w:hAnsi="Times New Roman" w:cs="Times New Roman"/>
-                <w:sz w:val="20"/>
-                <w:szCs w:val="20"/>
-              </w:rPr>
-            </w:pPr>
-          </w:p>
-        </w:tc>
-        <w:tc>
-          <w:tcPr>
-            <w:tcW w:w="1389" w:type="dxa"/>
-            <w:tcBorders>
-              <w:top w:val="single" w:sz="5" w:space="0" w:color="000000"/>
-              <w:left w:val="single" w:sz="5" w:space="0" w:color="000000"/>
-              <w:bottom w:val="single" w:sz="5" w:space="0" w:color="000000"/>
-              <w:right w:val="single" w:sz="5" w:space="0" w:color="000000"/>
-            </w:tcBorders>
-            <w:shd w:val="clear" w:color="auto" w:fill="DAE9F8"/>
-          </w:tcPr>
-          <w:p>
-            <w:pPr>
-              <w:spacing w:line="259" w:lineRule="auto"/>
-              <w:ind w:left="26"/>
-              <w:rPr>
-                <w:rFonts w:ascii="Times New Roman" w:hAnsi="Times New Roman" w:cs="Times New Roman"/>
-                <w:sz w:val="20"/>
-                <w:szCs w:val="20"/>
-              </w:rPr>
-            </w:pPr>
-          </w:p>
-        </w:tc>
-      </w:tr>
     </w:tbl>
     <w:p>
       <w:pPr>
-        <w:spacing w:after="200"/>
-        <w:rPr>
-          <w:rFonts w:ascii="Times New Roman" w:hAnsi="Times New Roman" w:cs="Times New Roman"/>
+        <w:spacing w:before="300" w:after="150"/>
+        <w:rPr>
+          <w:rFonts w:ascii="Times New Roman" w:hAnsi="Times New Roman" w:cs="Times New Roman"/>
+          <w:w w:val="101"/>
         </w:rPr>
       </w:pPr>
     </w:p>
     <w:p>
       <w:pPr>
-        <w:spacing w:after="160" w:line="259" w:lineRule="auto"/>
-        <w:rPr>
-          <w:rFonts w:ascii="Times New Roman" w:hAnsi="Times New Roman" w:cs="Times New Roman"/>
-        </w:rPr>
-      </w:pPr>
-      <w:r>
+        <w:spacing w:before="300" w:after="150"/>
         <w:rPr>
           <w:rFonts w:ascii="Times New Roman" w:hAnsi="Times New Roman" w:cs="Times New Roman"/>
           <w:w w:val="101"/>
         </w:rPr>
-        <w:t>Time</w:t>
-      </w:r>
-      <w:r>
-        <w:rPr>
-          <w:rFonts w:ascii="Times New Roman" w:hAnsi="Times New Roman" w:cs="Times New Roman"/>
-          <w:spacing w:val="-3"/>
+      </w:pPr>
+      <w:r>
+        <w:rPr>
+          <w:rFonts w:ascii="Times New Roman" w:hAnsi="Times New Roman" w:cs="Times New Roman"/>
           <w:w w:val="101"/>
         </w:rPr>
-        <w:t xml:space="preserve"> </w:t>
-      </w:r>
-      <w:r>
-        <w:rPr>
-          <w:rFonts w:ascii="Times New Roman" w:hAnsi="Times New Roman" w:cs="Times New Roman"/>
-          <w:w w:val="101"/>
-        </w:rPr>
-        <w:t>Estimate</w:t>
-      </w:r>
-      <w:r>
-        <w:rPr>
-          <w:rFonts w:ascii="Times New Roman" w:hAnsi="Times New Roman" w:cs="Times New Roman"/>
-          <w:spacing w:val="-5"/>
-          <w:w w:val="101"/>
-        </w:rPr>
-        <w:t xml:space="preserve"> </w:t>
+        <w:t>Time Estimate</w:t>
       </w:r>
     </w:p>
     <w:tbl>
       <w:tblPr>
         <w:tblStyle w:val="TableGrid0"/>
-        <w:tblW w:w="10060" w:type="dxa"/>
-        <w:tblLayout w:type="fixed"/>
+        <w:tblW w:w="10063" w:type="dxa"/>
         <w:tblLook w:val="04A0" w:firstRow="1" w:lastRow="0" w:firstColumn="1" w:lastColumn="0" w:noHBand="0" w:noVBand="1"/>
       </w:tblPr>
       <w:tblGrid>
-        <w:gridCol w:w="2689"/>
-        <w:gridCol w:w="3827"/>
-        <w:gridCol w:w="3544"/>
+        <w:gridCol w:w="4162"/>
+        <w:gridCol w:w="744"/>
+        <w:gridCol w:w="744"/>
+        <w:gridCol w:w="744"/>
+        <w:gridCol w:w="745"/>
+        <w:gridCol w:w="744"/>
+        <w:gridCol w:w="744"/>
+        <w:gridCol w:w="744"/>
+        <w:gridCol w:w="692"/>
       </w:tblGrid>
       <w:tr>
         <w:trPr>
-          <w:trHeight w:val="759"/>
+          <w:trHeight w:val="305"/>
         </w:trPr>
         <w:tc>
           <w:tcPr>
-            <w:tcW w:w="2689" w:type="dxa"/>
-          </w:tcPr>
-          <w:p>
-            <w:pPr>
-              <w:spacing w:after="160" w:line="259" w:lineRule="auto"/>
-              <w:jc w:val="center"/>
+            <w:tcW w:w="4162" w:type="dxa"/>
+            <w:vMerge w:val="restart"/>
+          </w:tcPr>
+          <w:p>
+            <w:pPr>
               <w:rPr>
                 <w:rFonts w:ascii="Times New Roman" w:hAnsi="Times New Roman" w:cs="Times New Roman"/>
               </w:rPr>
@@ -4887,397 +4400,317 @@
         </w:tc>
         <w:tc>
           <w:tcPr>
-            <w:tcW w:w="3827" w:type="dxa"/>
-            <w:tcBorders>
-              <w:bottom w:val="single" w:sz="2" w:space="0" w:color="auto"/>
-            </w:tcBorders>
-          </w:tcPr>
-          <w:p>
-            <w:pPr>
-              <w:spacing w:after="160" w:line="259" w:lineRule="auto"/>
-              <w:rPr>
-                <w:rFonts w:ascii="Times New Roman" w:hAnsi="Times New Roman" w:cs="Times New Roman"/>
-                <w:sz w:val="18"/>
-                <w:szCs w:val="18"/>
-              </w:rPr>
-            </w:pPr>
-            <w:r>
-              <w:rPr>
-                <w:rFonts w:ascii="Times New Roman" w:hAnsi="Times New Roman" w:cs="Times New Roman"/>
-                <w:sz w:val="18"/>
-                <w:szCs w:val="18"/>
+            <w:tcW w:w="2977" w:type="dxa"/>
+            <w:gridSpan w:val="4"/>
+          </w:tcPr>
+          <w:p>
+            <w:pPr>
+              <w:rPr>
+                <w:rFonts w:ascii="Times New Roman" w:hAnsi="Times New Roman" w:cs="Times New Roman"/>
+              </w:rPr>
+            </w:pPr>
+            <w:r>
+              <w:rPr>
+                <w:rFonts w:ascii="Times New Roman" w:hAnsi="Times New Roman" w:cs="Times New Roman"/>
               </w:rPr>
               <w:t>Month 1</w:t>
             </w:r>
           </w:p>
-          <w:tbl>
-            <w:tblPr>
-              <w:tblStyle w:val="TableGrid0"/>
-              <w:tblpPr w:leftFromText="180" w:rightFromText="180" w:vertAnchor="text" w:horzAnchor="margin" w:tblpX="-147" w:tblpY="40"/>
-              <w:tblOverlap w:val="never"/>
-              <w:tblW w:w="3823" w:type="dxa"/>
-              <w:tblLayout w:type="fixed"/>
-              <w:tblLook w:val="04A0" w:firstRow="1" w:lastRow="0" w:firstColumn="1" w:lastColumn="0" w:noHBand="0" w:noVBand="1"/>
-            </w:tblPr>
-            <w:tblGrid>
-              <w:gridCol w:w="1099"/>
-              <w:gridCol w:w="886"/>
-              <w:gridCol w:w="851"/>
-              <w:gridCol w:w="987"/>
-            </w:tblGrid>
-            <w:tr>
-              <w:trPr>
-                <w:trHeight w:val="405"/>
-              </w:trPr>
-              <w:tc>
-                <w:tcPr>
-                  <w:tcW w:w="1099" w:type="dxa"/>
-                </w:tcPr>
-                <w:p>
-                  <w:pPr>
-                    <w:spacing w:after="160" w:line="259" w:lineRule="auto"/>
-                    <w:rPr>
-                      <w:rFonts w:ascii="Times New Roman" w:hAnsi="Times New Roman" w:cs="Times New Roman"/>
-                      <w:sz w:val="18"/>
-                      <w:szCs w:val="18"/>
-                    </w:rPr>
-                  </w:pPr>
-                  <w:r>
-                    <w:rPr>
-                      <w:rFonts w:ascii="Times New Roman" w:hAnsi="Times New Roman" w:cs="Times New Roman"/>
-                      <w:sz w:val="18"/>
-                      <w:szCs w:val="18"/>
-                    </w:rPr>
-                    <w:t>WK1</w:t>
-                  </w:r>
-                </w:p>
-              </w:tc>
-              <w:tc>
-                <w:tcPr>
-                  <w:tcW w:w="886" w:type="dxa"/>
-                </w:tcPr>
-                <w:p>
-                  <w:pPr>
-                    <w:spacing w:after="160" w:line="259" w:lineRule="auto"/>
-                    <w:rPr>
-                      <w:rFonts w:ascii="Times New Roman" w:hAnsi="Times New Roman" w:cs="Times New Roman"/>
-                      <w:sz w:val="18"/>
-                      <w:szCs w:val="18"/>
-                    </w:rPr>
-                  </w:pPr>
-                  <w:r>
-                    <w:rPr>
-                      <w:rFonts w:ascii="Times New Roman" w:hAnsi="Times New Roman" w:cs="Times New Roman"/>
-                      <w:sz w:val="18"/>
-                      <w:szCs w:val="18"/>
-                    </w:rPr>
-                    <w:t>WK2</w:t>
-                  </w:r>
-                </w:p>
-              </w:tc>
-              <w:tc>
-                <w:tcPr>
-                  <w:tcW w:w="851" w:type="dxa"/>
-                </w:tcPr>
-                <w:p>
-                  <w:pPr>
-                    <w:spacing w:after="160" w:line="259" w:lineRule="auto"/>
-                    <w:rPr>
-                      <w:rFonts w:ascii="Times New Roman" w:hAnsi="Times New Roman" w:cs="Times New Roman"/>
-                      <w:sz w:val="18"/>
-                      <w:szCs w:val="18"/>
-                    </w:rPr>
-                  </w:pPr>
-                  <w:r>
-                    <w:rPr>
-                      <w:rFonts w:ascii="Times New Roman" w:hAnsi="Times New Roman" w:cs="Times New Roman"/>
-                      <w:sz w:val="18"/>
-                      <w:szCs w:val="18"/>
-                    </w:rPr>
-                    <w:t>WK3</w:t>
-                  </w:r>
-                </w:p>
-              </w:tc>
-              <w:tc>
-                <w:tcPr>
-                  <w:tcW w:w="987" w:type="dxa"/>
-                </w:tcPr>
-                <w:p>
-                  <w:pPr>
-                    <w:spacing w:after="160" w:line="259" w:lineRule="auto"/>
-                    <w:rPr>
-                      <w:rFonts w:ascii="Times New Roman" w:hAnsi="Times New Roman" w:cs="Times New Roman"/>
-                      <w:sz w:val="18"/>
-                      <w:szCs w:val="18"/>
-                    </w:rPr>
-                  </w:pPr>
-                  <w:r>
-                    <w:rPr>
-                      <w:rFonts w:ascii="Times New Roman" w:hAnsi="Times New Roman" w:cs="Times New Roman"/>
-                      <w:sz w:val="18"/>
-                      <w:szCs w:val="18"/>
-                    </w:rPr>
-                    <w:t>WK4</w:t>
-                  </w:r>
-                </w:p>
-              </w:tc>
-            </w:tr>
-          </w:tbl>
-          <w:p>
-            <w:pPr>
-              <w:spacing w:after="160" w:line="259" w:lineRule="auto"/>
-              <w:rPr>
-                <w:rFonts w:ascii="Times New Roman" w:hAnsi="Times New Roman" w:cs="Times New Roman"/>
-                <w:sz w:val="18"/>
-                <w:szCs w:val="18"/>
-              </w:rPr>
-            </w:pPr>
-          </w:p>
-        </w:tc>
-        <w:tc>
-          <w:tcPr>
-            <w:tcW w:w="3544" w:type="dxa"/>
-          </w:tcPr>
-          <w:p>
-            <w:pPr>
-              <w:spacing w:after="160" w:line="259" w:lineRule="auto"/>
-              <w:rPr>
-                <w:rFonts w:ascii="Times New Roman" w:hAnsi="Times New Roman" w:cs="Times New Roman"/>
-                <w:sz w:val="18"/>
-                <w:szCs w:val="18"/>
-              </w:rPr>
-            </w:pPr>
-            <w:r>
-              <w:rPr>
-                <w:rFonts w:ascii="Times New Roman" w:hAnsi="Times New Roman" w:cs="Times New Roman"/>
-                <w:sz w:val="18"/>
-                <w:szCs w:val="18"/>
+        </w:tc>
+        <w:tc>
+          <w:tcPr>
+            <w:tcW w:w="2924" w:type="dxa"/>
+            <w:gridSpan w:val="4"/>
+          </w:tcPr>
+          <w:p>
+            <w:pPr>
+              <w:rPr>
+                <w:rFonts w:ascii="Times New Roman" w:hAnsi="Times New Roman" w:cs="Times New Roman"/>
+              </w:rPr>
+            </w:pPr>
+            <w:r>
+              <w:rPr>
+                <w:rFonts w:ascii="Times New Roman" w:hAnsi="Times New Roman" w:cs="Times New Roman"/>
               </w:rPr>
               <w:t>Month 2</w:t>
             </w:r>
-          </w:p>
-          <w:tbl>
-            <w:tblPr>
-              <w:tblStyle w:val="TableGrid0"/>
-              <w:tblpPr w:leftFromText="180" w:rightFromText="180" w:vertAnchor="text" w:horzAnchor="margin" w:tblpY="24"/>
-              <w:tblOverlap w:val="never"/>
-              <w:tblW w:w="3591" w:type="dxa"/>
-              <w:tblLayout w:type="fixed"/>
-              <w:tblLook w:val="04A0" w:firstRow="1" w:lastRow="0" w:firstColumn="1" w:lastColumn="0" w:noHBand="0" w:noVBand="1"/>
-            </w:tblPr>
-            <w:tblGrid>
-              <w:gridCol w:w="1008"/>
-              <w:gridCol w:w="861"/>
-              <w:gridCol w:w="861"/>
-              <w:gridCol w:w="861"/>
-            </w:tblGrid>
-            <w:tr>
-              <w:trPr>
-                <w:trHeight w:val="415"/>
-              </w:trPr>
-              <w:tc>
-                <w:tcPr>
-                  <w:tcW w:w="1008" w:type="dxa"/>
-                </w:tcPr>
-                <w:p>
-                  <w:pPr>
-                    <w:spacing w:after="160" w:line="259" w:lineRule="auto"/>
-                    <w:rPr>
-                      <w:rFonts w:ascii="Times New Roman" w:hAnsi="Times New Roman" w:cs="Times New Roman"/>
-                      <w:sz w:val="18"/>
-                      <w:szCs w:val="18"/>
-                    </w:rPr>
-                  </w:pPr>
-                  <w:r>
-                    <w:rPr>
-                      <w:rFonts w:ascii="Times New Roman" w:hAnsi="Times New Roman" w:cs="Times New Roman"/>
-                      <w:sz w:val="18"/>
-                      <w:szCs w:val="18"/>
-                    </w:rPr>
-                    <w:t>WK1</w:t>
-                  </w:r>
-                </w:p>
-              </w:tc>
-              <w:tc>
-                <w:tcPr>
-                  <w:tcW w:w="861" w:type="dxa"/>
-                </w:tcPr>
-                <w:p>
-                  <w:pPr>
-                    <w:spacing w:after="160" w:line="259" w:lineRule="auto"/>
-                    <w:rPr>
-                      <w:rFonts w:ascii="Times New Roman" w:hAnsi="Times New Roman" w:cs="Times New Roman"/>
-                      <w:sz w:val="18"/>
-                      <w:szCs w:val="18"/>
-                    </w:rPr>
-                  </w:pPr>
-                  <w:r>
-                    <w:rPr>
-                      <w:rFonts w:ascii="Times New Roman" w:hAnsi="Times New Roman" w:cs="Times New Roman"/>
-                      <w:sz w:val="18"/>
-                      <w:szCs w:val="18"/>
-                    </w:rPr>
-                    <w:t>WK2</w:t>
-                  </w:r>
-                </w:p>
-              </w:tc>
-              <w:tc>
-                <w:tcPr>
-                  <w:tcW w:w="861" w:type="dxa"/>
-                </w:tcPr>
-                <w:p>
-                  <w:pPr>
-                    <w:spacing w:after="160" w:line="259" w:lineRule="auto"/>
-                    <w:rPr>
-                      <w:rFonts w:ascii="Times New Roman" w:hAnsi="Times New Roman" w:cs="Times New Roman"/>
-                      <w:sz w:val="18"/>
-                      <w:szCs w:val="18"/>
-                    </w:rPr>
-                  </w:pPr>
-                  <w:r>
-                    <w:rPr>
-                      <w:rFonts w:ascii="Times New Roman" w:hAnsi="Times New Roman" w:cs="Times New Roman"/>
-                      <w:sz w:val="18"/>
-                      <w:szCs w:val="18"/>
-                    </w:rPr>
-                    <w:t>WK3</w:t>
-                  </w:r>
-                </w:p>
-              </w:tc>
-              <w:tc>
-                <w:tcPr>
-                  <w:tcW w:w="861" w:type="dxa"/>
-                </w:tcPr>
-                <w:p>
-                  <w:pPr>
-                    <w:spacing w:after="160" w:line="259" w:lineRule="auto"/>
-                    <w:rPr>
-                      <w:rFonts w:ascii="Times New Roman" w:hAnsi="Times New Roman" w:cs="Times New Roman"/>
-                      <w:sz w:val="18"/>
-                      <w:szCs w:val="18"/>
-                    </w:rPr>
-                  </w:pPr>
-                  <w:r>
-                    <w:rPr>
-                      <w:rFonts w:ascii="Times New Roman" w:hAnsi="Times New Roman" w:cs="Times New Roman"/>
-                      <w:sz w:val="18"/>
-                      <w:szCs w:val="18"/>
-                    </w:rPr>
-                    <w:t>WK4</w:t>
-                  </w:r>
-                </w:p>
-              </w:tc>
-            </w:tr>
-          </w:tbl>
-          <w:p>
-            <w:pPr>
-              <w:spacing w:after="160" w:line="259" w:lineRule="auto"/>
-              <w:rPr>
-                <w:rFonts w:ascii="Times New Roman" w:hAnsi="Times New Roman" w:cs="Times New Roman"/>
-                <w:sz w:val="18"/>
-                <w:szCs w:val="18"/>
-              </w:rPr>
-            </w:pPr>
           </w:p>
         </w:tc>
       </w:tr>
       <w:tr>
         <w:trPr>
-          <w:trHeight w:val="393"/>
+          <w:trHeight w:val="305"/>
         </w:trPr>
         <w:tc>
           <w:tcPr>
-            <w:tcW w:w="2689" w:type="dxa"/>
-          </w:tcPr>
-          <w:p>
-            <w:pPr>
-              <w:spacing w:after="160" w:line="259" w:lineRule="auto"/>
-              <w:rPr>
-                <w:rFonts w:ascii="Times New Roman" w:hAnsi="Times New Roman" w:cs="Times New Roman"/>
-              </w:rPr>
-            </w:pPr>
-            <w:r>
-              <w:rPr>
-                <w:rFonts w:ascii="Times New Roman" w:hAnsi="Times New Roman" w:cs="Times New Roman"/>
-              </w:rPr>
-              <w:t>Pre-Implementation Visits</w:t>
-            </w:r>
-          </w:p>
-        </w:tc>
-        <w:tc>
-          <w:tcPr>
-            <w:tcW w:w="3827" w:type="dxa"/>
-            <w:tcBorders>
-              <w:top w:val="single" w:sz="2" w:space="0" w:color="auto"/>
-            </w:tcBorders>
-          </w:tcPr>
-          <w:p>
-            <w:pPr>
-              <w:spacing w:after="160" w:line="259" w:lineRule="auto"/>
-              <w:rPr>
-                <w:rFonts w:ascii="Times New Roman" w:hAnsi="Times New Roman" w:cs="Times New Roman"/>
-              </w:rPr>
-            </w:pPr>
-          </w:p>
-        </w:tc>
-        <w:tc>
-          <w:tcPr>
-            <w:tcW w:w="3544" w:type="dxa"/>
-          </w:tcPr>
-          <w:p>
-            <w:pPr>
-              <w:spacing w:after="160" w:line="259" w:lineRule="auto"/>
-              <w:rPr>
-                <w:rFonts w:ascii="Times New Roman" w:hAnsi="Times New Roman" w:cs="Times New Roman"/>
-              </w:rPr>
-            </w:pPr>
+            <w:tcW w:w="4162" w:type="dxa"/>
+            <w:vMerge/>
+          </w:tcPr>
+          <w:p>
+            <w:pPr>
+              <w:rPr>
+                <w:rFonts w:ascii="Times New Roman" w:hAnsi="Times New Roman" w:cs="Times New Roman"/>
+              </w:rPr>
+            </w:pPr>
+          </w:p>
+        </w:tc>
+        <w:tc>
+          <w:tcPr>
+            <w:tcW w:w="744" w:type="dxa"/>
+          </w:tcPr>
+          <w:p>
+            <w:pPr>
+              <w:rPr>
+                <w:rFonts w:ascii="Times New Roman" w:hAnsi="Times New Roman" w:cs="Times New Roman"/>
+              </w:rPr>
+            </w:pPr>
+            <w:r>
+              <w:rPr>
+                <w:rFonts w:ascii="Times New Roman" w:hAnsi="Times New Roman" w:cs="Times New Roman"/>
+              </w:rPr>
+              <w:t>WK1</w:t>
+            </w:r>
+          </w:p>
+        </w:tc>
+        <w:tc>
+          <w:tcPr>
+            <w:tcW w:w="744" w:type="dxa"/>
+          </w:tcPr>
+          <w:p>
+            <w:pPr>
+              <w:rPr>
+                <w:rFonts w:ascii="Times New Roman" w:hAnsi="Times New Roman" w:cs="Times New Roman"/>
+              </w:rPr>
+            </w:pPr>
+            <w:r>
+              <w:rPr>
+                <w:rFonts w:ascii="Times New Roman" w:hAnsi="Times New Roman" w:cs="Times New Roman"/>
+              </w:rPr>
+              <w:t>WK2</w:t>
+            </w:r>
+          </w:p>
+        </w:tc>
+        <w:tc>
+          <w:tcPr>
+            <w:tcW w:w="744" w:type="dxa"/>
+          </w:tcPr>
+          <w:p>
+            <w:pPr>
+              <w:rPr>
+                <w:rFonts w:ascii="Times New Roman" w:hAnsi="Times New Roman" w:cs="Times New Roman"/>
+              </w:rPr>
+            </w:pPr>
+            <w:r>
+              <w:rPr>
+                <w:rFonts w:ascii="Times New Roman" w:hAnsi="Times New Roman" w:cs="Times New Roman"/>
+              </w:rPr>
+              <w:t>WK3</w:t>
+            </w:r>
+          </w:p>
+        </w:tc>
+        <w:tc>
+          <w:tcPr>
+            <w:tcW w:w="743" w:type="dxa"/>
+          </w:tcPr>
+          <w:p>
+            <w:pPr>
+              <w:rPr>
+                <w:rFonts w:ascii="Times New Roman" w:hAnsi="Times New Roman" w:cs="Times New Roman"/>
+              </w:rPr>
+            </w:pPr>
+            <w:r>
+              <w:rPr>
+                <w:rFonts w:ascii="Times New Roman" w:hAnsi="Times New Roman" w:cs="Times New Roman"/>
+              </w:rPr>
+              <w:t>WK4</w:t>
+            </w:r>
+          </w:p>
+        </w:tc>
+        <w:tc>
+          <w:tcPr>
+            <w:tcW w:w="744" w:type="dxa"/>
+          </w:tcPr>
+          <w:p>
+            <w:pPr>
+              <w:rPr>
+                <w:rFonts w:ascii="Times New Roman" w:hAnsi="Times New Roman" w:cs="Times New Roman"/>
+              </w:rPr>
+            </w:pPr>
+            <w:r>
+              <w:rPr>
+                <w:rFonts w:ascii="Times New Roman" w:hAnsi="Times New Roman" w:cs="Times New Roman"/>
+              </w:rPr>
+              <w:t>WK1</w:t>
+            </w:r>
+          </w:p>
+        </w:tc>
+        <w:tc>
+          <w:tcPr>
+            <w:tcW w:w="744" w:type="dxa"/>
+          </w:tcPr>
+          <w:p>
+            <w:pPr>
+              <w:rPr>
+                <w:rFonts w:ascii="Times New Roman" w:hAnsi="Times New Roman" w:cs="Times New Roman"/>
+              </w:rPr>
+            </w:pPr>
+            <w:r>
+              <w:rPr>
+                <w:rFonts w:ascii="Times New Roman" w:hAnsi="Times New Roman" w:cs="Times New Roman"/>
+              </w:rPr>
+              <w:t>WK2</w:t>
+            </w:r>
+          </w:p>
+        </w:tc>
+        <w:tc>
+          <w:tcPr>
+            <w:tcW w:w="744" w:type="dxa"/>
+          </w:tcPr>
+          <w:p>
+            <w:pPr>
+              <w:rPr>
+                <w:rFonts w:ascii="Times New Roman" w:hAnsi="Times New Roman" w:cs="Times New Roman"/>
+              </w:rPr>
+            </w:pPr>
+            <w:r>
+              <w:rPr>
+                <w:rFonts w:ascii="Times New Roman" w:hAnsi="Times New Roman" w:cs="Times New Roman"/>
+              </w:rPr>
+              <w:t>WK3</w:t>
+            </w:r>
+          </w:p>
+        </w:tc>
+        <w:tc>
+          <w:tcPr>
+            <w:tcW w:w="690" w:type="dxa"/>
+          </w:tcPr>
+          <w:p>
+            <w:pPr>
+              <w:rPr>
+                <w:rFonts w:ascii="Times New Roman" w:hAnsi="Times New Roman" w:cs="Times New Roman"/>
+              </w:rPr>
+            </w:pPr>
+            <w:r>
+              <w:rPr>
+                <w:rFonts w:ascii="Times New Roman" w:hAnsi="Times New Roman" w:cs="Times New Roman"/>
+              </w:rPr>
+              <w:t>WK4</w:t>
+            </w:r>
           </w:p>
         </w:tc>
       </w:tr>
       <w:tr>
         <w:trPr>
-          <w:trHeight w:val="393"/>
+          <w:trHeight w:val="305"/>
         </w:trPr>
         <w:tc>
           <w:tcPr>
-            <w:tcW w:w="2689" w:type="dxa"/>
-          </w:tcPr>
-          <w:p>
-            <w:pPr>
-              <w:spacing w:after="160" w:line="259" w:lineRule="auto"/>
-              <w:rPr>
-                <w:rFonts w:ascii="Times New Roman" w:hAnsi="Times New Roman" w:cs="Times New Roman"/>
-              </w:rPr>
-            </w:pPr>
-            <w:r>
-              <w:rPr>
-                <w:rFonts w:ascii="Times New Roman" w:hAnsi="Times New Roman" w:cs="Times New Roman"/>
-              </w:rPr>
-              <w:lastRenderedPageBreak/>
-              <w:t>Master Preparations</w:t>
-            </w:r>
-          </w:p>
-        </w:tc>
-        <w:tc>
-          <w:tcPr>
-            <w:tcW w:w="3827" w:type="dxa"/>
-          </w:tcPr>
-          <w:p>
-            <w:pPr>
-              <w:spacing w:after="160" w:line="259" w:lineRule="auto"/>
-              <w:rPr>
-                <w:rFonts w:ascii="Times New Roman" w:hAnsi="Times New Roman" w:cs="Times New Roman"/>
-              </w:rPr>
-            </w:pPr>
-          </w:p>
-        </w:tc>
-        <w:tc>
-          <w:tcPr>
-            <w:tcW w:w="3544" w:type="dxa"/>
-          </w:tcPr>
-          <w:p>
-            <w:pPr>
-              <w:spacing w:after="160" w:line="259" w:lineRule="auto"/>
+            <w:tcW w:w="4162" w:type="dxa"/>
+          </w:tcPr>
+          <w:p>
+            <w:pPr>
+              <w:rPr>
+                <w:rFonts w:ascii="Times New Roman" w:hAnsi="Times New Roman" w:cs="Times New Roman"/>
+              </w:rPr>
+            </w:pPr>
+            <w:r>
+              <w:rPr>
+                <w:rFonts w:ascii="Times New Roman" w:hAnsi="Times New Roman" w:cs="Times New Roman"/>
+              </w:rPr>
+              <w:t>Pre-Implementation Visits</w:t>
+            </w:r>
+          </w:p>
+        </w:tc>
+        <w:tc>
+          <w:tcPr>
+            <w:tcW w:w="744" w:type="dxa"/>
+          </w:tcPr>
+          <w:p>
+            <w:pPr>
+              <w:rPr>
+                <w:rFonts w:ascii="Times New Roman" w:hAnsi="Times New Roman" w:cs="Times New Roman"/>
+              </w:rPr>
+            </w:pPr>
+          </w:p>
+        </w:tc>
+        <w:tc>
+          <w:tcPr>
+            <w:tcW w:w="744" w:type="dxa"/>
+          </w:tcPr>
+          <w:p>
+            <w:pPr>
+              <w:rPr>
+                <w:rFonts w:ascii="Times New Roman" w:hAnsi="Times New Roman" w:cs="Times New Roman"/>
+              </w:rPr>
+            </w:pPr>
+          </w:p>
+        </w:tc>
+        <w:tc>
+          <w:tcPr>
+            <w:tcW w:w="744" w:type="dxa"/>
+          </w:tcPr>
+          <w:p>
+            <w:pPr>
+              <w:rPr>
+                <w:rFonts w:ascii="Times New Roman" w:hAnsi="Times New Roman" w:cs="Times New Roman"/>
+              </w:rPr>
+            </w:pPr>
+          </w:p>
+        </w:tc>
+        <w:tc>
+          <w:tcPr>
+            <w:tcW w:w="743" w:type="dxa"/>
+          </w:tcPr>
+          <w:p>
+            <w:pPr>
+              <w:rPr>
+                <w:rFonts w:ascii="Times New Roman" w:hAnsi="Times New Roman" w:cs="Times New Roman"/>
+              </w:rPr>
+            </w:pPr>
+          </w:p>
+        </w:tc>
+        <w:tc>
+          <w:tcPr>
+            <w:tcW w:w="744" w:type="dxa"/>
+          </w:tcPr>
+          <w:p>
+            <w:pPr>
+              <w:rPr>
+                <w:rFonts w:ascii="Times New Roman" w:hAnsi="Times New Roman" w:cs="Times New Roman"/>
+              </w:rPr>
+            </w:pPr>
+          </w:p>
+        </w:tc>
+        <w:tc>
+          <w:tcPr>
+            <w:tcW w:w="744" w:type="dxa"/>
+          </w:tcPr>
+          <w:p>
+            <w:pPr>
+              <w:rPr>
+                <w:rFonts w:ascii="Times New Roman" w:hAnsi="Times New Roman" w:cs="Times New Roman"/>
+              </w:rPr>
+            </w:pPr>
+          </w:p>
+        </w:tc>
+        <w:tc>
+          <w:tcPr>
+            <w:tcW w:w="744" w:type="dxa"/>
+          </w:tcPr>
+          <w:p>
+            <w:pPr>
+              <w:rPr>
+                <w:rFonts w:ascii="Times New Roman" w:hAnsi="Times New Roman" w:cs="Times New Roman"/>
+              </w:rPr>
+            </w:pPr>
+          </w:p>
+        </w:tc>
+        <w:tc>
+          <w:tcPr>
+            <w:tcW w:w="690" w:type="dxa"/>
+          </w:tcPr>
+          <w:p>
+            <w:pPr>
               <w:rPr>
                 <w:rFonts w:ascii="Times New Roman" w:hAnsi="Times New Roman" w:cs="Times New Roman"/>
               </w:rPr>
@@ -5287,59 +4720,116 @@
       </w:tr>
       <w:tr>
         <w:trPr>
-          <w:trHeight w:val="393"/>
+          <w:trHeight w:val="305"/>
         </w:trPr>
         <w:tc>
           <w:tcPr>
-            <w:tcW w:w="2689" w:type="dxa"/>
-          </w:tcPr>
-          <w:p>
-            <w:pPr>
-              <w:spacing w:after="160" w:line="259" w:lineRule="auto"/>
-              <w:rPr>
-                <w:rFonts w:ascii="Times New Roman" w:hAnsi="Times New Roman" w:cs="Times New Roman"/>
-              </w:rPr>
-            </w:pPr>
-            <w:r>
-              <w:rPr>
-                <w:rFonts w:ascii="Times New Roman" w:hAnsi="Times New Roman" w:cs="Times New Roman"/>
-              </w:rPr>
-              <w:t>{{MODULE_LIST}}</w:t>
-            </w:r>
-            <w:r>
-              <w:rPr>
-                <w:rFonts w:ascii="Times New Roman" w:hAnsi="Times New Roman" w:cs="Times New Roman"/>
-              </w:rPr>
-              <w:t xml:space="preserve"> </w:t>
-            </w:r>
-            <w:r>
-              <w:rPr>
-                <w:rFonts w:ascii="Times New Roman" w:hAnsi="Times New Roman" w:cs="Times New Roman"/>
-              </w:rPr>
-              <w:t>Configuration &amp; Set Up</w:t>
-            </w:r>
-          </w:p>
-        </w:tc>
-        <w:tc>
-          <w:tcPr>
-            <w:tcW w:w="3827" w:type="dxa"/>
-          </w:tcPr>
-          <w:p>
-            <w:pPr>
-              <w:spacing w:after="160" w:line="259" w:lineRule="auto"/>
-              <w:rPr>
-                <w:rFonts w:ascii="Times New Roman" w:hAnsi="Times New Roman" w:cs="Times New Roman"/>
-              </w:rPr>
-            </w:pPr>
-          </w:p>
-        </w:tc>
-        <w:tc>
-          <w:tcPr>
-            <w:tcW w:w="3544" w:type="dxa"/>
-          </w:tcPr>
-          <w:p>
-            <w:pPr>
-              <w:spacing w:after="160" w:line="259" w:lineRule="auto"/>
+            <w:tcW w:w="4162" w:type="dxa"/>
+          </w:tcPr>
+          <w:p>
+            <w:pPr>
+              <w:rPr>
+                <w:rFonts w:ascii="Times New Roman" w:hAnsi="Times New Roman" w:cs="Times New Roman"/>
+              </w:rPr>
+            </w:pPr>
+            <w:r>
+              <w:rPr>
+                <w:rFonts w:ascii="Times New Roman" w:hAnsi="Times New Roman" w:cs="Times New Roman"/>
+              </w:rPr>
+              <w:t>Master Preparations</w:t>
+            </w:r>
+          </w:p>
+        </w:tc>
+        <w:tc>
+          <w:tcPr>
+            <w:tcW w:w="744" w:type="dxa"/>
+          </w:tcPr>
+          <w:p>
+            <w:pPr>
+              <w:rPr>
+                <w:rFonts w:ascii="Times New Roman" w:hAnsi="Times New Roman" w:cs="Times New Roman"/>
+              </w:rPr>
+            </w:pPr>
+          </w:p>
+        </w:tc>
+        <w:tc>
+          <w:tcPr>
+            <w:tcW w:w="744" w:type="dxa"/>
+          </w:tcPr>
+          <w:p>
+            <w:pPr>
+              <w:rPr>
+                <w:rFonts w:ascii="Times New Roman" w:hAnsi="Times New Roman" w:cs="Times New Roman"/>
+              </w:rPr>
+            </w:pPr>
+          </w:p>
+        </w:tc>
+        <w:tc>
+          <w:tcPr>
+            <w:tcW w:w="744" w:type="dxa"/>
+          </w:tcPr>
+          <w:p>
+            <w:pPr>
+              <w:rPr>
+                <w:rFonts w:ascii="Times New Roman" w:hAnsi="Times New Roman" w:cs="Times New Roman"/>
+              </w:rPr>
+            </w:pPr>
+          </w:p>
+        </w:tc>
+        <w:tc>
+          <w:tcPr>
+            <w:tcW w:w="743" w:type="dxa"/>
+          </w:tcPr>
+          <w:p>
+            <w:pPr>
+              <w:rPr>
+                <w:rFonts w:ascii="Times New Roman" w:hAnsi="Times New Roman" w:cs="Times New Roman"/>
+              </w:rPr>
+            </w:pPr>
+          </w:p>
+        </w:tc>
+        <w:tc>
+          <w:tcPr>
+            <w:tcW w:w="744" w:type="dxa"/>
+          </w:tcPr>
+          <w:p>
+            <w:pPr>
+              <w:rPr>
+                <w:rFonts w:ascii="Times New Roman" w:hAnsi="Times New Roman" w:cs="Times New Roman"/>
+              </w:rPr>
+            </w:pPr>
+          </w:p>
+        </w:tc>
+        <w:tc>
+          <w:tcPr>
+            <w:tcW w:w="744" w:type="dxa"/>
+          </w:tcPr>
+          <w:p>
+            <w:pPr>
+              <w:rPr>
+                <w:rFonts w:ascii="Times New Roman" w:hAnsi="Times New Roman" w:cs="Times New Roman"/>
+              </w:rPr>
+            </w:pPr>
+          </w:p>
+        </w:tc>
+        <w:tc>
+          <w:tcPr>
+            <w:tcW w:w="744" w:type="dxa"/>
+          </w:tcPr>
+          <w:p>
+            <w:pPr>
+              <w:rPr>
+                <w:rFonts w:ascii="Times New Roman" w:hAnsi="Times New Roman" w:cs="Times New Roman"/>
+              </w:rPr>
+            </w:pPr>
+          </w:p>
+        </w:tc>
+        <w:tc>
+          <w:tcPr>
+            <w:tcW w:w="690" w:type="dxa"/>
+          </w:tcPr>
+          <w:p>
+            <w:pPr>
               <w:rPr>
                 <w:rFonts w:ascii="Times New Roman" w:hAnsi="Times New Roman" w:cs="Times New Roman"/>
               </w:rPr>
@@ -5349,47 +4839,116 @@
       </w:tr>
       <w:tr>
         <w:trPr>
-          <w:trHeight w:val="393"/>
+          <w:trHeight w:val="305"/>
         </w:trPr>
         <w:tc>
           <w:tcPr>
-            <w:tcW w:w="2689" w:type="dxa"/>
-          </w:tcPr>
-          <w:p>
-            <w:pPr>
-              <w:spacing w:after="160" w:line="259" w:lineRule="auto"/>
-              <w:rPr>
-                <w:rFonts w:ascii="Times New Roman" w:hAnsi="Times New Roman" w:cs="Times New Roman"/>
-              </w:rPr>
-            </w:pPr>
-            <w:r>
-              <w:rPr>
-                <w:rFonts w:ascii="Times New Roman" w:hAnsi="Times New Roman" w:cs="Times New Roman"/>
-              </w:rPr>
-              <w:t>Trainings and Pilot run</w:t>
-            </w:r>
-          </w:p>
-        </w:tc>
-        <w:tc>
-          <w:tcPr>
-            <w:tcW w:w="3827" w:type="dxa"/>
-          </w:tcPr>
-          <w:p>
-            <w:pPr>
-              <w:spacing w:after="160" w:line="259" w:lineRule="auto"/>
-              <w:rPr>
-                <w:rFonts w:ascii="Times New Roman" w:hAnsi="Times New Roman" w:cs="Times New Roman"/>
-              </w:rPr>
-            </w:pPr>
-          </w:p>
-        </w:tc>
-        <w:tc>
-          <w:tcPr>
-            <w:tcW w:w="3544" w:type="dxa"/>
-          </w:tcPr>
-          <w:p>
-            <w:pPr>
-              <w:spacing w:after="160" w:line="259" w:lineRule="auto"/>
+            <w:tcW w:w="4162" w:type="dxa"/>
+          </w:tcPr>
+          <w:p>
+            <w:pPr>
+              <w:rPr>
+                <w:rFonts w:ascii="Times New Roman" w:hAnsi="Times New Roman" w:cs="Times New Roman"/>
+              </w:rPr>
+            </w:pPr>
+            <w:r>
+              <w:rPr>
+                <w:rFonts w:ascii="Times New Roman" w:hAnsi="Times New Roman" w:cs="Times New Roman"/>
+              </w:rPr>
+              <w:t>{{MODULE_LIST}} Configuration &amp; Set Up</w:t>
+            </w:r>
+          </w:p>
+        </w:tc>
+        <w:tc>
+          <w:tcPr>
+            <w:tcW w:w="744" w:type="dxa"/>
+          </w:tcPr>
+          <w:p>
+            <w:pPr>
+              <w:rPr>
+                <w:rFonts w:ascii="Times New Roman" w:hAnsi="Times New Roman" w:cs="Times New Roman"/>
+              </w:rPr>
+            </w:pPr>
+          </w:p>
+        </w:tc>
+        <w:tc>
+          <w:tcPr>
+            <w:tcW w:w="744" w:type="dxa"/>
+          </w:tcPr>
+          <w:p>
+            <w:pPr>
+              <w:rPr>
+                <w:rFonts w:ascii="Times New Roman" w:hAnsi="Times New Roman" w:cs="Times New Roman"/>
+              </w:rPr>
+            </w:pPr>
+          </w:p>
+        </w:tc>
+        <w:tc>
+          <w:tcPr>
+            <w:tcW w:w="744" w:type="dxa"/>
+          </w:tcPr>
+          <w:p>
+            <w:pPr>
+              <w:rPr>
+                <w:rFonts w:ascii="Times New Roman" w:hAnsi="Times New Roman" w:cs="Times New Roman"/>
+              </w:rPr>
+            </w:pPr>
+          </w:p>
+        </w:tc>
+        <w:tc>
+          <w:tcPr>
+            <w:tcW w:w="743" w:type="dxa"/>
+          </w:tcPr>
+          <w:p>
+            <w:pPr>
+              <w:rPr>
+                <w:rFonts w:ascii="Times New Roman" w:hAnsi="Times New Roman" w:cs="Times New Roman"/>
+              </w:rPr>
+            </w:pPr>
+          </w:p>
+        </w:tc>
+        <w:tc>
+          <w:tcPr>
+            <w:tcW w:w="744" w:type="dxa"/>
+          </w:tcPr>
+          <w:p>
+            <w:pPr>
+              <w:rPr>
+                <w:rFonts w:ascii="Times New Roman" w:hAnsi="Times New Roman" w:cs="Times New Roman"/>
+              </w:rPr>
+            </w:pPr>
+          </w:p>
+        </w:tc>
+        <w:tc>
+          <w:tcPr>
+            <w:tcW w:w="744" w:type="dxa"/>
+          </w:tcPr>
+          <w:p>
+            <w:pPr>
+              <w:rPr>
+                <w:rFonts w:ascii="Times New Roman" w:hAnsi="Times New Roman" w:cs="Times New Roman"/>
+              </w:rPr>
+            </w:pPr>
+          </w:p>
+        </w:tc>
+        <w:tc>
+          <w:tcPr>
+            <w:tcW w:w="744" w:type="dxa"/>
+          </w:tcPr>
+          <w:p>
+            <w:pPr>
+              <w:rPr>
+                <w:rFonts w:ascii="Times New Roman" w:hAnsi="Times New Roman" w:cs="Times New Roman"/>
+              </w:rPr>
+            </w:pPr>
+          </w:p>
+        </w:tc>
+        <w:tc>
+          <w:tcPr>
+            <w:tcW w:w="690" w:type="dxa"/>
+          </w:tcPr>
+          <w:p>
+            <w:pPr>
               <w:rPr>
                 <w:rFonts w:ascii="Times New Roman" w:hAnsi="Times New Roman" w:cs="Times New Roman"/>
               </w:rPr>
@@ -5399,47 +4958,116 @@
       </w:tr>
       <w:tr>
         <w:trPr>
-          <w:trHeight w:val="377"/>
+          <w:trHeight w:val="305"/>
         </w:trPr>
         <w:tc>
           <w:tcPr>
-            <w:tcW w:w="2689" w:type="dxa"/>
-          </w:tcPr>
-          <w:p>
-            <w:pPr>
-              <w:spacing w:after="160" w:line="259" w:lineRule="auto"/>
-              <w:rPr>
-                <w:rFonts w:ascii="Times New Roman" w:hAnsi="Times New Roman" w:cs="Times New Roman"/>
-              </w:rPr>
-            </w:pPr>
-            <w:r>
-              <w:rPr>
-                <w:rFonts w:ascii="Times New Roman" w:hAnsi="Times New Roman" w:cs="Times New Roman"/>
-              </w:rPr>
-              <w:t>Data Preparation for Go-Live</w:t>
-            </w:r>
-          </w:p>
-        </w:tc>
-        <w:tc>
-          <w:tcPr>
-            <w:tcW w:w="3827" w:type="dxa"/>
-          </w:tcPr>
-          <w:p>
-            <w:pPr>
-              <w:spacing w:after="160" w:line="259" w:lineRule="auto"/>
-              <w:rPr>
-                <w:rFonts w:ascii="Times New Roman" w:hAnsi="Times New Roman" w:cs="Times New Roman"/>
-              </w:rPr>
-            </w:pPr>
-          </w:p>
-        </w:tc>
-        <w:tc>
-          <w:tcPr>
-            <w:tcW w:w="3544" w:type="dxa"/>
-          </w:tcPr>
-          <w:p>
-            <w:pPr>
-              <w:spacing w:after="160" w:line="259" w:lineRule="auto"/>
+            <w:tcW w:w="4162" w:type="dxa"/>
+          </w:tcPr>
+          <w:p>
+            <w:pPr>
+              <w:rPr>
+                <w:rFonts w:ascii="Times New Roman" w:hAnsi="Times New Roman" w:cs="Times New Roman"/>
+              </w:rPr>
+            </w:pPr>
+            <w:r>
+              <w:rPr>
+                <w:rFonts w:ascii="Times New Roman" w:hAnsi="Times New Roman" w:cs="Times New Roman"/>
+              </w:rPr>
+              <w:t>Trainings and Pilot run</w:t>
+            </w:r>
+          </w:p>
+        </w:tc>
+        <w:tc>
+          <w:tcPr>
+            <w:tcW w:w="744" w:type="dxa"/>
+          </w:tcPr>
+          <w:p>
+            <w:pPr>
+              <w:rPr>
+                <w:rFonts w:ascii="Times New Roman" w:hAnsi="Times New Roman" w:cs="Times New Roman"/>
+              </w:rPr>
+            </w:pPr>
+          </w:p>
+        </w:tc>
+        <w:tc>
+          <w:tcPr>
+            <w:tcW w:w="744" w:type="dxa"/>
+          </w:tcPr>
+          <w:p>
+            <w:pPr>
+              <w:rPr>
+                <w:rFonts w:ascii="Times New Roman" w:hAnsi="Times New Roman" w:cs="Times New Roman"/>
+              </w:rPr>
+            </w:pPr>
+          </w:p>
+        </w:tc>
+        <w:tc>
+          <w:tcPr>
+            <w:tcW w:w="744" w:type="dxa"/>
+          </w:tcPr>
+          <w:p>
+            <w:pPr>
+              <w:rPr>
+                <w:rFonts w:ascii="Times New Roman" w:hAnsi="Times New Roman" w:cs="Times New Roman"/>
+              </w:rPr>
+            </w:pPr>
+          </w:p>
+        </w:tc>
+        <w:tc>
+          <w:tcPr>
+            <w:tcW w:w="743" w:type="dxa"/>
+          </w:tcPr>
+          <w:p>
+            <w:pPr>
+              <w:rPr>
+                <w:rFonts w:ascii="Times New Roman" w:hAnsi="Times New Roman" w:cs="Times New Roman"/>
+              </w:rPr>
+            </w:pPr>
+          </w:p>
+        </w:tc>
+        <w:tc>
+          <w:tcPr>
+            <w:tcW w:w="744" w:type="dxa"/>
+          </w:tcPr>
+          <w:p>
+            <w:pPr>
+              <w:rPr>
+                <w:rFonts w:ascii="Times New Roman" w:hAnsi="Times New Roman" w:cs="Times New Roman"/>
+              </w:rPr>
+            </w:pPr>
+          </w:p>
+        </w:tc>
+        <w:tc>
+          <w:tcPr>
+            <w:tcW w:w="744" w:type="dxa"/>
+          </w:tcPr>
+          <w:p>
+            <w:pPr>
+              <w:rPr>
+                <w:rFonts w:ascii="Times New Roman" w:hAnsi="Times New Roman" w:cs="Times New Roman"/>
+              </w:rPr>
+            </w:pPr>
+          </w:p>
+        </w:tc>
+        <w:tc>
+          <w:tcPr>
+            <w:tcW w:w="744" w:type="dxa"/>
+          </w:tcPr>
+          <w:p>
+            <w:pPr>
+              <w:rPr>
+                <w:rFonts w:ascii="Times New Roman" w:hAnsi="Times New Roman" w:cs="Times New Roman"/>
+              </w:rPr>
+            </w:pPr>
+          </w:p>
+        </w:tc>
+        <w:tc>
+          <w:tcPr>
+            <w:tcW w:w="690" w:type="dxa"/>
+          </w:tcPr>
+          <w:p>
+            <w:pPr>
               <w:rPr>
                 <w:rFonts w:ascii="Times New Roman" w:hAnsi="Times New Roman" w:cs="Times New Roman"/>
               </w:rPr>
@@ -5449,47 +5077,116 @@
       </w:tr>
       <w:tr>
         <w:trPr>
-          <w:trHeight w:val="393"/>
+          <w:trHeight w:val="322"/>
         </w:trPr>
         <w:tc>
           <w:tcPr>
-            <w:tcW w:w="2689" w:type="dxa"/>
-          </w:tcPr>
-          <w:p>
-            <w:pPr>
-              <w:spacing w:after="160" w:line="259" w:lineRule="auto"/>
-              <w:rPr>
-                <w:rFonts w:ascii="Times New Roman" w:hAnsi="Times New Roman" w:cs="Times New Roman"/>
-              </w:rPr>
-            </w:pPr>
-            <w:r>
-              <w:rPr>
-                <w:rFonts w:ascii="Times New Roman" w:hAnsi="Times New Roman" w:cs="Times New Roman"/>
-              </w:rPr>
-              <w:t>Go-Live</w:t>
-            </w:r>
-          </w:p>
-        </w:tc>
-        <w:tc>
-          <w:tcPr>
-            <w:tcW w:w="3827" w:type="dxa"/>
-          </w:tcPr>
-          <w:p>
-            <w:pPr>
-              <w:spacing w:after="160" w:line="259" w:lineRule="auto"/>
-              <w:rPr>
-                <w:rFonts w:ascii="Times New Roman" w:hAnsi="Times New Roman" w:cs="Times New Roman"/>
-              </w:rPr>
-            </w:pPr>
-          </w:p>
-        </w:tc>
-        <w:tc>
-          <w:tcPr>
-            <w:tcW w:w="3544" w:type="dxa"/>
-          </w:tcPr>
-          <w:p>
-            <w:pPr>
-              <w:spacing w:after="160" w:line="259" w:lineRule="auto"/>
+            <w:tcW w:w="4162" w:type="dxa"/>
+          </w:tcPr>
+          <w:p>
+            <w:pPr>
+              <w:rPr>
+                <w:rFonts w:ascii="Times New Roman" w:hAnsi="Times New Roman" w:cs="Times New Roman"/>
+              </w:rPr>
+            </w:pPr>
+            <w:r>
+              <w:rPr>
+                <w:rFonts w:ascii="Times New Roman" w:hAnsi="Times New Roman" w:cs="Times New Roman"/>
+              </w:rPr>
+              <w:t>Data Preparation for Go-Live</w:t>
+            </w:r>
+          </w:p>
+        </w:tc>
+        <w:tc>
+          <w:tcPr>
+            <w:tcW w:w="744" w:type="dxa"/>
+          </w:tcPr>
+          <w:p>
+            <w:pPr>
+              <w:rPr>
+                <w:rFonts w:ascii="Times New Roman" w:hAnsi="Times New Roman" w:cs="Times New Roman"/>
+              </w:rPr>
+            </w:pPr>
+          </w:p>
+        </w:tc>
+        <w:tc>
+          <w:tcPr>
+            <w:tcW w:w="744" w:type="dxa"/>
+          </w:tcPr>
+          <w:p>
+            <w:pPr>
+              <w:rPr>
+                <w:rFonts w:ascii="Times New Roman" w:hAnsi="Times New Roman" w:cs="Times New Roman"/>
+              </w:rPr>
+            </w:pPr>
+          </w:p>
+        </w:tc>
+        <w:tc>
+          <w:tcPr>
+            <w:tcW w:w="744" w:type="dxa"/>
+          </w:tcPr>
+          <w:p>
+            <w:pPr>
+              <w:rPr>
+                <w:rFonts w:ascii="Times New Roman" w:hAnsi="Times New Roman" w:cs="Times New Roman"/>
+              </w:rPr>
+            </w:pPr>
+          </w:p>
+        </w:tc>
+        <w:tc>
+          <w:tcPr>
+            <w:tcW w:w="743" w:type="dxa"/>
+          </w:tcPr>
+          <w:p>
+            <w:pPr>
+              <w:rPr>
+                <w:rFonts w:ascii="Times New Roman" w:hAnsi="Times New Roman" w:cs="Times New Roman"/>
+              </w:rPr>
+            </w:pPr>
+          </w:p>
+        </w:tc>
+        <w:tc>
+          <w:tcPr>
+            <w:tcW w:w="744" w:type="dxa"/>
+          </w:tcPr>
+          <w:p>
+            <w:pPr>
+              <w:rPr>
+                <w:rFonts w:ascii="Times New Roman" w:hAnsi="Times New Roman" w:cs="Times New Roman"/>
+              </w:rPr>
+            </w:pPr>
+          </w:p>
+        </w:tc>
+        <w:tc>
+          <w:tcPr>
+            <w:tcW w:w="744" w:type="dxa"/>
+          </w:tcPr>
+          <w:p>
+            <w:pPr>
+              <w:rPr>
+                <w:rFonts w:ascii="Times New Roman" w:hAnsi="Times New Roman" w:cs="Times New Roman"/>
+              </w:rPr>
+            </w:pPr>
+          </w:p>
+        </w:tc>
+        <w:tc>
+          <w:tcPr>
+            <w:tcW w:w="744" w:type="dxa"/>
+          </w:tcPr>
+          <w:p>
+            <w:pPr>
+              <w:rPr>
+                <w:rFonts w:ascii="Times New Roman" w:hAnsi="Times New Roman" w:cs="Times New Roman"/>
+              </w:rPr>
+            </w:pPr>
+          </w:p>
+        </w:tc>
+        <w:tc>
+          <w:tcPr>
+            <w:tcW w:w="690" w:type="dxa"/>
+          </w:tcPr>
+          <w:p>
+            <w:pPr>
               <w:rPr>
                 <w:rFonts w:ascii="Times New Roman" w:hAnsi="Times New Roman" w:cs="Times New Roman"/>
               </w:rPr>
@@ -5499,15 +5196,134 @@
       </w:tr>
       <w:tr>
         <w:trPr>
-          <w:trHeight w:val="65"/>
+          <w:trHeight w:val="305"/>
         </w:trPr>
         <w:tc>
           <w:tcPr>
-            <w:tcW w:w="2689" w:type="dxa"/>
-          </w:tcPr>
-          <w:p>
-            <w:pPr>
-              <w:spacing w:after="160" w:line="259" w:lineRule="auto"/>
+            <w:tcW w:w="4162" w:type="dxa"/>
+          </w:tcPr>
+          <w:p>
+            <w:pPr>
+              <w:rPr>
+                <w:rFonts w:ascii="Times New Roman" w:hAnsi="Times New Roman" w:cs="Times New Roman"/>
+              </w:rPr>
+            </w:pPr>
+            <w:r>
+              <w:rPr>
+                <w:rFonts w:ascii="Times New Roman" w:hAnsi="Times New Roman" w:cs="Times New Roman"/>
+              </w:rPr>
+              <w:lastRenderedPageBreak/>
+              <w:t>Go-Live</w:t>
+            </w:r>
+          </w:p>
+        </w:tc>
+        <w:tc>
+          <w:tcPr>
+            <w:tcW w:w="744" w:type="dxa"/>
+          </w:tcPr>
+          <w:p>
+            <w:pPr>
+              <w:rPr>
+                <w:rFonts w:ascii="Times New Roman" w:hAnsi="Times New Roman" w:cs="Times New Roman"/>
+              </w:rPr>
+            </w:pPr>
+          </w:p>
+        </w:tc>
+        <w:tc>
+          <w:tcPr>
+            <w:tcW w:w="744" w:type="dxa"/>
+          </w:tcPr>
+          <w:p>
+            <w:pPr>
+              <w:rPr>
+                <w:rFonts w:ascii="Times New Roman" w:hAnsi="Times New Roman" w:cs="Times New Roman"/>
+              </w:rPr>
+            </w:pPr>
+          </w:p>
+        </w:tc>
+        <w:tc>
+          <w:tcPr>
+            <w:tcW w:w="744" w:type="dxa"/>
+          </w:tcPr>
+          <w:p>
+            <w:pPr>
+              <w:rPr>
+                <w:rFonts w:ascii="Times New Roman" w:hAnsi="Times New Roman" w:cs="Times New Roman"/>
+              </w:rPr>
+            </w:pPr>
+          </w:p>
+        </w:tc>
+        <w:tc>
+          <w:tcPr>
+            <w:tcW w:w="743" w:type="dxa"/>
+          </w:tcPr>
+          <w:p>
+            <w:pPr>
+              <w:rPr>
+                <w:rFonts w:ascii="Times New Roman" w:hAnsi="Times New Roman" w:cs="Times New Roman"/>
+              </w:rPr>
+            </w:pPr>
+          </w:p>
+        </w:tc>
+        <w:tc>
+          <w:tcPr>
+            <w:tcW w:w="744" w:type="dxa"/>
+          </w:tcPr>
+          <w:p>
+            <w:pPr>
+              <w:rPr>
+                <w:rFonts w:ascii="Times New Roman" w:hAnsi="Times New Roman" w:cs="Times New Roman"/>
+              </w:rPr>
+            </w:pPr>
+          </w:p>
+        </w:tc>
+        <w:tc>
+          <w:tcPr>
+            <w:tcW w:w="744" w:type="dxa"/>
+          </w:tcPr>
+          <w:p>
+            <w:pPr>
+              <w:rPr>
+                <w:rFonts w:ascii="Times New Roman" w:hAnsi="Times New Roman" w:cs="Times New Roman"/>
+              </w:rPr>
+            </w:pPr>
+          </w:p>
+        </w:tc>
+        <w:tc>
+          <w:tcPr>
+            <w:tcW w:w="744" w:type="dxa"/>
+          </w:tcPr>
+          <w:p>
+            <w:pPr>
+              <w:rPr>
+                <w:rFonts w:ascii="Times New Roman" w:hAnsi="Times New Roman" w:cs="Times New Roman"/>
+              </w:rPr>
+            </w:pPr>
+          </w:p>
+        </w:tc>
+        <w:tc>
+          <w:tcPr>
+            <w:tcW w:w="690" w:type="dxa"/>
+          </w:tcPr>
+          <w:p>
+            <w:pPr>
+              <w:rPr>
+                <w:rFonts w:ascii="Times New Roman" w:hAnsi="Times New Roman" w:cs="Times New Roman"/>
+              </w:rPr>
+            </w:pPr>
+          </w:p>
+        </w:tc>
+      </w:tr>
+      <w:tr>
+        <w:trPr>
+          <w:trHeight w:val="305"/>
+        </w:trPr>
+        <w:tc>
+          <w:tcPr>
+            <w:tcW w:w="4162" w:type="dxa"/>
+          </w:tcPr>
+          <w:p>
+            <w:pPr>
               <w:rPr>
                 <w:rFonts w:ascii="Times New Roman" w:hAnsi="Times New Roman" w:cs="Times New Roman"/>
               </w:rPr>
@@ -5522,24 +5338,94 @@
         </w:tc>
         <w:tc>
           <w:tcPr>
-            <w:tcW w:w="3827" w:type="dxa"/>
-          </w:tcPr>
-          <w:p>
-            <w:pPr>
-              <w:spacing w:after="160" w:line="259" w:lineRule="auto"/>
-              <w:rPr>
-                <w:rFonts w:ascii="Times New Roman" w:hAnsi="Times New Roman" w:cs="Times New Roman"/>
-              </w:rPr>
-            </w:pPr>
-          </w:p>
-        </w:tc>
-        <w:tc>
-          <w:tcPr>
-            <w:tcW w:w="3544" w:type="dxa"/>
-          </w:tcPr>
-          <w:p>
-            <w:pPr>
-              <w:spacing w:after="160" w:line="259" w:lineRule="auto"/>
+            <w:tcW w:w="744" w:type="dxa"/>
+          </w:tcPr>
+          <w:p>
+            <w:pPr>
+              <w:rPr>
+                <w:rFonts w:ascii="Times New Roman" w:hAnsi="Times New Roman" w:cs="Times New Roman"/>
+              </w:rPr>
+            </w:pPr>
+          </w:p>
+        </w:tc>
+        <w:tc>
+          <w:tcPr>
+            <w:tcW w:w="744" w:type="dxa"/>
+          </w:tcPr>
+          <w:p>
+            <w:pPr>
+              <w:rPr>
+                <w:rFonts w:ascii="Times New Roman" w:hAnsi="Times New Roman" w:cs="Times New Roman"/>
+              </w:rPr>
+            </w:pPr>
+          </w:p>
+        </w:tc>
+        <w:tc>
+          <w:tcPr>
+            <w:tcW w:w="744" w:type="dxa"/>
+          </w:tcPr>
+          <w:p>
+            <w:pPr>
+              <w:rPr>
+                <w:rFonts w:ascii="Times New Roman" w:hAnsi="Times New Roman" w:cs="Times New Roman"/>
+              </w:rPr>
+            </w:pPr>
+          </w:p>
+        </w:tc>
+        <w:tc>
+          <w:tcPr>
+            <w:tcW w:w="743" w:type="dxa"/>
+          </w:tcPr>
+          <w:p>
+            <w:pPr>
+              <w:rPr>
+                <w:rFonts w:ascii="Times New Roman" w:hAnsi="Times New Roman" w:cs="Times New Roman"/>
+              </w:rPr>
+            </w:pPr>
+          </w:p>
+        </w:tc>
+        <w:tc>
+          <w:tcPr>
+            <w:tcW w:w="744" w:type="dxa"/>
+          </w:tcPr>
+          <w:p>
+            <w:pPr>
+              <w:rPr>
+                <w:rFonts w:ascii="Times New Roman" w:hAnsi="Times New Roman" w:cs="Times New Roman"/>
+              </w:rPr>
+            </w:pPr>
+          </w:p>
+        </w:tc>
+        <w:tc>
+          <w:tcPr>
+            <w:tcW w:w="744" w:type="dxa"/>
+          </w:tcPr>
+          <w:p>
+            <w:pPr>
+              <w:rPr>
+                <w:rFonts w:ascii="Times New Roman" w:hAnsi="Times New Roman" w:cs="Times New Roman"/>
+              </w:rPr>
+            </w:pPr>
+          </w:p>
+        </w:tc>
+        <w:tc>
+          <w:tcPr>
+            <w:tcW w:w="744" w:type="dxa"/>
+          </w:tcPr>
+          <w:p>
+            <w:pPr>
+              <w:rPr>
+                <w:rFonts w:ascii="Times New Roman" w:hAnsi="Times New Roman" w:cs="Times New Roman"/>
+              </w:rPr>
+            </w:pPr>
+          </w:p>
+        </w:tc>
+        <w:tc>
+          <w:tcPr>
+            <w:tcW w:w="690" w:type="dxa"/>
+          </w:tcPr>
+          <w:p>
+            <w:pPr>
               <w:rPr>
                 <w:rFonts w:ascii="Times New Roman" w:hAnsi="Times New Roman" w:cs="Times New Roman"/>
               </w:rPr>
@@ -5706,6 +5592,7 @@
         </w:rPr>
         <w:t xml:space="preserve"> </w:t>
       </w:r>
+      <w:proofErr w:type="gramStart"/>
       <w:r>
         <w:rPr>
           <w:rFonts w:ascii="Times New Roman" w:hAnsi="Times New Roman" w:cs="Times New Roman"/>
@@ -5713,6 +5600,7 @@
         </w:rPr>
         <w:t>Organization</w:t>
       </w:r>
+      <w:proofErr w:type="gramEnd"/>
     </w:p>
     <w:p>
       <w:pPr>
@@ -6064,7 +5952,6 @@
           <w:rFonts w:ascii="Times New Roman" w:hAnsi="Times New Roman" w:cs="Times New Roman"/>
           <w:color w:val="000000" w:themeColor="text1"/>
         </w:rPr>
-        <w:lastRenderedPageBreak/>
         <w:t>6. Excused Performance</w:t>
       </w:r>
     </w:p>
@@ -6142,6 +6029,7 @@
         <w:rPr>
           <w:rFonts w:ascii="Times New Roman" w:hAnsi="Times New Roman" w:cs="Times New Roman"/>
         </w:rPr>
+        <w:lastRenderedPageBreak/>
         <w:t xml:space="preserve">You will be required to pay the balance amount to BlechTek immediately in case of the </w:t>
       </w:r>
       <w:r>
@@ -7627,7 +7515,7 @@
   <w:style w:type="paragraph" w:default="1" w:styleId="Normal">
     <w:name w:val="Normal"/>
     <w:qFormat/>
-    <w:rsid w:val="007F787B"/>
+    <w:rsid w:val="00240486"/>
   </w:style>
   <w:style w:type="paragraph" w:styleId="Heading1">
     <w:name w:val="heading 1"/>

</xml_diff>

<commit_message>
updates in quotation page for haivng the discount % udpates correctly.of updates
</commit_message>
<xml_diff>
--- a/QuotationApp.API/Templates/QuotationTemplate_Updated.docx
+++ b/QuotationApp.API/Templates/QuotationTemplate_Updated.docx
@@ -2,17 +2,6 @@
 <file path=word/document.xml><?xml version="1.0" encoding="utf-8"?>
 <w:document xmlns:wpc="http://schemas.microsoft.com/office/word/2010/wordprocessingCanvas" xmlns:cx="http://schemas.microsoft.com/office/drawing/2014/chartex" xmlns:cx1="http://schemas.microsoft.com/office/drawing/2015/9/8/chartex" xmlns:cx2="http://schemas.microsoft.com/office/drawing/2015/10/21/chartex" xmlns:cx3="http://schemas.microsoft.com/office/drawing/2016/5/9/chartex" xmlns:cx4="http://schemas.microsoft.com/office/drawing/2016/5/10/chartex" xmlns:cx5="http://schemas.microsoft.com/office/drawing/2016/5/11/chartex" xmlns:cx6="http://schemas.microsoft.com/office/drawing/2016/5/12/chartex" xmlns:cx7="http://schemas.microsoft.com/office/drawing/2016/5/13/chartex" xmlns:cx8="http://schemas.microsoft.com/office/drawing/2016/5/14/chartex" xmlns:mc="http://schemas.openxmlformats.org/markup-compatibility/2006" xmlns:aink="http://schemas.microsoft.com/office/drawing/2016/ink" xmlns:am3d="http://schemas.microsoft.com/office/drawing/2017/model3d" xmlns:o="urn:schemas-microsoft-com:office:office" xmlns:oel="http://schemas.microsoft.com/office/2019/extlst" xmlns:r="http://schemas.openxmlformats.org/officeDocument/2006/relationships" xmlns:m="http://schemas.openxmlformats.org/officeDocument/2006/math" xmlns:v="urn:schemas-microsoft-com:vml" xmlns:wp14="http://schemas.microsoft.com/office/word/2010/wordprocessingDrawing" xmlns:wp="http://schemas.openxmlformats.org/drawingml/2006/wordprocessingDrawing" xmlns:w10="urn:schemas-microsoft-com:office:word" xmlns:w="http://schemas.openxmlformats.org/wordprocessingml/2006/main" xmlns:w14="http://schemas.microsoft.com/office/word/2010/wordml" xmlns:w15="http://schemas.microsoft.com/office/word/2012/wordml" xmlns:w16cex="http://schemas.microsoft.com/office/word/2018/wordml/cex" xmlns:w16cid="http://schemas.microsoft.com/office/word/2016/wordml/cid" xmlns:w16="http://schemas.microsoft.com/office/word/2018/wordml" xmlns:w16du="http://schemas.microsoft.com/office/word/2023/wordml/word16du" xmlns:w16sdtdh="http://schemas.microsoft.com/office/word/2020/wordml/sdtdatahash" xmlns:w16sdtfl="http://schemas.microsoft.com/office/word/2024/wordml/sdtformatlock" xmlns:w16se="http://schemas.microsoft.com/office/word/2015/wordml/symex" xmlns:wpg="http://schemas.microsoft.com/office/word/2010/wordprocessingGroup" xmlns:wpi="http://schemas.microsoft.com/office/word/2010/wordprocessingInk" xmlns:wne="http://schemas.microsoft.com/office/word/2006/wordml" xmlns:wps="http://schemas.microsoft.com/office/word/2010/wordprocessingShape" mc:Ignorable="w14 w15 w16se w16cid w16 w16cex w16sdtdh w16sdtfl w16du wp14">
   <w:body>
-    <w:p>
-      <w:pPr>
-        <w:spacing w:after="120"/>
-        <w:rPr>
-          <w:rFonts w:ascii="Times New Roman" w:hAnsi="Times New Roman" w:cs="Times New Roman"/>
-          <w:b/>
-          <w:bCs/>
-          <w:color w:val="65AADB"/>
-        </w:rPr>
-      </w:pPr>
-    </w:p>
     <w:p>
       <w:pPr>
         <w:spacing w:after="120"/>
@@ -743,6 +732,24 @@
         <w:spacing w:line="240" w:lineRule="auto"/>
         <w:rPr>
           <w:rFonts w:ascii="Times New Roman" w:hAnsi="Times New Roman" w:cs="Times New Roman"/>
+          <w:noProof/>
+        </w:rPr>
+      </w:pPr>
+    </w:p>
+    <w:p>
+      <w:pPr>
+        <w:spacing w:line="240" w:lineRule="auto"/>
+        <w:rPr>
+          <w:rFonts w:ascii="Times New Roman" w:hAnsi="Times New Roman" w:cs="Times New Roman"/>
+          <w:noProof/>
+        </w:rPr>
+      </w:pPr>
+    </w:p>
+    <w:p>
+      <w:pPr>
+        <w:spacing w:line="240" w:lineRule="auto"/>
+        <w:rPr>
+          <w:rFonts w:ascii="Times New Roman" w:hAnsi="Times New Roman" w:cs="Times New Roman"/>
           <w:b/>
           <w:bCs/>
           <w:lang w:val="en-US"/>
@@ -774,15 +781,6 @@
     </w:p>
     <w:p>
       <w:pPr>
-        <w:spacing w:after="200"/>
-        <w:rPr>
-          <w:rFonts w:ascii="Times New Roman" w:hAnsi="Times New Roman" w:cs="Times New Roman"/>
-          <w:lang w:val="en-US"/>
-        </w:rPr>
-      </w:pPr>
-    </w:p>
-    <w:p>
-      <w:pPr>
         <w:spacing w:before="300" w:after="150"/>
         <w:rPr>
           <w:rFonts w:ascii="Times New Roman" w:hAnsi="Times New Roman" w:cs="Times New Roman"/>
@@ -794,6 +792,7 @@
           <w:rFonts w:ascii="Times New Roman" w:hAnsi="Times New Roman" w:cs="Times New Roman"/>
           <w:color w:val="000000" w:themeColor="text1"/>
         </w:rPr>
+        <w:lastRenderedPageBreak/>
         <w:t>Scope</w:t>
       </w:r>
       <w:r>
@@ -2499,7 +2498,21 @@
               <w:rPr>
                 <w:rFonts w:ascii="Times New Roman" w:hAnsi="Times New Roman" w:cs="Times New Roman"/>
               </w:rPr>
-              <w:t>First Year - These Services start a er 1 Month from start of Go Live. Subsequent Years – A er comple on of 7 Man Days</w:t>
+              <w:t xml:space="preserve">First Year - These Services start a er 1 Month from start of Go Live. Subsequent Years – A er </w:t>
+            </w:r>
+            <w:proofErr w:type="spellStart"/>
+            <w:r>
+              <w:rPr>
+                <w:rFonts w:ascii="Times New Roman" w:hAnsi="Times New Roman" w:cs="Times New Roman"/>
+              </w:rPr>
+              <w:t>comple</w:t>
+            </w:r>
+            <w:proofErr w:type="spellEnd"/>
+            <w:r>
+              <w:rPr>
+                <w:rFonts w:ascii="Times New Roman" w:hAnsi="Times New Roman" w:cs="Times New Roman"/>
+              </w:rPr>
+              <w:t xml:space="preserve"> on of 7 Man Days</w:t>
             </w:r>
           </w:p>
         </w:tc>
@@ -2548,7 +2561,6 @@
               <w:rPr>
                 <w:rFonts w:ascii="Times New Roman" w:hAnsi="Times New Roman" w:cs="Times New Roman"/>
               </w:rPr>
-              <w:lastRenderedPageBreak/>
               <w:t>5</w:t>
             </w:r>
           </w:p>
@@ -2623,6 +2635,7 @@
               <w:rPr>
                 <w:rFonts w:ascii="Times New Roman" w:hAnsi="Times New Roman" w:cs="Times New Roman"/>
               </w:rPr>
+              <w:lastRenderedPageBreak/>
               <w:t xml:space="preserve"> 5.1</w:t>
             </w:r>
           </w:p>
@@ -5272,184 +5285,176 @@
           <w:w w:val="101"/>
         </w:rPr>
       </w:pPr>
+      <w:r>
+        <w:rPr>
+          <w:rFonts w:ascii="Times New Roman" w:hAnsi="Times New Roman" w:cs="Times New Roman"/>
+          <w:w w:val="101"/>
+        </w:rPr>
+        <w:t>We</w:t>
+      </w:r>
+      <w:r>
+        <w:rPr>
+          <w:rFonts w:ascii="Times New Roman" w:hAnsi="Times New Roman" w:cs="Times New Roman"/>
+          <w:spacing w:val="-5"/>
+          <w:w w:val="101"/>
+        </w:rPr>
+        <w:t xml:space="preserve"> </w:t>
+      </w:r>
+      <w:r>
+        <w:rPr>
+          <w:rFonts w:ascii="Times New Roman" w:hAnsi="Times New Roman" w:cs="Times New Roman"/>
+          <w:w w:val="101"/>
+        </w:rPr>
+        <w:t>agree</w:t>
+      </w:r>
+      <w:r>
+        <w:rPr>
+          <w:rFonts w:ascii="Times New Roman" w:hAnsi="Times New Roman" w:cs="Times New Roman"/>
+          <w:spacing w:val="-6"/>
+          <w:w w:val="101"/>
+        </w:rPr>
+        <w:t xml:space="preserve"> </w:t>
+      </w:r>
+      <w:r>
+        <w:rPr>
+          <w:rFonts w:ascii="Times New Roman" w:hAnsi="Times New Roman" w:cs="Times New Roman"/>
+          <w:w w:val="101"/>
+        </w:rPr>
+        <w:t>to</w:t>
+      </w:r>
+      <w:r>
+        <w:rPr>
+          <w:rFonts w:ascii="Times New Roman" w:hAnsi="Times New Roman" w:cs="Times New Roman"/>
+          <w:spacing w:val="-2"/>
+          <w:w w:val="101"/>
+        </w:rPr>
+        <w:t xml:space="preserve"> </w:t>
+      </w:r>
+      <w:r>
+        <w:rPr>
+          <w:rFonts w:ascii="Times New Roman" w:hAnsi="Times New Roman" w:cs="Times New Roman"/>
+          <w:w w:val="101"/>
+        </w:rPr>
+        <w:t>maintain</w:t>
+      </w:r>
+      <w:r>
+        <w:rPr>
+          <w:rFonts w:ascii="Times New Roman" w:hAnsi="Times New Roman" w:cs="Times New Roman"/>
+          <w:spacing w:val="-5"/>
+          <w:w w:val="101"/>
+        </w:rPr>
+        <w:t xml:space="preserve"> </w:t>
+      </w:r>
+      <w:r>
+        <w:rPr>
+          <w:rFonts w:ascii="Times New Roman" w:hAnsi="Times New Roman" w:cs="Times New Roman"/>
+          <w:w w:val="101"/>
+        </w:rPr>
+        <w:t>the</w:t>
+      </w:r>
+      <w:r>
+        <w:rPr>
+          <w:rFonts w:ascii="Times New Roman" w:hAnsi="Times New Roman" w:cs="Times New Roman"/>
+          <w:spacing w:val="-5"/>
+          <w:w w:val="101"/>
+        </w:rPr>
+        <w:t xml:space="preserve"> </w:t>
+      </w:r>
+      <w:r>
+        <w:rPr>
+          <w:rFonts w:ascii="Times New Roman" w:hAnsi="Times New Roman" w:cs="Times New Roman"/>
+          <w:w w:val="101"/>
+        </w:rPr>
+        <w:t>secrecy</w:t>
+      </w:r>
+      <w:r>
+        <w:rPr>
+          <w:rFonts w:ascii="Times New Roman" w:hAnsi="Times New Roman" w:cs="Times New Roman"/>
+          <w:spacing w:val="-3"/>
+          <w:w w:val="101"/>
+        </w:rPr>
+        <w:t xml:space="preserve"> </w:t>
+      </w:r>
+      <w:r>
+        <w:rPr>
+          <w:rFonts w:ascii="Times New Roman" w:hAnsi="Times New Roman" w:cs="Times New Roman"/>
+          <w:w w:val="101"/>
+        </w:rPr>
+        <w:t>of</w:t>
+      </w:r>
+      <w:r>
+        <w:rPr>
+          <w:rFonts w:ascii="Times New Roman" w:hAnsi="Times New Roman" w:cs="Times New Roman"/>
+          <w:spacing w:val="-5"/>
+          <w:w w:val="101"/>
+        </w:rPr>
+        <w:t xml:space="preserve"> </w:t>
+      </w:r>
+      <w:r>
+        <w:rPr>
+          <w:rFonts w:ascii="Times New Roman" w:hAnsi="Times New Roman" w:cs="Times New Roman"/>
+          <w:w w:val="101"/>
+        </w:rPr>
+        <w:t>insight</w:t>
+      </w:r>
+      <w:r>
+        <w:rPr>
+          <w:rFonts w:ascii="Times New Roman" w:hAnsi="Times New Roman" w:cs="Times New Roman"/>
+          <w:spacing w:val="-2"/>
+          <w:w w:val="101"/>
+        </w:rPr>
+        <w:t xml:space="preserve"> </w:t>
+      </w:r>
+      <w:r>
+        <w:rPr>
+          <w:rFonts w:ascii="Times New Roman" w:hAnsi="Times New Roman" w:cs="Times New Roman"/>
+          <w:w w:val="101"/>
+        </w:rPr>
+        <w:t>into</w:t>
+      </w:r>
+      <w:r>
+        <w:rPr>
+          <w:rFonts w:ascii="Times New Roman" w:hAnsi="Times New Roman" w:cs="Times New Roman"/>
+          <w:spacing w:val="-5"/>
+          <w:w w:val="101"/>
+        </w:rPr>
+        <w:t xml:space="preserve"> </w:t>
+      </w:r>
+      <w:r>
+        <w:rPr>
+          <w:rFonts w:ascii="Times New Roman" w:hAnsi="Times New Roman" w:cs="Times New Roman"/>
+          <w:w w:val="101"/>
+        </w:rPr>
+        <w:t>your</w:t>
+      </w:r>
+      <w:r>
+        <w:rPr>
+          <w:rFonts w:ascii="Times New Roman" w:hAnsi="Times New Roman" w:cs="Times New Roman"/>
+          <w:spacing w:val="-5"/>
+          <w:w w:val="101"/>
+        </w:rPr>
+        <w:t xml:space="preserve"> </w:t>
+      </w:r>
+      <w:r>
+        <w:rPr>
+          <w:rFonts w:ascii="Times New Roman" w:hAnsi="Times New Roman" w:cs="Times New Roman"/>
+          <w:w w:val="101"/>
+        </w:rPr>
+        <w:t>Organization</w:t>
+      </w:r>
     </w:p>
     <w:p>
       <w:pPr>
         <w:spacing w:before="300" w:after="150"/>
         <w:rPr>
           <w:rFonts w:ascii="Times New Roman" w:hAnsi="Times New Roman" w:cs="Times New Roman"/>
-          <w:w w:val="101"/>
-        </w:rPr>
-      </w:pPr>
-      <w:r>
-        <w:rPr>
-          <w:rFonts w:ascii="Times New Roman" w:hAnsi="Times New Roman" w:cs="Times New Roman"/>
-          <w:w w:val="101"/>
-        </w:rPr>
-        <w:t>We</w:t>
-      </w:r>
-      <w:r>
-        <w:rPr>
-          <w:rFonts w:ascii="Times New Roman" w:hAnsi="Times New Roman" w:cs="Times New Roman"/>
-          <w:spacing w:val="-5"/>
-          <w:w w:val="101"/>
-        </w:rPr>
-        <w:t xml:space="preserve"> </w:t>
-      </w:r>
-      <w:r>
-        <w:rPr>
-          <w:rFonts w:ascii="Times New Roman" w:hAnsi="Times New Roman" w:cs="Times New Roman"/>
-          <w:w w:val="101"/>
-        </w:rPr>
-        <w:t>agree</w:t>
-      </w:r>
-      <w:r>
-        <w:rPr>
-          <w:rFonts w:ascii="Times New Roman" w:hAnsi="Times New Roman" w:cs="Times New Roman"/>
-          <w:spacing w:val="-6"/>
-          <w:w w:val="101"/>
-        </w:rPr>
-        <w:t xml:space="preserve"> </w:t>
-      </w:r>
-      <w:r>
-        <w:rPr>
-          <w:rFonts w:ascii="Times New Roman" w:hAnsi="Times New Roman" w:cs="Times New Roman"/>
-          <w:w w:val="101"/>
-        </w:rPr>
-        <w:t>to</w:t>
-      </w:r>
-      <w:r>
-        <w:rPr>
-          <w:rFonts w:ascii="Times New Roman" w:hAnsi="Times New Roman" w:cs="Times New Roman"/>
-          <w:spacing w:val="-2"/>
-          <w:w w:val="101"/>
-        </w:rPr>
-        <w:t xml:space="preserve"> </w:t>
-      </w:r>
-      <w:r>
-        <w:rPr>
-          <w:rFonts w:ascii="Times New Roman" w:hAnsi="Times New Roman" w:cs="Times New Roman"/>
-          <w:w w:val="101"/>
-        </w:rPr>
-        <w:t>maintain</w:t>
-      </w:r>
-      <w:r>
-        <w:rPr>
-          <w:rFonts w:ascii="Times New Roman" w:hAnsi="Times New Roman" w:cs="Times New Roman"/>
-          <w:spacing w:val="-5"/>
-          <w:w w:val="101"/>
-        </w:rPr>
-        <w:t xml:space="preserve"> </w:t>
-      </w:r>
-      <w:r>
-        <w:rPr>
-          <w:rFonts w:ascii="Times New Roman" w:hAnsi="Times New Roman" w:cs="Times New Roman"/>
-          <w:w w:val="101"/>
-        </w:rPr>
-        <w:t>the</w:t>
-      </w:r>
-      <w:r>
-        <w:rPr>
-          <w:rFonts w:ascii="Times New Roman" w:hAnsi="Times New Roman" w:cs="Times New Roman"/>
-          <w:spacing w:val="-5"/>
-          <w:w w:val="101"/>
-        </w:rPr>
-        <w:t xml:space="preserve"> </w:t>
-      </w:r>
-      <w:r>
-        <w:rPr>
-          <w:rFonts w:ascii="Times New Roman" w:hAnsi="Times New Roman" w:cs="Times New Roman"/>
-          <w:w w:val="101"/>
-        </w:rPr>
-        <w:t>secrecy</w:t>
-      </w:r>
-      <w:r>
-        <w:rPr>
-          <w:rFonts w:ascii="Times New Roman" w:hAnsi="Times New Roman" w:cs="Times New Roman"/>
-          <w:spacing w:val="-3"/>
-          <w:w w:val="101"/>
-        </w:rPr>
-        <w:t xml:space="preserve"> </w:t>
-      </w:r>
-      <w:r>
-        <w:rPr>
-          <w:rFonts w:ascii="Times New Roman" w:hAnsi="Times New Roman" w:cs="Times New Roman"/>
-          <w:w w:val="101"/>
-        </w:rPr>
-        <w:t>of</w:t>
-      </w:r>
-      <w:r>
-        <w:rPr>
-          <w:rFonts w:ascii="Times New Roman" w:hAnsi="Times New Roman" w:cs="Times New Roman"/>
-          <w:spacing w:val="-5"/>
-          <w:w w:val="101"/>
-        </w:rPr>
-        <w:t xml:space="preserve"> </w:t>
-      </w:r>
-      <w:r>
-        <w:rPr>
-          <w:rFonts w:ascii="Times New Roman" w:hAnsi="Times New Roman" w:cs="Times New Roman"/>
-          <w:w w:val="101"/>
-        </w:rPr>
-        <w:t>insight</w:t>
-      </w:r>
-      <w:r>
-        <w:rPr>
-          <w:rFonts w:ascii="Times New Roman" w:hAnsi="Times New Roman" w:cs="Times New Roman"/>
-          <w:spacing w:val="-2"/>
-          <w:w w:val="101"/>
-        </w:rPr>
-        <w:t xml:space="preserve"> </w:t>
-      </w:r>
-      <w:r>
-        <w:rPr>
-          <w:rFonts w:ascii="Times New Roman" w:hAnsi="Times New Roman" w:cs="Times New Roman"/>
-          <w:w w:val="101"/>
-        </w:rPr>
-        <w:t>into</w:t>
-      </w:r>
-      <w:r>
-        <w:rPr>
-          <w:rFonts w:ascii="Times New Roman" w:hAnsi="Times New Roman" w:cs="Times New Roman"/>
-          <w:spacing w:val="-5"/>
-          <w:w w:val="101"/>
-        </w:rPr>
-        <w:t xml:space="preserve"> </w:t>
-      </w:r>
-      <w:r>
-        <w:rPr>
-          <w:rFonts w:ascii="Times New Roman" w:hAnsi="Times New Roman" w:cs="Times New Roman"/>
-          <w:w w:val="101"/>
-        </w:rPr>
-        <w:t>your</w:t>
-      </w:r>
-      <w:r>
-        <w:rPr>
-          <w:rFonts w:ascii="Times New Roman" w:hAnsi="Times New Roman" w:cs="Times New Roman"/>
-          <w:spacing w:val="-5"/>
-          <w:w w:val="101"/>
-        </w:rPr>
-        <w:t xml:space="preserve"> </w:t>
-      </w:r>
-      <w:r>
-        <w:rPr>
-          <w:rFonts w:ascii="Times New Roman" w:hAnsi="Times New Roman" w:cs="Times New Roman"/>
-          <w:w w:val="101"/>
-        </w:rPr>
-        <w:t>Organization</w:t>
-      </w:r>
-    </w:p>
-    <w:p>
-      <w:pPr>
-        <w:spacing w:before="300" w:after="150"/>
-        <w:rPr>
-          <w:rFonts w:ascii="Times New Roman" w:hAnsi="Times New Roman" w:cs="Times New Roman"/>
-        </w:rPr>
-      </w:pPr>
-      <w:r>
-        <w:rPr>
-          <w:rFonts w:ascii="Times New Roman" w:hAnsi="Times New Roman" w:cs="Times New Roman"/>
-        </w:rPr>
+        </w:rPr>
+      </w:pPr>
+      <w:r>
+        <w:rPr>
+          <w:rFonts w:ascii="Times New Roman" w:hAnsi="Times New Roman" w:cs="Times New Roman"/>
+        </w:rPr>
+        <w:lastRenderedPageBreak/>
         <w:t>You</w:t>
       </w:r>
       <w:r>
@@ -5939,11 +5944,21 @@
           <w:color w:val="000000" w:themeColor="text1"/>
         </w:rPr>
       </w:pPr>
-      <w:r>
+    </w:p>
+    <w:p>
+      <w:pPr>
+        <w:spacing w:before="160" w:after="40"/>
         <w:rPr>
           <w:rFonts w:ascii="Times New Roman" w:hAnsi="Times New Roman" w:cs="Times New Roman"/>
           <w:color w:val="000000" w:themeColor="text1"/>
         </w:rPr>
+      </w:pPr>
+      <w:r>
+        <w:rPr>
+          <w:rFonts w:ascii="Times New Roman" w:hAnsi="Times New Roman" w:cs="Times New Roman"/>
+          <w:color w:val="000000" w:themeColor="text1"/>
+        </w:rPr>
+        <w:lastRenderedPageBreak/>
         <w:t>8. TDS</w:t>
       </w:r>
     </w:p>
@@ -6210,7 +6225,7 @@
       <w:headerReference w:type="first" r:id="rId12"/>
       <w:footerReference w:type="first" r:id="rId13"/>
       <w:pgSz w:w="12240" w:h="15840"/>
-      <w:pgMar w:top="1000" w:right="1100" w:bottom="1000" w:left="1100" w:header="680" w:footer="737" w:gutter="0"/>
+      <w:pgMar w:top="1000" w:right="1100" w:bottom="1000" w:left="1100" w:header="1020" w:footer="340" w:gutter="0"/>
       <w:cols w:space="720"/>
       <w:docGrid w:linePitch="360"/>
     </w:sectPr>
@@ -6300,9 +6315,10 @@
     <w:pPr>
       <w:jc w:val="center"/>
       <w:rPr>
-        <w:color w:val="5B6478"/>
-        <w:sz w:val="14"/>
-        <w:szCs w:val="14"/>
+        <w:rFonts w:ascii="Times New Roman" w:hAnsi="Times New Roman" w:cs="Times New Roman"/>
+        <w:color w:val="000000" w:themeColor="text1"/>
+        <w:sz w:val="18"/>
+        <w:szCs w:val="18"/>
       </w:rPr>
     </w:pPr>
     <w:r>
@@ -6314,6 +6330,27 @@
       </w:rPr>
       <w:t>WindMill Village, Bavdhan, Pune 411021, Maharashtra</w:t>
     </w:r>
+  </w:p>
+  <w:p>
+    <w:pPr>
+      <w:jc w:val="center"/>
+      <w:rPr>
+        <w:rFonts w:ascii="Times New Roman" w:hAnsi="Times New Roman" w:cs="Times New Roman"/>
+        <w:color w:val="000000" w:themeColor="text1"/>
+        <w:sz w:val="18"/>
+        <w:szCs w:val="18"/>
+      </w:rPr>
+    </w:pPr>
+  </w:p>
+  <w:p>
+    <w:pPr>
+      <w:jc w:val="center"/>
+      <w:rPr>
+        <w:color w:val="5B6478"/>
+        <w:sz w:val="14"/>
+        <w:szCs w:val="14"/>
+      </w:rPr>
+    </w:pPr>
     <w:r>
       <w:rPr>
         <w:noProof/>
@@ -6322,7 +6359,7 @@
         <wp:inline distT="0" distB="0" distL="0" distR="0" wp14:anchorId="0C7DB755" wp14:editId="4C568021">
           <wp:extent cx="6375400" cy="47625"/>
           <wp:effectExtent l="0" t="0" r="6350" b="9525"/>
-          <wp:docPr id="1" name="Footer Line"/>
+          <wp:docPr id="1622519558" name="Footer Line"/>
           <wp:cNvGraphicFramePr>
             <a:graphicFrameLocks xmlns:a="http://schemas.openxmlformats.org/drawingml/2006/main" noChangeAspect="1"/>
           </wp:cNvGraphicFramePr>
@@ -6537,7 +6574,7 @@
           <wp:extent cx="2912249" cy="3307021"/>
           <wp:effectExtent l="0" t="0" r="0" b="0"/>
           <wp:wrapNone/>
-          <wp:docPr id="592" name="Picture 1"/>
+          <wp:docPr id="1233503933" name="Picture 1"/>
           <wp:cNvGraphicFramePr/>
           <a:graphic xmlns:a="http://schemas.openxmlformats.org/drawingml/2006/main">
             <a:graphicData uri="http://schemas.openxmlformats.org/drawingml/2006/picture">
@@ -6583,7 +6620,7 @@
           <wp:extent cx="1475232" cy="438912"/>
           <wp:effectExtent l="0" t="0" r="0" b="0"/>
           <wp:wrapSquare wrapText="bothSides"/>
-          <wp:docPr id="1637576006" name="Picture 1637576006"/>
+          <wp:docPr id="520551588" name="Picture 520551588"/>
           <wp:cNvGraphicFramePr/>
           <a:graphic xmlns:a="http://schemas.openxmlformats.org/drawingml/2006/main">
             <a:graphicData uri="http://schemas.openxmlformats.org/drawingml/2006/picture">
@@ -6628,14 +6665,6 @@
         <w:color w:val="65AADB"/>
       </w:rPr>
       <w:t xml:space="preserve">           </w:t>
-    </w:r>
-    <w:r>
-      <w:rPr>
-        <w:b/>
-        <w:bCs/>
-        <w:color w:val="65AADB"/>
-      </w:rPr>
-      <w:t xml:space="preserve">    </w:t>
     </w:r>
     <w:r>
       <w:rPr>

</xml_diff>

<commit_message>
updates in Time Estimate (Gantt) chart updates to store and show module wise
</commit_message>
<xml_diff>
--- a/QuotationApp.API/Templates/QuotationTemplate_Updated.docx
+++ b/QuotationApp.API/Templates/QuotationTemplate_Updated.docx
@@ -90,7 +90,18 @@
                 <w:szCs w:val="18"/>
                 <w:lang w:val="en-US"/>
               </w:rPr>
-              <w:t xml:space="preserve">Quotation No: </w:t>
+              <w:t xml:space="preserve">Quotation </w:t>
+            </w:r>
+            <w:proofErr w:type="gramStart"/>
+            <w:r>
+              <w:rPr>
+                <w:rFonts w:ascii="Times New Roman" w:hAnsi="Times New Roman" w:cs="Times New Roman"/>
+                <w:color w:val="000000" w:themeColor="text1"/>
+                <w:sz w:val="18"/>
+                <w:szCs w:val="18"/>
+                <w:lang w:val="en-US"/>
+              </w:rPr>
+              <w:t xml:space="preserve">No: </w:t>
             </w:r>
             <w:r>
               <w:rPr>
@@ -99,7 +110,17 @@
                 <w:sz w:val="18"/>
                 <w:szCs w:val="18"/>
               </w:rPr>
-              <w:t>{{QuotationNo}}</w:t>
+              <w:t>{{</w:t>
+            </w:r>
+            <w:proofErr w:type="gramEnd"/>
+            <w:r>
+              <w:rPr>
+                <w:rFonts w:ascii="Times New Roman" w:hAnsi="Times New Roman" w:cs="Times New Roman"/>
+                <w:color w:val="65AADB"/>
+                <w:sz w:val="18"/>
+                <w:szCs w:val="18"/>
+              </w:rPr>
+              <w:t>QuotationNo}}</w:t>
             </w:r>
           </w:p>
         </w:tc>
@@ -144,6 +165,7 @@
             <w:pPr>
               <w:spacing w:line="360" w:lineRule="auto"/>
             </w:pPr>
+            <w:proofErr w:type="gramStart"/>
             <w:r>
               <w:rPr>
                 <w:rFonts w:ascii="Times New Roman" w:hAnsi="Times New Roman" w:cs="Times New Roman"/>
@@ -161,7 +183,17 @@
                 <w:sz w:val="18"/>
                 <w:szCs w:val="18"/>
               </w:rPr>
-              <w:t>{{Date}}</w:t>
+              <w:t>{{</w:t>
+            </w:r>
+            <w:proofErr w:type="gramEnd"/>
+            <w:r>
+              <w:rPr>
+                <w:rFonts w:ascii="Times New Roman" w:hAnsi="Times New Roman" w:cs="Times New Roman"/>
+                <w:color w:val="65AADB"/>
+                <w:sz w:val="18"/>
+                <w:szCs w:val="18"/>
+              </w:rPr>
+              <w:t>Date}}</w:t>
             </w:r>
           </w:p>
         </w:tc>
@@ -200,7 +232,17 @@
                 <w:sz w:val="18"/>
                 <w:szCs w:val="18"/>
               </w:rPr>
-              <w:t xml:space="preserve">{{CONTACT_PHONE}}  </w:t>
+              <w:t>{{CONTACT_PHONE</w:t>
+            </w:r>
+            <w:proofErr w:type="gramStart"/>
+            <w:r>
+              <w:rPr>
+                <w:rFonts w:ascii="Times New Roman" w:hAnsi="Times New Roman" w:cs="Times New Roman"/>
+                <w:color w:val="65AADB"/>
+                <w:sz w:val="18"/>
+                <w:szCs w:val="18"/>
+              </w:rPr>
+              <w:t xml:space="preserve">}}  </w:t>
             </w:r>
             <w:r>
               <w:rPr>
@@ -209,7 +251,17 @@
                 <w:sz w:val="18"/>
                 <w:szCs w:val="18"/>
               </w:rPr>
-              <w:t xml:space="preserve">|   Email: </w:t>
+              <w:t>|</w:t>
+            </w:r>
+            <w:proofErr w:type="gramEnd"/>
+            <w:r>
+              <w:rPr>
+                <w:rFonts w:ascii="Times New Roman" w:hAnsi="Times New Roman" w:cs="Times New Roman"/>
+                <w:color w:val="000000" w:themeColor="text1"/>
+                <w:sz w:val="18"/>
+                <w:szCs w:val="18"/>
+              </w:rPr>
+              <w:t xml:space="preserve">   Email: </w:t>
             </w:r>
             <w:r>
               <w:rPr>
@@ -404,15 +456,26 @@
           <w:bCs/>
           <w:color w:val="65AADB"/>
         </w:rPr>
-        <w:t>{{ORG_NAME}}</w:t>
-      </w:r>
-      <w:r>
-        <w:rPr>
-          <w:rFonts w:ascii="Times New Roman" w:hAnsi="Times New Roman" w:cs="Times New Roman"/>
+        <w:t>{{ORG_</w:t>
+      </w:r>
+      <w:proofErr w:type="gramStart"/>
+      <w:r>
+        <w:rPr>
+          <w:rFonts w:ascii="Times New Roman" w:hAnsi="Times New Roman" w:cs="Times New Roman"/>
+          <w:b/>
+          <w:bCs/>
           <w:color w:val="65AADB"/>
         </w:rPr>
+        <w:t>NAME}}</w:t>
+      </w:r>
+      <w:r>
+        <w:rPr>
+          <w:rFonts w:ascii="Times New Roman" w:hAnsi="Times New Roman" w:cs="Times New Roman"/>
+          <w:color w:val="65AADB"/>
+        </w:rPr>
         <w:t>.</w:t>
       </w:r>
+      <w:proofErr w:type="gramEnd"/>
     </w:p>
     <w:p>
       <w:pPr>
@@ -732,16 +795,9 @@
         <w:spacing w:line="240" w:lineRule="auto"/>
         <w:rPr>
           <w:rFonts w:ascii="Times New Roman" w:hAnsi="Times New Roman" w:cs="Times New Roman"/>
-          <w:noProof/>
-        </w:rPr>
-      </w:pPr>
-    </w:p>
-    <w:p>
-      <w:pPr>
-        <w:spacing w:line="240" w:lineRule="auto"/>
-        <w:rPr>
-          <w:rFonts w:ascii="Times New Roman" w:hAnsi="Times New Roman" w:cs="Times New Roman"/>
-          <w:noProof/>
+          <w:b/>
+          <w:bCs/>
+          <w:lang w:val="en-US"/>
         </w:rPr>
       </w:pPr>
     </w:p>
@@ -5435,6 +5491,7 @@
         </w:rPr>
         <w:t xml:space="preserve"> </w:t>
       </w:r>
+      <w:proofErr w:type="gramStart"/>
       <w:r>
         <w:rPr>
           <w:rFonts w:ascii="Times New Roman" w:hAnsi="Times New Roman" w:cs="Times New Roman"/>
@@ -5442,6 +5499,7 @@
         </w:rPr>
         <w:t>Organization</w:t>
       </w:r>
+      <w:proofErr w:type="gramEnd"/>
     </w:p>
     <w:p>
       <w:pPr>
@@ -5935,6 +5993,13 @@
           <w:color w:val="000000" w:themeColor="text1"/>
         </w:rPr>
       </w:pPr>
+      <w:r>
+        <w:rPr>
+          <w:rFonts w:ascii="Times New Roman" w:hAnsi="Times New Roman" w:cs="Times New Roman"/>
+          <w:color w:val="000000" w:themeColor="text1"/>
+        </w:rPr>
+        <w:t>8. TDS</w:t>
+      </w:r>
     </w:p>
     <w:p>
       <w:pPr>
@@ -5944,36 +6009,40 @@
           <w:color w:val="000000" w:themeColor="text1"/>
         </w:rPr>
       </w:pPr>
-    </w:p>
-    <w:p>
-      <w:pPr>
-        <w:spacing w:before="160" w:after="40"/>
-        <w:rPr>
-          <w:rFonts w:ascii="Times New Roman" w:hAnsi="Times New Roman" w:cs="Times New Roman"/>
-          <w:color w:val="000000" w:themeColor="text1"/>
-        </w:rPr>
-      </w:pPr>
-      <w:r>
-        <w:rPr>
-          <w:rFonts w:ascii="Times New Roman" w:hAnsi="Times New Roman" w:cs="Times New Roman"/>
-          <w:color w:val="000000" w:themeColor="text1"/>
+      <w:r>
+        <w:rPr>
+          <w:rFonts w:ascii="Times New Roman" w:hAnsi="Times New Roman" w:cs="Times New Roman"/>
         </w:rPr>
         <w:lastRenderedPageBreak/>
-        <w:t>8. TDS</w:t>
-      </w:r>
-    </w:p>
-    <w:p>
-      <w:pPr>
-        <w:spacing w:before="160" w:after="40"/>
-        <w:rPr>
-          <w:rFonts w:ascii="Times New Roman" w:hAnsi="Times New Roman" w:cs="Times New Roman"/>
-        </w:rPr>
-      </w:pPr>
-      <w:r>
-        <w:rPr>
-          <w:rFonts w:ascii="Times New Roman" w:hAnsi="Times New Roman" w:cs="Times New Roman"/>
-        </w:rPr>
-        <w:t xml:space="preserve">In case of deduction of TDS Amount, You have to give us the TDS certificate immediately along with our Payment. If we do not receive the TDS Certificate within 6 months or by the end of the Financial Year, you </w:t>
+        <w:t xml:space="preserve">In case of deduction of TDS Amount, </w:t>
+      </w:r>
+      <w:proofErr w:type="gramStart"/>
+      <w:r>
+        <w:rPr>
+          <w:rFonts w:ascii="Times New Roman" w:hAnsi="Times New Roman" w:cs="Times New Roman"/>
+        </w:rPr>
+        <w:t>You</w:t>
+      </w:r>
+      <w:proofErr w:type="gramEnd"/>
+      <w:r>
+        <w:rPr>
+          <w:rFonts w:ascii="Times New Roman" w:hAnsi="Times New Roman" w:cs="Times New Roman"/>
+        </w:rPr>
+        <w:t xml:space="preserve"> </w:t>
+      </w:r>
+      <w:proofErr w:type="gramStart"/>
+      <w:r>
+        <w:rPr>
+          <w:rFonts w:ascii="Times New Roman" w:hAnsi="Times New Roman" w:cs="Times New Roman"/>
+        </w:rPr>
+        <w:t>have to</w:t>
+      </w:r>
+      <w:proofErr w:type="gramEnd"/>
+      <w:r>
+        <w:rPr>
+          <w:rFonts w:ascii="Times New Roman" w:hAnsi="Times New Roman" w:cs="Times New Roman"/>
+        </w:rPr>
+        <w:t xml:space="preserve"> give us the TDS certificate immediately along with our Payment. If we do not receive the TDS Certificate within 6 months or by the end of the Financial Year, you </w:t>
       </w:r>
     </w:p>
     <w:p>

</xml_diff>

<commit_message>
updates in Price for Implementation of cqual - table for showing the sr no correction module wise of 1.
</commit_message>
<xml_diff>
--- a/QuotationApp.API/Templates/QuotationTemplate_Updated.docx
+++ b/QuotationApp.API/Templates/QuotationTemplate_Updated.docx
@@ -93,18 +93,7 @@
                 <w:szCs w:val="18"/>
                 <w:lang w:val="en-US"/>
               </w:rPr>
-              <w:t xml:space="preserve">Quotation </w:t>
-            </w:r>
-            <w:proofErr w:type="gramStart"/>
-            <w:r>
-              <w:rPr>
-                <w:rFonts w:ascii="Times New Roman" w:hAnsi="Times New Roman" w:cs="Times New Roman"/>
-                <w:color w:val="000000" w:themeColor="text1"/>
-                <w:sz w:val="18"/>
-                <w:szCs w:val="18"/>
-                <w:lang w:val="en-US"/>
-              </w:rPr>
-              <w:t xml:space="preserve">No: </w:t>
+              <w:t xml:space="preserve">Quotation No: </w:t>
             </w:r>
             <w:r>
               <w:rPr>
@@ -113,17 +102,7 @@
                 <w:sz w:val="18"/>
                 <w:szCs w:val="18"/>
               </w:rPr>
-              <w:t>{{</w:t>
-            </w:r>
-            <w:proofErr w:type="gramEnd"/>
-            <w:r>
-              <w:rPr>
-                <w:rFonts w:ascii="Times New Roman" w:hAnsi="Times New Roman" w:cs="Times New Roman"/>
-                <w:color w:val="65AADB"/>
-                <w:sz w:val="18"/>
-                <w:szCs w:val="18"/>
-              </w:rPr>
-              <w:t>QuotationNo}}</w:t>
+              <w:t>{{QuotationNo}}</w:t>
             </w:r>
           </w:p>
         </w:tc>
@@ -170,7 +149,6 @@
               <w:spacing w:line="360" w:lineRule="auto"/>
               <w:jc w:val="both"/>
             </w:pPr>
-            <w:proofErr w:type="gramStart"/>
             <w:r>
               <w:rPr>
                 <w:rFonts w:ascii="Times New Roman" w:hAnsi="Times New Roman" w:cs="Times New Roman"/>
@@ -188,17 +166,7 @@
                 <w:sz w:val="18"/>
                 <w:szCs w:val="18"/>
               </w:rPr>
-              <w:t>{{</w:t>
-            </w:r>
-            <w:proofErr w:type="gramEnd"/>
-            <w:r>
-              <w:rPr>
-                <w:rFonts w:ascii="Times New Roman" w:hAnsi="Times New Roman" w:cs="Times New Roman"/>
-                <w:color w:val="65AADB"/>
-                <w:sz w:val="18"/>
-                <w:szCs w:val="18"/>
-              </w:rPr>
-              <w:t>Date}}</w:t>
+              <w:t>{{Date}}</w:t>
             </w:r>
           </w:p>
         </w:tc>
@@ -457,26 +425,15 @@
           <w:bCs/>
           <w:color w:val="65AADB"/>
         </w:rPr>
-        <w:t>{{ORG_</w:t>
-      </w:r>
-      <w:proofErr w:type="gramStart"/>
-      <w:r>
-        <w:rPr>
-          <w:rFonts w:ascii="Times New Roman" w:hAnsi="Times New Roman" w:cs="Times New Roman"/>
-          <w:b/>
-          <w:bCs/>
+        <w:t>{{ORG_NAME}}</w:t>
+      </w:r>
+      <w:r>
+        <w:rPr>
+          <w:rFonts w:ascii="Times New Roman" w:hAnsi="Times New Roman" w:cs="Times New Roman"/>
           <w:color w:val="65AADB"/>
         </w:rPr>
-        <w:t>NAME}}</w:t>
-      </w:r>
-      <w:r>
-        <w:rPr>
-          <w:rFonts w:ascii="Times New Roman" w:hAnsi="Times New Roman" w:cs="Times New Roman"/>
-          <w:color w:val="65AADB"/>
-        </w:rPr>
         <w:t>.</w:t>
       </w:r>
-      <w:proofErr w:type="gramEnd"/>
     </w:p>
     <w:p>
       <w:pPr>
@@ -1832,12 +1789,6 @@
                 <w:rFonts w:ascii="Times New Roman" w:hAnsi="Times New Roman" w:cs="Times New Roman"/>
               </w:rPr>
             </w:pPr>
-            <w:r>
-              <w:rPr>
-                <w:rFonts w:ascii="Times New Roman" w:hAnsi="Times New Roman" w:cs="Times New Roman"/>
-              </w:rPr>
-              <w:t xml:space="preserve"> 1.1</w:t>
-            </w:r>
           </w:p>
         </w:tc>
         <w:tc>
@@ -6149,21 +6100,7 @@
         <w:rPr>
           <w:rFonts w:ascii="Times New Roman" w:hAnsi="Times New Roman" w:cs="Times New Roman"/>
         </w:rPr>
-        <w:t xml:space="preserve">In case of deduction of TDS Amount, </w:t>
-      </w:r>
-      <w:proofErr w:type="gramStart"/>
-      <w:r>
-        <w:rPr>
-          <w:rFonts w:ascii="Times New Roman" w:hAnsi="Times New Roman" w:cs="Times New Roman"/>
-        </w:rPr>
-        <w:t>You</w:t>
-      </w:r>
-      <w:proofErr w:type="gramEnd"/>
-      <w:r>
-        <w:rPr>
-          <w:rFonts w:ascii="Times New Roman" w:hAnsi="Times New Roman" w:cs="Times New Roman"/>
-        </w:rPr>
-        <w:t xml:space="preserve"> </w:t>
+        <w:t xml:space="preserve">In case of deduction of TDS Amount, You </w:t>
       </w:r>
       <w:r>
         <w:rPr>

</xml_diff>

<commit_message>
updates in new dashboard pages
</commit_message>
<xml_diff>
--- a/QuotationApp.API/Templates/QuotationTemplate_Updated.docx
+++ b/QuotationApp.API/Templates/QuotationTemplate_Updated.docx
@@ -8,6 +8,8 @@
         <w:jc w:val="both"/>
         <w:rPr>
           <w:rFonts w:ascii="Times New Roman" w:hAnsi="Times New Roman" w:cs="Times New Roman"/>
+          <w:b/>
+          <w:bCs/>
           <w:color w:val="000000" w:themeColor="text1"/>
           <w:sz w:val="22"/>
           <w:szCs w:val="22"/>
@@ -16,6 +18,8 @@
       <w:r>
         <w:rPr>
           <w:rFonts w:ascii="Times New Roman" w:hAnsi="Times New Roman" w:cs="Times New Roman"/>
+          <w:b/>
+          <w:bCs/>
           <w:color w:val="000000" w:themeColor="text1"/>
           <w:sz w:val="22"/>
           <w:szCs w:val="22"/>
@@ -25,6 +29,8 @@
       <w:r>
         <w:rPr>
           <w:rFonts w:ascii="Times New Roman" w:hAnsi="Times New Roman" w:cs="Times New Roman"/>
+          <w:b/>
+          <w:bCs/>
           <w:color w:val="000000" w:themeColor="text1"/>
           <w:sz w:val="22"/>
           <w:szCs w:val="22"/>
@@ -40,8 +46,8 @@
         <w:tblLook w:val="04A0" w:firstRow="1" w:lastRow="0" w:firstColumn="1" w:lastColumn="0" w:noHBand="0" w:noVBand="1"/>
       </w:tblPr>
       <w:tblGrid>
-        <w:gridCol w:w="7019"/>
-        <w:gridCol w:w="3135"/>
+        <w:gridCol w:w="6374"/>
+        <w:gridCol w:w="3780"/>
       </w:tblGrid>
       <w:tr>
         <w:trPr>
@@ -49,16 +55,22 @@
         </w:trPr>
         <w:tc>
           <w:tcPr>
-            <w:tcW w:w="7019" w:type="dxa"/>
+            <w:tcW w:w="6374" w:type="dxa"/>
           </w:tcPr>
           <w:p>
             <w:pPr>
               <w:spacing w:line="360" w:lineRule="auto"/>
               <w:jc w:val="both"/>
-            </w:pPr>
-            <w:r>
-              <w:rPr>
-                <w:rFonts w:ascii="Times New Roman" w:hAnsi="Times New Roman" w:cs="Times New Roman"/>
+              <w:rPr>
+                <w:b/>
+                <w:bCs/>
+              </w:rPr>
+            </w:pPr>
+            <w:r>
+              <w:rPr>
+                <w:rFonts w:ascii="Times New Roman" w:hAnsi="Times New Roman" w:cs="Times New Roman"/>
+                <w:b/>
+                <w:bCs/>
                 <w:color w:val="000000" w:themeColor="text1"/>
                 <w:sz w:val="18"/>
                 <w:szCs w:val="18"/>
@@ -68,6 +80,8 @@
             <w:r>
               <w:rPr>
                 <w:rFonts w:ascii="Times New Roman" w:hAnsi="Times New Roman" w:cs="Times New Roman"/>
+                <w:b/>
+                <w:bCs/>
                 <w:color w:val="65AADB"/>
                 <w:sz w:val="18"/>
                 <w:szCs w:val="18"/>
@@ -78,16 +92,22 @@
         </w:tc>
         <w:tc>
           <w:tcPr>
-            <w:tcW w:w="3135" w:type="dxa"/>
+            <w:tcW w:w="3780" w:type="dxa"/>
           </w:tcPr>
           <w:p>
             <w:pPr>
               <w:spacing w:line="360" w:lineRule="auto"/>
               <w:jc w:val="both"/>
-            </w:pPr>
-            <w:r>
-              <w:rPr>
-                <w:rFonts w:ascii="Times New Roman" w:hAnsi="Times New Roman" w:cs="Times New Roman"/>
+              <w:rPr>
+                <w:b/>
+                <w:bCs/>
+              </w:rPr>
+            </w:pPr>
+            <w:r>
+              <w:rPr>
+                <w:rFonts w:ascii="Times New Roman" w:hAnsi="Times New Roman" w:cs="Times New Roman"/>
+                <w:b/>
+                <w:bCs/>
                 <w:color w:val="000000" w:themeColor="text1"/>
                 <w:sz w:val="18"/>
                 <w:szCs w:val="18"/>
@@ -98,6 +118,8 @@
             <w:r>
               <w:rPr>
                 <w:rFonts w:ascii="Times New Roman" w:hAnsi="Times New Roman" w:cs="Times New Roman"/>
+                <w:b/>
+                <w:bCs/>
                 <w:color w:val="65AADB"/>
                 <w:sz w:val="18"/>
                 <w:szCs w:val="18"/>
@@ -113,16 +135,22 @@
         </w:trPr>
         <w:tc>
           <w:tcPr>
-            <w:tcW w:w="7019" w:type="dxa"/>
+            <w:tcW w:w="6374" w:type="dxa"/>
           </w:tcPr>
           <w:p>
             <w:pPr>
               <w:spacing w:line="360" w:lineRule="auto"/>
               <w:jc w:val="both"/>
-            </w:pPr>
-            <w:r>
-              <w:rPr>
-                <w:rFonts w:ascii="Times New Roman" w:hAnsi="Times New Roman" w:cs="Times New Roman"/>
+              <w:rPr>
+                <w:b/>
+                <w:bCs/>
+              </w:rPr>
+            </w:pPr>
+            <w:r>
+              <w:rPr>
+                <w:rFonts w:ascii="Times New Roman" w:hAnsi="Times New Roman" w:cs="Times New Roman"/>
+                <w:b/>
+                <w:bCs/>
                 <w:color w:val="000000" w:themeColor="text1"/>
                 <w:sz w:val="18"/>
                 <w:szCs w:val="18"/>
@@ -132,6 +160,8 @@
             <w:r>
               <w:rPr>
                 <w:rFonts w:ascii="Times New Roman" w:hAnsi="Times New Roman" w:cs="Times New Roman"/>
+                <w:b/>
+                <w:bCs/>
                 <w:color w:val="65AADB"/>
                 <w:sz w:val="18"/>
                 <w:szCs w:val="18"/>
@@ -142,16 +172,22 @@
         </w:tc>
         <w:tc>
           <w:tcPr>
-            <w:tcW w:w="3135" w:type="dxa"/>
+            <w:tcW w:w="3780" w:type="dxa"/>
           </w:tcPr>
           <w:p>
             <w:pPr>
               <w:spacing w:line="360" w:lineRule="auto"/>
               <w:jc w:val="both"/>
-            </w:pPr>
-            <w:r>
-              <w:rPr>
-                <w:rFonts w:ascii="Times New Roman" w:hAnsi="Times New Roman" w:cs="Times New Roman"/>
+              <w:rPr>
+                <w:b/>
+                <w:bCs/>
+              </w:rPr>
+            </w:pPr>
+            <w:r>
+              <w:rPr>
+                <w:rFonts w:ascii="Times New Roman" w:hAnsi="Times New Roman" w:cs="Times New Roman"/>
+                <w:b/>
+                <w:bCs/>
                 <w:color w:val="000000" w:themeColor="text1"/>
                 <w:sz w:val="18"/>
                 <w:szCs w:val="18"/>
@@ -162,6 +198,8 @@
             <w:r>
               <w:rPr>
                 <w:rFonts w:ascii="Times New Roman" w:hAnsi="Times New Roman" w:cs="Times New Roman"/>
+                <w:b/>
+                <w:bCs/>
                 <w:color w:val="65AADB"/>
                 <w:sz w:val="18"/>
                 <w:szCs w:val="18"/>
@@ -177,7 +215,7 @@
         </w:trPr>
         <w:tc>
           <w:tcPr>
-            <w:tcW w:w="7019" w:type="dxa"/>
+            <w:tcW w:w="6374" w:type="dxa"/>
           </w:tcPr>
           <w:p>
             <w:pPr>
@@ -185,6 +223,8 @@
               <w:jc w:val="both"/>
               <w:rPr>
                 <w:rFonts w:ascii="Times New Roman" w:hAnsi="Times New Roman" w:cs="Times New Roman"/>
+                <w:b/>
+                <w:bCs/>
                 <w:color w:val="000000" w:themeColor="text1"/>
                 <w:sz w:val="18"/>
                 <w:szCs w:val="18"/>
@@ -193,6 +233,8 @@
             <w:r>
               <w:rPr>
                 <w:rFonts w:ascii="Times New Roman" w:hAnsi="Times New Roman" w:cs="Times New Roman"/>
+                <w:b/>
+                <w:bCs/>
                 <w:color w:val="000000" w:themeColor="text1"/>
                 <w:sz w:val="18"/>
                 <w:szCs w:val="18"/>
@@ -202,6 +244,8 @@
             <w:r>
               <w:rPr>
                 <w:rFonts w:ascii="Times New Roman" w:hAnsi="Times New Roman" w:cs="Times New Roman"/>
+                <w:b/>
+                <w:bCs/>
                 <w:color w:val="65AADB"/>
                 <w:sz w:val="18"/>
                 <w:szCs w:val="18"/>
@@ -211,6 +255,8 @@
             <w:r>
               <w:rPr>
                 <w:rFonts w:ascii="Times New Roman" w:hAnsi="Times New Roman" w:cs="Times New Roman"/>
+                <w:b/>
+                <w:bCs/>
                 <w:color w:val="65AADB"/>
                 <w:sz w:val="18"/>
                 <w:szCs w:val="18"/>
@@ -220,6 +266,8 @@
             <w:r>
               <w:rPr>
                 <w:rFonts w:ascii="Times New Roman" w:hAnsi="Times New Roman" w:cs="Times New Roman"/>
+                <w:b/>
+                <w:bCs/>
                 <w:color w:val="000000" w:themeColor="text1"/>
                 <w:sz w:val="18"/>
                 <w:szCs w:val="18"/>
@@ -229,6 +277,8 @@
             <w:r>
               <w:rPr>
                 <w:rFonts w:ascii="Times New Roman" w:hAnsi="Times New Roman" w:cs="Times New Roman"/>
+                <w:b/>
+                <w:bCs/>
                 <w:color w:val="65AADB"/>
                 <w:sz w:val="18"/>
                 <w:szCs w:val="18"/>
@@ -239,7 +289,7 @@
         </w:tc>
         <w:tc>
           <w:tcPr>
-            <w:tcW w:w="3135" w:type="dxa"/>
+            <w:tcW w:w="3780" w:type="dxa"/>
           </w:tcPr>
           <w:p>
             <w:pPr>
@@ -275,17 +325,19 @@
       <w:r>
         <w:rPr>
           <w:rFonts w:ascii="Times New Roman" w:hAnsi="Times New Roman" w:cs="Times New Roman"/>
-          <w:color w:val="000000" w:themeColor="text1"/>
-        </w:rPr>
-        <w:t>Reference:</w:t>
-      </w:r>
-      <w:r>
-        <w:rPr>
-          <w:rFonts w:ascii="Times New Roman" w:hAnsi="Times New Roman" w:cs="Times New Roman"/>
           <w:b/>
           <w:bCs/>
           <w:color w:val="000000" w:themeColor="text1"/>
         </w:rPr>
+        <w:t>Reference:</w:t>
+      </w:r>
+      <w:r>
+        <w:rPr>
+          <w:rFonts w:ascii="Times New Roman" w:hAnsi="Times New Roman" w:cs="Times New Roman"/>
+          <w:b/>
+          <w:bCs/>
+          <w:color w:val="000000" w:themeColor="text1"/>
+        </w:rPr>
         <w:t xml:space="preserve"> </w:t>
       </w:r>
       <w:r>
@@ -293,7 +345,14 @@
           <w:rFonts w:ascii="Times New Roman" w:hAnsi="Times New Roman" w:cs="Times New Roman"/>
           <w:color w:val="000000" w:themeColor="text1"/>
         </w:rPr>
-        <w:t xml:space="preserve">Our discussions on implementation of </w:t>
+        <w:t>Our discussions</w:t>
+      </w:r>
+      <w:r>
+        <w:rPr>
+          <w:rFonts w:ascii="Times New Roman" w:hAnsi="Times New Roman" w:cs="Times New Roman"/>
+          <w:color w:val="000000" w:themeColor="text1"/>
+        </w:rPr>
+        <w:t xml:space="preserve"> on implementation of </w:t>
       </w:r>
       <w:r>
         <w:rPr>
@@ -331,17 +390,19 @@
       <w:r>
         <w:rPr>
           <w:rFonts w:ascii="Times New Roman" w:hAnsi="Times New Roman" w:cs="Times New Roman"/>
-          <w:color w:val="000000" w:themeColor="text1"/>
-        </w:rPr>
-        <w:t>Subject:</w:t>
-      </w:r>
-      <w:r>
-        <w:rPr>
-          <w:rFonts w:ascii="Times New Roman" w:hAnsi="Times New Roman" w:cs="Times New Roman"/>
           <w:b/>
           <w:bCs/>
           <w:color w:val="000000" w:themeColor="text1"/>
         </w:rPr>
+        <w:t>Subject:</w:t>
+      </w:r>
+      <w:r>
+        <w:rPr>
+          <w:rFonts w:ascii="Times New Roman" w:hAnsi="Times New Roman" w:cs="Times New Roman"/>
+          <w:b/>
+          <w:bCs/>
+          <w:color w:val="000000" w:themeColor="text1"/>
+        </w:rPr>
         <w:t xml:space="preserve"> </w:t>
       </w:r>
       <w:r>
@@ -358,14 +419,7 @@
           <w:bCs/>
           <w:color w:val="65AADB"/>
         </w:rPr>
-        <w:t>{{MODULE_LIST}}</w:t>
-      </w:r>
-      <w:r>
-        <w:rPr>
-          <w:rFonts w:ascii="Times New Roman" w:hAnsi="Times New Roman" w:cs="Times New Roman"/>
-          <w:color w:val="65AADB"/>
-        </w:rPr>
-        <w:t>.</w:t>
+        <w:t>{{MODULE_LIST}}.</w:t>
       </w:r>
     </w:p>
     <w:p>
@@ -425,14 +479,7 @@
           <w:bCs/>
           <w:color w:val="65AADB"/>
         </w:rPr>
-        <w:t>{{ORG_NAME}}</w:t>
-      </w:r>
-      <w:r>
-        <w:rPr>
-          <w:rFonts w:ascii="Times New Roman" w:hAnsi="Times New Roman" w:cs="Times New Roman"/>
-          <w:color w:val="65AADB"/>
-        </w:rPr>
-        <w:t>.</w:t>
+        <w:t>{{ORG_NAME}}.</w:t>
       </w:r>
     </w:p>
     <w:p>
@@ -441,6 +488,8 @@
         <w:jc w:val="both"/>
         <w:rPr>
           <w:rFonts w:ascii="Times New Roman" w:hAnsi="Times New Roman" w:cs="Times New Roman"/>
+          <w:b/>
+          <w:bCs/>
           <w:color w:val="000000" w:themeColor="text1"/>
           <w:sz w:val="16"/>
           <w:szCs w:val="16"/>
@@ -450,6 +499,8 @@
       <w:r>
         <w:rPr>
           <w:rFonts w:ascii="Times New Roman" w:hAnsi="Times New Roman" w:cs="Times New Roman"/>
+          <w:b/>
+          <w:bCs/>
           <w:color w:val="000000" w:themeColor="text1"/>
           <w:u w:val="single"/>
         </w:rPr>
@@ -462,6 +513,8 @@
         <w:jc w:val="both"/>
         <w:rPr>
           <w:rFonts w:ascii="Times New Roman" w:hAnsi="Times New Roman" w:cs="Times New Roman"/>
+          <w:b/>
+          <w:bCs/>
         </w:rPr>
       </w:pPr>
       <w:r>
@@ -482,6 +535,8 @@
       <w:r>
         <w:rPr>
           <w:rFonts w:ascii="Times New Roman" w:hAnsi="Times New Roman" w:cs="Times New Roman"/>
+          <w:b/>
+          <w:bCs/>
         </w:rPr>
         <w:t>.</w:t>
       </w:r>
@@ -532,6 +587,8 @@
         <w:jc w:val="both"/>
         <w:rPr>
           <w:rFonts w:ascii="Times New Roman" w:hAnsi="Times New Roman" w:cs="Times New Roman"/>
+          <w:b/>
+          <w:bCs/>
           <w:color w:val="000000" w:themeColor="text1"/>
           <w:u w:val="single"/>
         </w:rPr>
@@ -539,6 +596,8 @@
       <w:r>
         <w:rPr>
           <w:rFonts w:ascii="Times New Roman" w:hAnsi="Times New Roman" w:cs="Times New Roman"/>
+          <w:b/>
+          <w:bCs/>
           <w:color w:val="000000" w:themeColor="text1"/>
           <w:u w:val="single"/>
         </w:rPr>
@@ -547,6 +606,8 @@
       <w:r>
         <w:rPr>
           <w:rFonts w:ascii="Times New Roman" w:hAnsi="Times New Roman" w:cs="Times New Roman"/>
+          <w:b/>
+          <w:bCs/>
           <w:color w:val="000000" w:themeColor="text1"/>
           <w:u w:val="single"/>
         </w:rPr>
@@ -715,120 +776,121 @@
         <w:jc w:val="both"/>
         <w:rPr>
           <w:rFonts w:ascii="Times New Roman" w:hAnsi="Times New Roman" w:cs="Times New Roman"/>
-          <w:lang w:val="en-US"/>
-        </w:rPr>
-      </w:pPr>
-      <w:r>
-        <w:rPr>
-          <w:rFonts w:ascii="Times New Roman" w:hAnsi="Times New Roman" w:cs="Times New Roman"/>
-          <w:lang w:val="en-US"/>
-        </w:rPr>
-        <w:t>For BlechTek Software Solutions LLP.</w:t>
-      </w:r>
-    </w:p>
-    <w:p>
-      <w:pPr>
-        <w:spacing w:line="240" w:lineRule="auto"/>
-        <w:rPr>
-          <w:rFonts w:ascii="Times New Roman" w:hAnsi="Times New Roman" w:cs="Times New Roman"/>
-          <w:noProof/>
-        </w:rPr>
-      </w:pPr>
-    </w:p>
-    <w:p>
-      <w:pPr>
-        <w:spacing w:line="240" w:lineRule="auto"/>
-        <w:rPr>
-          <w:rFonts w:ascii="Times New Roman" w:hAnsi="Times New Roman" w:cs="Times New Roman"/>
-          <w:noProof/>
-        </w:rPr>
-      </w:pPr>
-    </w:p>
-    <w:p>
-      <w:pPr>
-        <w:spacing w:line="240" w:lineRule="auto"/>
-        <w:rPr>
-          <w:rFonts w:ascii="Times New Roman" w:hAnsi="Times New Roman" w:cs="Times New Roman"/>
-          <w:noProof/>
-        </w:rPr>
-      </w:pPr>
-    </w:p>
-    <w:p>
-      <w:pPr>
-        <w:spacing w:line="240" w:lineRule="auto"/>
-        <w:rPr>
-          <w:rFonts w:ascii="Times New Roman" w:hAnsi="Times New Roman" w:cs="Times New Roman"/>
-          <w:noProof/>
-        </w:rPr>
-      </w:pPr>
-    </w:p>
-    <w:p>
-      <w:pPr>
-        <w:spacing w:line="240" w:lineRule="auto"/>
-        <w:rPr>
-          <w:rFonts w:ascii="Times New Roman" w:hAnsi="Times New Roman" w:cs="Times New Roman"/>
           <w:b/>
           <w:bCs/>
           <w:lang w:val="en-US"/>
         </w:rPr>
       </w:pPr>
-    </w:p>
-    <w:p>
-      <w:pPr>
-        <w:spacing w:line="240" w:lineRule="auto"/>
+      <w:r>
         <w:rPr>
           <w:rFonts w:ascii="Times New Roman" w:hAnsi="Times New Roman" w:cs="Times New Roman"/>
           <w:b/>
           <w:bCs/>
           <w:lang w:val="en-US"/>
         </w:rPr>
-      </w:pPr>
+        <w:t>For BlechTek Software Solutions LLP.</w:t>
+      </w:r>
     </w:p>
     <w:p>
       <w:pPr>
-        <w:spacing w:after="200"/>
-        <w:rPr>
-          <w:rFonts w:ascii="Times New Roman" w:hAnsi="Times New Roman" w:cs="Times New Roman"/>
-          <w:lang w:val="en-US"/>
-        </w:rPr>
-      </w:pPr>
-      <w:r>
-        <w:rPr>
-          <w:rFonts w:ascii="Times New Roman" w:hAnsi="Times New Roman" w:cs="Times New Roman"/>
-          <w:lang w:val="en-US"/>
-        </w:rPr>
-        <w:t> </w:t>
-      </w:r>
-      <w:r>
-        <w:rPr>
-          <w:rFonts w:ascii="Times New Roman" w:hAnsi="Times New Roman" w:cs="Times New Roman"/>
-          <w:lang w:val="en-US"/>
-        </w:rPr>
-        <w:t>Sushama Inamdar</w:t>
-      </w:r>
+        <w:spacing w:line="240" w:lineRule="auto"/>
+        <w:rPr>
+          <w:rFonts w:ascii="Times New Roman" w:hAnsi="Times New Roman" w:cs="Times New Roman"/>
+          <w:noProof/>
+        </w:rPr>
+      </w:pPr>
     </w:p>
     <w:p>
       <w:pPr>
+        <w:spacing w:line="240" w:lineRule="auto"/>
+        <w:rPr>
+          <w:rFonts w:ascii="Times New Roman" w:hAnsi="Times New Roman" w:cs="Times New Roman"/>
+          <w:noProof/>
+        </w:rPr>
+      </w:pPr>
+    </w:p>
+    <w:p>
+      <w:pPr>
+        <w:spacing w:line="240" w:lineRule="auto"/>
+        <w:rPr>
+          <w:rFonts w:ascii="Times New Roman" w:hAnsi="Times New Roman" w:cs="Times New Roman"/>
+          <w:noProof/>
+        </w:rPr>
+      </w:pPr>
+    </w:p>
+    <w:p>
+      <w:pPr>
+        <w:spacing w:line="240" w:lineRule="auto"/>
+        <w:rPr>
+          <w:rFonts w:ascii="Times New Roman" w:hAnsi="Times New Roman" w:cs="Times New Roman"/>
+          <w:noProof/>
+        </w:rPr>
+      </w:pPr>
+    </w:p>
+    <w:p>
+      <w:pPr>
+        <w:spacing w:line="240" w:lineRule="auto"/>
+        <w:rPr>
+          <w:rFonts w:ascii="Times New Roman" w:hAnsi="Times New Roman" w:cs="Times New Roman"/>
+          <w:b/>
+          <w:bCs/>
+          <w:lang w:val="en-US"/>
+        </w:rPr>
+      </w:pPr>
+    </w:p>
+    <w:p>
+      <w:pPr>
+        <w:spacing w:line="240" w:lineRule="auto"/>
+        <w:rPr>
+          <w:rFonts w:ascii="Times New Roman" w:hAnsi="Times New Roman" w:cs="Times New Roman"/>
+          <w:b/>
+          <w:bCs/>
+          <w:lang w:val="en-US"/>
+        </w:rPr>
+      </w:pPr>
+    </w:p>
+    <w:p>
+      <w:pPr>
+        <w:spacing w:after="200"/>
+        <w:rPr>
+          <w:rFonts w:ascii="Times New Roman" w:hAnsi="Times New Roman" w:cs="Times New Roman"/>
+          <w:lang w:val="en-US"/>
+        </w:rPr>
+      </w:pPr>
+      <w:r>
+        <w:rPr>
+          <w:rFonts w:ascii="Times New Roman" w:hAnsi="Times New Roman" w:cs="Times New Roman"/>
+          <w:lang w:val="en-US"/>
+        </w:rPr>
+        <w:t> </w:t>
+      </w:r>
+      <w:r>
+        <w:rPr>
+          <w:rFonts w:ascii="Times New Roman" w:hAnsi="Times New Roman" w:cs="Times New Roman"/>
+          <w:lang w:val="en-US"/>
+        </w:rPr>
+        <w:t>Sushama Inamdar</w:t>
+      </w:r>
+    </w:p>
+    <w:p>
+      <w:pPr>
         <w:spacing w:before="300" w:after="150"/>
         <w:rPr>
           <w:rFonts w:ascii="Times New Roman" w:hAnsi="Times New Roman" w:cs="Times New Roman"/>
+          <w:b/>
+          <w:bCs/>
           <w:color w:val="000000" w:themeColor="text1"/>
         </w:rPr>
       </w:pPr>
       <w:r>
         <w:rPr>
           <w:rFonts w:ascii="Times New Roman" w:hAnsi="Times New Roman" w:cs="Times New Roman"/>
+          <w:b/>
+          <w:bCs/>
           <w:color w:val="000000" w:themeColor="text1"/>
         </w:rPr>
         <w:lastRenderedPageBreak/>
-        <w:t>Scope</w:t>
-      </w:r>
-      <w:r>
-        <w:rPr>
-          <w:rFonts w:ascii="Times New Roman" w:hAnsi="Times New Roman" w:cs="Times New Roman"/>
-          <w:color w:val="000000" w:themeColor="text1"/>
-        </w:rPr>
-        <w:t>:</w:t>
+        <w:t>Scope:</w:t>
       </w:r>
     </w:p>
     <w:tbl>
@@ -874,12 +936,16 @@
             <w:pPr>
               <w:rPr>
                 <w:rFonts w:ascii="Times New Roman" w:hAnsi="Times New Roman" w:cs="Times New Roman"/>
+                <w:b/>
+                <w:bCs/>
                 <w:color w:val="000000" w:themeColor="text1"/>
               </w:rPr>
             </w:pPr>
             <w:r>
               <w:rPr>
                 <w:rFonts w:ascii="Times New Roman" w:hAnsi="Times New Roman" w:cs="Times New Roman"/>
+                <w:b/>
+                <w:bCs/>
                 <w:color w:val="000000" w:themeColor="text1"/>
               </w:rPr>
               <w:t>Pillar</w:t>
@@ -905,12 +971,16 @@
             <w:pPr>
               <w:rPr>
                 <w:rFonts w:ascii="Times New Roman" w:hAnsi="Times New Roman" w:cs="Times New Roman"/>
+                <w:b/>
+                <w:bCs/>
                 <w:color w:val="000000" w:themeColor="text1"/>
               </w:rPr>
             </w:pPr>
             <w:r>
               <w:rPr>
                 <w:rFonts w:ascii="Times New Roman" w:hAnsi="Times New Roman" w:cs="Times New Roman"/>
+                <w:b/>
+                <w:bCs/>
                 <w:color w:val="000000" w:themeColor="text1"/>
               </w:rPr>
               <w:t>Module</w:t>
@@ -933,12 +1003,16 @@
             <w:pPr>
               <w:rPr>
                 <w:rFonts w:ascii="Times New Roman" w:hAnsi="Times New Roman" w:cs="Times New Roman"/>
+                <w:b/>
+                <w:bCs/>
                 <w:color w:val="000000" w:themeColor="text1"/>
               </w:rPr>
             </w:pPr>
             <w:r>
               <w:rPr>
                 <w:rFonts w:ascii="Times New Roman" w:hAnsi="Times New Roman" w:cs="Times New Roman"/>
+                <w:b/>
+                <w:bCs/>
               </w:rPr>
               <w:t>Required</w:t>
             </w:r>
@@ -1049,11 +1123,15 @@
         <w:spacing w:after="200"/>
         <w:rPr>
           <w:rFonts w:ascii="Times New Roman" w:hAnsi="Times New Roman" w:cs="Times New Roman"/>
-        </w:rPr>
-      </w:pPr>
-      <w:r>
-        <w:rPr>
-          <w:rFonts w:ascii="Times New Roman" w:hAnsi="Times New Roman" w:cs="Times New Roman"/>
+          <w:b/>
+          <w:bCs/>
+        </w:rPr>
+      </w:pPr>
+      <w:r>
+        <w:rPr>
+          <w:rFonts w:ascii="Times New Roman" w:hAnsi="Times New Roman" w:cs="Times New Roman"/>
+          <w:b/>
+          <w:bCs/>
         </w:rPr>
         <w:t>Additional Scope:</w:t>
       </w:r>
@@ -1087,12 +1165,16 @@
               <w:spacing w:line="276" w:lineRule="auto"/>
               <w:rPr>
                 <w:rFonts w:ascii="Times New Roman" w:hAnsi="Times New Roman" w:cs="Times New Roman"/>
+                <w:b/>
+                <w:bCs/>
                 <w:color w:val="000000" w:themeColor="text1"/>
               </w:rPr>
             </w:pPr>
             <w:r>
               <w:rPr>
                 <w:rFonts w:ascii="Times New Roman" w:hAnsi="Times New Roman" w:cs="Times New Roman"/>
+                <w:b/>
+                <w:bCs/>
                 <w:color w:val="000000" w:themeColor="text1"/>
               </w:rPr>
               <w:t>Requirements</w:t>
@@ -1108,12 +1190,16 @@
               <w:spacing w:line="276" w:lineRule="auto"/>
               <w:rPr>
                 <w:rFonts w:ascii="Times New Roman" w:hAnsi="Times New Roman" w:cs="Times New Roman"/>
+                <w:b/>
+                <w:bCs/>
                 <w:color w:val="000000" w:themeColor="text1"/>
               </w:rPr>
             </w:pPr>
             <w:r>
               <w:rPr>
                 <w:rFonts w:ascii="Times New Roman" w:hAnsi="Times New Roman" w:cs="Times New Roman"/>
+                <w:b/>
+                <w:bCs/>
                 <w:color w:val="000000" w:themeColor="text1"/>
               </w:rPr>
               <w:t>Module</w:t>
@@ -1129,12 +1215,16 @@
               <w:spacing w:line="276" w:lineRule="auto"/>
               <w:rPr>
                 <w:rFonts w:ascii="Times New Roman" w:hAnsi="Times New Roman" w:cs="Times New Roman"/>
+                <w:b/>
+                <w:bCs/>
                 <w:color w:val="000000" w:themeColor="text1"/>
               </w:rPr>
             </w:pPr>
             <w:r>
               <w:rPr>
                 <w:rFonts w:ascii="Times New Roman" w:hAnsi="Times New Roman" w:cs="Times New Roman"/>
+                <w:b/>
+                <w:bCs/>
                 <w:color w:val="000000" w:themeColor="text1"/>
               </w:rPr>
               <w:t>No. of Man Power</w:t>
@@ -1150,12 +1240,16 @@
               <w:spacing w:line="276" w:lineRule="auto"/>
               <w:rPr>
                 <w:rFonts w:ascii="Times New Roman" w:hAnsi="Times New Roman" w:cs="Times New Roman"/>
+                <w:b/>
+                <w:bCs/>
                 <w:color w:val="000000" w:themeColor="text1"/>
               </w:rPr>
             </w:pPr>
             <w:r>
               <w:rPr>
                 <w:rFonts w:ascii="Times New Roman" w:hAnsi="Times New Roman" w:cs="Times New Roman"/>
+                <w:b/>
+                <w:bCs/>
                 <w:color w:val="000000" w:themeColor="text1"/>
               </w:rPr>
               <w:t>No. of Days</w:t>
@@ -1171,12 +1265,16 @@
               <w:spacing w:line="276" w:lineRule="auto"/>
               <w:rPr>
                 <w:rFonts w:ascii="Times New Roman" w:hAnsi="Times New Roman" w:cs="Times New Roman"/>
+                <w:b/>
+                <w:bCs/>
                 <w:color w:val="000000" w:themeColor="text1"/>
               </w:rPr>
             </w:pPr>
             <w:r>
               <w:rPr>
                 <w:rFonts w:ascii="Times New Roman" w:hAnsi="Times New Roman" w:cs="Times New Roman"/>
+                <w:b/>
+                <w:bCs/>
                 <w:color w:val="000000" w:themeColor="text1"/>
               </w:rPr>
               <w:t>Rate</w:t>
@@ -1192,12 +1290,16 @@
               <w:spacing w:line="276" w:lineRule="auto"/>
               <w:rPr>
                 <w:rFonts w:ascii="Times New Roman" w:hAnsi="Times New Roman" w:cs="Times New Roman"/>
+                <w:b/>
+                <w:bCs/>
                 <w:color w:val="000000" w:themeColor="text1"/>
               </w:rPr>
             </w:pPr>
             <w:r>
               <w:rPr>
                 <w:rFonts w:ascii="Times New Roman" w:hAnsi="Times New Roman" w:cs="Times New Roman"/>
+                <w:b/>
+                <w:bCs/>
                 <w:color w:val="000000" w:themeColor="text1"/>
               </w:rPr>
               <w:t>Amount</w:t>
@@ -1371,27 +1473,17 @@
       <w:r>
         <w:rPr>
           <w:rFonts w:ascii="Times New Roman" w:hAnsi="Times New Roman" w:cs="Times New Roman"/>
+          <w:b/>
+          <w:bCs/>
           <w:color w:val="000000" w:themeColor="text1"/>
         </w:rPr>
-        <w:t xml:space="preserve">Price for </w:t>
-      </w:r>
-      <w:r>
-        <w:rPr>
-          <w:rFonts w:ascii="Times New Roman" w:hAnsi="Times New Roman" w:cs="Times New Roman"/>
-          <w:color w:val="000000" w:themeColor="text1"/>
-        </w:rPr>
-        <w:t>I</w:t>
-      </w:r>
-      <w:r>
-        <w:rPr>
-          <w:rFonts w:ascii="Times New Roman" w:hAnsi="Times New Roman" w:cs="Times New Roman"/>
-          <w:color w:val="000000" w:themeColor="text1"/>
-        </w:rPr>
-        <w:t xml:space="preserve">mplementation of </w:t>
-      </w:r>
-      <w:r>
-        <w:rPr>
-          <w:rFonts w:ascii="Times New Roman" w:hAnsi="Times New Roman" w:cs="Times New Roman"/>
+        <w:t xml:space="preserve">Price for Implementation of </w:t>
+      </w:r>
+      <w:r>
+        <w:rPr>
+          <w:rFonts w:ascii="Times New Roman" w:hAnsi="Times New Roman" w:cs="Times New Roman"/>
+          <w:b/>
+          <w:bCs/>
           <w:caps/>
           <w:color w:val="000000" w:themeColor="text1"/>
         </w:rPr>
@@ -1435,9 +1527,9 @@
         <w:tblLook w:val="04A0" w:firstRow="1" w:lastRow="0" w:firstColumn="1" w:lastColumn="0" w:noHBand="0" w:noVBand="1"/>
       </w:tblPr>
       <w:tblGrid>
-        <w:gridCol w:w="866"/>
-        <w:gridCol w:w="5390"/>
-        <w:gridCol w:w="3804"/>
+        <w:gridCol w:w="846"/>
+        <w:gridCol w:w="6289"/>
+        <w:gridCol w:w="2925"/>
       </w:tblGrid>
       <w:tr>
         <w:trPr>
@@ -1446,7 +1538,7 @@
         </w:trPr>
         <w:tc>
           <w:tcPr>
-            <w:tcW w:w="866" w:type="dxa"/>
+            <w:tcW w:w="846" w:type="dxa"/>
             <w:shd w:val="clear" w:color="auto" w:fill="FFFFFF" w:themeFill="background1"/>
             <w:tcMar>
               <w:top w:w="80" w:type="dxa"/>
@@ -1461,12 +1553,16 @@
               <w:spacing w:line="240" w:lineRule="auto"/>
               <w:rPr>
                 <w:rFonts w:ascii="Times New Roman" w:hAnsi="Times New Roman" w:cs="Times New Roman"/>
+                <w:b/>
+                <w:bCs/>
                 <w:color w:val="000000" w:themeColor="text1"/>
               </w:rPr>
             </w:pPr>
             <w:r>
               <w:rPr>
                 <w:rFonts w:ascii="Times New Roman" w:hAnsi="Times New Roman" w:cs="Times New Roman"/>
+                <w:b/>
+                <w:bCs/>
                 <w:color w:val="000000" w:themeColor="text1"/>
               </w:rPr>
               <w:t>Sr. No.</w:t>
@@ -1475,7 +1571,7 @@
         </w:tc>
         <w:tc>
           <w:tcPr>
-            <w:tcW w:w="5390" w:type="dxa"/>
+            <w:tcW w:w="6289" w:type="dxa"/>
             <w:shd w:val="clear" w:color="auto" w:fill="FFFFFF" w:themeFill="background1"/>
             <w:tcMar>
               <w:top w:w="80" w:type="dxa"/>
@@ -1490,12 +1586,16 @@
               <w:spacing w:line="240" w:lineRule="auto"/>
               <w:rPr>
                 <w:rFonts w:ascii="Times New Roman" w:hAnsi="Times New Roman" w:cs="Times New Roman"/>
+                <w:b/>
+                <w:bCs/>
                 <w:color w:val="000000" w:themeColor="text1"/>
               </w:rPr>
             </w:pPr>
             <w:r>
               <w:rPr>
                 <w:rFonts w:ascii="Times New Roman" w:hAnsi="Times New Roman" w:cs="Times New Roman"/>
+                <w:b/>
+                <w:bCs/>
                 <w:color w:val="000000" w:themeColor="text1"/>
               </w:rPr>
               <w:t>Particulars</w:t>
@@ -1504,7 +1604,7 @@
         </w:tc>
         <w:tc>
           <w:tcPr>
-            <w:tcW w:w="3804" w:type="dxa"/>
+            <w:tcW w:w="2925" w:type="dxa"/>
             <w:shd w:val="clear" w:color="auto" w:fill="FFFFFF" w:themeFill="background1"/>
             <w:tcMar>
               <w:top w:w="80" w:type="dxa"/>
@@ -1519,12 +1619,16 @@
               <w:spacing w:line="240" w:lineRule="auto"/>
               <w:rPr>
                 <w:rFonts w:ascii="Times New Roman" w:hAnsi="Times New Roman" w:cs="Times New Roman"/>
+                <w:b/>
+                <w:bCs/>
                 <w:color w:val="000000" w:themeColor="text1"/>
               </w:rPr>
             </w:pPr>
             <w:r>
               <w:rPr>
                 <w:rFonts w:ascii="Times New Roman" w:hAnsi="Times New Roman" w:cs="Times New Roman"/>
+                <w:b/>
+                <w:bCs/>
                 <w:color w:val="000000" w:themeColor="text1"/>
               </w:rPr>
               <w:t xml:space="preserve">Price </w:t>
@@ -1532,6 +1636,8 @@
             <w:r>
               <w:rPr>
                 <w:rFonts w:ascii="Times New Roman" w:hAnsi="Times New Roman" w:cs="Times New Roman"/>
+                <w:b/>
+                <w:bCs/>
                 <w:color w:val="000000" w:themeColor="text1"/>
               </w:rPr>
               <w:t xml:space="preserve">in </w:t>
@@ -1539,6 +1645,8 @@
             <w:r>
               <w:rPr>
                 <w:rFonts w:ascii="Times New Roman" w:hAnsi="Times New Roman" w:cs="Times New Roman"/>
+                <w:b/>
+                <w:bCs/>
                 <w:color w:val="000000" w:themeColor="text1"/>
               </w:rPr>
               <w:t>INR</w:t>
@@ -1552,7 +1660,7 @@
         </w:trPr>
         <w:tc>
           <w:tcPr>
-            <w:tcW w:w="866" w:type="dxa"/>
+            <w:tcW w:w="846" w:type="dxa"/>
             <w:shd w:val="clear" w:color="auto" w:fill="FFFFFF" w:themeFill="background1"/>
             <w:tcMar>
               <w:top w:w="80" w:type="dxa"/>
@@ -1577,7 +1685,7 @@
         </w:tc>
         <w:tc>
           <w:tcPr>
-            <w:tcW w:w="5390" w:type="dxa"/>
+            <w:tcW w:w="6289" w:type="dxa"/>
             <w:shd w:val="clear" w:color="auto" w:fill="FFFFFF" w:themeFill="background1"/>
             <w:tcMar>
               <w:top w:w="80" w:type="dxa"/>
@@ -1663,7 +1771,7 @@
         </w:tc>
         <w:tc>
           <w:tcPr>
-            <w:tcW w:w="3804" w:type="dxa"/>
+            <w:tcW w:w="2925" w:type="dxa"/>
             <w:shd w:val="clear" w:color="auto" w:fill="FFFFFF" w:themeFill="background1"/>
             <w:tcMar>
               <w:top w:w="80" w:type="dxa"/>
@@ -1700,7 +1808,7 @@
         </w:trPr>
         <w:tc>
           <w:tcPr>
-            <w:tcW w:w="866" w:type="dxa"/>
+            <w:tcW w:w="846" w:type="dxa"/>
             <w:shd w:val="clear" w:color="auto" w:fill="FFFFFF" w:themeFill="background1"/>
             <w:tcMar>
               <w:top w:w="80" w:type="dxa"/>
@@ -1719,7 +1827,7 @@
         </w:tc>
         <w:tc>
           <w:tcPr>
-            <w:tcW w:w="5390" w:type="dxa"/>
+            <w:tcW w:w="6289" w:type="dxa"/>
             <w:shd w:val="clear" w:color="auto" w:fill="FFFFFF" w:themeFill="background1"/>
             <w:tcMar>
               <w:top w:w="80" w:type="dxa"/>
@@ -1744,7 +1852,7 @@
         </w:tc>
         <w:tc>
           <w:tcPr>
-            <w:tcW w:w="3804" w:type="dxa"/>
+            <w:tcW w:w="2925" w:type="dxa"/>
             <w:shd w:val="clear" w:color="auto" w:fill="FFFFFF" w:themeFill="background1"/>
             <w:tcMar>
               <w:top w:w="80" w:type="dxa"/>
@@ -1774,7 +1882,7 @@
         </w:trPr>
         <w:tc>
           <w:tcPr>
-            <w:tcW w:w="866" w:type="dxa"/>
+            <w:tcW w:w="846" w:type="dxa"/>
             <w:shd w:val="clear" w:color="auto" w:fill="FFFFFF" w:themeFill="background1"/>
             <w:tcMar>
               <w:top w:w="80" w:type="dxa"/>
@@ -1793,7 +1901,7 @@
         </w:tc>
         <w:tc>
           <w:tcPr>
-            <w:tcW w:w="5390" w:type="dxa"/>
+            <w:tcW w:w="6289" w:type="dxa"/>
             <w:shd w:val="clear" w:color="auto" w:fill="FFFFFF" w:themeFill="background1"/>
             <w:tcMar>
               <w:top w:w="80" w:type="dxa"/>
@@ -1860,7 +1968,7 @@
         </w:tc>
         <w:tc>
           <w:tcPr>
-            <w:tcW w:w="3804" w:type="dxa"/>
+            <w:tcW w:w="2925" w:type="dxa"/>
             <w:shd w:val="clear" w:color="auto" w:fill="FFFFFF" w:themeFill="background1"/>
             <w:tcMar>
               <w:top w:w="80" w:type="dxa"/>
@@ -1890,7 +1998,7 @@
         </w:trPr>
         <w:tc>
           <w:tcPr>
-            <w:tcW w:w="866" w:type="dxa"/>
+            <w:tcW w:w="846" w:type="dxa"/>
             <w:shd w:val="clear" w:color="auto" w:fill="FFFFFF" w:themeFill="background1"/>
             <w:tcMar>
               <w:top w:w="80" w:type="dxa"/>
@@ -1909,7 +2017,7 @@
         </w:tc>
         <w:tc>
           <w:tcPr>
-            <w:tcW w:w="5390" w:type="dxa"/>
+            <w:tcW w:w="6289" w:type="dxa"/>
             <w:shd w:val="clear" w:color="auto" w:fill="FFFFFF" w:themeFill="background1"/>
             <w:tcMar>
               <w:top w:w="80" w:type="dxa"/>
@@ -1940,7 +2048,7 @@
         </w:tc>
         <w:tc>
           <w:tcPr>
-            <w:tcW w:w="3804" w:type="dxa"/>
+            <w:tcW w:w="2925" w:type="dxa"/>
             <w:shd w:val="clear" w:color="auto" w:fill="FFFFFF" w:themeFill="background1"/>
             <w:tcMar>
               <w:top w:w="80" w:type="dxa"/>
@@ -1970,7 +2078,7 @@
         </w:trPr>
         <w:tc>
           <w:tcPr>
-            <w:tcW w:w="866" w:type="dxa"/>
+            <w:tcW w:w="846" w:type="dxa"/>
             <w:shd w:val="clear" w:color="auto" w:fill="FFFFFF" w:themeFill="background1"/>
             <w:tcMar>
               <w:top w:w="80" w:type="dxa"/>
@@ -1989,7 +2097,7 @@
         </w:tc>
         <w:tc>
           <w:tcPr>
-            <w:tcW w:w="5390" w:type="dxa"/>
+            <w:tcW w:w="6289" w:type="dxa"/>
             <w:shd w:val="clear" w:color="auto" w:fill="FFFFFF" w:themeFill="background1"/>
             <w:tcMar>
               <w:top w:w="80" w:type="dxa"/>
@@ -2014,7 +2122,7 @@
         </w:tc>
         <w:tc>
           <w:tcPr>
-            <w:tcW w:w="3804" w:type="dxa"/>
+            <w:tcW w:w="2925" w:type="dxa"/>
             <w:shd w:val="clear" w:color="auto" w:fill="FFFFFF" w:themeFill="background1"/>
             <w:tcMar>
               <w:top w:w="80" w:type="dxa"/>
@@ -2033,7 +2141,7 @@
               <w:rPr>
                 <w:rFonts w:ascii="Times New Roman" w:hAnsi="Times New Roman" w:cs="Times New Roman"/>
               </w:rPr>
-              <w:t>{{ADDITIONAL_SCOPE_SUBTOTAL}}</w:t>
+              <w:t>{{ADD_SCOPE_SUBTOTAL}}</w:t>
             </w:r>
           </w:p>
         </w:tc>
@@ -2044,7 +2152,7 @@
         </w:trPr>
         <w:tc>
           <w:tcPr>
-            <w:tcW w:w="866" w:type="dxa"/>
+            <w:tcW w:w="846" w:type="dxa"/>
             <w:shd w:val="clear" w:color="auto" w:fill="FFFFFF" w:themeFill="background1"/>
             <w:tcMar>
               <w:top w:w="80" w:type="dxa"/>
@@ -2063,7 +2171,7 @@
         </w:tc>
         <w:tc>
           <w:tcPr>
-            <w:tcW w:w="5390" w:type="dxa"/>
+            <w:tcW w:w="6289" w:type="dxa"/>
             <w:shd w:val="clear" w:color="auto" w:fill="FFFFFF" w:themeFill="background1"/>
             <w:tcMar>
               <w:top w:w="80" w:type="dxa"/>
@@ -2088,7 +2196,7 @@
         </w:tc>
         <w:tc>
           <w:tcPr>
-            <w:tcW w:w="3804" w:type="dxa"/>
+            <w:tcW w:w="2925" w:type="dxa"/>
             <w:shd w:val="clear" w:color="auto" w:fill="FFFFFF" w:themeFill="background1"/>
             <w:tcMar>
               <w:top w:w="80" w:type="dxa"/>
@@ -2118,7 +2226,7 @@
         </w:trPr>
         <w:tc>
           <w:tcPr>
-            <w:tcW w:w="866" w:type="dxa"/>
+            <w:tcW w:w="846" w:type="dxa"/>
             <w:shd w:val="clear" w:color="auto" w:fill="FFFFFF" w:themeFill="background1"/>
             <w:tcMar>
               <w:top w:w="80" w:type="dxa"/>
@@ -2143,7 +2251,7 @@
         </w:tc>
         <w:tc>
           <w:tcPr>
-            <w:tcW w:w="5390" w:type="dxa"/>
+            <w:tcW w:w="6289" w:type="dxa"/>
             <w:shd w:val="clear" w:color="auto" w:fill="FFFFFF" w:themeFill="background1"/>
             <w:tcMar>
               <w:top w:w="80" w:type="dxa"/>
@@ -2168,7 +2276,7 @@
         </w:tc>
         <w:tc>
           <w:tcPr>
-            <w:tcW w:w="3804" w:type="dxa"/>
+            <w:tcW w:w="2925" w:type="dxa"/>
             <w:shd w:val="clear" w:color="auto" w:fill="FFFFFF" w:themeFill="background1"/>
             <w:tcMar>
               <w:top w:w="80" w:type="dxa"/>
@@ -2198,7 +2306,7 @@
         </w:trPr>
         <w:tc>
           <w:tcPr>
-            <w:tcW w:w="866" w:type="dxa"/>
+            <w:tcW w:w="846" w:type="dxa"/>
             <w:shd w:val="clear" w:color="auto" w:fill="FFFFFF" w:themeFill="background1"/>
             <w:tcMar>
               <w:top w:w="80" w:type="dxa"/>
@@ -2223,7 +2331,7 @@
         </w:tc>
         <w:tc>
           <w:tcPr>
-            <w:tcW w:w="5390" w:type="dxa"/>
+            <w:tcW w:w="6289" w:type="dxa"/>
             <w:shd w:val="clear" w:color="auto" w:fill="FFFFFF" w:themeFill="background1"/>
             <w:tcMar>
               <w:top w:w="80" w:type="dxa"/>
@@ -2248,7 +2356,7 @@
         </w:tc>
         <w:tc>
           <w:tcPr>
-            <w:tcW w:w="3804" w:type="dxa"/>
+            <w:tcW w:w="2925" w:type="dxa"/>
             <w:shd w:val="clear" w:color="auto" w:fill="FFFFFF" w:themeFill="background1"/>
             <w:tcMar>
               <w:top w:w="80" w:type="dxa"/>
@@ -2272,7 +2380,7 @@
         </w:trPr>
         <w:tc>
           <w:tcPr>
-            <w:tcW w:w="866" w:type="dxa"/>
+            <w:tcW w:w="846" w:type="dxa"/>
             <w:shd w:val="clear" w:color="auto" w:fill="FFFFFF" w:themeFill="background1"/>
             <w:tcMar>
               <w:top w:w="80" w:type="dxa"/>
@@ -2297,7 +2405,7 @@
         </w:tc>
         <w:tc>
           <w:tcPr>
-            <w:tcW w:w="5390" w:type="dxa"/>
+            <w:tcW w:w="6289" w:type="dxa"/>
             <w:shd w:val="clear" w:color="auto" w:fill="FFFFFF" w:themeFill="background1"/>
             <w:tcMar>
               <w:top w:w="80" w:type="dxa"/>
@@ -2322,7 +2430,7 @@
         </w:tc>
         <w:tc>
           <w:tcPr>
-            <w:tcW w:w="3804" w:type="dxa"/>
+            <w:tcW w:w="2925" w:type="dxa"/>
             <w:shd w:val="clear" w:color="auto" w:fill="FFFFFF" w:themeFill="background1"/>
             <w:tcMar>
               <w:top w:w="80" w:type="dxa"/>
@@ -2346,7 +2454,7 @@
         </w:trPr>
         <w:tc>
           <w:tcPr>
-            <w:tcW w:w="866" w:type="dxa"/>
+            <w:tcW w:w="846" w:type="dxa"/>
             <w:shd w:val="clear" w:color="auto" w:fill="FFFFFF" w:themeFill="background1"/>
             <w:tcMar>
               <w:top w:w="80" w:type="dxa"/>
@@ -2383,7 +2491,7 @@
         </w:tc>
         <w:tc>
           <w:tcPr>
-            <w:tcW w:w="5390" w:type="dxa"/>
+            <w:tcW w:w="6289" w:type="dxa"/>
             <w:shd w:val="clear" w:color="auto" w:fill="FFFFFF" w:themeFill="background1"/>
             <w:tcMar>
               <w:top w:w="80" w:type="dxa"/>
@@ -2421,7 +2529,7 @@
         </w:tc>
         <w:tc>
           <w:tcPr>
-            <w:tcW w:w="3804" w:type="dxa"/>
+            <w:tcW w:w="2925" w:type="dxa"/>
             <w:shd w:val="clear" w:color="auto" w:fill="FFFFFF" w:themeFill="background1"/>
             <w:tcMar>
               <w:top w:w="80" w:type="dxa"/>
@@ -2470,7 +2578,7 @@
         </w:trPr>
         <w:tc>
           <w:tcPr>
-            <w:tcW w:w="866" w:type="dxa"/>
+            <w:tcW w:w="846" w:type="dxa"/>
             <w:shd w:val="clear" w:color="auto" w:fill="FFFFFF" w:themeFill="background1"/>
             <w:tcMar>
               <w:top w:w="80" w:type="dxa"/>
@@ -2495,7 +2603,7 @@
         </w:tc>
         <w:tc>
           <w:tcPr>
-            <w:tcW w:w="5390" w:type="dxa"/>
+            <w:tcW w:w="6289" w:type="dxa"/>
             <w:shd w:val="clear" w:color="auto" w:fill="FFFFFF" w:themeFill="background1"/>
             <w:tcMar>
               <w:top w:w="80" w:type="dxa"/>
@@ -2520,7 +2628,7 @@
         </w:tc>
         <w:tc>
           <w:tcPr>
-            <w:tcW w:w="3804" w:type="dxa"/>
+            <w:tcW w:w="2925" w:type="dxa"/>
             <w:shd w:val="clear" w:color="auto" w:fill="FFFFFF" w:themeFill="background1"/>
             <w:tcMar>
               <w:top w:w="80" w:type="dxa"/>
@@ -2550,7 +2658,7 @@
         </w:trPr>
         <w:tc>
           <w:tcPr>
-            <w:tcW w:w="866" w:type="dxa"/>
+            <w:tcW w:w="846" w:type="dxa"/>
             <w:shd w:val="clear" w:color="auto" w:fill="FFFFFF" w:themeFill="background1"/>
             <w:tcMar>
               <w:top w:w="80" w:type="dxa"/>
@@ -2569,14 +2677,13 @@
               <w:rPr>
                 <w:rFonts w:ascii="Times New Roman" w:hAnsi="Times New Roman" w:cs="Times New Roman"/>
               </w:rPr>
-              <w:lastRenderedPageBreak/>
               <w:t xml:space="preserve"> 4.1</w:t>
             </w:r>
           </w:p>
         </w:tc>
         <w:tc>
           <w:tcPr>
-            <w:tcW w:w="5390" w:type="dxa"/>
+            <w:tcW w:w="6289" w:type="dxa"/>
             <w:shd w:val="clear" w:color="auto" w:fill="FFFFFF" w:themeFill="background1"/>
             <w:tcMar>
               <w:top w:w="80" w:type="dxa"/>
@@ -2595,27 +2702,49 @@
               <w:rPr>
                 <w:rFonts w:ascii="Times New Roman" w:hAnsi="Times New Roman" w:cs="Times New Roman"/>
               </w:rPr>
-              <w:t xml:space="preserve">First Year - These Services start a er 1 Month from start of Go Live. Subsequent Years – A er </w:t>
-            </w:r>
-            <w:proofErr w:type="spellStart"/>
-            <w:r>
-              <w:rPr>
-                <w:rFonts w:ascii="Times New Roman" w:hAnsi="Times New Roman" w:cs="Times New Roman"/>
-              </w:rPr>
-              <w:t>comple</w:t>
-            </w:r>
-            <w:proofErr w:type="spellEnd"/>
-            <w:r>
-              <w:rPr>
-                <w:rFonts w:ascii="Times New Roman" w:hAnsi="Times New Roman" w:cs="Times New Roman"/>
-              </w:rPr>
-              <w:t xml:space="preserve"> on of 7 Man Days</w:t>
-            </w:r>
-          </w:p>
-        </w:tc>
-        <w:tc>
-          <w:tcPr>
-            <w:tcW w:w="3804" w:type="dxa"/>
+              <w:t>First Year - These Services start a</w:t>
+            </w:r>
+            <w:r>
+              <w:rPr>
+                <w:rFonts w:ascii="Times New Roman" w:hAnsi="Times New Roman" w:cs="Times New Roman"/>
+              </w:rPr>
+              <w:t>ft</w:t>
+            </w:r>
+            <w:r>
+              <w:rPr>
+                <w:rFonts w:ascii="Times New Roman" w:hAnsi="Times New Roman" w:cs="Times New Roman"/>
+              </w:rPr>
+              <w:t xml:space="preserve">er 1 Month from start of Go Live. Subsequent Years – </w:t>
+            </w:r>
+            <w:r>
+              <w:rPr>
+                <w:rFonts w:ascii="Times New Roman" w:hAnsi="Times New Roman" w:cs="Times New Roman"/>
+              </w:rPr>
+              <w:t>Aft</w:t>
+            </w:r>
+            <w:r>
+              <w:rPr>
+                <w:rFonts w:ascii="Times New Roman" w:hAnsi="Times New Roman" w:cs="Times New Roman"/>
+              </w:rPr>
+              <w:t>er comple</w:t>
+            </w:r>
+            <w:r>
+              <w:rPr>
+                <w:rFonts w:ascii="Times New Roman" w:hAnsi="Times New Roman" w:cs="Times New Roman"/>
+              </w:rPr>
+              <w:t>ti</w:t>
+            </w:r>
+            <w:r>
+              <w:rPr>
+                <w:rFonts w:ascii="Times New Roman" w:hAnsi="Times New Roman" w:cs="Times New Roman"/>
+              </w:rPr>
+              <w:t>on of 7 Man Days</w:t>
+            </w:r>
+          </w:p>
+        </w:tc>
+        <w:tc>
+          <w:tcPr>
+            <w:tcW w:w="2925" w:type="dxa"/>
             <w:shd w:val="clear" w:color="auto" w:fill="FFFFFF" w:themeFill="background1"/>
             <w:tcMar>
               <w:top w:w="80" w:type="dxa"/>
@@ -2639,7 +2768,7 @@
         </w:trPr>
         <w:tc>
           <w:tcPr>
-            <w:tcW w:w="866" w:type="dxa"/>
+            <w:tcW w:w="846" w:type="dxa"/>
             <w:shd w:val="clear" w:color="auto" w:fill="FFFFFF" w:themeFill="background1"/>
             <w:tcMar>
               <w:top w:w="80" w:type="dxa"/>
@@ -2658,13 +2787,14 @@
               <w:rPr>
                 <w:rFonts w:ascii="Times New Roman" w:hAnsi="Times New Roman" w:cs="Times New Roman"/>
               </w:rPr>
+              <w:lastRenderedPageBreak/>
               <w:t>5</w:t>
             </w:r>
           </w:p>
         </w:tc>
         <w:tc>
           <w:tcPr>
-            <w:tcW w:w="5390" w:type="dxa"/>
+            <w:tcW w:w="6289" w:type="dxa"/>
             <w:shd w:val="clear" w:color="auto" w:fill="FFFFFF" w:themeFill="background1"/>
             <w:tcMar>
               <w:top w:w="80" w:type="dxa"/>
@@ -2689,7 +2819,7 @@
         </w:tc>
         <w:tc>
           <w:tcPr>
-            <w:tcW w:w="3804" w:type="dxa"/>
+            <w:tcW w:w="2925" w:type="dxa"/>
             <w:shd w:val="clear" w:color="auto" w:fill="FFFFFF" w:themeFill="background1"/>
             <w:tcMar>
               <w:top w:w="80" w:type="dxa"/>
@@ -2713,7 +2843,7 @@
         </w:trPr>
         <w:tc>
           <w:tcPr>
-            <w:tcW w:w="866" w:type="dxa"/>
+            <w:tcW w:w="846" w:type="dxa"/>
             <w:shd w:val="clear" w:color="auto" w:fill="FFFFFF" w:themeFill="background1"/>
             <w:tcMar>
               <w:top w:w="80" w:type="dxa"/>
@@ -2738,7 +2868,7 @@
         </w:tc>
         <w:tc>
           <w:tcPr>
-            <w:tcW w:w="5390" w:type="dxa"/>
+            <w:tcW w:w="6289" w:type="dxa"/>
             <w:shd w:val="clear" w:color="auto" w:fill="FFFFFF" w:themeFill="background1"/>
             <w:tcMar>
               <w:top w:w="80" w:type="dxa"/>
@@ -2763,7 +2893,7 @@
         </w:tc>
         <w:tc>
           <w:tcPr>
-            <w:tcW w:w="3804" w:type="dxa"/>
+            <w:tcW w:w="2925" w:type="dxa"/>
             <w:shd w:val="clear" w:color="auto" w:fill="FFFFFF" w:themeFill="background1"/>
             <w:tcMar>
               <w:top w:w="80" w:type="dxa"/>
@@ -2787,7 +2917,7 @@
         </w:trPr>
         <w:tc>
           <w:tcPr>
-            <w:tcW w:w="866" w:type="dxa"/>
+            <w:tcW w:w="846" w:type="dxa"/>
             <w:shd w:val="clear" w:color="auto" w:fill="FFFFFF" w:themeFill="background1"/>
             <w:tcMar>
               <w:top w:w="80" w:type="dxa"/>
@@ -2812,7 +2942,7 @@
         </w:tc>
         <w:tc>
           <w:tcPr>
-            <w:tcW w:w="5390" w:type="dxa"/>
+            <w:tcW w:w="6289" w:type="dxa"/>
             <w:shd w:val="clear" w:color="auto" w:fill="FFFFFF" w:themeFill="background1"/>
             <w:tcMar>
               <w:top w:w="80" w:type="dxa"/>
@@ -2849,7 +2979,7 @@
         </w:tc>
         <w:tc>
           <w:tcPr>
-            <w:tcW w:w="3804" w:type="dxa"/>
+            <w:tcW w:w="2925" w:type="dxa"/>
             <w:shd w:val="clear" w:color="auto" w:fill="FFFFFF" w:themeFill="background1"/>
             <w:tcMar>
               <w:top w:w="80" w:type="dxa"/>
@@ -2873,7 +3003,7 @@
         </w:trPr>
         <w:tc>
           <w:tcPr>
-            <w:tcW w:w="866" w:type="dxa"/>
+            <w:tcW w:w="846" w:type="dxa"/>
             <w:shd w:val="clear" w:color="auto" w:fill="FFFFFF" w:themeFill="background1"/>
             <w:tcMar>
               <w:top w:w="80" w:type="dxa"/>
@@ -2898,7 +3028,7 @@
         </w:tc>
         <w:tc>
           <w:tcPr>
-            <w:tcW w:w="5390" w:type="dxa"/>
+            <w:tcW w:w="6289" w:type="dxa"/>
             <w:shd w:val="clear" w:color="auto" w:fill="FFFFFF" w:themeFill="background1"/>
             <w:tcMar>
               <w:top w:w="80" w:type="dxa"/>
@@ -2923,7 +3053,7 @@
         </w:tc>
         <w:tc>
           <w:tcPr>
-            <w:tcW w:w="3804" w:type="dxa"/>
+            <w:tcW w:w="2925" w:type="dxa"/>
             <w:shd w:val="clear" w:color="auto" w:fill="FFFFFF" w:themeFill="background1"/>
             <w:tcMar>
               <w:top w:w="80" w:type="dxa"/>
@@ -2947,7 +3077,7 @@
         </w:trPr>
         <w:tc>
           <w:tcPr>
-            <w:tcW w:w="866" w:type="dxa"/>
+            <w:tcW w:w="846" w:type="dxa"/>
             <w:shd w:val="clear" w:color="auto" w:fill="FFFFFF" w:themeFill="background1"/>
             <w:tcMar>
               <w:top w:w="80" w:type="dxa"/>
@@ -2972,7 +3102,7 @@
         </w:tc>
         <w:tc>
           <w:tcPr>
-            <w:tcW w:w="5390" w:type="dxa"/>
+            <w:tcW w:w="6289" w:type="dxa"/>
             <w:shd w:val="clear" w:color="auto" w:fill="FFFFFF" w:themeFill="background1"/>
             <w:tcMar>
               <w:top w:w="80" w:type="dxa"/>
@@ -2997,7 +3127,7 @@
         </w:tc>
         <w:tc>
           <w:tcPr>
-            <w:tcW w:w="3804" w:type="dxa"/>
+            <w:tcW w:w="2925" w:type="dxa"/>
             <w:shd w:val="clear" w:color="auto" w:fill="FFFFFF" w:themeFill="background1"/>
             <w:tcMar>
               <w:top w:w="80" w:type="dxa"/>
@@ -3021,7 +3151,7 @@
         </w:trPr>
         <w:tc>
           <w:tcPr>
-            <w:tcW w:w="866" w:type="dxa"/>
+            <w:tcW w:w="846" w:type="dxa"/>
             <w:shd w:val="clear" w:color="auto" w:fill="FFFFFF" w:themeFill="background1"/>
             <w:tcMar>
               <w:top w:w="80" w:type="dxa"/>
@@ -3046,7 +3176,7 @@
         </w:tc>
         <w:tc>
           <w:tcPr>
-            <w:tcW w:w="5390" w:type="dxa"/>
+            <w:tcW w:w="6289" w:type="dxa"/>
             <w:shd w:val="clear" w:color="auto" w:fill="FFFFFF" w:themeFill="background1"/>
             <w:tcMar>
               <w:top w:w="80" w:type="dxa"/>
@@ -3106,7 +3236,7 @@
         </w:tc>
         <w:tc>
           <w:tcPr>
-            <w:tcW w:w="3804" w:type="dxa"/>
+            <w:tcW w:w="2925" w:type="dxa"/>
             <w:shd w:val="clear" w:color="auto" w:fill="FFFFFF" w:themeFill="background1"/>
             <w:tcMar>
               <w:top w:w="80" w:type="dxa"/>
@@ -3151,7 +3281,7 @@
         </w:trPr>
         <w:tc>
           <w:tcPr>
-            <w:tcW w:w="866" w:type="dxa"/>
+            <w:tcW w:w="846" w:type="dxa"/>
             <w:shd w:val="clear" w:color="auto" w:fill="FFFFFF" w:themeFill="background1"/>
             <w:tcMar>
               <w:top w:w="80" w:type="dxa"/>
@@ -3176,7 +3306,7 @@
         </w:tc>
         <w:tc>
           <w:tcPr>
-            <w:tcW w:w="5390" w:type="dxa"/>
+            <w:tcW w:w="6289" w:type="dxa"/>
             <w:shd w:val="clear" w:color="auto" w:fill="FFFFFF" w:themeFill="background1"/>
             <w:tcMar>
               <w:top w:w="80" w:type="dxa"/>
@@ -3230,13 +3360,19 @@
               <w:rPr>
                 <w:rFonts w:ascii="Times New Roman" w:hAnsi="Times New Roman" w:cs="Times New Roman"/>
               </w:rPr>
-              <w:t>Identified by you or by BlechTek Software Solutions LLP.</w:t>
-            </w:r>
-          </w:p>
-        </w:tc>
-        <w:tc>
-          <w:tcPr>
-            <w:tcW w:w="3804" w:type="dxa"/>
+              <w:t>i</w:t>
+            </w:r>
+            <w:r>
+              <w:rPr>
+                <w:rFonts w:ascii="Times New Roman" w:hAnsi="Times New Roman" w:cs="Times New Roman"/>
+              </w:rPr>
+              <w:t>dentified by you or by BlechTek Software Solutions LLP.</w:t>
+            </w:r>
+          </w:p>
+        </w:tc>
+        <w:tc>
+          <w:tcPr>
+            <w:tcW w:w="2925" w:type="dxa"/>
             <w:shd w:val="clear" w:color="auto" w:fill="FFFFFF" w:themeFill="background1"/>
             <w:tcMar>
               <w:top w:w="80" w:type="dxa"/>
@@ -3255,7 +3391,20 @@
               <w:rPr>
                 <w:rFonts w:ascii="Times New Roman" w:hAnsi="Times New Roman" w:cs="Times New Roman"/>
               </w:rPr>
-              <w:t>Free, under License Fee Renewal</w:t>
+              <w:t xml:space="preserve">Free, under License Fee </w:t>
+            </w:r>
+          </w:p>
+          <w:p>
+            <w:pPr>
+              <w:rPr>
+                <w:rFonts w:ascii="Times New Roman" w:hAnsi="Times New Roman" w:cs="Times New Roman"/>
+              </w:rPr>
+            </w:pPr>
+            <w:r>
+              <w:rPr>
+                <w:rFonts w:ascii="Times New Roman" w:hAnsi="Times New Roman" w:cs="Times New Roman"/>
+              </w:rPr>
+              <w:t>Renewal</w:t>
             </w:r>
           </w:p>
         </w:tc>
@@ -3266,7 +3415,7 @@
         </w:trPr>
         <w:tc>
           <w:tcPr>
-            <w:tcW w:w="866" w:type="dxa"/>
+            <w:tcW w:w="846" w:type="dxa"/>
             <w:shd w:val="clear" w:color="auto" w:fill="FFFFFF" w:themeFill="background1"/>
             <w:tcMar>
               <w:top w:w="80" w:type="dxa"/>
@@ -3291,7 +3440,7 @@
         </w:tc>
         <w:tc>
           <w:tcPr>
-            <w:tcW w:w="5390" w:type="dxa"/>
+            <w:tcW w:w="6289" w:type="dxa"/>
             <w:shd w:val="clear" w:color="auto" w:fill="FFFFFF" w:themeFill="background1"/>
             <w:tcMar>
               <w:top w:w="80" w:type="dxa"/>
@@ -3337,13 +3486,25 @@
               <w:rPr>
                 <w:rFonts w:ascii="Times New Roman" w:hAnsi="Times New Roman" w:cs="Times New Roman"/>
               </w:rPr>
-              <w:t>New/Change in Document Prin ng format, New/Changes in Reports, New/Change in Reports</w:t>
-            </w:r>
-          </w:p>
-        </w:tc>
-        <w:tc>
-          <w:tcPr>
-            <w:tcW w:w="3804" w:type="dxa"/>
+              <w:t>New/Change in Document Prin</w:t>
+            </w:r>
+            <w:r>
+              <w:rPr>
+                <w:rFonts w:ascii="Times New Roman" w:hAnsi="Times New Roman" w:cs="Times New Roman"/>
+              </w:rPr>
+              <w:t>ti</w:t>
+            </w:r>
+            <w:r>
+              <w:rPr>
+                <w:rFonts w:ascii="Times New Roman" w:hAnsi="Times New Roman" w:cs="Times New Roman"/>
+              </w:rPr>
+              <w:t>ng format, New/Changes in Reports, New/Change in Reports</w:t>
+            </w:r>
+          </w:p>
+        </w:tc>
+        <w:tc>
+          <w:tcPr>
+            <w:tcW w:w="2925" w:type="dxa"/>
             <w:shd w:val="clear" w:color="auto" w:fill="FFFFFF" w:themeFill="background1"/>
             <w:tcMar>
               <w:top w:w="80" w:type="dxa"/>
@@ -3388,7 +3549,7 @@
         </w:trPr>
         <w:tc>
           <w:tcPr>
-            <w:tcW w:w="866" w:type="dxa"/>
+            <w:tcW w:w="846" w:type="dxa"/>
             <w:shd w:val="clear" w:color="auto" w:fill="FFFFFF" w:themeFill="background1"/>
             <w:tcMar>
               <w:top w:w="80" w:type="dxa"/>
@@ -3413,7 +3574,7 @@
         </w:tc>
         <w:tc>
           <w:tcPr>
-            <w:tcW w:w="5390" w:type="dxa"/>
+            <w:tcW w:w="6289" w:type="dxa"/>
             <w:shd w:val="clear" w:color="auto" w:fill="FFFFFF" w:themeFill="background1"/>
             <w:tcMar>
               <w:top w:w="80" w:type="dxa"/>
@@ -3477,7 +3638,7 @@
         </w:tc>
         <w:tc>
           <w:tcPr>
-            <w:tcW w:w="3804" w:type="dxa"/>
+            <w:tcW w:w="2925" w:type="dxa"/>
             <w:shd w:val="clear" w:color="auto" w:fill="FFFFFF" w:themeFill="background1"/>
             <w:tcMar>
               <w:top w:w="80" w:type="dxa"/>
@@ -3496,7 +3657,20 @@
               <w:rPr>
                 <w:rFonts w:ascii="Times New Roman" w:hAnsi="Times New Roman" w:cs="Times New Roman"/>
               </w:rPr>
-              <w:t>Free, under License Fee Renewal</w:t>
+              <w:t xml:space="preserve">Free, under License Fee </w:t>
+            </w:r>
+          </w:p>
+          <w:p>
+            <w:pPr>
+              <w:rPr>
+                <w:rFonts w:ascii="Times New Roman" w:hAnsi="Times New Roman" w:cs="Times New Roman"/>
+              </w:rPr>
+            </w:pPr>
+            <w:r>
+              <w:rPr>
+                <w:rFonts w:ascii="Times New Roman" w:hAnsi="Times New Roman" w:cs="Times New Roman"/>
+              </w:rPr>
+              <w:t>Renewal</w:t>
             </w:r>
           </w:p>
         </w:tc>
@@ -3507,7 +3681,7 @@
         </w:trPr>
         <w:tc>
           <w:tcPr>
-            <w:tcW w:w="866" w:type="dxa"/>
+            <w:tcW w:w="846" w:type="dxa"/>
             <w:shd w:val="clear" w:color="auto" w:fill="FFFFFF" w:themeFill="background1"/>
             <w:tcMar>
               <w:top w:w="80" w:type="dxa"/>
@@ -3532,7 +3706,7 @@
         </w:tc>
         <w:tc>
           <w:tcPr>
-            <w:tcW w:w="5390" w:type="dxa"/>
+            <w:tcW w:w="6289" w:type="dxa"/>
             <w:shd w:val="clear" w:color="auto" w:fill="FFFFFF" w:themeFill="background1"/>
             <w:tcMar>
               <w:top w:w="80" w:type="dxa"/>
@@ -3578,7 +3752,7 @@
         </w:tc>
         <w:tc>
           <w:tcPr>
-            <w:tcW w:w="3804" w:type="dxa"/>
+            <w:tcW w:w="2925" w:type="dxa"/>
             <w:shd w:val="clear" w:color="auto" w:fill="FFFFFF" w:themeFill="background1"/>
             <w:tcMar>
               <w:top w:w="80" w:type="dxa"/>
@@ -3621,7 +3795,7 @@
         </w:trPr>
         <w:tc>
           <w:tcPr>
-            <w:tcW w:w="866" w:type="dxa"/>
+            <w:tcW w:w="846" w:type="dxa"/>
             <w:shd w:val="clear" w:color="auto" w:fill="FFFFFF" w:themeFill="background1"/>
             <w:tcMar>
               <w:top w:w="80" w:type="dxa"/>
@@ -3646,7 +3820,7 @@
         </w:tc>
         <w:tc>
           <w:tcPr>
-            <w:tcW w:w="5390" w:type="dxa"/>
+            <w:tcW w:w="6289" w:type="dxa"/>
             <w:shd w:val="clear" w:color="auto" w:fill="FFFFFF" w:themeFill="background1"/>
             <w:tcMar>
               <w:top w:w="80" w:type="dxa"/>
@@ -3671,7 +3845,7 @@
         </w:tc>
         <w:tc>
           <w:tcPr>
-            <w:tcW w:w="3804" w:type="dxa"/>
+            <w:tcW w:w="2925" w:type="dxa"/>
             <w:shd w:val="clear" w:color="auto" w:fill="FFFFFF" w:themeFill="background1"/>
             <w:tcMar>
               <w:top w:w="80" w:type="dxa"/>
@@ -3709,11 +3883,15 @@
         <w:spacing w:after="200"/>
         <w:rPr>
           <w:rFonts w:ascii="Times New Roman" w:hAnsi="Times New Roman" w:cs="Times New Roman"/>
-        </w:rPr>
-      </w:pPr>
-      <w:r>
-        <w:rPr>
-          <w:rFonts w:ascii="Times New Roman" w:hAnsi="Times New Roman" w:cs="Times New Roman"/>
+          <w:b/>
+          <w:bCs/>
+        </w:rPr>
+      </w:pPr>
+      <w:r>
+        <w:rPr>
+          <w:rFonts w:ascii="Times New Roman" w:hAnsi="Times New Roman" w:cs="Times New Roman"/>
+          <w:b/>
+          <w:bCs/>
         </w:rPr>
         <w:t xml:space="preserve">Price Summary  </w:t>
       </w:r>
@@ -3761,6 +3939,8 @@
               <w:spacing w:line="259" w:lineRule="auto"/>
               <w:rPr>
                 <w:rFonts w:ascii="Times New Roman" w:hAnsi="Times New Roman" w:cs="Times New Roman"/>
+                <w:b/>
+                <w:bCs/>
                 <w:sz w:val="18"/>
                 <w:szCs w:val="18"/>
               </w:rPr>
@@ -3768,6 +3948,8 @@
             <w:r>
               <w:rPr>
                 <w:rFonts w:ascii="Times New Roman" w:hAnsi="Times New Roman" w:cs="Times New Roman"/>
+                <w:b/>
+                <w:bCs/>
                 <w:sz w:val="18"/>
                 <w:szCs w:val="18"/>
               </w:rPr>
@@ -3792,6 +3974,8 @@
               <w:ind w:left="1"/>
               <w:rPr>
                 <w:rFonts w:ascii="Times New Roman" w:hAnsi="Times New Roman" w:cs="Times New Roman"/>
+                <w:b/>
+                <w:bCs/>
                 <w:sz w:val="18"/>
                 <w:szCs w:val="18"/>
               </w:rPr>
@@ -3799,6 +3983,8 @@
             <w:r>
               <w:rPr>
                 <w:rFonts w:ascii="Times New Roman" w:hAnsi="Times New Roman" w:cs="Times New Roman"/>
+                <w:b/>
+                <w:bCs/>
                 <w:sz w:val="18"/>
                 <w:szCs w:val="18"/>
               </w:rPr>
@@ -3824,6 +4010,8 @@
               <w:jc w:val="center"/>
               <w:rPr>
                 <w:rFonts w:ascii="Times New Roman" w:hAnsi="Times New Roman" w:cs="Times New Roman"/>
+                <w:b/>
+                <w:bCs/>
                 <w:sz w:val="18"/>
                 <w:szCs w:val="18"/>
               </w:rPr>
@@ -3831,6 +4019,8 @@
             <w:r>
               <w:rPr>
                 <w:rFonts w:ascii="Times New Roman" w:hAnsi="Times New Roman" w:cs="Times New Roman"/>
+                <w:b/>
+                <w:bCs/>
                 <w:sz w:val="18"/>
                 <w:szCs w:val="18"/>
               </w:rPr>
@@ -3856,6 +4046,8 @@
               <w:jc w:val="center"/>
               <w:rPr>
                 <w:rFonts w:ascii="Times New Roman" w:hAnsi="Times New Roman" w:cs="Times New Roman"/>
+                <w:b/>
+                <w:bCs/>
                 <w:sz w:val="18"/>
                 <w:szCs w:val="18"/>
               </w:rPr>
@@ -3863,6 +4055,8 @@
             <w:r>
               <w:rPr>
                 <w:rFonts w:ascii="Times New Roman" w:hAnsi="Times New Roman" w:cs="Times New Roman"/>
+                <w:b/>
+                <w:bCs/>
                 <w:sz w:val="18"/>
                 <w:szCs w:val="18"/>
               </w:rPr>
@@ -3888,6 +4082,8 @@
               <w:jc w:val="center"/>
               <w:rPr>
                 <w:rFonts w:ascii="Times New Roman" w:hAnsi="Times New Roman" w:cs="Times New Roman"/>
+                <w:b/>
+                <w:bCs/>
                 <w:sz w:val="18"/>
                 <w:szCs w:val="18"/>
               </w:rPr>
@@ -3895,6 +4091,8 @@
             <w:r>
               <w:rPr>
                 <w:rFonts w:ascii="Times New Roman" w:hAnsi="Times New Roman" w:cs="Times New Roman"/>
+                <w:b/>
+                <w:bCs/>
                 <w:sz w:val="18"/>
                 <w:szCs w:val="18"/>
               </w:rPr>
@@ -3920,6 +4118,8 @@
               <w:jc w:val="center"/>
               <w:rPr>
                 <w:rFonts w:ascii="Times New Roman" w:hAnsi="Times New Roman" w:cs="Times New Roman"/>
+                <w:b/>
+                <w:bCs/>
                 <w:sz w:val="18"/>
                 <w:szCs w:val="18"/>
               </w:rPr>
@@ -3927,6 +4127,8 @@
             <w:r>
               <w:rPr>
                 <w:rFonts w:ascii="Times New Roman" w:hAnsi="Times New Roman" w:cs="Times New Roman"/>
+                <w:b/>
+                <w:bCs/>
                 <w:sz w:val="18"/>
                 <w:szCs w:val="18"/>
               </w:rPr>
@@ -3952,6 +4154,8 @@
               <w:jc w:val="center"/>
               <w:rPr>
                 <w:rFonts w:ascii="Times New Roman" w:hAnsi="Times New Roman" w:cs="Times New Roman"/>
+                <w:b/>
+                <w:bCs/>
                 <w:sz w:val="18"/>
                 <w:szCs w:val="18"/>
               </w:rPr>
@@ -3959,6 +4163,8 @@
             <w:r>
               <w:rPr>
                 <w:rFonts w:ascii="Times New Roman" w:hAnsi="Times New Roman" w:cs="Times New Roman"/>
+                <w:b/>
+                <w:bCs/>
                 <w:sz w:val="18"/>
                 <w:szCs w:val="18"/>
               </w:rPr>
@@ -3984,6 +4190,8 @@
               <w:jc w:val="center"/>
               <w:rPr>
                 <w:rFonts w:ascii="Times New Roman" w:hAnsi="Times New Roman" w:cs="Times New Roman"/>
+                <w:b/>
+                <w:bCs/>
                 <w:sz w:val="18"/>
                 <w:szCs w:val="18"/>
               </w:rPr>
@@ -3991,6 +4199,8 @@
             <w:r>
               <w:rPr>
                 <w:rFonts w:ascii="Times New Roman" w:hAnsi="Times New Roman" w:cs="Times New Roman"/>
+                <w:b/>
+                <w:bCs/>
                 <w:sz w:val="18"/>
                 <w:szCs w:val="18"/>
               </w:rPr>
@@ -4016,6 +4226,8 @@
               <w:jc w:val="both"/>
               <w:rPr>
                 <w:rFonts w:ascii="Times New Roman" w:hAnsi="Times New Roman" w:cs="Times New Roman"/>
+                <w:b/>
+                <w:bCs/>
                 <w:sz w:val="18"/>
                 <w:szCs w:val="18"/>
               </w:rPr>
@@ -4023,6 +4235,8 @@
             <w:r>
               <w:rPr>
                 <w:rFonts w:ascii="Times New Roman" w:hAnsi="Times New Roman" w:cs="Times New Roman"/>
+                <w:b/>
+                <w:bCs/>
                 <w:sz w:val="18"/>
                 <w:szCs w:val="18"/>
               </w:rPr>
@@ -4287,12 +4501,16 @@
         <w:spacing w:before="300" w:after="150"/>
         <w:rPr>
           <w:rFonts w:ascii="Times New Roman" w:hAnsi="Times New Roman" w:cs="Times New Roman"/>
+          <w:b/>
+          <w:bCs/>
           <w:w w:val="101"/>
         </w:rPr>
       </w:pPr>
       <w:r>
         <w:rPr>
           <w:rFonts w:ascii="Times New Roman" w:hAnsi="Times New Roman" w:cs="Times New Roman"/>
+          <w:b/>
+          <w:bCs/>
           <w:w w:val="101"/>
         </w:rPr>
         <w:t>Time Estimate</w:t>
@@ -4328,11 +4546,15 @@
             <w:pPr>
               <w:rPr>
                 <w:rFonts w:ascii="Times New Roman" w:hAnsi="Times New Roman" w:cs="Times New Roman"/>
-              </w:rPr>
-            </w:pPr>
-            <w:r>
-              <w:rPr>
-                <w:rFonts w:ascii="Times New Roman" w:hAnsi="Times New Roman" w:cs="Times New Roman"/>
+                <w:b/>
+                <w:bCs/>
+              </w:rPr>
+            </w:pPr>
+            <w:r>
+              <w:rPr>
+                <w:rFonts w:ascii="Times New Roman" w:hAnsi="Times New Roman" w:cs="Times New Roman"/>
+                <w:b/>
+                <w:bCs/>
               </w:rPr>
               <w:t>Main Stages</w:t>
             </w:r>
@@ -4345,13 +4567,18 @@
           </w:tcPr>
           <w:p>
             <w:pPr>
-              <w:rPr>
-                <w:rFonts w:ascii="Times New Roman" w:hAnsi="Times New Roman" w:cs="Times New Roman"/>
-              </w:rPr>
-            </w:pPr>
-            <w:r>
-              <w:rPr>
-                <w:rFonts w:ascii="Times New Roman" w:hAnsi="Times New Roman" w:cs="Times New Roman"/>
+              <w:jc w:val="center"/>
+              <w:rPr>
+                <w:rFonts w:ascii="Times New Roman" w:hAnsi="Times New Roman" w:cs="Times New Roman"/>
+                <w:b/>
+                <w:bCs/>
+              </w:rPr>
+            </w:pPr>
+            <w:r>
+              <w:rPr>
+                <w:rFonts w:ascii="Times New Roman" w:hAnsi="Times New Roman" w:cs="Times New Roman"/>
+                <w:b/>
+                <w:bCs/>
               </w:rPr>
               <w:t>Month 1</w:t>
             </w:r>
@@ -4364,13 +4591,18 @@
           </w:tcPr>
           <w:p>
             <w:pPr>
-              <w:rPr>
-                <w:rFonts w:ascii="Times New Roman" w:hAnsi="Times New Roman" w:cs="Times New Roman"/>
-              </w:rPr>
-            </w:pPr>
-            <w:r>
-              <w:rPr>
-                <w:rFonts w:ascii="Times New Roman" w:hAnsi="Times New Roman" w:cs="Times New Roman"/>
+              <w:jc w:val="center"/>
+              <w:rPr>
+                <w:rFonts w:ascii="Times New Roman" w:hAnsi="Times New Roman" w:cs="Times New Roman"/>
+                <w:b/>
+                <w:bCs/>
+              </w:rPr>
+            </w:pPr>
+            <w:r>
+              <w:rPr>
+                <w:rFonts w:ascii="Times New Roman" w:hAnsi="Times New Roman" w:cs="Times New Roman"/>
+                <w:b/>
+                <w:bCs/>
               </w:rPr>
               <w:t>Month 2</w:t>
             </w:r>
@@ -4402,11 +4634,15 @@
             <w:pPr>
               <w:rPr>
                 <w:rFonts w:ascii="Times New Roman" w:hAnsi="Times New Roman" w:cs="Times New Roman"/>
-              </w:rPr>
-            </w:pPr>
-            <w:r>
-              <w:rPr>
-                <w:rFonts w:ascii="Times New Roman" w:hAnsi="Times New Roman" w:cs="Times New Roman"/>
+                <w:b/>
+                <w:bCs/>
+              </w:rPr>
+            </w:pPr>
+            <w:r>
+              <w:rPr>
+                <w:rFonts w:ascii="Times New Roman" w:hAnsi="Times New Roman" w:cs="Times New Roman"/>
+                <w:b/>
+                <w:bCs/>
               </w:rPr>
               <w:t>WK1</w:t>
             </w:r>
@@ -4420,11 +4656,15 @@
             <w:pPr>
               <w:rPr>
                 <w:rFonts w:ascii="Times New Roman" w:hAnsi="Times New Roman" w:cs="Times New Roman"/>
-              </w:rPr>
-            </w:pPr>
-            <w:r>
-              <w:rPr>
-                <w:rFonts w:ascii="Times New Roman" w:hAnsi="Times New Roman" w:cs="Times New Roman"/>
+                <w:b/>
+                <w:bCs/>
+              </w:rPr>
+            </w:pPr>
+            <w:r>
+              <w:rPr>
+                <w:rFonts w:ascii="Times New Roman" w:hAnsi="Times New Roman" w:cs="Times New Roman"/>
+                <w:b/>
+                <w:bCs/>
               </w:rPr>
               <w:t>WK2</w:t>
             </w:r>
@@ -4438,11 +4678,15 @@
             <w:pPr>
               <w:rPr>
                 <w:rFonts w:ascii="Times New Roman" w:hAnsi="Times New Roman" w:cs="Times New Roman"/>
-              </w:rPr>
-            </w:pPr>
-            <w:r>
-              <w:rPr>
-                <w:rFonts w:ascii="Times New Roman" w:hAnsi="Times New Roman" w:cs="Times New Roman"/>
+                <w:b/>
+                <w:bCs/>
+              </w:rPr>
+            </w:pPr>
+            <w:r>
+              <w:rPr>
+                <w:rFonts w:ascii="Times New Roman" w:hAnsi="Times New Roman" w:cs="Times New Roman"/>
+                <w:b/>
+                <w:bCs/>
               </w:rPr>
               <w:t>WK3</w:t>
             </w:r>
@@ -4456,11 +4700,15 @@
             <w:pPr>
               <w:rPr>
                 <w:rFonts w:ascii="Times New Roman" w:hAnsi="Times New Roman" w:cs="Times New Roman"/>
-              </w:rPr>
-            </w:pPr>
-            <w:r>
-              <w:rPr>
-                <w:rFonts w:ascii="Times New Roman" w:hAnsi="Times New Roman" w:cs="Times New Roman"/>
+                <w:b/>
+                <w:bCs/>
+              </w:rPr>
+            </w:pPr>
+            <w:r>
+              <w:rPr>
+                <w:rFonts w:ascii="Times New Roman" w:hAnsi="Times New Roman" w:cs="Times New Roman"/>
+                <w:b/>
+                <w:bCs/>
               </w:rPr>
               <w:t>WK4</w:t>
             </w:r>
@@ -4474,11 +4722,15 @@
             <w:pPr>
               <w:rPr>
                 <w:rFonts w:ascii="Times New Roman" w:hAnsi="Times New Roman" w:cs="Times New Roman"/>
-              </w:rPr>
-            </w:pPr>
-            <w:r>
-              <w:rPr>
-                <w:rFonts w:ascii="Times New Roman" w:hAnsi="Times New Roman" w:cs="Times New Roman"/>
+                <w:b/>
+                <w:bCs/>
+              </w:rPr>
+            </w:pPr>
+            <w:r>
+              <w:rPr>
+                <w:rFonts w:ascii="Times New Roman" w:hAnsi="Times New Roman" w:cs="Times New Roman"/>
+                <w:b/>
+                <w:bCs/>
               </w:rPr>
               <w:t>WK1</w:t>
             </w:r>
@@ -4492,11 +4744,15 @@
             <w:pPr>
               <w:rPr>
                 <w:rFonts w:ascii="Times New Roman" w:hAnsi="Times New Roman" w:cs="Times New Roman"/>
-              </w:rPr>
-            </w:pPr>
-            <w:r>
-              <w:rPr>
-                <w:rFonts w:ascii="Times New Roman" w:hAnsi="Times New Roman" w:cs="Times New Roman"/>
+                <w:b/>
+                <w:bCs/>
+              </w:rPr>
+            </w:pPr>
+            <w:r>
+              <w:rPr>
+                <w:rFonts w:ascii="Times New Roman" w:hAnsi="Times New Roman" w:cs="Times New Roman"/>
+                <w:b/>
+                <w:bCs/>
               </w:rPr>
               <w:t>WK2</w:t>
             </w:r>
@@ -4510,11 +4766,15 @@
             <w:pPr>
               <w:rPr>
                 <w:rFonts w:ascii="Times New Roman" w:hAnsi="Times New Roman" w:cs="Times New Roman"/>
-              </w:rPr>
-            </w:pPr>
-            <w:r>
-              <w:rPr>
-                <w:rFonts w:ascii="Times New Roman" w:hAnsi="Times New Roman" w:cs="Times New Roman"/>
+                <w:b/>
+                <w:bCs/>
+              </w:rPr>
+            </w:pPr>
+            <w:r>
+              <w:rPr>
+                <w:rFonts w:ascii="Times New Roman" w:hAnsi="Times New Roman" w:cs="Times New Roman"/>
+                <w:b/>
+                <w:bCs/>
               </w:rPr>
               <w:t>WK3</w:t>
             </w:r>
@@ -4528,11 +4788,15 @@
             <w:pPr>
               <w:rPr>
                 <w:rFonts w:ascii="Times New Roman" w:hAnsi="Times New Roman" w:cs="Times New Roman"/>
-              </w:rPr>
-            </w:pPr>
-            <w:r>
-              <w:rPr>
-                <w:rFonts w:ascii="Times New Roman" w:hAnsi="Times New Roman" w:cs="Times New Roman"/>
+                <w:b/>
+                <w:bCs/>
+              </w:rPr>
+            </w:pPr>
+            <w:r>
+              <w:rPr>
+                <w:rFonts w:ascii="Times New Roman" w:hAnsi="Times New Roman" w:cs="Times New Roman"/>
+                <w:b/>
+                <w:bCs/>
               </w:rPr>
               <w:t>WK4</w:t>
             </w:r>
@@ -4552,11 +4816,15 @@
             <w:pPr>
               <w:rPr>
                 <w:rFonts w:ascii="Times New Roman" w:hAnsi="Times New Roman" w:cs="Times New Roman"/>
-              </w:rPr>
-            </w:pPr>
-            <w:r>
-              <w:rPr>
-                <w:rFonts w:ascii="Times New Roman" w:hAnsi="Times New Roman" w:cs="Times New Roman"/>
+                <w:b/>
+                <w:bCs/>
+              </w:rPr>
+            </w:pPr>
+            <w:r>
+              <w:rPr>
+                <w:rFonts w:ascii="Times New Roman" w:hAnsi="Times New Roman" w:cs="Times New Roman"/>
+                <w:b/>
+                <w:bCs/>
               </w:rPr>
               <w:t>{{MODULE_NAME}}</w:t>
             </w:r>
@@ -4700,7 +4968,6 @@
               <w:rPr>
                 <w:rFonts w:ascii="Times New Roman" w:hAnsi="Times New Roman" w:cs="Times New Roman"/>
               </w:rPr>
-              <w:lastRenderedPageBreak/>
               <w:t>Master Preparations</w:t>
             </w:r>
           </w:p>
@@ -4820,7 +5087,13 @@
               <w:rPr>
                 <w:rFonts w:ascii="Times New Roman" w:hAnsi="Times New Roman" w:cs="Times New Roman"/>
               </w:rPr>
-              <w:t>{{MODULE_LIST}} Configuration &amp; Set Up</w:t>
+              <w:t>{{MODULE_LIST}}</w:t>
+            </w:r>
+            <w:r>
+              <w:rPr>
+                <w:rFonts w:ascii="Times New Roman" w:hAnsi="Times New Roman" w:cs="Times New Roman"/>
+              </w:rPr>
+              <w:t xml:space="preserve"> Configuration &amp; Set Up</w:t>
             </w:r>
           </w:p>
         </w:tc>
@@ -5058,6 +5331,7 @@
               <w:rPr>
                 <w:rFonts w:ascii="Times New Roman" w:hAnsi="Times New Roman" w:cs="Times New Roman"/>
               </w:rPr>
+              <w:lastRenderedPageBreak/>
               <w:t>Data Preparation for Go-Live</w:t>
             </w:r>
           </w:p>
@@ -5718,11 +5992,15 @@
         <w:jc w:val="both"/>
         <w:rPr>
           <w:rFonts w:ascii="Times New Roman" w:hAnsi="Times New Roman" w:cs="Times New Roman"/>
-        </w:rPr>
-      </w:pPr>
-      <w:r>
-        <w:rPr>
-          <w:rFonts w:ascii="Times New Roman" w:hAnsi="Times New Roman" w:cs="Times New Roman"/>
+          <w:b/>
+          <w:bCs/>
+        </w:rPr>
+      </w:pPr>
+      <w:r>
+        <w:rPr>
+          <w:rFonts w:ascii="Times New Roman" w:hAnsi="Times New Roman" w:cs="Times New Roman"/>
+          <w:b/>
+          <w:bCs/>
         </w:rPr>
         <w:t xml:space="preserve">Terms and Conditions  </w:t>
       </w:r>
@@ -5733,12 +6011,16 @@
         <w:jc w:val="both"/>
         <w:rPr>
           <w:rFonts w:ascii="Times New Roman" w:hAnsi="Times New Roman" w:cs="Times New Roman"/>
+          <w:b/>
+          <w:bCs/>
           <w:color w:val="000000" w:themeColor="text1"/>
         </w:rPr>
       </w:pPr>
       <w:r>
         <w:rPr>
           <w:rFonts w:ascii="Times New Roman" w:hAnsi="Times New Roman" w:cs="Times New Roman"/>
+          <w:b/>
+          <w:bCs/>
           <w:color w:val="000000" w:themeColor="text1"/>
         </w:rPr>
         <w:t>1. Confidentiality</w:t>
@@ -5765,12 +6047,16 @@
         <w:jc w:val="both"/>
         <w:rPr>
           <w:rFonts w:ascii="Times New Roman" w:hAnsi="Times New Roman" w:cs="Times New Roman"/>
+          <w:b/>
+          <w:bCs/>
           <w:color w:val="000000" w:themeColor="text1"/>
         </w:rPr>
       </w:pPr>
       <w:r>
         <w:rPr>
           <w:rFonts w:ascii="Times New Roman" w:hAnsi="Times New Roman" w:cs="Times New Roman"/>
+          <w:b/>
+          <w:bCs/>
           <w:color w:val="000000" w:themeColor="text1"/>
         </w:rPr>
         <w:t>2. License</w:t>
@@ -5797,12 +6083,16 @@
         <w:jc w:val="both"/>
         <w:rPr>
           <w:rFonts w:ascii="Times New Roman" w:hAnsi="Times New Roman" w:cs="Times New Roman"/>
+          <w:b/>
+          <w:bCs/>
           <w:color w:val="000000" w:themeColor="text1"/>
         </w:rPr>
       </w:pPr>
       <w:r>
         <w:rPr>
           <w:rFonts w:ascii="Times New Roman" w:hAnsi="Times New Roman" w:cs="Times New Roman"/>
+          <w:b/>
+          <w:bCs/>
           <w:color w:val="000000" w:themeColor="text1"/>
         </w:rPr>
         <w:t>3. Ownership of Source Code</w:t>
@@ -5829,12 +6119,16 @@
         <w:jc w:val="both"/>
         <w:rPr>
           <w:rFonts w:ascii="Times New Roman" w:hAnsi="Times New Roman" w:cs="Times New Roman"/>
+          <w:b/>
+          <w:bCs/>
           <w:color w:val="000000" w:themeColor="text1"/>
         </w:rPr>
       </w:pPr>
       <w:r>
         <w:rPr>
           <w:rFonts w:ascii="Times New Roman" w:hAnsi="Times New Roman" w:cs="Times New Roman"/>
+          <w:b/>
+          <w:bCs/>
           <w:color w:val="000000" w:themeColor="text1"/>
         </w:rPr>
         <w:t>4. Warranty</w:t>
@@ -5861,12 +6155,16 @@
         <w:jc w:val="both"/>
         <w:rPr>
           <w:rFonts w:ascii="Times New Roman" w:hAnsi="Times New Roman" w:cs="Times New Roman"/>
+          <w:b/>
+          <w:bCs/>
           <w:color w:val="000000" w:themeColor="text1"/>
         </w:rPr>
       </w:pPr>
       <w:r>
         <w:rPr>
           <w:rFonts w:ascii="Times New Roman" w:hAnsi="Times New Roman" w:cs="Times New Roman"/>
+          <w:b/>
+          <w:bCs/>
           <w:color w:val="000000" w:themeColor="text1"/>
         </w:rPr>
         <w:t>5. Installation of Software</w:t>
@@ -5922,12 +6220,16 @@
         <w:jc w:val="both"/>
         <w:rPr>
           <w:rFonts w:ascii="Times New Roman" w:hAnsi="Times New Roman" w:cs="Times New Roman"/>
+          <w:b/>
+          <w:bCs/>
           <w:color w:val="000000" w:themeColor="text1"/>
         </w:rPr>
       </w:pPr>
       <w:r>
         <w:rPr>
           <w:rFonts w:ascii="Times New Roman" w:hAnsi="Times New Roman" w:cs="Times New Roman"/>
+          <w:b/>
+          <w:bCs/>
           <w:color w:val="000000" w:themeColor="text1"/>
         </w:rPr>
         <w:t>6. Excused Performance</w:t>
@@ -5946,7 +6248,6 @@
         <w:rPr>
           <w:rFonts w:ascii="Times New Roman" w:hAnsi="Times New Roman" w:cs="Times New Roman"/>
         </w:rPr>
-        <w:lastRenderedPageBreak/>
         <w:t xml:space="preserve">BlechTek shall not be liable or deemed to be in default for any delay or failure in performance under this Contract or interruption of services due to strike or </w:t>
       </w:r>
       <w:r>
@@ -5980,14 +6281,19 @@
         <w:jc w:val="both"/>
         <w:rPr>
           <w:rFonts w:ascii="Times New Roman" w:hAnsi="Times New Roman" w:cs="Times New Roman"/>
+          <w:b/>
+          <w:bCs/>
           <w:color w:val="000000" w:themeColor="text1"/>
         </w:rPr>
       </w:pPr>
       <w:r>
         <w:rPr>
           <w:rFonts w:ascii="Times New Roman" w:hAnsi="Times New Roman" w:cs="Times New Roman"/>
+          <w:b/>
+          <w:bCs/>
           <w:color w:val="000000" w:themeColor="text1"/>
         </w:rPr>
+        <w:lastRenderedPageBreak/>
         <w:t>7. Discontinuation of Contract</w:t>
       </w:r>
     </w:p>
@@ -6076,12 +6382,16 @@
         <w:jc w:val="both"/>
         <w:rPr>
           <w:rFonts w:ascii="Times New Roman" w:hAnsi="Times New Roman" w:cs="Times New Roman"/>
+          <w:b/>
+          <w:bCs/>
           <w:color w:val="000000" w:themeColor="text1"/>
         </w:rPr>
       </w:pPr>
       <w:r>
         <w:rPr>
           <w:rFonts w:ascii="Times New Roman" w:hAnsi="Times New Roman" w:cs="Times New Roman"/>
+          <w:b/>
+          <w:bCs/>
           <w:color w:val="000000" w:themeColor="text1"/>
         </w:rPr>
         <w:t>8. TDS</w:t>
@@ -6100,7 +6410,19 @@
         <w:rPr>
           <w:rFonts w:ascii="Times New Roman" w:hAnsi="Times New Roman" w:cs="Times New Roman"/>
         </w:rPr>
-        <w:t xml:space="preserve">In case of deduction of TDS Amount, You </w:t>
+        <w:t xml:space="preserve">In case of deduction of TDS Amount, </w:t>
+      </w:r>
+      <w:r>
+        <w:rPr>
+          <w:rFonts w:ascii="Times New Roman" w:hAnsi="Times New Roman" w:cs="Times New Roman"/>
+        </w:rPr>
+        <w:t>you</w:t>
+      </w:r>
+      <w:r>
+        <w:rPr>
+          <w:rFonts w:ascii="Times New Roman" w:hAnsi="Times New Roman" w:cs="Times New Roman"/>
+        </w:rPr>
+        <w:t xml:space="preserve"> </w:t>
       </w:r>
       <w:r>
         <w:rPr>
@@ -6121,12 +6443,16 @@
         <w:jc w:val="both"/>
         <w:rPr>
           <w:rFonts w:ascii="Times New Roman" w:hAnsi="Times New Roman" w:cs="Times New Roman"/>
+          <w:b/>
+          <w:bCs/>
           <w:color w:val="000000" w:themeColor="text1"/>
         </w:rPr>
       </w:pPr>
       <w:r>
         <w:rPr>
           <w:rFonts w:ascii="Times New Roman" w:hAnsi="Times New Roman" w:cs="Times New Roman"/>
+          <w:b/>
+          <w:bCs/>
           <w:color w:val="000000" w:themeColor="text1"/>
         </w:rPr>
         <w:t>9. Validity of the Offer</w:t>
@@ -6138,13 +6464,23 @@
         <w:jc w:val="both"/>
         <w:rPr>
           <w:rFonts w:ascii="Times New Roman" w:hAnsi="Times New Roman" w:cs="Times New Roman"/>
-        </w:rPr>
-      </w:pPr>
-      <w:r>
-        <w:rPr>
-          <w:rFonts w:ascii="Times New Roman" w:hAnsi="Times New Roman" w:cs="Times New Roman"/>
-        </w:rPr>
-        <w:t>This offer is valid up to {{VALIDATION_DATE}}.</w:t>
+          <w:b/>
+          <w:bCs/>
+        </w:rPr>
+      </w:pPr>
+      <w:r>
+        <w:rPr>
+          <w:rFonts w:ascii="Times New Roman" w:hAnsi="Times New Roman" w:cs="Times New Roman"/>
+        </w:rPr>
+        <w:t xml:space="preserve">This offer is valid up to </w:t>
+      </w:r>
+      <w:r>
+        <w:rPr>
+          <w:rFonts w:ascii="Times New Roman" w:hAnsi="Times New Roman" w:cs="Times New Roman"/>
+          <w:b/>
+          <w:bCs/>
+        </w:rPr>
+        <w:t>{{VALIDATION_DATE}}.</w:t>
       </w:r>
     </w:p>
     <w:p>
@@ -6153,12 +6489,16 @@
         <w:jc w:val="both"/>
         <w:rPr>
           <w:rFonts w:ascii="Times New Roman" w:hAnsi="Times New Roman" w:cs="Times New Roman"/>
+          <w:b/>
+          <w:bCs/>
           <w:color w:val="000000" w:themeColor="text1"/>
         </w:rPr>
       </w:pPr>
       <w:r>
         <w:rPr>
           <w:rFonts w:ascii="Times New Roman" w:hAnsi="Times New Roman" w:cs="Times New Roman"/>
+          <w:b/>
+          <w:bCs/>
           <w:color w:val="000000" w:themeColor="text1"/>
         </w:rPr>
         <w:t>10. Suggestions by Auditors / Consultants</w:t>
@@ -6197,12 +6537,16 @@
         <w:jc w:val="both"/>
         <w:rPr>
           <w:rFonts w:ascii="Times New Roman" w:hAnsi="Times New Roman" w:cs="Times New Roman"/>
+          <w:b/>
+          <w:bCs/>
           <w:color w:val="000000" w:themeColor="text1"/>
         </w:rPr>
       </w:pPr>
       <w:r>
         <w:rPr>
           <w:rFonts w:ascii="Times New Roman" w:hAnsi="Times New Roman" w:cs="Times New Roman"/>
+          <w:b/>
+          <w:bCs/>
           <w:color w:val="000000" w:themeColor="text1"/>
         </w:rPr>
         <w:t>11. Legal</w:t>
@@ -6271,12 +6615,16 @@
         <w:jc w:val="both"/>
         <w:rPr>
           <w:rFonts w:ascii="Times New Roman" w:hAnsi="Times New Roman" w:cs="Times New Roman"/>
+          <w:b/>
+          <w:bCs/>
           <w:color w:val="000000" w:themeColor="text1"/>
         </w:rPr>
       </w:pPr>
       <w:r>
         <w:rPr>
           <w:rFonts w:ascii="Times New Roman" w:hAnsi="Times New Roman" w:cs="Times New Roman"/>
+          <w:b/>
+          <w:bCs/>
           <w:color w:val="000000" w:themeColor="text1"/>
         </w:rPr>
         <w:t>For BlechTek Software Solutions LLP</w:t>
@@ -6340,21 +6688,6 @@
           <w:rFonts w:ascii="Times New Roman" w:hAnsi="Times New Roman" w:cs="Times New Roman"/>
         </w:rPr>
       </w:pPr>
-    </w:p>
-    <w:p>
-      <w:pPr>
-        <w:spacing w:after="20"/>
-        <w:jc w:val="both"/>
-        <w:rPr>
-          <w:rFonts w:ascii="Times New Roman" w:hAnsi="Times New Roman" w:cs="Times New Roman"/>
-        </w:rPr>
-      </w:pPr>
-      <w:r>
-        <w:rPr>
-          <w:rFonts w:ascii="Times New Roman" w:hAnsi="Times New Roman" w:cs="Times New Roman"/>
-        </w:rPr>
-        <w:t>should pay us the deducted TDS amount immediately.</w:t>
-      </w:r>
     </w:p>
     <w:p>
       <w:pPr>
@@ -6497,56 +6830,6 @@
         <w:szCs w:val="18"/>
       </w:rPr>
     </w:pPr>
-  </w:p>
-  <w:p>
-    <w:pPr>
-      <w:jc w:val="center"/>
-      <w:rPr>
-        <w:color w:val="5B6478"/>
-        <w:sz w:val="14"/>
-        <w:szCs w:val="14"/>
-      </w:rPr>
-    </w:pPr>
-    <w:r>
-      <w:rPr>
-        <w:noProof/>
-      </w:rPr>
-      <w:drawing>
-        <wp:inline distT="0" distB="0" distL="0" distR="0" wp14:anchorId="0C7DB755" wp14:editId="4C568021">
-          <wp:extent cx="6375400" cy="47625"/>
-          <wp:effectExtent l="0" t="0" r="6350" b="9525"/>
-          <wp:docPr id="1622519558" name="Footer Line"/>
-          <wp:cNvGraphicFramePr>
-            <a:graphicFrameLocks xmlns:a="http://schemas.openxmlformats.org/drawingml/2006/main" noChangeAspect="1"/>
-          </wp:cNvGraphicFramePr>
-          <a:graphic xmlns:a="http://schemas.openxmlformats.org/drawingml/2006/main">
-            <a:graphicData uri="http://schemas.openxmlformats.org/drawingml/2006/picture">
-              <pic:pic xmlns:pic="http://schemas.openxmlformats.org/drawingml/2006/picture">
-                <pic:nvPicPr>
-                  <pic:cNvPr id="1" name="Footer Line"/>
-                  <pic:cNvPicPr/>
-                </pic:nvPicPr>
-                <pic:blipFill>
-                  <a:blip r:embed="rId1"/>
-                  <a:stretch>
-                    <a:fillRect/>
-                  </a:stretch>
-                </pic:blipFill>
-                <pic:spPr>
-                  <a:xfrm>
-                    <a:off x="0" y="0"/>
-                    <a:ext cx="6375400" cy="47625"/>
-                  </a:xfrm>
-                  <a:prstGeom prst="rect">
-                    <a:avLst/>
-                  </a:prstGeom>
-                </pic:spPr>
-              </pic:pic>
-            </a:graphicData>
-          </a:graphic>
-        </wp:inline>
-      </w:drawing>
-    </w:r>
   </w:p>
   <w:p>
     <w:pPr>
@@ -6656,6 +6939,56 @@
         <w:szCs w:val="18"/>
       </w:rPr>
       <w:t>MSME Certificate No.: UDYAM-MH-26-0746115</w:t>
+    </w:r>
+  </w:p>
+  <w:p>
+    <w:pPr>
+      <w:jc w:val="center"/>
+      <w:rPr>
+        <w:color w:val="5B6478"/>
+        <w:sz w:val="14"/>
+        <w:szCs w:val="14"/>
+      </w:rPr>
+    </w:pPr>
+    <w:r>
+      <w:rPr>
+        <w:noProof/>
+      </w:rPr>
+      <w:drawing>
+        <wp:inline distT="0" distB="0" distL="0" distR="0" wp14:anchorId="0C7DB755" wp14:editId="4C568021">
+          <wp:extent cx="6375400" cy="47625"/>
+          <wp:effectExtent l="0" t="0" r="6350" b="9525"/>
+          <wp:docPr id="1622519558" name="Footer Line"/>
+          <wp:cNvGraphicFramePr>
+            <a:graphicFrameLocks xmlns:a="http://schemas.openxmlformats.org/drawingml/2006/main" noChangeAspect="1"/>
+          </wp:cNvGraphicFramePr>
+          <a:graphic xmlns:a="http://schemas.openxmlformats.org/drawingml/2006/main">
+            <a:graphicData uri="http://schemas.openxmlformats.org/drawingml/2006/picture">
+              <pic:pic xmlns:pic="http://schemas.openxmlformats.org/drawingml/2006/picture">
+                <pic:nvPicPr>
+                  <pic:cNvPr id="1" name="Footer Line"/>
+                  <pic:cNvPicPr/>
+                </pic:nvPicPr>
+                <pic:blipFill>
+                  <a:blip r:embed="rId1"/>
+                  <a:stretch>
+                    <a:fillRect/>
+                  </a:stretch>
+                </pic:blipFill>
+                <pic:spPr>
+                  <a:xfrm>
+                    <a:off x="0" y="0"/>
+                    <a:ext cx="6375400" cy="47625"/>
+                  </a:xfrm>
+                  <a:prstGeom prst="rect">
+                    <a:avLst/>
+                  </a:prstGeom>
+                </pic:spPr>
+              </pic:pic>
+            </a:graphicData>
+          </a:graphic>
+        </wp:inline>
+      </w:drawing>
     </w:r>
   </w:p>
 </w:ftr>

</xml_diff>

<commit_message>
updates in quotation pdf about the no of the Implementation ( {{IMPL_EFFORT}} Man Day * {{IMPL_RATE}} per Man Day)
</commit_message>
<xml_diff>
--- a/QuotationApp.API/Templates/QuotationTemplate_Updated.docx
+++ b/QuotationApp.API/Templates/QuotationTemplate_Updated.docx
@@ -1923,22 +1923,25 @@
               <w:t>Implementation (</w:t>
             </w:r>
             <w:r>
-              <w:rPr>
-                <w:rFonts w:ascii="Times New Roman" w:hAnsi="Times New Roman" w:cs="Times New Roman"/>
-              </w:rPr>
-              <w:t>{{NO_OF_USERS</w:t>
-            </w:r>
-            <w:r>
-              <w:rPr>
-                <w:rFonts w:ascii="Times New Roman" w:hAnsi="Times New Roman" w:cs="Times New Roman"/>
-              </w:rPr>
-              <w:t>}}</w:t>
-            </w:r>
-            <w:r>
-              <w:rPr>
-                <w:rFonts w:ascii="Times New Roman" w:hAnsi="Times New Roman" w:cs="Times New Roman"/>
-              </w:rPr>
-              <w:t xml:space="preserve"> Man</w:t>
+              <w:t xml:space="preserve"> </w:t>
+            </w:r>
+            <w:r>
+              <w:rPr>
+                <w:rFonts w:ascii="Times New Roman" w:hAnsi="Times New Roman" w:cs="Times New Roman"/>
+              </w:rPr>
+              <w:t>{{IMPL_EFFORT}}</w:t>
+            </w:r>
+            <w:r>
+              <w:rPr>
+                <w:rFonts w:ascii="Times New Roman" w:hAnsi="Times New Roman" w:cs="Times New Roman"/>
+              </w:rPr>
+              <w:t xml:space="preserve"> </w:t>
+            </w:r>
+            <w:r>
+              <w:rPr>
+                <w:rFonts w:ascii="Times New Roman" w:hAnsi="Times New Roman" w:cs="Times New Roman"/>
+              </w:rPr>
+              <w:t>Man</w:t>
             </w:r>
             <w:r>
               <w:rPr>

</xml_diff>

<commit_message>
updates in new quotation pdf for Price Summary year wise calculations
</commit_message>
<xml_diff>
--- a/QuotationApp.API/Templates/QuotationTemplate_Updated.docx
+++ b/QuotationApp.API/Templates/QuotationTemplate_Updated.docx
@@ -130,8 +130,6 @@
             <w:r>
               <w:rPr>
                 <w:rFonts w:ascii="Times New Roman" w:hAnsi="Times New Roman" w:cs="Times New Roman"/>
-                <w:b/>
-                <w:bCs/>
                 <w:sz w:val="18"/>
                 <w:szCs w:val="18"/>
               </w:rPr>
@@ -141,8 +139,6 @@
             <w:r>
               <w:rPr>
                 <w:rFonts w:ascii="Times New Roman" w:hAnsi="Times New Roman" w:cs="Times New Roman"/>
-                <w:b/>
-                <w:bCs/>
                 <w:sz w:val="18"/>
                 <w:szCs w:val="18"/>
               </w:rPr>
@@ -220,8 +216,6 @@
             <w:r>
               <w:rPr>
                 <w:rFonts w:ascii="Times New Roman" w:hAnsi="Times New Roman" w:cs="Times New Roman"/>
-                <w:b/>
-                <w:bCs/>
                 <w:sz w:val="18"/>
                 <w:szCs w:val="18"/>
               </w:rPr>
@@ -231,8 +225,6 @@
             <w:r>
               <w:rPr>
                 <w:rFonts w:ascii="Times New Roman" w:hAnsi="Times New Roman" w:cs="Times New Roman"/>
-                <w:b/>
-                <w:bCs/>
                 <w:sz w:val="18"/>
                 <w:szCs w:val="18"/>
               </w:rPr>
@@ -276,8 +268,6 @@
             <w:r>
               <w:rPr>
                 <w:rFonts w:ascii="Times New Roman" w:hAnsi="Times New Roman" w:cs="Times New Roman"/>
-                <w:b/>
-                <w:bCs/>
                 <w:sz w:val="18"/>
                 <w:szCs w:val="18"/>
               </w:rPr>
@@ -287,8 +277,6 @@
             <w:r>
               <w:rPr>
                 <w:rFonts w:ascii="Times New Roman" w:hAnsi="Times New Roman" w:cs="Times New Roman"/>
-                <w:b/>
-                <w:bCs/>
                 <w:sz w:val="18"/>
                 <w:szCs w:val="18"/>
               </w:rPr>
@@ -927,6 +915,8 @@
         <w:spacing w:after="200"/>
         <w:rPr>
           <w:rFonts w:ascii="Times New Roman" w:hAnsi="Times New Roman" w:cs="Times New Roman"/>
+          <w:b/>
+          <w:bCs/>
           <w:lang w:val="en-US"/>
         </w:rPr>
       </w:pPr>
@@ -940,6 +930,8 @@
       <w:r>
         <w:rPr>
           <w:rFonts w:ascii="Times New Roman" w:hAnsi="Times New Roman" w:cs="Times New Roman"/>
+          <w:b/>
+          <w:bCs/>
           <w:lang w:val="en-US"/>
         </w:rPr>
         <w:t>Sushama Inamdar</w:t>
@@ -2822,7 +2814,6 @@
               <w:rPr>
                 <w:rFonts w:ascii="Times New Roman" w:hAnsi="Times New Roman" w:cs="Times New Roman"/>
               </w:rPr>
-              <w:lastRenderedPageBreak/>
               <w:t>5</w:t>
             </w:r>
           </w:p>
@@ -2894,6 +2885,7 @@
               <w:rPr>
                 <w:rFonts w:ascii="Times New Roman" w:hAnsi="Times New Roman" w:cs="Times New Roman"/>
               </w:rPr>
+              <w:lastRenderedPageBreak/>
               <w:t xml:space="preserve"> 5.1</w:t>
             </w:r>
           </w:p>
@@ -5345,7 +5337,6 @@
               <w:rPr>
                 <w:rFonts w:ascii="Times New Roman" w:hAnsi="Times New Roman" w:cs="Times New Roman"/>
               </w:rPr>
-              <w:lastRenderedPageBreak/>
               <w:t>Data Preparation for Go-Live</w:t>
             </w:r>
           </w:p>
@@ -5700,6 +5691,7 @@
           <w:rFonts w:ascii="Times New Roman" w:hAnsi="Times New Roman" w:cs="Times New Roman"/>
           <w:w w:val="101"/>
         </w:rPr>
+        <w:lastRenderedPageBreak/>
         <w:t>We</w:t>
       </w:r>
       <w:r>
@@ -6307,7 +6299,6 @@
           <w:bCs/>
           <w:color w:val="000000" w:themeColor="text1"/>
         </w:rPr>
-        <w:lastRenderedPageBreak/>
         <w:t>7. Discontinuation of Contract</w:t>
       </w:r>
     </w:p>
@@ -6424,6 +6415,7 @@
         <w:rPr>
           <w:rFonts w:ascii="Times New Roman" w:hAnsi="Times New Roman" w:cs="Times New Roman"/>
         </w:rPr>
+        <w:lastRenderedPageBreak/>
         <w:t xml:space="preserve">In case of deduction of TDS Amount, </w:t>
       </w:r>
       <w:r>
@@ -6709,12 +6701,16 @@
         <w:jc w:val="both"/>
         <w:rPr>
           <w:rFonts w:ascii="Times New Roman" w:hAnsi="Times New Roman" w:cs="Times New Roman"/>
+          <w:b/>
+          <w:bCs/>
           <w:color w:val="000000" w:themeColor="text1"/>
         </w:rPr>
       </w:pPr>
       <w:r>
         <w:rPr>
           <w:rFonts w:ascii="Times New Roman" w:hAnsi="Times New Roman" w:cs="Times New Roman"/>
+          <w:b/>
+          <w:bCs/>
           <w:color w:val="000000" w:themeColor="text1"/>
         </w:rPr>
         <w:t>Sushama Inamdar</w:t>
@@ -6783,12 +6779,16 @@
       <w:jc w:val="center"/>
       <w:rPr>
         <w:rFonts w:ascii="Times New Roman" w:hAnsi="Times New Roman" w:cs="Times New Roman"/>
+        <w:b/>
+        <w:bCs/>
         <w:color w:val="000000" w:themeColor="text1"/>
       </w:rPr>
     </w:pPr>
     <w:r>
       <w:rPr>
         <w:rFonts w:ascii="Times New Roman" w:hAnsi="Times New Roman" w:cs="Times New Roman"/>
+        <w:b/>
+        <w:bCs/>
         <w:color w:val="000000" w:themeColor="text1"/>
       </w:rPr>
       <w:t>BlechTek Software Solutions LLP</w:t>
@@ -6807,11 +6807,22 @@
     <w:r>
       <w:rPr>
         <w:rFonts w:ascii="Times New Roman" w:hAnsi="Times New Roman" w:cs="Times New Roman"/>
+        <w:b/>
+        <w:bCs/>
         <w:color w:val="000000" w:themeColor="text1"/>
         <w:sz w:val="18"/>
         <w:szCs w:val="18"/>
       </w:rPr>
-      <w:t xml:space="preserve">Address: S.NO. 257/2/2A/4 ABC Business Center, S Floor, Opp. WindMill Village Road, </w:t>
+      <w:t>Address:</w:t>
+    </w:r>
+    <w:r>
+      <w:rPr>
+        <w:rFonts w:ascii="Times New Roman" w:hAnsi="Times New Roman" w:cs="Times New Roman"/>
+        <w:color w:val="000000" w:themeColor="text1"/>
+        <w:sz w:val="18"/>
+        <w:szCs w:val="18"/>
+      </w:rPr>
+      <w:t xml:space="preserve"> S.NO. 257/2/2A/4 ABC Business Center, S Floor, Opp. WindMill Village Road, </w:t>
     </w:r>
   </w:p>
   <w:p>
@@ -6844,17 +6855,17 @@
         <w:szCs w:val="18"/>
       </w:rPr>
     </w:pPr>
-  </w:p>
-  <w:p>
-    <w:pPr>
-      <w:jc w:val="center"/>
+    <w:r>
       <w:rPr>
         <w:rFonts w:ascii="Times New Roman" w:hAnsi="Times New Roman" w:cs="Times New Roman"/>
+        <w:b/>
+        <w:bCs/>
         <w:color w:val="000000" w:themeColor="text1"/>
         <w:sz w:val="18"/>
         <w:szCs w:val="18"/>
       </w:rPr>
-    </w:pPr>
+      <w:t>LLP No.:</w:t>
+    </w:r>
     <w:r>
       <w:rPr>
         <w:rFonts w:ascii="Times New Roman" w:hAnsi="Times New Roman" w:cs="Times New Roman"/>
@@ -6862,7 +6873,7 @@
         <w:sz w:val="18"/>
         <w:szCs w:val="18"/>
       </w:rPr>
-      <w:t>LLP No.: ACD-6620</w:t>
+      <w:t xml:space="preserve"> ACD-6620</w:t>
     </w:r>
     <w:r>
       <w:rPr>
@@ -6912,11 +6923,22 @@
     <w:r>
       <w:rPr>
         <w:rFonts w:ascii="Times New Roman" w:hAnsi="Times New Roman" w:cs="Times New Roman"/>
+        <w:b/>
+        <w:bCs/>
         <w:color w:val="000000" w:themeColor="text1"/>
         <w:sz w:val="18"/>
         <w:szCs w:val="18"/>
       </w:rPr>
-      <w:t>GST NO.: 27ABCFB0283B1Z0</w:t>
+      <w:t>GST NO.:</w:t>
+    </w:r>
+    <w:r>
+      <w:rPr>
+        <w:rFonts w:ascii="Times New Roman" w:hAnsi="Times New Roman" w:cs="Times New Roman"/>
+        <w:color w:val="000000" w:themeColor="text1"/>
+        <w:sz w:val="18"/>
+        <w:szCs w:val="18"/>
+      </w:rPr>
+      <w:t xml:space="preserve"> 27ABCFB0283B1Z0</w:t>
     </w:r>
     <w:r>
       <w:rPr>
@@ -6948,11 +6970,22 @@
     <w:r>
       <w:rPr>
         <w:rFonts w:ascii="Times New Roman" w:hAnsi="Times New Roman" w:cs="Times New Roman"/>
+        <w:b/>
+        <w:bCs/>
         <w:color w:val="000000" w:themeColor="text1"/>
         <w:sz w:val="18"/>
         <w:szCs w:val="18"/>
       </w:rPr>
-      <w:t>MSME Certificate No.: UDYAM-MH-26-0746115</w:t>
+      <w:t>MSME Certificate No.:</w:t>
+    </w:r>
+    <w:r>
+      <w:rPr>
+        <w:rFonts w:ascii="Times New Roman" w:hAnsi="Times New Roman" w:cs="Times New Roman"/>
+        <w:color w:val="000000" w:themeColor="text1"/>
+        <w:sz w:val="18"/>
+        <w:szCs w:val="18"/>
+      </w:rPr>
+      <w:t xml:space="preserve"> UDYAM-MH-26-0746115</w:t>
     </w:r>
   </w:p>
   <w:p>

</xml_diff>

<commit_message>
updates in new quotation pdf for generating the auto sr.no. correctly based on the selected modules
</commit_message>
<xml_diff>
--- a/QuotationApp.API/Templates/QuotationTemplate_Updated.docx
+++ b/QuotationApp.API/Templates/QuotationTemplate_Updated.docx
@@ -4117,30 +4117,6 @@
                 <w:szCs w:val="18"/>
               </w:rPr>
             </w:pPr>
-            <w:r>
-              <w:rPr>
-                <w:rFonts w:ascii="Times New Roman" w:hAnsi="Times New Roman" w:cs="Times New Roman"/>
-                <w:sz w:val="18"/>
-                <w:szCs w:val="18"/>
-              </w:rPr>
-              <w:t>{{</w:t>
-            </w:r>
-            <w:r>
-              <w:rPr>
-                <w:rFonts w:ascii="Times New Roman" w:hAnsi="Times New Roman" w:cs="Times New Roman"/>
-                <w:sz w:val="18"/>
-                <w:szCs w:val="18"/>
-              </w:rPr>
-              <w:t>M_</w:t>
-            </w:r>
-            <w:r>
-              <w:rPr>
-                <w:rFonts w:ascii="Times New Roman" w:hAnsi="Times New Roman" w:cs="Times New Roman"/>
-                <w:sz w:val="18"/>
-                <w:szCs w:val="18"/>
-              </w:rPr>
-              <w:t>NAME}}</w:t>
-            </w:r>
           </w:p>
         </w:tc>
         <w:tc>

</xml_diff>